<commit_message>
Add v4 multi-fan configuration support
Replaces the single-fan v3 schema with a v4 fan_configurations[] array,
enabling multiple fan types and quantities per quote. Includes combine
quotes endpoint, multi-config Word template loops, and grand totals
aggregation across all configurations.

Co-Authored-By: Claude Opus 4.6 <noreply@anthropic.com>
</commit_message>
<xml_diff>
--- a/ui/templates/quote_template.docx
+++ b/ui/templates/quote_template.docx
@@ -993,6 +993,22 @@
     </w:p>
     <w:p>
       <w:pPr>
+        <w:pStyle w:val="Normal"/>
+      </w:pPr>
+      <w:r>
+        <w:t xml:space="preserve">{%p for fan_config in fan_configs %}</w:t>
+      </w:r>
+    </w:p>
+    <w:p>
+      <w:pPr>
+        <w:pStyle w:val="List Paragraph"/>
+      </w:pPr>
+      <w:r>
+        <w:t xml:space="preserve">{%p if is_multi_config %}{{ fan_config.label }}{% if fan_config.quantity &gt; 1 %} (x{{ fan_config.quantity }}){% endif %}{%p endif %}</w:t>
+      </w:r>
+    </w:p>
+    <w:p>
+      <w:pPr>
         <w:pStyle w:val="ListParagraph"/>
         <w:numPr>
           <w:ilvl w:val="0"/>
@@ -1014,237 +1030,26 @@
           <w:bCs/>
           <w:u w:val="single"/>
         </w:rPr>
-        <w:t>(</w:t>
-      </w:r>
-      <w:r>
-        <w:rPr>
-          <w:rFonts w:ascii="Arial" w:eastAsia="Times New Roman" w:hAnsi="Arial" w:cs="Arial"/>
-          <w:b/>
-          <w:bCs/>
-          <w:u w:val="single"/>
-        </w:rPr>
-        <w:t>1</w:t>
-      </w:r>
-      <w:r>
-        <w:rPr>
-          <w:rFonts w:ascii="Arial" w:eastAsia="Times New Roman" w:hAnsi="Arial" w:cs="Arial"/>
-          <w:b/>
-          <w:bCs/>
-          <w:u w:val="single"/>
-        </w:rPr>
-        <w:t xml:space="preserve"> </w:t>
-      </w:r>
-      <w:r>
-        <w:rPr>
-          <w:rFonts w:ascii="Arial" w:eastAsia="Times New Roman" w:hAnsi="Arial" w:cs="Arial"/>
-          <w:b/>
-          <w:bCs/>
-          <w:u w:val="single"/>
-        </w:rPr>
-        <w:t xml:space="preserve">Unit) – </w:t>
+        <w:t>(1 Unit) – {{ fan_config.fan_size_mm }}mm Fan, {{ fan_config.motor_output }}kW, {{ fan_config.motor_pole }}-pole, 525V Auxiliary Fan:</w:t>
       </w:r>
       <w:proofErr w:type="gramStart"/>
-      <w:r>
-        <w:rPr>
-          <w:rFonts w:ascii="Arial" w:eastAsia="Times New Roman" w:hAnsi="Arial" w:cs="Arial"/>
-          <w:b/>
-          <w:bCs/>
-        </w:rPr>
-        <w:t xml:space="preserve">{{ </w:t>
-      </w:r>
       <w:proofErr w:type="spellStart"/>
-      <w:r>
-        <w:rPr>
-          <w:rFonts w:ascii="Arial" w:eastAsia="Times New Roman" w:hAnsi="Arial" w:cs="Arial"/>
-          <w:b/>
-          <w:bCs/>
-        </w:rPr>
-        <w:t>fan</w:t>
-      </w:r>
       <w:proofErr w:type="gramEnd"/>
-      <w:r>
-        <w:rPr>
-          <w:rFonts w:ascii="Arial" w:eastAsia="Times New Roman" w:hAnsi="Arial" w:cs="Arial"/>
-          <w:b/>
-          <w:bCs/>
-        </w:rPr>
-        <w:t>_size_</w:t>
-      </w:r>
       <w:proofErr w:type="gramStart"/>
-      <w:r>
-        <w:rPr>
-          <w:rFonts w:ascii="Arial" w:eastAsia="Times New Roman" w:hAnsi="Arial" w:cs="Arial"/>
-          <w:b/>
-          <w:bCs/>
-        </w:rPr>
-        <w:t>mm</w:t>
-      </w:r>
       <w:proofErr w:type="spellEnd"/>
-      <w:r>
-        <w:rPr>
-          <w:rFonts w:ascii="Arial" w:eastAsia="Times New Roman" w:hAnsi="Arial" w:cs="Arial"/>
-          <w:b/>
-          <w:bCs/>
-        </w:rPr>
-        <w:t xml:space="preserve"> }}m</w:t>
-      </w:r>
-      <w:r>
-        <w:rPr>
-          <w:rFonts w:ascii="Arial" w:eastAsia="Times New Roman" w:hAnsi="Arial" w:cs="Arial"/>
-          <w:b/>
-          <w:bCs/>
-        </w:rPr>
-        <w:t>m</w:t>
-      </w:r>
       <w:proofErr w:type="gramEnd"/>
-      <w:r>
-        <w:rPr>
-          <w:rFonts w:ascii="Arial" w:eastAsia="Times New Roman" w:hAnsi="Arial" w:cs="Arial"/>
-          <w:b/>
-          <w:bCs/>
-        </w:rPr>
-        <w:t xml:space="preserve"> </w:t>
-      </w:r>
-      <w:r>
-        <w:rPr>
-          <w:rFonts w:ascii="Arial" w:eastAsia="Times New Roman" w:hAnsi="Arial" w:cs="Arial"/>
-          <w:b/>
-          <w:bCs/>
-        </w:rPr>
-        <w:t>Fan</w:t>
-      </w:r>
-      <w:r>
-        <w:rPr>
-          <w:rFonts w:ascii="Arial" w:eastAsia="Times New Roman" w:hAnsi="Arial" w:cs="Arial"/>
-          <w:b/>
-          <w:bCs/>
-        </w:rPr>
-        <w:t xml:space="preserve">, </w:t>
-      </w:r>
       <w:proofErr w:type="gramStart"/>
-      <w:r>
-        <w:rPr>
-          <w:rFonts w:ascii="Arial" w:eastAsia="Times New Roman" w:hAnsi="Arial" w:cs="Arial"/>
-          <w:b/>
-          <w:bCs/>
-        </w:rPr>
-        <w:t xml:space="preserve">{{ </w:t>
-      </w:r>
       <w:proofErr w:type="spellStart"/>
-      <w:r>
-        <w:rPr>
-          <w:rFonts w:ascii="Arial" w:eastAsia="Times New Roman" w:hAnsi="Arial" w:cs="Arial"/>
-          <w:b/>
-          <w:bCs/>
-        </w:rPr>
-        <w:t>motor</w:t>
-      </w:r>
       <w:proofErr w:type="gramEnd"/>
-      <w:r>
-        <w:rPr>
-          <w:rFonts w:ascii="Arial" w:eastAsia="Times New Roman" w:hAnsi="Arial" w:cs="Arial"/>
-          <w:b/>
-          <w:bCs/>
-        </w:rPr>
-        <w:t>_</w:t>
-      </w:r>
       <w:proofErr w:type="gramStart"/>
-      <w:r>
-        <w:rPr>
-          <w:rFonts w:ascii="Arial" w:eastAsia="Times New Roman" w:hAnsi="Arial" w:cs="Arial"/>
-          <w:b/>
-          <w:bCs/>
-        </w:rPr>
-        <w:t>output</w:t>
-      </w:r>
       <w:proofErr w:type="spellEnd"/>
-      <w:r>
-        <w:rPr>
-          <w:rFonts w:ascii="Arial" w:eastAsia="Times New Roman" w:hAnsi="Arial" w:cs="Arial"/>
-          <w:b/>
-          <w:bCs/>
-        </w:rPr>
-        <w:t xml:space="preserve"> }}kW</w:t>
-      </w:r>
       <w:proofErr w:type="gramEnd"/>
-      <w:r>
-        <w:rPr>
-          <w:rFonts w:ascii="Arial" w:eastAsia="Times New Roman" w:hAnsi="Arial" w:cs="Arial"/>
-          <w:b/>
-          <w:bCs/>
-        </w:rPr>
-        <w:t xml:space="preserve">, </w:t>
-      </w:r>
       <w:proofErr w:type="gramStart"/>
-      <w:r>
-        <w:rPr>
-          <w:rFonts w:ascii="Arial" w:eastAsia="Times New Roman" w:hAnsi="Arial" w:cs="Arial"/>
-          <w:b/>
-          <w:bCs/>
-        </w:rPr>
-        <w:t xml:space="preserve">{{ </w:t>
-      </w:r>
       <w:proofErr w:type="spellStart"/>
-      <w:r>
-        <w:rPr>
-          <w:rFonts w:ascii="Arial" w:eastAsia="Times New Roman" w:hAnsi="Arial" w:cs="Arial"/>
-          <w:b/>
-          <w:bCs/>
-        </w:rPr>
-        <w:t>motor</w:t>
-      </w:r>
       <w:proofErr w:type="gramEnd"/>
-      <w:r>
-        <w:rPr>
-          <w:rFonts w:ascii="Arial" w:eastAsia="Times New Roman" w:hAnsi="Arial" w:cs="Arial"/>
-          <w:b/>
-          <w:bCs/>
-        </w:rPr>
-        <w:t>_</w:t>
-      </w:r>
       <w:proofErr w:type="gramStart"/>
-      <w:r>
-        <w:rPr>
-          <w:rFonts w:ascii="Arial" w:eastAsia="Times New Roman" w:hAnsi="Arial" w:cs="Arial"/>
-          <w:b/>
-          <w:bCs/>
-        </w:rPr>
-        <w:t>pole</w:t>
-      </w:r>
       <w:proofErr w:type="spellEnd"/>
-      <w:r>
-        <w:rPr>
-          <w:rFonts w:ascii="Arial" w:eastAsia="Times New Roman" w:hAnsi="Arial" w:cs="Arial"/>
-          <w:b/>
-          <w:bCs/>
-        </w:rPr>
-        <w:t xml:space="preserve"> }}-</w:t>
-      </w:r>
       <w:proofErr w:type="gramEnd"/>
-      <w:r>
-        <w:rPr>
-          <w:rFonts w:ascii="Arial" w:eastAsia="Times New Roman" w:hAnsi="Arial" w:cs="Arial"/>
-          <w:b/>
-          <w:bCs/>
-        </w:rPr>
-        <w:t>pole</w:t>
-      </w:r>
-      <w:r>
-        <w:rPr>
-          <w:rFonts w:ascii="Arial" w:eastAsia="Times New Roman" w:hAnsi="Arial" w:cs="Arial"/>
-          <w:b/>
-          <w:bCs/>
-        </w:rPr>
-        <w:t>, 525V Auxiliary Fan</w:t>
-      </w:r>
-      <w:r>
-        <w:rPr>
-          <w:rFonts w:ascii="Arial" w:eastAsia="Times New Roman" w:hAnsi="Arial" w:cs="Arial"/>
-          <w:b/>
-          <w:bCs/>
-        </w:rPr>
-        <w:t>:</w:t>
-      </w:r>
     </w:p>
     <w:p>
       <w:pPr>
@@ -1307,50 +1112,14 @@
         <w:rPr>
           <w:rFonts w:ascii="Arial" w:eastAsia="Times New Roman" w:hAnsi="Arial" w:cs="Arial"/>
         </w:rPr>
-        <w:t xml:space="preserve">Fan Model: </w:t>
+        <w:t>Fan Model: {{ fan_config.fan_uid }}</w:t>
       </w:r>
       <w:proofErr w:type="gramStart"/>
-      <w:r>
-        <w:rPr>
-          <w:rFonts w:ascii="Arial" w:eastAsia="Times New Roman" w:hAnsi="Arial" w:cs="Arial"/>
-        </w:rPr>
-        <w:t xml:space="preserve">{{ </w:t>
-      </w:r>
       <w:proofErr w:type="spellStart"/>
-      <w:r>
-        <w:rPr>
-          <w:rFonts w:ascii="Arial" w:eastAsia="Times New Roman" w:hAnsi="Arial" w:cs="Arial"/>
-        </w:rPr>
-        <w:t>fan</w:t>
-      </w:r>
       <w:proofErr w:type="gramEnd"/>
-      <w:r>
-        <w:rPr>
-          <w:rFonts w:ascii="Arial" w:eastAsia="Times New Roman" w:hAnsi="Arial" w:cs="Arial"/>
-        </w:rPr>
-        <w:t>_</w:t>
-      </w:r>
       <w:proofErr w:type="gramStart"/>
-      <w:r>
-        <w:rPr>
-          <w:rFonts w:ascii="Arial" w:eastAsia="Times New Roman" w:hAnsi="Arial" w:cs="Arial"/>
-        </w:rPr>
-        <w:t>uid</w:t>
-      </w:r>
       <w:proofErr w:type="spellEnd"/>
-      <w:r>
-        <w:rPr>
-          <w:rFonts w:ascii="Arial" w:eastAsia="Times New Roman" w:hAnsi="Arial" w:cs="Arial"/>
-        </w:rPr>
-        <w:t xml:space="preserve"> }</w:t>
-      </w:r>
       <w:proofErr w:type="gramEnd"/>
-      <w:r>
-        <w:rPr>
-          <w:rFonts w:ascii="Arial" w:eastAsia="Times New Roman" w:hAnsi="Arial" w:cs="Arial"/>
-        </w:rPr>
-        <w:t>}</w:t>
-      </w:r>
     </w:p>
     <w:p>
       <w:pPr>
@@ -1376,49 +1145,13 @@
         <w:rPr>
           <w:rFonts w:ascii="Arial" w:eastAsia="Times New Roman" w:hAnsi="Arial" w:cs="Arial"/>
         </w:rPr>
-        <w:t>Fan Size:</w:t>
-      </w:r>
-      <w:r>
-        <w:rPr>
-          <w:rFonts w:ascii="Arial" w:eastAsia="Times New Roman" w:hAnsi="Arial" w:cs="Arial"/>
-        </w:rPr>
-        <w:t xml:space="preserve"> </w:t>
+        <w:t>Fan Size: {{ fan_config.fan_size_mm }}mm</w:t>
       </w:r>
       <w:proofErr w:type="gramStart"/>
-      <w:r>
-        <w:rPr>
-          <w:rFonts w:ascii="Arial" w:eastAsia="Times New Roman" w:hAnsi="Arial" w:cs="Arial"/>
-        </w:rPr>
-        <w:t xml:space="preserve">{{ </w:t>
-      </w:r>
       <w:proofErr w:type="spellStart"/>
-      <w:r>
-        <w:rPr>
-          <w:rFonts w:ascii="Arial" w:eastAsia="Times New Roman" w:hAnsi="Arial" w:cs="Arial"/>
-        </w:rPr>
-        <w:t>fan</w:t>
-      </w:r>
       <w:proofErr w:type="gramEnd"/>
-      <w:r>
-        <w:rPr>
-          <w:rFonts w:ascii="Arial" w:eastAsia="Times New Roman" w:hAnsi="Arial" w:cs="Arial"/>
-        </w:rPr>
-        <w:t>_size_</w:t>
-      </w:r>
       <w:proofErr w:type="gramStart"/>
-      <w:r>
-        <w:rPr>
-          <w:rFonts w:ascii="Arial" w:eastAsia="Times New Roman" w:hAnsi="Arial" w:cs="Arial"/>
-        </w:rPr>
-        <w:t>mm</w:t>
-      </w:r>
       <w:proofErr w:type="spellEnd"/>
-      <w:r>
-        <w:rPr>
-          <w:rFonts w:ascii="Arial" w:eastAsia="Times New Roman" w:hAnsi="Arial" w:cs="Arial"/>
-        </w:rPr>
-        <w:t xml:space="preserve"> }}mm</w:t>
-      </w:r>
       <w:proofErr w:type="gramEnd"/>
     </w:p>
     <w:p>
@@ -1445,50 +1178,14 @@
         <w:rPr>
           <w:rFonts w:ascii="Arial" w:eastAsia="Times New Roman" w:hAnsi="Arial" w:cs="Arial"/>
         </w:rPr>
-        <w:t xml:space="preserve">Blade Sets: </w:t>
+        <w:t>Blade Sets: {{ fan_config.blade_sets }}</w:t>
       </w:r>
       <w:proofErr w:type="gramStart"/>
-      <w:r>
-        <w:rPr>
-          <w:rFonts w:ascii="Arial" w:eastAsia="Times New Roman" w:hAnsi="Arial" w:cs="Arial"/>
-        </w:rPr>
-        <w:t xml:space="preserve">{{ </w:t>
-      </w:r>
       <w:proofErr w:type="spellStart"/>
-      <w:r>
-        <w:rPr>
-          <w:rFonts w:ascii="Arial" w:eastAsia="Times New Roman" w:hAnsi="Arial" w:cs="Arial"/>
-        </w:rPr>
-        <w:t>blade</w:t>
-      </w:r>
       <w:proofErr w:type="gramEnd"/>
-      <w:r>
-        <w:rPr>
-          <w:rFonts w:ascii="Arial" w:eastAsia="Times New Roman" w:hAnsi="Arial" w:cs="Arial"/>
-        </w:rPr>
-        <w:t>_</w:t>
-      </w:r>
       <w:proofErr w:type="gramStart"/>
-      <w:r>
-        <w:rPr>
-          <w:rFonts w:ascii="Arial" w:eastAsia="Times New Roman" w:hAnsi="Arial" w:cs="Arial"/>
-        </w:rPr>
-        <w:t>sets</w:t>
-      </w:r>
       <w:proofErr w:type="spellEnd"/>
-      <w:r>
-        <w:rPr>
-          <w:rFonts w:ascii="Arial" w:eastAsia="Times New Roman" w:hAnsi="Arial" w:cs="Arial"/>
-        </w:rPr>
-        <w:t xml:space="preserve"> }</w:t>
-      </w:r>
       <w:proofErr w:type="gramEnd"/>
-      <w:r>
-        <w:rPr>
-          <w:rFonts w:ascii="Arial" w:eastAsia="Times New Roman" w:hAnsi="Arial" w:cs="Arial"/>
-        </w:rPr>
-        <w:t>}</w:t>
-      </w:r>
     </w:p>
     <w:p>
       <w:pPr>
@@ -1627,7 +1324,7 @@
         <w:rPr>
           <w:rFonts w:ascii="Arial" w:eastAsia="Times New Roman" w:hAnsi="Arial" w:cs="Arial"/>
         </w:rPr>
-        <w:t>{%p for comp in components %}</w:t>
+        <w:t>{%p for comp in fan_config.components %}</w:t>
       </w:r>
     </w:p>
     <w:p>
@@ -1726,73 +1423,13 @@
         <w:rPr>
           <w:rFonts w:ascii="Arial" w:eastAsia="Times New Roman" w:hAnsi="Arial" w:cs="Arial"/>
         </w:rPr>
-        <w:t>Mass of all mechanical components</w:t>
-      </w:r>
-      <w:r>
-        <w:rPr>
-          <w:rFonts w:ascii="Arial" w:eastAsia="Times New Roman" w:hAnsi="Arial" w:cs="Arial"/>
-        </w:rPr>
-        <w:t xml:space="preserve"> (excluding motor): </w:t>
+        <w:t>Mass of all mechanical components (excluding motor): {{ fan_config.total_mass_kg }}kg</w:t>
       </w:r>
       <w:proofErr w:type="gramStart"/>
-      <w:r>
-        <w:rPr>
-          <w:rFonts w:ascii="Arial" w:eastAsia="Times New Roman" w:hAnsi="Arial" w:cs="Arial"/>
-          <w:b/>
-          <w:bCs/>
-        </w:rPr>
-        <w:t xml:space="preserve">{{ </w:t>
-      </w:r>
       <w:proofErr w:type="spellStart"/>
-      <w:r>
-        <w:rPr>
-          <w:rFonts w:ascii="Arial" w:eastAsia="Times New Roman" w:hAnsi="Arial" w:cs="Arial"/>
-          <w:b/>
-          <w:bCs/>
-        </w:rPr>
-        <w:t>total</w:t>
-      </w:r>
       <w:proofErr w:type="gramEnd"/>
-      <w:r>
-        <w:rPr>
-          <w:rFonts w:ascii="Arial" w:eastAsia="Times New Roman" w:hAnsi="Arial" w:cs="Arial"/>
-          <w:b/>
-          <w:bCs/>
-        </w:rPr>
-        <w:t>_mass</w:t>
-      </w:r>
-      <w:r>
-        <w:rPr>
-          <w:rFonts w:ascii="Arial" w:eastAsia="Times New Roman" w:hAnsi="Arial" w:cs="Arial"/>
-          <w:b/>
-          <w:bCs/>
-        </w:rPr>
-        <w:t>_</w:t>
-      </w:r>
       <w:proofErr w:type="gramStart"/>
-      <w:r>
-        <w:rPr>
-          <w:rFonts w:ascii="Arial" w:eastAsia="Times New Roman" w:hAnsi="Arial" w:cs="Arial"/>
-          <w:b/>
-          <w:bCs/>
-        </w:rPr>
-        <w:t>kg</w:t>
-      </w:r>
       <w:proofErr w:type="spellEnd"/>
-      <w:r>
-        <w:rPr>
-          <w:rFonts w:ascii="Arial" w:eastAsia="Times New Roman" w:hAnsi="Arial" w:cs="Arial"/>
-          <w:b/>
-          <w:bCs/>
-        </w:rPr>
-        <w:t xml:space="preserve"> }}</w:t>
-      </w:r>
-      <w:r>
-        <w:rPr>
-          <w:rFonts w:ascii="Arial" w:eastAsia="Times New Roman" w:hAnsi="Arial" w:cs="Arial"/>
-        </w:rPr>
-        <w:t>kg</w:t>
-      </w:r>
       <w:proofErr w:type="gramEnd"/>
     </w:p>
     <w:p>
@@ -1815,71 +1452,13 @@
         <w:rPr>
           <w:rFonts w:ascii="Arial" w:eastAsia="Times New Roman" w:hAnsi="Arial" w:cs="Arial"/>
         </w:rPr>
-        <w:t>Total l</w:t>
-      </w:r>
-      <w:r>
-        <w:rPr>
-          <w:rFonts w:ascii="Arial" w:eastAsia="Times New Roman" w:hAnsi="Arial" w:cs="Arial"/>
-        </w:rPr>
-        <w:t xml:space="preserve">ength of </w:t>
-      </w:r>
-      <w:r>
-        <w:rPr>
-          <w:rFonts w:ascii="Arial" w:eastAsia="Times New Roman" w:hAnsi="Arial" w:cs="Arial"/>
-        </w:rPr>
-        <w:t xml:space="preserve">all mechanical components: </w:t>
+        <w:t>Total length of all mechanical components: {{ fan_config.total_length }}mm</w:t>
       </w:r>
       <w:proofErr w:type="gramStart"/>
-      <w:r>
-        <w:rPr>
-          <w:rFonts w:ascii="Arial" w:eastAsia="Times New Roman" w:hAnsi="Arial" w:cs="Arial"/>
-          <w:b/>
-          <w:bCs/>
-        </w:rPr>
-        <w:t xml:space="preserve">{{ </w:t>
-      </w:r>
       <w:proofErr w:type="spellStart"/>
-      <w:r>
-        <w:rPr>
-          <w:rFonts w:ascii="Arial" w:eastAsia="Times New Roman" w:hAnsi="Arial" w:cs="Arial"/>
-          <w:b/>
-          <w:bCs/>
-        </w:rPr>
-        <w:t>total</w:t>
-      </w:r>
       <w:proofErr w:type="gramEnd"/>
-      <w:r>
-        <w:rPr>
-          <w:rFonts w:ascii="Arial" w:eastAsia="Times New Roman" w:hAnsi="Arial" w:cs="Arial"/>
-          <w:b/>
-          <w:bCs/>
-        </w:rPr>
-        <w:t>_</w:t>
-      </w:r>
       <w:proofErr w:type="gramStart"/>
-      <w:r>
-        <w:rPr>
-          <w:rFonts w:ascii="Arial" w:eastAsia="Times New Roman" w:hAnsi="Arial" w:cs="Arial"/>
-          <w:b/>
-          <w:bCs/>
-        </w:rPr>
-        <w:t>length</w:t>
-      </w:r>
       <w:proofErr w:type="spellEnd"/>
-      <w:r>
-        <w:rPr>
-          <w:rFonts w:ascii="Arial" w:eastAsia="Times New Roman" w:hAnsi="Arial" w:cs="Arial"/>
-          <w:b/>
-          <w:bCs/>
-        </w:rPr>
-        <w:t xml:space="preserve"> }}</w:t>
-      </w:r>
-      <w:r>
-        <w:rPr>
-          <w:rFonts w:ascii="Arial" w:eastAsia="Times New Roman" w:hAnsi="Arial" w:cs="Arial"/>
-        </w:rPr>
-        <w:t>mm</w:t>
-      </w:r>
       <w:proofErr w:type="gramEnd"/>
     </w:p>
     <w:p>
@@ -1974,50 +1553,14 @@
         <w:rPr>
           <w:rFonts w:ascii="Arial" w:eastAsia="Times New Roman" w:hAnsi="Arial" w:cs="Arial"/>
         </w:rPr>
-        <w:t xml:space="preserve">Power: </w:t>
+        <w:t>Power: {{ fan_config.motor_output }}kW</w:t>
       </w:r>
       <w:bookmarkStart w:id="2" w:name="_Hlk210293638"/>
       <w:proofErr w:type="gramStart"/>
-      <w:r>
-        <w:rPr>
-          <w:rFonts w:ascii="Arial" w:eastAsia="Times New Roman" w:hAnsi="Arial" w:cs="Arial"/>
-        </w:rPr>
-        <w:t xml:space="preserve">{{ </w:t>
-      </w:r>
       <w:proofErr w:type="spellStart"/>
-      <w:r>
-        <w:rPr>
-          <w:rFonts w:ascii="Arial" w:eastAsia="Times New Roman" w:hAnsi="Arial" w:cs="Arial"/>
-        </w:rPr>
-        <w:t>motor</w:t>
-      </w:r>
       <w:proofErr w:type="gramEnd"/>
-      <w:r>
-        <w:rPr>
-          <w:rFonts w:ascii="Arial" w:eastAsia="Times New Roman" w:hAnsi="Arial" w:cs="Arial"/>
-        </w:rPr>
-        <w:t>_</w:t>
-      </w:r>
       <w:proofErr w:type="gramStart"/>
-      <w:r>
-        <w:rPr>
-          <w:rFonts w:ascii="Arial" w:eastAsia="Times New Roman" w:hAnsi="Arial" w:cs="Arial"/>
-        </w:rPr>
-        <w:t>output</w:t>
-      </w:r>
       <w:proofErr w:type="spellEnd"/>
-      <w:r>
-        <w:rPr>
-          <w:rFonts w:ascii="Arial" w:eastAsia="Times New Roman" w:hAnsi="Arial" w:cs="Arial"/>
-        </w:rPr>
-        <w:t xml:space="preserve"> }}</w:t>
-      </w:r>
-      <w:r>
-        <w:rPr>
-          <w:rFonts w:ascii="Arial" w:eastAsia="Times New Roman" w:hAnsi="Arial" w:cs="Arial"/>
-        </w:rPr>
-        <w:t>kW</w:t>
-      </w:r>
       <w:bookmarkEnd w:id="2"/>
       <w:proofErr w:type="gramEnd"/>
     </w:p>
@@ -2045,69 +1588,14 @@
         <w:rPr>
           <w:rFonts w:ascii="Arial" w:eastAsia="Times New Roman" w:hAnsi="Arial" w:cs="Arial"/>
         </w:rPr>
-        <w:lastRenderedPageBreak/>
-        <w:t xml:space="preserve">Efficiency: </w:t>
+        <w:t xml:space="preserve">Efficiency: {{ fan_config.motor_product_range }} </w:t>
       </w:r>
       <w:proofErr w:type="gramStart"/>
-      <w:r>
-        <w:rPr>
-          <w:rFonts w:ascii="Arial" w:eastAsia="Times New Roman" w:hAnsi="Arial" w:cs="Arial"/>
-        </w:rPr>
-        <w:t>{{</w:t>
-      </w:r>
-      <w:r>
-        <w:rPr>
-          <w:rFonts w:ascii="Arial" w:eastAsia="Times New Roman" w:hAnsi="Arial" w:cs="Arial"/>
-        </w:rPr>
-        <w:t xml:space="preserve"> </w:t>
-      </w:r>
       <w:proofErr w:type="spellStart"/>
-      <w:r>
-        <w:rPr>
-          <w:rFonts w:ascii="Arial" w:eastAsia="Times New Roman" w:hAnsi="Arial" w:cs="Arial"/>
-        </w:rPr>
-        <w:t>motor</w:t>
-      </w:r>
       <w:proofErr w:type="gramEnd"/>
-      <w:r>
-        <w:rPr>
-          <w:rFonts w:ascii="Arial" w:eastAsia="Times New Roman" w:hAnsi="Arial" w:cs="Arial"/>
-        </w:rPr>
-        <w:t>_product_</w:t>
-      </w:r>
       <w:proofErr w:type="gramStart"/>
-      <w:r>
-        <w:rPr>
-          <w:rFonts w:ascii="Arial" w:eastAsia="Times New Roman" w:hAnsi="Arial" w:cs="Arial"/>
-        </w:rPr>
-        <w:t>range</w:t>
-      </w:r>
       <w:proofErr w:type="spellEnd"/>
-      <w:r>
-        <w:rPr>
-          <w:rFonts w:ascii="Arial" w:eastAsia="Times New Roman" w:hAnsi="Arial" w:cs="Arial"/>
-        </w:rPr>
-        <w:t xml:space="preserve"> </w:t>
-      </w:r>
-      <w:r>
-        <w:rPr>
-          <w:rFonts w:ascii="Arial" w:eastAsia="Times New Roman" w:hAnsi="Arial" w:cs="Arial"/>
-        </w:rPr>
-        <w:t>}</w:t>
-      </w:r>
       <w:proofErr w:type="gramEnd"/>
-      <w:r>
-        <w:rPr>
-          <w:rFonts w:ascii="Arial" w:eastAsia="Times New Roman" w:hAnsi="Arial" w:cs="Arial"/>
-        </w:rPr>
-        <w:t>}</w:t>
-      </w:r>
-      <w:r>
-        <w:rPr>
-          <w:rFonts w:ascii="Arial" w:eastAsia="Times New Roman" w:hAnsi="Arial" w:cs="Arial"/>
-        </w:rPr>
-        <w:t xml:space="preserve"> </w:t>
-      </w:r>
     </w:p>
     <w:p>
       <w:pPr>
@@ -2133,136 +1621,22 @@
         <w:rPr>
           <w:rFonts w:ascii="Arial" w:eastAsia="Times New Roman" w:hAnsi="Arial" w:cs="Arial"/>
         </w:rPr>
-        <w:t xml:space="preserve">Speed: </w:t>
+        <w:t xml:space="preserve">Speed: {{ fan_config.motor_pole }}-pole (synchronous speed ~ {{ fan_config.motor_speed }}RPM @50 Hz)  </w:t>
       </w:r>
       <w:bookmarkStart w:id="3" w:name="_Hlk210293681"/>
       <w:proofErr w:type="gramStart"/>
-      <w:r>
-        <w:rPr>
-          <w:rFonts w:ascii="Arial" w:eastAsia="Times New Roman" w:hAnsi="Arial" w:cs="Arial"/>
-        </w:rPr>
-        <w:t>{{</w:t>
-      </w:r>
-      <w:r>
-        <w:rPr>
-          <w:rFonts w:ascii="Arial" w:eastAsia="Times New Roman" w:hAnsi="Arial" w:cs="Arial"/>
-        </w:rPr>
-        <w:t xml:space="preserve"> </w:t>
-      </w:r>
       <w:proofErr w:type="spellStart"/>
-      <w:r>
-        <w:rPr>
-          <w:rFonts w:ascii="Arial" w:eastAsia="Times New Roman" w:hAnsi="Arial" w:cs="Arial"/>
-        </w:rPr>
-        <w:t>motor</w:t>
-      </w:r>
       <w:proofErr w:type="gramEnd"/>
-      <w:r>
-        <w:rPr>
-          <w:rFonts w:ascii="Arial" w:eastAsia="Times New Roman" w:hAnsi="Arial" w:cs="Arial"/>
-        </w:rPr>
-        <w:t>_</w:t>
-      </w:r>
       <w:proofErr w:type="gramStart"/>
-      <w:r>
-        <w:rPr>
-          <w:rFonts w:ascii="Arial" w:eastAsia="Times New Roman" w:hAnsi="Arial" w:cs="Arial"/>
-        </w:rPr>
-        <w:t>pole</w:t>
-      </w:r>
       <w:proofErr w:type="spellEnd"/>
-      <w:r>
-        <w:rPr>
-          <w:rFonts w:ascii="Arial" w:eastAsia="Times New Roman" w:hAnsi="Arial" w:cs="Arial"/>
-        </w:rPr>
-        <w:t xml:space="preserve"> </w:t>
-      </w:r>
-      <w:r>
-        <w:rPr>
-          <w:rFonts w:ascii="Arial" w:eastAsia="Times New Roman" w:hAnsi="Arial" w:cs="Arial"/>
-        </w:rPr>
-        <w:t>}}</w:t>
-      </w:r>
-      <w:r>
-        <w:rPr>
-          <w:rFonts w:ascii="Arial" w:eastAsia="Times New Roman" w:hAnsi="Arial" w:cs="Arial"/>
-        </w:rPr>
-        <w:t>-</w:t>
-      </w:r>
       <w:proofErr w:type="gramEnd"/>
-      <w:r>
-        <w:rPr>
-          <w:rFonts w:ascii="Arial" w:eastAsia="Times New Roman" w:hAnsi="Arial" w:cs="Arial"/>
-        </w:rPr>
-        <w:t xml:space="preserve">pole </w:t>
-      </w:r>
       <w:bookmarkEnd w:id="3"/>
-      <w:r>
-        <w:rPr>
-          <w:rFonts w:ascii="Arial" w:eastAsia="Times New Roman" w:hAnsi="Arial" w:cs="Arial"/>
-        </w:rPr>
-        <w:t xml:space="preserve">(synchronous speed ~ </w:t>
-      </w:r>
       <w:proofErr w:type="gramStart"/>
-      <w:r>
-        <w:rPr>
-          <w:rFonts w:ascii="Arial" w:eastAsia="Times New Roman" w:hAnsi="Arial" w:cs="Arial"/>
-        </w:rPr>
-        <w:t>{{</w:t>
-      </w:r>
-      <w:r>
-        <w:rPr>
-          <w:rFonts w:ascii="Arial" w:eastAsia="Times New Roman" w:hAnsi="Arial" w:cs="Arial"/>
-        </w:rPr>
-        <w:t xml:space="preserve"> </w:t>
-      </w:r>
       <w:proofErr w:type="spellStart"/>
-      <w:r>
-        <w:rPr>
-          <w:rFonts w:ascii="Arial" w:eastAsia="Times New Roman" w:hAnsi="Arial" w:cs="Arial"/>
-        </w:rPr>
-        <w:t>motor</w:t>
-      </w:r>
       <w:proofErr w:type="gramEnd"/>
-      <w:r>
-        <w:rPr>
-          <w:rFonts w:ascii="Arial" w:eastAsia="Times New Roman" w:hAnsi="Arial" w:cs="Arial"/>
-        </w:rPr>
-        <w:t>_</w:t>
-      </w:r>
       <w:proofErr w:type="gramStart"/>
-      <w:r>
-        <w:rPr>
-          <w:rFonts w:ascii="Arial" w:eastAsia="Times New Roman" w:hAnsi="Arial" w:cs="Arial"/>
-        </w:rPr>
-        <w:t>speed</w:t>
-      </w:r>
       <w:proofErr w:type="spellEnd"/>
-      <w:r>
-        <w:rPr>
-          <w:rFonts w:ascii="Arial" w:eastAsia="Times New Roman" w:hAnsi="Arial" w:cs="Arial"/>
-        </w:rPr>
-        <w:t xml:space="preserve"> </w:t>
-      </w:r>
-      <w:r>
-        <w:rPr>
-          <w:rFonts w:ascii="Arial" w:eastAsia="Times New Roman" w:hAnsi="Arial" w:cs="Arial"/>
-        </w:rPr>
-        <w:t>}}</w:t>
-      </w:r>
-      <w:r>
-        <w:rPr>
-          <w:rFonts w:ascii="Arial" w:eastAsia="Times New Roman" w:hAnsi="Arial" w:cs="Arial"/>
-        </w:rPr>
-        <w:t>RPM</w:t>
-      </w:r>
       <w:proofErr w:type="gramEnd"/>
-      <w:r>
-        <w:rPr>
-          <w:rFonts w:ascii="Arial" w:eastAsia="Times New Roman" w:hAnsi="Arial" w:cs="Arial"/>
-        </w:rPr>
-        <w:t xml:space="preserve"> @50 Hz)  </w:t>
-      </w:r>
     </w:p>
     <w:p>
       <w:pPr>
@@ -2307,6 +1681,14 @@
           <w:rFonts w:ascii="Arial" w:eastAsia="Times New Roman" w:hAnsi="Arial" w:cs="Arial"/>
         </w:rPr>
         <w:t>V</w:t>
+      </w:r>
+    </w:p>
+    <w:p>
+      <w:pPr>
+        <w:pStyle w:val="Normal"/>
+      </w:pPr>
+      <w:r>
+        <w:t xml:space="preserve">{%p endfor %}</w:t>
       </w:r>
     </w:p>
     <w:p>
@@ -2921,6 +2303,48 @@
         </w:tc>
       </w:tr>
       <w:tr>
+        <w:tc>
+          <w:p>
+            <w:r>
+              <w:t xml:space="preserve">{%tr for fan_config in fan_configs %}</w:t>
+            </w:r>
+          </w:p>
+        </w:tc>
+        <w:tc>
+          <w:p/>
+        </w:tc>
+        <w:tc>
+          <w:p/>
+        </w:tc>
+        <w:tc>
+          <w:p/>
+        </w:tc>
+        <w:tc>
+          <w:p/>
+        </w:tc>
+      </w:tr>
+      <w:tr>
+        <w:tc>
+          <w:p>
+            <w:r>
+              <w:t xml:space="preserve">{{ fan_config.label }}{% if fan_config.quantity &gt; 1 %} (x{{ fan_config.quantity }}){% endif %}</w:t>
+            </w:r>
+          </w:p>
+        </w:tc>
+        <w:tc>
+          <w:p/>
+        </w:tc>
+        <w:tc>
+          <w:p/>
+        </w:tc>
+        <w:tc>
+          <w:p/>
+        </w:tc>
+        <w:tc>
+          <w:p/>
+        </w:tc>
+      </w:tr>
+      <w:tr>
         <w:trPr>
           <w:trHeight w:val="70"/>
         </w:trPr>
@@ -3007,73 +2431,13 @@
               <w:rPr>
                 <w:rFonts w:ascii="Arial" w:eastAsia="Times New Roman" w:hAnsi="Arial" w:cs="Arial"/>
               </w:rPr>
-              <w:t xml:space="preserve">{{ </w:t>
+              <w:t>{{ fan_config.fan_size_mm }}mm Diameter auxiliary fan that includes rotor assembly with a variable pitch rotor and additional selected mechanical components.</w:t>
             </w:r>
             <w:proofErr w:type="spellStart"/>
-            <w:r>
-              <w:rPr>
-                <w:rFonts w:ascii="Arial" w:eastAsia="Times New Roman" w:hAnsi="Arial" w:cs="Arial"/>
-              </w:rPr>
-              <w:t>fan</w:t>
-            </w:r>
             <w:proofErr w:type="gramEnd"/>
-            <w:r>
-              <w:rPr>
-                <w:rFonts w:ascii="Arial" w:eastAsia="Times New Roman" w:hAnsi="Arial" w:cs="Arial"/>
-              </w:rPr>
-              <w:t>_size_</w:t>
-            </w:r>
             <w:proofErr w:type="gramStart"/>
-            <w:r>
-              <w:rPr>
-                <w:rFonts w:ascii="Arial" w:eastAsia="Times New Roman" w:hAnsi="Arial" w:cs="Arial"/>
-              </w:rPr>
-              <w:t>mm</w:t>
-            </w:r>
             <w:proofErr w:type="spellEnd"/>
-            <w:r>
-              <w:rPr>
-                <w:rFonts w:ascii="Arial" w:eastAsia="Times New Roman" w:hAnsi="Arial" w:cs="Arial"/>
-              </w:rPr>
-              <w:t xml:space="preserve"> }}mm</w:t>
-            </w:r>
             <w:proofErr w:type="gramEnd"/>
-            <w:r>
-              <w:rPr>
-                <w:rFonts w:ascii="Arial" w:eastAsia="Times New Roman" w:hAnsi="Arial" w:cs="Arial"/>
-              </w:rPr>
-              <w:t xml:space="preserve"> Diameter auxi</w:t>
-            </w:r>
-            <w:r>
-              <w:rPr>
-                <w:rFonts w:ascii="Arial" w:eastAsia="Times New Roman" w:hAnsi="Arial" w:cs="Arial"/>
-              </w:rPr>
-              <w:t>l</w:t>
-            </w:r>
-            <w:r>
-              <w:rPr>
-                <w:rFonts w:ascii="Arial" w:eastAsia="Times New Roman" w:hAnsi="Arial" w:cs="Arial"/>
-              </w:rPr>
-              <w:t xml:space="preserve">iary fan that includes </w:t>
-            </w:r>
-            <w:r>
-              <w:rPr>
-                <w:rFonts w:ascii="Arial" w:eastAsia="Times New Roman" w:hAnsi="Arial" w:cs="Arial"/>
-              </w:rPr>
-              <w:t xml:space="preserve">rotor assembly </w:t>
-            </w:r>
-            <w:r>
-              <w:rPr>
-                <w:rFonts w:ascii="Arial" w:eastAsia="Times New Roman" w:hAnsi="Arial" w:cs="Arial"/>
-              </w:rPr>
-              <w:t xml:space="preserve">with a variable </w:t>
-            </w:r>
-            <w:r>
-              <w:rPr>
-                <w:rFonts w:ascii="Arial" w:eastAsia="Times New Roman" w:hAnsi="Arial" w:cs="Arial"/>
-              </w:rPr>
-              <w:t>pitch rotor and additional selected mechanical components.</w:t>
-            </w:r>
           </w:p>
         </w:tc>
         <w:tc>
@@ -3193,45 +2557,10 @@
                 <w:rFonts w:ascii="Arial" w:eastAsia="Times New Roman" w:hAnsi="Arial" w:cs="Arial"/>
                 <w:bCs/>
               </w:rPr>
-              <w:t xml:space="preserve">{%tr for </w:t>
-            </w:r>
-            <w:r>
-              <w:rPr>
-                <w:rFonts w:ascii="Arial" w:eastAsia="Times New Roman" w:hAnsi="Arial" w:cs="Arial"/>
-                <w:bCs/>
-              </w:rPr>
-              <w:t>comp</w:t>
-            </w:r>
-            <w:r>
-              <w:rPr>
-                <w:rFonts w:ascii="Arial" w:eastAsia="Times New Roman" w:hAnsi="Arial" w:cs="Arial"/>
-                <w:bCs/>
-              </w:rPr>
-              <w:t xml:space="preserve"> in </w:t>
+              <w:t>{%tr for comp in fan_config.component_pricing %}</w:t>
             </w:r>
             <w:proofErr w:type="spellStart"/>
-            <w:r>
-              <w:rPr>
-                <w:rFonts w:ascii="Arial" w:eastAsia="Times New Roman" w:hAnsi="Arial" w:cs="Arial"/>
-                <w:bCs/>
-              </w:rPr>
-              <w:t>component</w:t>
-            </w:r>
-            <w:r>
-              <w:rPr>
-                <w:rFonts w:ascii="Arial" w:eastAsia="Times New Roman" w:hAnsi="Arial" w:cs="Arial"/>
-                <w:bCs/>
-              </w:rPr>
-              <w:t>_pricing</w:t>
-            </w:r>
             <w:proofErr w:type="spellEnd"/>
-            <w:r>
-              <w:rPr>
-                <w:rFonts w:ascii="Arial" w:eastAsia="Times New Roman" w:hAnsi="Arial" w:cs="Arial"/>
-                <w:bCs/>
-              </w:rPr>
-              <w:t xml:space="preserve"> %}</w:t>
-            </w:r>
           </w:p>
         </w:tc>
         <w:tc>
@@ -3816,44 +3145,12 @@
                 <w:b/>
                 <w:color w:val="2F5496" w:themeColor="accent1" w:themeShade="BF"/>
               </w:rPr>
-              <w:t xml:space="preserve">R </w:t>
+              <w:t>R {{ fan_config.component_subtotal }}</w:t>
             </w:r>
             <w:proofErr w:type="gramStart"/>
-            <w:r>
-              <w:rPr>
-                <w:rFonts w:ascii="Arial" w:eastAsia="Times New Roman" w:hAnsi="Arial" w:cs="Arial"/>
-                <w:b/>
-                <w:color w:val="2F5496" w:themeColor="accent1" w:themeShade="BF"/>
-              </w:rPr>
-              <w:t xml:space="preserve">{{ </w:t>
-            </w:r>
             <w:proofErr w:type="spellStart"/>
-            <w:r>
-              <w:rPr>
-                <w:rFonts w:ascii="Arial" w:eastAsia="Times New Roman" w:hAnsi="Arial" w:cs="Arial"/>
-                <w:b/>
-                <w:color w:val="2F5496" w:themeColor="accent1" w:themeShade="BF"/>
-              </w:rPr>
-              <w:t>component</w:t>
-            </w:r>
             <w:proofErr w:type="gramEnd"/>
-            <w:r>
-              <w:rPr>
-                <w:rFonts w:ascii="Arial" w:eastAsia="Times New Roman" w:hAnsi="Arial" w:cs="Arial"/>
-                <w:b/>
-                <w:color w:val="2F5496" w:themeColor="accent1" w:themeShade="BF"/>
-              </w:rPr>
-              <w:t>_subtotal</w:t>
-            </w:r>
             <w:proofErr w:type="spellEnd"/>
-            <w:r>
-              <w:rPr>
-                <w:rFonts w:ascii="Arial" w:eastAsia="Times New Roman" w:hAnsi="Arial" w:cs="Arial"/>
-                <w:b/>
-                <w:color w:val="2F5496" w:themeColor="accent1" w:themeShade="BF"/>
-              </w:rPr>
-              <w:t xml:space="preserve"> }}</w:t>
-            </w:r>
           </w:p>
         </w:tc>
       </w:tr>
@@ -4034,102 +3331,183 @@
               <w:rPr>
                 <w:rFonts w:ascii="Arial" w:eastAsia="Times New Roman" w:hAnsi="Arial" w:cs="Arial"/>
               </w:rPr>
-              <w:t xml:space="preserve">{{ </w:t>
+              <w:t>{{ fan_config.motor_output }}kW, {{ fan_config.motor_pole }}-pole, 525V, I.E.3. Motor</w:t>
             </w:r>
             <w:proofErr w:type="spellStart"/>
+            <w:proofErr w:type="gramEnd"/>
+            <w:proofErr w:type="gramStart"/>
+            <w:proofErr w:type="spellEnd"/>
+            <w:proofErr w:type="gramEnd"/>
+            <w:proofErr w:type="gramStart"/>
+            <w:proofErr w:type="spellStart"/>
+            <w:proofErr w:type="gramEnd"/>
+            <w:proofErr w:type="gramStart"/>
+            <w:proofErr w:type="spellEnd"/>
+            <w:proofErr w:type="gramEnd"/>
+          </w:p>
+        </w:tc>
+        <w:tc>
+          <w:tcPr>
+            <w:tcW w:w="1418" w:type="dxa"/>
+            <w:tcBorders>
+              <w:top w:val="single" w:sz="4" w:space="0" w:color="000000"/>
+              <w:left w:val="single" w:sz="4" w:space="0" w:color="000000"/>
+              <w:bottom w:val="single" w:sz="4" w:space="0" w:color="000000"/>
+              <w:right w:val="single" w:sz="4" w:space="0" w:color="000000"/>
+            </w:tcBorders>
+          </w:tcPr>
+          <w:p>
+            <w:pPr>
+              <w:spacing w:after="0" w:line="240" w:lineRule="auto"/>
+              <w:rPr>
+                <w:rFonts w:ascii="Arial" w:eastAsia="Times New Roman" w:hAnsi="Arial" w:cs="Arial"/>
+                <w:b/>
+                <w:bCs/>
+              </w:rPr>
+            </w:pPr>
             <w:r>
               <w:rPr>
                 <w:rFonts w:ascii="Arial" w:eastAsia="Times New Roman" w:hAnsi="Arial" w:cs="Arial"/>
-              </w:rPr>
-              <w:t>motor</w:t>
-            </w:r>
-            <w:proofErr w:type="gramEnd"/>
-            <w:r>
-              <w:rPr>
-                <w:rFonts w:ascii="Arial" w:eastAsia="Times New Roman" w:hAnsi="Arial" w:cs="Arial"/>
-              </w:rPr>
-              <w:t>_</w:t>
+                <w:b/>
+                <w:bCs/>
+              </w:rPr>
+              <w:t>R {{ fan_config.motor_unit_price }}</w:t>
             </w:r>
             <w:proofErr w:type="gramStart"/>
+            <w:proofErr w:type="spellStart"/>
+            <w:proofErr w:type="gramEnd"/>
+            <w:proofErr w:type="spellEnd"/>
+          </w:p>
+        </w:tc>
+        <w:tc>
+          <w:tcPr>
+            <w:tcW w:w="709" w:type="dxa"/>
+            <w:tcBorders>
+              <w:top w:val="single" w:sz="4" w:space="0" w:color="000000"/>
+              <w:left w:val="single" w:sz="4" w:space="0" w:color="000000"/>
+              <w:bottom w:val="single" w:sz="4" w:space="0" w:color="000000"/>
+              <w:right w:val="single" w:sz="4" w:space="0" w:color="000000"/>
+            </w:tcBorders>
+          </w:tcPr>
+          <w:p>
+            <w:pPr>
+              <w:spacing w:after="0" w:line="240" w:lineRule="auto"/>
+              <w:jc w:val="center"/>
+              <w:rPr>
+                <w:rFonts w:ascii="Arial" w:eastAsia="Times New Roman" w:hAnsi="Arial" w:cs="Arial"/>
+                <w:b/>
+              </w:rPr>
+            </w:pPr>
+            <w:proofErr w:type="gramStart"/>
             <w:r>
               <w:rPr>
                 <w:rFonts w:ascii="Arial" w:eastAsia="Times New Roman" w:hAnsi="Arial" w:cs="Arial"/>
-              </w:rPr>
-              <w:t>output</w:t>
+                <w:b/>
+              </w:rPr>
+              <w:t>{{ fan_config.motor_qty }}</w:t>
             </w:r>
+            <w:proofErr w:type="spellStart"/>
+            <w:proofErr w:type="gramEnd"/>
             <w:proofErr w:type="spellEnd"/>
+          </w:p>
+        </w:tc>
+        <w:tc>
+          <w:tcPr>
+            <w:tcW w:w="1988" w:type="dxa"/>
+            <w:tcBorders>
+              <w:top w:val="single" w:sz="4" w:space="0" w:color="000000"/>
+              <w:left w:val="single" w:sz="4" w:space="0" w:color="000000"/>
+              <w:bottom w:val="single" w:sz="4" w:space="0" w:color="000000"/>
+              <w:right w:val="single" w:sz="4" w:space="0" w:color="000000"/>
+            </w:tcBorders>
+          </w:tcPr>
+          <w:p>
+            <w:pPr>
+              <w:spacing w:after="0" w:line="240" w:lineRule="auto"/>
+              <w:jc w:val="center"/>
+              <w:rPr>
+                <w:rFonts w:ascii="Arial" w:eastAsia="Times New Roman" w:hAnsi="Arial" w:cs="Arial"/>
+                <w:b/>
+              </w:rPr>
+            </w:pPr>
             <w:r>
               <w:rPr>
                 <w:rFonts w:ascii="Arial" w:eastAsia="Times New Roman" w:hAnsi="Arial" w:cs="Arial"/>
-              </w:rPr>
-              <w:t xml:space="preserve"> }}kW</w:t>
-            </w:r>
-            <w:proofErr w:type="gramEnd"/>
-            <w:r>
-              <w:rPr>
-                <w:rFonts w:ascii="Arial" w:eastAsia="Times New Roman" w:hAnsi="Arial" w:cs="Arial"/>
-              </w:rPr>
-              <w:t xml:space="preserve">, </w:t>
+                <w:b/>
+              </w:rPr>
+              <w:t>R {{ fan_config.motor_total_price }}</w:t>
             </w:r>
             <w:proofErr w:type="gramStart"/>
+            <w:proofErr w:type="spellStart"/>
+            <w:proofErr w:type="gramEnd"/>
+            <w:proofErr w:type="spellEnd"/>
+          </w:p>
+        </w:tc>
+      </w:tr>
+      <w:tr>
+        <w:trPr>
+          <w:trHeight w:val="211"/>
+        </w:trPr>
+        <w:tc>
+          <w:tcPr>
+            <w:tcW w:w="851" w:type="dxa"/>
+            <w:tcBorders>
+              <w:top w:val="single" w:sz="4" w:space="0" w:color="000000"/>
+              <w:left w:val="single" w:sz="4" w:space="0" w:color="000000"/>
+              <w:bottom w:val="single" w:sz="4" w:space="0" w:color="000000"/>
+              <w:right w:val="single" w:sz="4" w:space="0" w:color="000000"/>
+            </w:tcBorders>
+          </w:tcPr>
+          <w:p>
+            <w:pPr>
+              <w:spacing w:after="0" w:line="240" w:lineRule="auto"/>
+              <w:jc w:val="center"/>
+              <w:rPr>
+                <w:rFonts w:ascii="Arial" w:eastAsia="Times New Roman" w:hAnsi="Arial" w:cs="Arial"/>
+                <w:b/>
+              </w:rPr>
+            </w:pPr>
             <w:r>
               <w:rPr>
                 <w:rFonts w:ascii="Arial" w:eastAsia="Times New Roman" w:hAnsi="Arial" w:cs="Arial"/>
-              </w:rPr>
-              <w:t xml:space="preserve">{{ </w:t>
+                <w:b/>
+              </w:rPr>
+              <w:t>3</w:t>
             </w:r>
-            <w:proofErr w:type="spellStart"/>
+          </w:p>
+        </w:tc>
+        <w:tc>
+          <w:tcPr>
+            <w:tcW w:w="4819" w:type="dxa"/>
+            <w:tcBorders>
+              <w:top w:val="single" w:sz="4" w:space="0" w:color="000000"/>
+              <w:left w:val="single" w:sz="4" w:space="0" w:color="000000"/>
+              <w:bottom w:val="single" w:sz="4" w:space="0" w:color="000000"/>
+              <w:right w:val="single" w:sz="4" w:space="0" w:color="000000"/>
+            </w:tcBorders>
+          </w:tcPr>
+          <w:p>
+            <w:pPr>
+              <w:spacing w:after="0" w:line="240" w:lineRule="auto"/>
+              <w:rPr>
+                <w:rFonts w:ascii="Arial" w:eastAsia="Times New Roman" w:hAnsi="Arial" w:cs="Arial"/>
+                <w:bCs/>
+              </w:rPr>
+            </w:pPr>
             <w:r>
               <w:rPr>
                 <w:rFonts w:ascii="Arial" w:eastAsia="Times New Roman" w:hAnsi="Arial" w:cs="Arial"/>
-              </w:rPr>
-              <w:t>motor</w:t>
-            </w:r>
-            <w:proofErr w:type="gramEnd"/>
-            <w:r>
-              <w:rPr>
-                <w:rFonts w:ascii="Arial" w:eastAsia="Times New Roman" w:hAnsi="Arial" w:cs="Arial"/>
-              </w:rPr>
-              <w:t>_</w:t>
-            </w:r>
-            <w:proofErr w:type="gramStart"/>
-            <w:r>
-              <w:rPr>
-                <w:rFonts w:ascii="Arial" w:eastAsia="Times New Roman" w:hAnsi="Arial" w:cs="Arial"/>
-              </w:rPr>
-              <w:t>pole</w:t>
-            </w:r>
-            <w:proofErr w:type="spellEnd"/>
-            <w:r>
-              <w:rPr>
-                <w:rFonts w:ascii="Arial" w:eastAsia="Times New Roman" w:hAnsi="Arial" w:cs="Arial"/>
-              </w:rPr>
-              <w:t xml:space="preserve"> }</w:t>
+                <w:b/>
+              </w:rPr>
+              <w:t xml:space="preserve"> </w:t>
             </w:r>
             <w:r>
               <w:rPr>
                 <w:rFonts w:ascii="Arial" w:eastAsia="Times New Roman" w:hAnsi="Arial" w:cs="Arial"/>
-              </w:rPr>
-              <w:t>}</w:t>
-            </w:r>
-            <w:r>
-              <w:rPr>
-                <w:rFonts w:ascii="Arial" w:eastAsia="Times New Roman" w:hAnsi="Arial" w:cs="Arial"/>
-              </w:rPr>
-              <w:t>-</w:t>
-            </w:r>
-            <w:proofErr w:type="gramEnd"/>
-            <w:r>
-              <w:rPr>
-                <w:rFonts w:ascii="Arial" w:eastAsia="Times New Roman" w:hAnsi="Arial" w:cs="Arial"/>
-              </w:rPr>
-              <w:t>pole</w:t>
-            </w:r>
-            <w:r>
-              <w:rPr>
-                <w:rFonts w:ascii="Arial" w:eastAsia="Times New Roman" w:hAnsi="Arial" w:cs="Arial"/>
-              </w:rPr>
-              <w:t>, 525V, I.E.3. Motor</w:t>
+                <w:b/>
+                <w:color w:val="833C0B" w:themeColor="accent2" w:themeShade="80"/>
+              </w:rPr>
+              <w:t>Buyout Items</w:t>
             </w:r>
           </w:p>
         </w:tc>
@@ -4146,6 +3524,288 @@
           <w:p>
             <w:pPr>
               <w:spacing w:after="0" w:line="240" w:lineRule="auto"/>
+              <w:jc w:val="center"/>
+              <w:rPr>
+                <w:rFonts w:ascii="Arial" w:eastAsia="Times New Roman" w:hAnsi="Arial" w:cs="Arial"/>
+              </w:rPr>
+            </w:pPr>
+          </w:p>
+        </w:tc>
+        <w:tc>
+          <w:tcPr>
+            <w:tcW w:w="709" w:type="dxa"/>
+            <w:tcBorders>
+              <w:top w:val="single" w:sz="4" w:space="0" w:color="000000"/>
+              <w:left w:val="single" w:sz="4" w:space="0" w:color="000000"/>
+              <w:bottom w:val="single" w:sz="4" w:space="0" w:color="000000"/>
+              <w:right w:val="single" w:sz="4" w:space="0" w:color="000000"/>
+            </w:tcBorders>
+          </w:tcPr>
+          <w:p>
+            <w:pPr>
+              <w:spacing w:after="0" w:line="240" w:lineRule="auto"/>
+              <w:jc w:val="center"/>
+              <w:rPr>
+                <w:rFonts w:ascii="Arial" w:eastAsia="Times New Roman" w:hAnsi="Arial" w:cs="Arial"/>
+                <w:b/>
+              </w:rPr>
+            </w:pPr>
+          </w:p>
+        </w:tc>
+        <w:tc>
+          <w:tcPr>
+            <w:tcW w:w="1988" w:type="dxa"/>
+            <w:tcBorders>
+              <w:top w:val="single" w:sz="4" w:space="0" w:color="000000"/>
+              <w:left w:val="single" w:sz="4" w:space="0" w:color="000000"/>
+              <w:bottom w:val="single" w:sz="4" w:space="0" w:color="000000"/>
+              <w:right w:val="single" w:sz="4" w:space="0" w:color="000000"/>
+            </w:tcBorders>
+          </w:tcPr>
+          <w:p>
+            <w:pPr>
+              <w:spacing w:after="0" w:line="240" w:lineRule="auto"/>
+              <w:jc w:val="center"/>
+              <w:rPr>
+                <w:rFonts w:ascii="Arial" w:eastAsia="Times New Roman" w:hAnsi="Arial" w:cs="Arial"/>
+                <w:b/>
+              </w:rPr>
+            </w:pPr>
+          </w:p>
+        </w:tc>
+      </w:tr>
+      <w:tr>
+        <w:trPr>
+          <w:trHeight w:val="211"/>
+        </w:trPr>
+        <w:tc>
+          <w:tcPr>
+            <w:tcW w:w="851" w:type="dxa"/>
+            <w:tcBorders>
+              <w:top w:val="single" w:sz="4" w:space="0" w:color="000000"/>
+              <w:left w:val="single" w:sz="4" w:space="0" w:color="000000"/>
+              <w:bottom w:val="single" w:sz="4" w:space="0" w:color="000000"/>
+              <w:right w:val="single" w:sz="4" w:space="0" w:color="000000"/>
+            </w:tcBorders>
+          </w:tcPr>
+          <w:p>
+            <w:pPr>
+              <w:spacing w:after="0" w:line="240" w:lineRule="auto"/>
+              <w:jc w:val="center"/>
+              <w:rPr>
+                <w:rFonts w:ascii="Arial" w:eastAsia="Times New Roman" w:hAnsi="Arial" w:cs="Arial"/>
+                <w:b/>
+              </w:rPr>
+            </w:pPr>
+          </w:p>
+        </w:tc>
+        <w:tc>
+          <w:tcPr>
+            <w:tcW w:w="4819" w:type="dxa"/>
+            <w:tcBorders>
+              <w:top w:val="single" w:sz="4" w:space="0" w:color="000000"/>
+              <w:left w:val="single" w:sz="4" w:space="0" w:color="000000"/>
+              <w:bottom w:val="single" w:sz="4" w:space="0" w:color="000000"/>
+              <w:right w:val="single" w:sz="4" w:space="0" w:color="000000"/>
+            </w:tcBorders>
+          </w:tcPr>
+          <w:p>
+            <w:pPr>
+              <w:spacing w:after="0" w:line="240" w:lineRule="auto"/>
+              <w:rPr>
+                <w:rFonts w:ascii="Arial" w:eastAsia="Times New Roman" w:hAnsi="Arial" w:cs="Arial"/>
+              </w:rPr>
+            </w:pPr>
+            <w:r>
+              <w:rPr>
+                <w:rFonts w:ascii="Arial" w:eastAsia="Times New Roman" w:hAnsi="Arial" w:cs="Arial"/>
+                <w:bCs/>
+              </w:rPr>
+              <w:t xml:space="preserve">{%tr for </w:t>
+            </w:r>
+            <w:r>
+              <w:rPr>
+                <w:rFonts w:ascii="Arial" w:eastAsia="Times New Roman" w:hAnsi="Arial" w:cs="Arial"/>
+                <w:bCs/>
+              </w:rPr>
+              <w:t>buyout</w:t>
+            </w:r>
+            <w:r>
+              <w:rPr>
+                <w:rFonts w:ascii="Arial" w:eastAsia="Times New Roman" w:hAnsi="Arial" w:cs="Arial"/>
+                <w:bCs/>
+              </w:rPr>
+              <w:t xml:space="preserve"> in </w:t>
+            </w:r>
+            <w:proofErr w:type="spellStart"/>
+            <w:r>
+              <w:rPr>
+                <w:rFonts w:ascii="Arial" w:eastAsia="Times New Roman" w:hAnsi="Arial" w:cs="Arial"/>
+                <w:bCs/>
+              </w:rPr>
+              <w:t>fan_config.buyout_items</w:t>
+            </w:r>
+            <w:proofErr w:type="spellEnd"/>
+            <w:r>
+              <w:rPr>
+                <w:rFonts w:ascii="Arial" w:eastAsia="Times New Roman" w:hAnsi="Arial" w:cs="Arial"/>
+                <w:bCs/>
+              </w:rPr>
+              <w:t xml:space="preserve"> %}</w:t>
+            </w:r>
+          </w:p>
+        </w:tc>
+        <w:tc>
+          <w:tcPr>
+            <w:tcW w:w="1418" w:type="dxa"/>
+            <w:tcBorders>
+              <w:top w:val="single" w:sz="4" w:space="0" w:color="000000"/>
+              <w:left w:val="single" w:sz="4" w:space="0" w:color="000000"/>
+              <w:bottom w:val="single" w:sz="4" w:space="0" w:color="000000"/>
+              <w:right w:val="single" w:sz="4" w:space="0" w:color="000000"/>
+            </w:tcBorders>
+          </w:tcPr>
+          <w:p>
+            <w:pPr>
+              <w:spacing w:after="0" w:line="240" w:lineRule="auto"/>
+              <w:jc w:val="center"/>
+              <w:rPr>
+                <w:rFonts w:ascii="Arial" w:eastAsia="Times New Roman" w:hAnsi="Arial" w:cs="Arial"/>
+              </w:rPr>
+            </w:pPr>
+          </w:p>
+        </w:tc>
+        <w:tc>
+          <w:tcPr>
+            <w:tcW w:w="709" w:type="dxa"/>
+            <w:tcBorders>
+              <w:top w:val="single" w:sz="4" w:space="0" w:color="000000"/>
+              <w:left w:val="single" w:sz="4" w:space="0" w:color="000000"/>
+              <w:bottom w:val="single" w:sz="4" w:space="0" w:color="000000"/>
+              <w:right w:val="single" w:sz="4" w:space="0" w:color="000000"/>
+            </w:tcBorders>
+          </w:tcPr>
+          <w:p>
+            <w:pPr>
+              <w:spacing w:after="0" w:line="240" w:lineRule="auto"/>
+              <w:jc w:val="center"/>
+              <w:rPr>
+                <w:rFonts w:ascii="Arial" w:eastAsia="Times New Roman" w:hAnsi="Arial" w:cs="Arial"/>
+                <w:b/>
+              </w:rPr>
+            </w:pPr>
+          </w:p>
+        </w:tc>
+        <w:tc>
+          <w:tcPr>
+            <w:tcW w:w="1988" w:type="dxa"/>
+            <w:tcBorders>
+              <w:top w:val="single" w:sz="4" w:space="0" w:color="000000"/>
+              <w:left w:val="single" w:sz="4" w:space="0" w:color="000000"/>
+              <w:bottom w:val="single" w:sz="4" w:space="0" w:color="000000"/>
+              <w:right w:val="single" w:sz="4" w:space="0" w:color="000000"/>
+            </w:tcBorders>
+          </w:tcPr>
+          <w:p>
+            <w:pPr>
+              <w:spacing w:after="0" w:line="240" w:lineRule="auto"/>
+              <w:jc w:val="center"/>
+              <w:rPr>
+                <w:rFonts w:ascii="Arial" w:eastAsia="Times New Roman" w:hAnsi="Arial" w:cs="Arial"/>
+                <w:b/>
+              </w:rPr>
+            </w:pPr>
+          </w:p>
+        </w:tc>
+      </w:tr>
+      <w:tr>
+        <w:trPr>
+          <w:trHeight w:val="211"/>
+        </w:trPr>
+        <w:tc>
+          <w:tcPr>
+            <w:tcW w:w="851" w:type="dxa"/>
+            <w:tcBorders>
+              <w:top w:val="single" w:sz="4" w:space="0" w:color="000000"/>
+              <w:left w:val="single" w:sz="4" w:space="0" w:color="000000"/>
+              <w:bottom w:val="single" w:sz="4" w:space="0" w:color="000000"/>
+              <w:right w:val="single" w:sz="4" w:space="0" w:color="000000"/>
+            </w:tcBorders>
+          </w:tcPr>
+          <w:p>
+            <w:pPr>
+              <w:spacing w:after="0" w:line="240" w:lineRule="auto"/>
+              <w:jc w:val="center"/>
+              <w:rPr>
+                <w:rFonts w:ascii="Arial" w:eastAsia="Times New Roman" w:hAnsi="Arial" w:cs="Arial"/>
+                <w:b/>
+              </w:rPr>
+            </w:pPr>
+          </w:p>
+        </w:tc>
+        <w:tc>
+          <w:tcPr>
+            <w:tcW w:w="4819" w:type="dxa"/>
+            <w:tcBorders>
+              <w:top w:val="single" w:sz="4" w:space="0" w:color="000000"/>
+              <w:left w:val="single" w:sz="4" w:space="0" w:color="000000"/>
+              <w:bottom w:val="single" w:sz="4" w:space="0" w:color="000000"/>
+              <w:right w:val="single" w:sz="4" w:space="0" w:color="000000"/>
+            </w:tcBorders>
+          </w:tcPr>
+          <w:p>
+            <w:pPr>
+              <w:spacing w:after="0" w:line="240" w:lineRule="auto"/>
+              <w:rPr>
+                <w:rFonts w:ascii="Arial" w:eastAsia="Times New Roman" w:hAnsi="Arial" w:cs="Arial"/>
+              </w:rPr>
+            </w:pPr>
+            <w:proofErr w:type="gramStart"/>
+            <w:r>
+              <w:rPr>
+                <w:rFonts w:ascii="Arial" w:eastAsia="Times New Roman" w:hAnsi="Arial" w:cs="Arial"/>
+                <w:bCs/>
+              </w:rPr>
+              <w:t xml:space="preserve">{{ </w:t>
+            </w:r>
+            <w:r>
+              <w:rPr>
+                <w:rFonts w:ascii="Arial" w:eastAsia="Times New Roman" w:hAnsi="Arial" w:cs="Arial"/>
+                <w:bCs/>
+              </w:rPr>
+              <w:t>buyout</w:t>
+            </w:r>
+            <w:r>
+              <w:rPr>
+                <w:rFonts w:ascii="Arial" w:eastAsia="Times New Roman" w:hAnsi="Arial" w:cs="Arial"/>
+                <w:bCs/>
+              </w:rPr>
+              <w:t>.name</w:t>
+            </w:r>
+            <w:proofErr w:type="gramEnd"/>
+            <w:r>
+              <w:rPr>
+                <w:rFonts w:ascii="Arial" w:eastAsia="Times New Roman" w:hAnsi="Arial" w:cs="Arial"/>
+                <w:bCs/>
+              </w:rPr>
+              <w:t xml:space="preserve"> }}</w:t>
+            </w:r>
+          </w:p>
+        </w:tc>
+        <w:tc>
+          <w:tcPr>
+            <w:tcW w:w="1418" w:type="dxa"/>
+            <w:tcBorders>
+              <w:top w:val="single" w:sz="4" w:space="0" w:color="000000"/>
+              <w:left w:val="single" w:sz="4" w:space="0" w:color="000000"/>
+              <w:bottom w:val="single" w:sz="4" w:space="0" w:color="000000"/>
+              <w:right w:val="single" w:sz="4" w:space="0" w:color="000000"/>
+            </w:tcBorders>
+          </w:tcPr>
+          <w:p>
+            <w:pPr>
+              <w:spacing w:after="0" w:line="240" w:lineRule="auto"/>
+              <w:jc w:val="center"/>
               <w:rPr>
                 <w:rFonts w:ascii="Arial" w:eastAsia="Times New Roman" w:hAnsi="Arial" w:cs="Arial"/>
                 <w:b/>
@@ -4176,7 +3836,7 @@
                 <w:b/>
                 <w:bCs/>
               </w:rPr>
-              <w:t>motor</w:t>
+              <w:t>buyout</w:t>
             </w:r>
             <w:proofErr w:type="gramEnd"/>
             <w:r>
@@ -4185,7 +3845,7 @@
                 <w:b/>
                 <w:bCs/>
               </w:rPr>
-              <w:t>_unit_price</w:t>
+              <w:t>.unit_price</w:t>
             </w:r>
             <w:proofErr w:type="spellEnd"/>
             <w:r>
@@ -4231,17 +3891,10 @@
                 <w:rFonts w:ascii="Arial" w:eastAsia="Times New Roman" w:hAnsi="Arial" w:cs="Arial"/>
                 <w:b/>
               </w:rPr>
-              <w:t>motor</w:t>
-            </w:r>
-            <w:proofErr w:type="gramEnd"/>
-            <w:r>
-              <w:rPr>
-                <w:rFonts w:ascii="Arial" w:eastAsia="Times New Roman" w:hAnsi="Arial" w:cs="Arial"/>
-                <w:b/>
-              </w:rPr>
-              <w:t>_qty</w:t>
+              <w:t>buyout.qty</w:t>
             </w:r>
             <w:proofErr w:type="spellEnd"/>
+            <w:proofErr w:type="gramEnd"/>
             <w:r>
               <w:rPr>
                 <w:rFonts w:ascii="Arial" w:eastAsia="Times New Roman" w:hAnsi="Arial" w:cs="Arial"/>
@@ -4291,7 +3944,7 @@
                 <w:rFonts w:ascii="Arial" w:eastAsia="Times New Roman" w:hAnsi="Arial" w:cs="Arial"/>
                 <w:b/>
               </w:rPr>
-              <w:t>motor</w:t>
+              <w:t>buyout</w:t>
             </w:r>
             <w:proofErr w:type="gramEnd"/>
             <w:r>
@@ -4299,7 +3952,7 @@
                 <w:rFonts w:ascii="Arial" w:eastAsia="Times New Roman" w:hAnsi="Arial" w:cs="Arial"/>
                 <w:b/>
               </w:rPr>
-              <w:t>_total_price</w:t>
+              <w:t>.total_price</w:t>
             </w:r>
             <w:proofErr w:type="spellEnd"/>
             <w:r>
@@ -4335,527 +3988,6 @@
                 <w:b/>
               </w:rPr>
             </w:pPr>
-            <w:r>
-              <w:rPr>
-                <w:rFonts w:ascii="Arial" w:eastAsia="Times New Roman" w:hAnsi="Arial" w:cs="Arial"/>
-                <w:b/>
-              </w:rPr>
-              <w:t>3</w:t>
-            </w:r>
-          </w:p>
-        </w:tc>
-        <w:tc>
-          <w:tcPr>
-            <w:tcW w:w="4819" w:type="dxa"/>
-            <w:tcBorders>
-              <w:top w:val="single" w:sz="4" w:space="0" w:color="000000"/>
-              <w:left w:val="single" w:sz="4" w:space="0" w:color="000000"/>
-              <w:bottom w:val="single" w:sz="4" w:space="0" w:color="000000"/>
-              <w:right w:val="single" w:sz="4" w:space="0" w:color="000000"/>
-            </w:tcBorders>
-          </w:tcPr>
-          <w:p>
-            <w:pPr>
-              <w:spacing w:after="0" w:line="240" w:lineRule="auto"/>
-              <w:rPr>
-                <w:rFonts w:ascii="Arial" w:eastAsia="Times New Roman" w:hAnsi="Arial" w:cs="Arial"/>
-                <w:bCs/>
-              </w:rPr>
-            </w:pPr>
-            <w:r>
-              <w:rPr>
-                <w:rFonts w:ascii="Arial" w:eastAsia="Times New Roman" w:hAnsi="Arial" w:cs="Arial"/>
-                <w:b/>
-              </w:rPr>
-              <w:t xml:space="preserve"> </w:t>
-            </w:r>
-            <w:r>
-              <w:rPr>
-                <w:rFonts w:ascii="Arial" w:eastAsia="Times New Roman" w:hAnsi="Arial" w:cs="Arial"/>
-                <w:b/>
-                <w:color w:val="833C0B" w:themeColor="accent2" w:themeShade="80"/>
-              </w:rPr>
-              <w:t>Buyout Items</w:t>
-            </w:r>
-          </w:p>
-        </w:tc>
-        <w:tc>
-          <w:tcPr>
-            <w:tcW w:w="1418" w:type="dxa"/>
-            <w:tcBorders>
-              <w:top w:val="single" w:sz="4" w:space="0" w:color="000000"/>
-              <w:left w:val="single" w:sz="4" w:space="0" w:color="000000"/>
-              <w:bottom w:val="single" w:sz="4" w:space="0" w:color="000000"/>
-              <w:right w:val="single" w:sz="4" w:space="0" w:color="000000"/>
-            </w:tcBorders>
-          </w:tcPr>
-          <w:p>
-            <w:pPr>
-              <w:spacing w:after="0" w:line="240" w:lineRule="auto"/>
-              <w:jc w:val="center"/>
-              <w:rPr>
-                <w:rFonts w:ascii="Arial" w:eastAsia="Times New Roman" w:hAnsi="Arial" w:cs="Arial"/>
-              </w:rPr>
-            </w:pPr>
-          </w:p>
-        </w:tc>
-        <w:tc>
-          <w:tcPr>
-            <w:tcW w:w="709" w:type="dxa"/>
-            <w:tcBorders>
-              <w:top w:val="single" w:sz="4" w:space="0" w:color="000000"/>
-              <w:left w:val="single" w:sz="4" w:space="0" w:color="000000"/>
-              <w:bottom w:val="single" w:sz="4" w:space="0" w:color="000000"/>
-              <w:right w:val="single" w:sz="4" w:space="0" w:color="000000"/>
-            </w:tcBorders>
-          </w:tcPr>
-          <w:p>
-            <w:pPr>
-              <w:spacing w:after="0" w:line="240" w:lineRule="auto"/>
-              <w:jc w:val="center"/>
-              <w:rPr>
-                <w:rFonts w:ascii="Arial" w:eastAsia="Times New Roman" w:hAnsi="Arial" w:cs="Arial"/>
-                <w:b/>
-              </w:rPr>
-            </w:pPr>
-          </w:p>
-        </w:tc>
-        <w:tc>
-          <w:tcPr>
-            <w:tcW w:w="1988" w:type="dxa"/>
-            <w:tcBorders>
-              <w:top w:val="single" w:sz="4" w:space="0" w:color="000000"/>
-              <w:left w:val="single" w:sz="4" w:space="0" w:color="000000"/>
-              <w:bottom w:val="single" w:sz="4" w:space="0" w:color="000000"/>
-              <w:right w:val="single" w:sz="4" w:space="0" w:color="000000"/>
-            </w:tcBorders>
-          </w:tcPr>
-          <w:p>
-            <w:pPr>
-              <w:spacing w:after="0" w:line="240" w:lineRule="auto"/>
-              <w:jc w:val="center"/>
-              <w:rPr>
-                <w:rFonts w:ascii="Arial" w:eastAsia="Times New Roman" w:hAnsi="Arial" w:cs="Arial"/>
-                <w:b/>
-              </w:rPr>
-            </w:pPr>
-          </w:p>
-        </w:tc>
-      </w:tr>
-      <w:tr>
-        <w:trPr>
-          <w:trHeight w:val="211"/>
-        </w:trPr>
-        <w:tc>
-          <w:tcPr>
-            <w:tcW w:w="851" w:type="dxa"/>
-            <w:tcBorders>
-              <w:top w:val="single" w:sz="4" w:space="0" w:color="000000"/>
-              <w:left w:val="single" w:sz="4" w:space="0" w:color="000000"/>
-              <w:bottom w:val="single" w:sz="4" w:space="0" w:color="000000"/>
-              <w:right w:val="single" w:sz="4" w:space="0" w:color="000000"/>
-            </w:tcBorders>
-          </w:tcPr>
-          <w:p>
-            <w:pPr>
-              <w:spacing w:after="0" w:line="240" w:lineRule="auto"/>
-              <w:jc w:val="center"/>
-              <w:rPr>
-                <w:rFonts w:ascii="Arial" w:eastAsia="Times New Roman" w:hAnsi="Arial" w:cs="Arial"/>
-                <w:b/>
-              </w:rPr>
-            </w:pPr>
-          </w:p>
-        </w:tc>
-        <w:tc>
-          <w:tcPr>
-            <w:tcW w:w="4819" w:type="dxa"/>
-            <w:tcBorders>
-              <w:top w:val="single" w:sz="4" w:space="0" w:color="000000"/>
-              <w:left w:val="single" w:sz="4" w:space="0" w:color="000000"/>
-              <w:bottom w:val="single" w:sz="4" w:space="0" w:color="000000"/>
-              <w:right w:val="single" w:sz="4" w:space="0" w:color="000000"/>
-            </w:tcBorders>
-          </w:tcPr>
-          <w:p>
-            <w:pPr>
-              <w:spacing w:after="0" w:line="240" w:lineRule="auto"/>
-              <w:rPr>
-                <w:rFonts w:ascii="Arial" w:eastAsia="Times New Roman" w:hAnsi="Arial" w:cs="Arial"/>
-              </w:rPr>
-            </w:pPr>
-            <w:r>
-              <w:rPr>
-                <w:rFonts w:ascii="Arial" w:eastAsia="Times New Roman" w:hAnsi="Arial" w:cs="Arial"/>
-                <w:bCs/>
-              </w:rPr>
-              <w:t xml:space="preserve">{%tr for </w:t>
-            </w:r>
-            <w:r>
-              <w:rPr>
-                <w:rFonts w:ascii="Arial" w:eastAsia="Times New Roman" w:hAnsi="Arial" w:cs="Arial"/>
-                <w:bCs/>
-              </w:rPr>
-              <w:t>buyout</w:t>
-            </w:r>
-            <w:r>
-              <w:rPr>
-                <w:rFonts w:ascii="Arial" w:eastAsia="Times New Roman" w:hAnsi="Arial" w:cs="Arial"/>
-                <w:bCs/>
-              </w:rPr>
-              <w:t xml:space="preserve"> in </w:t>
-            </w:r>
-            <w:proofErr w:type="spellStart"/>
-            <w:r>
-              <w:rPr>
-                <w:rFonts w:ascii="Arial" w:eastAsia="Times New Roman" w:hAnsi="Arial" w:cs="Arial"/>
-                <w:bCs/>
-              </w:rPr>
-              <w:t>buyout_items</w:t>
-            </w:r>
-            <w:proofErr w:type="spellEnd"/>
-            <w:r>
-              <w:rPr>
-                <w:rFonts w:ascii="Arial" w:eastAsia="Times New Roman" w:hAnsi="Arial" w:cs="Arial"/>
-                <w:bCs/>
-              </w:rPr>
-              <w:t xml:space="preserve"> %}</w:t>
-            </w:r>
-          </w:p>
-        </w:tc>
-        <w:tc>
-          <w:tcPr>
-            <w:tcW w:w="1418" w:type="dxa"/>
-            <w:tcBorders>
-              <w:top w:val="single" w:sz="4" w:space="0" w:color="000000"/>
-              <w:left w:val="single" w:sz="4" w:space="0" w:color="000000"/>
-              <w:bottom w:val="single" w:sz="4" w:space="0" w:color="000000"/>
-              <w:right w:val="single" w:sz="4" w:space="0" w:color="000000"/>
-            </w:tcBorders>
-          </w:tcPr>
-          <w:p>
-            <w:pPr>
-              <w:spacing w:after="0" w:line="240" w:lineRule="auto"/>
-              <w:jc w:val="center"/>
-              <w:rPr>
-                <w:rFonts w:ascii="Arial" w:eastAsia="Times New Roman" w:hAnsi="Arial" w:cs="Arial"/>
-              </w:rPr>
-            </w:pPr>
-          </w:p>
-        </w:tc>
-        <w:tc>
-          <w:tcPr>
-            <w:tcW w:w="709" w:type="dxa"/>
-            <w:tcBorders>
-              <w:top w:val="single" w:sz="4" w:space="0" w:color="000000"/>
-              <w:left w:val="single" w:sz="4" w:space="0" w:color="000000"/>
-              <w:bottom w:val="single" w:sz="4" w:space="0" w:color="000000"/>
-              <w:right w:val="single" w:sz="4" w:space="0" w:color="000000"/>
-            </w:tcBorders>
-          </w:tcPr>
-          <w:p>
-            <w:pPr>
-              <w:spacing w:after="0" w:line="240" w:lineRule="auto"/>
-              <w:jc w:val="center"/>
-              <w:rPr>
-                <w:rFonts w:ascii="Arial" w:eastAsia="Times New Roman" w:hAnsi="Arial" w:cs="Arial"/>
-                <w:b/>
-              </w:rPr>
-            </w:pPr>
-          </w:p>
-        </w:tc>
-        <w:tc>
-          <w:tcPr>
-            <w:tcW w:w="1988" w:type="dxa"/>
-            <w:tcBorders>
-              <w:top w:val="single" w:sz="4" w:space="0" w:color="000000"/>
-              <w:left w:val="single" w:sz="4" w:space="0" w:color="000000"/>
-              <w:bottom w:val="single" w:sz="4" w:space="0" w:color="000000"/>
-              <w:right w:val="single" w:sz="4" w:space="0" w:color="000000"/>
-            </w:tcBorders>
-          </w:tcPr>
-          <w:p>
-            <w:pPr>
-              <w:spacing w:after="0" w:line="240" w:lineRule="auto"/>
-              <w:jc w:val="center"/>
-              <w:rPr>
-                <w:rFonts w:ascii="Arial" w:eastAsia="Times New Roman" w:hAnsi="Arial" w:cs="Arial"/>
-                <w:b/>
-              </w:rPr>
-            </w:pPr>
-          </w:p>
-        </w:tc>
-      </w:tr>
-      <w:tr>
-        <w:trPr>
-          <w:trHeight w:val="211"/>
-        </w:trPr>
-        <w:tc>
-          <w:tcPr>
-            <w:tcW w:w="851" w:type="dxa"/>
-            <w:tcBorders>
-              <w:top w:val="single" w:sz="4" w:space="0" w:color="000000"/>
-              <w:left w:val="single" w:sz="4" w:space="0" w:color="000000"/>
-              <w:bottom w:val="single" w:sz="4" w:space="0" w:color="000000"/>
-              <w:right w:val="single" w:sz="4" w:space="0" w:color="000000"/>
-            </w:tcBorders>
-          </w:tcPr>
-          <w:p>
-            <w:pPr>
-              <w:spacing w:after="0" w:line="240" w:lineRule="auto"/>
-              <w:jc w:val="center"/>
-              <w:rPr>
-                <w:rFonts w:ascii="Arial" w:eastAsia="Times New Roman" w:hAnsi="Arial" w:cs="Arial"/>
-                <w:b/>
-              </w:rPr>
-            </w:pPr>
-          </w:p>
-        </w:tc>
-        <w:tc>
-          <w:tcPr>
-            <w:tcW w:w="4819" w:type="dxa"/>
-            <w:tcBorders>
-              <w:top w:val="single" w:sz="4" w:space="0" w:color="000000"/>
-              <w:left w:val="single" w:sz="4" w:space="0" w:color="000000"/>
-              <w:bottom w:val="single" w:sz="4" w:space="0" w:color="000000"/>
-              <w:right w:val="single" w:sz="4" w:space="0" w:color="000000"/>
-            </w:tcBorders>
-          </w:tcPr>
-          <w:p>
-            <w:pPr>
-              <w:spacing w:after="0" w:line="240" w:lineRule="auto"/>
-              <w:rPr>
-                <w:rFonts w:ascii="Arial" w:eastAsia="Times New Roman" w:hAnsi="Arial" w:cs="Arial"/>
-              </w:rPr>
-            </w:pPr>
-            <w:proofErr w:type="gramStart"/>
-            <w:r>
-              <w:rPr>
-                <w:rFonts w:ascii="Arial" w:eastAsia="Times New Roman" w:hAnsi="Arial" w:cs="Arial"/>
-                <w:bCs/>
-              </w:rPr>
-              <w:t xml:space="preserve">{{ </w:t>
-            </w:r>
-            <w:r>
-              <w:rPr>
-                <w:rFonts w:ascii="Arial" w:eastAsia="Times New Roman" w:hAnsi="Arial" w:cs="Arial"/>
-                <w:bCs/>
-              </w:rPr>
-              <w:t>buyout</w:t>
-            </w:r>
-            <w:r>
-              <w:rPr>
-                <w:rFonts w:ascii="Arial" w:eastAsia="Times New Roman" w:hAnsi="Arial" w:cs="Arial"/>
-                <w:bCs/>
-              </w:rPr>
-              <w:t>.name</w:t>
-            </w:r>
-            <w:proofErr w:type="gramEnd"/>
-            <w:r>
-              <w:rPr>
-                <w:rFonts w:ascii="Arial" w:eastAsia="Times New Roman" w:hAnsi="Arial" w:cs="Arial"/>
-                <w:bCs/>
-              </w:rPr>
-              <w:t xml:space="preserve"> }}</w:t>
-            </w:r>
-          </w:p>
-        </w:tc>
-        <w:tc>
-          <w:tcPr>
-            <w:tcW w:w="1418" w:type="dxa"/>
-            <w:tcBorders>
-              <w:top w:val="single" w:sz="4" w:space="0" w:color="000000"/>
-              <w:left w:val="single" w:sz="4" w:space="0" w:color="000000"/>
-              <w:bottom w:val="single" w:sz="4" w:space="0" w:color="000000"/>
-              <w:right w:val="single" w:sz="4" w:space="0" w:color="000000"/>
-            </w:tcBorders>
-          </w:tcPr>
-          <w:p>
-            <w:pPr>
-              <w:spacing w:after="0" w:line="240" w:lineRule="auto"/>
-              <w:jc w:val="center"/>
-              <w:rPr>
-                <w:rFonts w:ascii="Arial" w:eastAsia="Times New Roman" w:hAnsi="Arial" w:cs="Arial"/>
-                <w:b/>
-                <w:bCs/>
-              </w:rPr>
-            </w:pPr>
-            <w:r>
-              <w:rPr>
-                <w:rFonts w:ascii="Arial" w:eastAsia="Times New Roman" w:hAnsi="Arial" w:cs="Arial"/>
-                <w:b/>
-                <w:bCs/>
-              </w:rPr>
-              <w:t xml:space="preserve">R </w:t>
-            </w:r>
-            <w:proofErr w:type="gramStart"/>
-            <w:r>
-              <w:rPr>
-                <w:rFonts w:ascii="Arial" w:eastAsia="Times New Roman" w:hAnsi="Arial" w:cs="Arial"/>
-                <w:b/>
-                <w:bCs/>
-              </w:rPr>
-              <w:t xml:space="preserve">{{ </w:t>
-            </w:r>
-            <w:proofErr w:type="spellStart"/>
-            <w:r>
-              <w:rPr>
-                <w:rFonts w:ascii="Arial" w:eastAsia="Times New Roman" w:hAnsi="Arial" w:cs="Arial"/>
-                <w:b/>
-                <w:bCs/>
-              </w:rPr>
-              <w:t>buyout</w:t>
-            </w:r>
-            <w:proofErr w:type="gramEnd"/>
-            <w:r>
-              <w:rPr>
-                <w:rFonts w:ascii="Arial" w:eastAsia="Times New Roman" w:hAnsi="Arial" w:cs="Arial"/>
-                <w:b/>
-                <w:bCs/>
-              </w:rPr>
-              <w:t>.unit_price</w:t>
-            </w:r>
-            <w:proofErr w:type="spellEnd"/>
-            <w:r>
-              <w:rPr>
-                <w:rFonts w:ascii="Arial" w:eastAsia="Times New Roman" w:hAnsi="Arial" w:cs="Arial"/>
-                <w:b/>
-                <w:bCs/>
-              </w:rPr>
-              <w:t xml:space="preserve"> }}</w:t>
-            </w:r>
-          </w:p>
-        </w:tc>
-        <w:tc>
-          <w:tcPr>
-            <w:tcW w:w="709" w:type="dxa"/>
-            <w:tcBorders>
-              <w:top w:val="single" w:sz="4" w:space="0" w:color="000000"/>
-              <w:left w:val="single" w:sz="4" w:space="0" w:color="000000"/>
-              <w:bottom w:val="single" w:sz="4" w:space="0" w:color="000000"/>
-              <w:right w:val="single" w:sz="4" w:space="0" w:color="000000"/>
-            </w:tcBorders>
-          </w:tcPr>
-          <w:p>
-            <w:pPr>
-              <w:spacing w:after="0" w:line="240" w:lineRule="auto"/>
-              <w:jc w:val="center"/>
-              <w:rPr>
-                <w:rFonts w:ascii="Arial" w:eastAsia="Times New Roman" w:hAnsi="Arial" w:cs="Arial"/>
-                <w:b/>
-              </w:rPr>
-            </w:pPr>
-            <w:proofErr w:type="gramStart"/>
-            <w:r>
-              <w:rPr>
-                <w:rFonts w:ascii="Arial" w:eastAsia="Times New Roman" w:hAnsi="Arial" w:cs="Arial"/>
-                <w:b/>
-              </w:rPr>
-              <w:t xml:space="preserve">{{ </w:t>
-            </w:r>
-            <w:proofErr w:type="spellStart"/>
-            <w:r>
-              <w:rPr>
-                <w:rFonts w:ascii="Arial" w:eastAsia="Times New Roman" w:hAnsi="Arial" w:cs="Arial"/>
-                <w:b/>
-              </w:rPr>
-              <w:t>buyout.qty</w:t>
-            </w:r>
-            <w:proofErr w:type="spellEnd"/>
-            <w:proofErr w:type="gramEnd"/>
-            <w:r>
-              <w:rPr>
-                <w:rFonts w:ascii="Arial" w:eastAsia="Times New Roman" w:hAnsi="Arial" w:cs="Arial"/>
-                <w:b/>
-              </w:rPr>
-              <w:t xml:space="preserve"> }}</w:t>
-            </w:r>
-          </w:p>
-        </w:tc>
-        <w:tc>
-          <w:tcPr>
-            <w:tcW w:w="1988" w:type="dxa"/>
-            <w:tcBorders>
-              <w:top w:val="single" w:sz="4" w:space="0" w:color="000000"/>
-              <w:left w:val="single" w:sz="4" w:space="0" w:color="000000"/>
-              <w:bottom w:val="single" w:sz="4" w:space="0" w:color="000000"/>
-              <w:right w:val="single" w:sz="4" w:space="0" w:color="000000"/>
-            </w:tcBorders>
-          </w:tcPr>
-          <w:p>
-            <w:pPr>
-              <w:spacing w:after="0" w:line="240" w:lineRule="auto"/>
-              <w:jc w:val="center"/>
-              <w:rPr>
-                <w:rFonts w:ascii="Arial" w:eastAsia="Times New Roman" w:hAnsi="Arial" w:cs="Arial"/>
-                <w:b/>
-              </w:rPr>
-            </w:pPr>
-            <w:r>
-              <w:rPr>
-                <w:rFonts w:ascii="Arial" w:eastAsia="Times New Roman" w:hAnsi="Arial" w:cs="Arial"/>
-                <w:b/>
-              </w:rPr>
-              <w:t xml:space="preserve">R </w:t>
-            </w:r>
-            <w:proofErr w:type="gramStart"/>
-            <w:r>
-              <w:rPr>
-                <w:rFonts w:ascii="Arial" w:eastAsia="Times New Roman" w:hAnsi="Arial" w:cs="Arial"/>
-                <w:b/>
-              </w:rPr>
-              <w:t xml:space="preserve">{{ </w:t>
-            </w:r>
-            <w:proofErr w:type="spellStart"/>
-            <w:r>
-              <w:rPr>
-                <w:rFonts w:ascii="Arial" w:eastAsia="Times New Roman" w:hAnsi="Arial" w:cs="Arial"/>
-                <w:b/>
-              </w:rPr>
-              <w:t>buyout</w:t>
-            </w:r>
-            <w:proofErr w:type="gramEnd"/>
-            <w:r>
-              <w:rPr>
-                <w:rFonts w:ascii="Arial" w:eastAsia="Times New Roman" w:hAnsi="Arial" w:cs="Arial"/>
-                <w:b/>
-              </w:rPr>
-              <w:t>.total_price</w:t>
-            </w:r>
-            <w:proofErr w:type="spellEnd"/>
-            <w:r>
-              <w:rPr>
-                <w:rFonts w:ascii="Arial" w:eastAsia="Times New Roman" w:hAnsi="Arial" w:cs="Arial"/>
-                <w:b/>
-              </w:rPr>
-              <w:t xml:space="preserve"> }}</w:t>
-            </w:r>
-          </w:p>
-        </w:tc>
-      </w:tr>
-      <w:tr>
-        <w:trPr>
-          <w:trHeight w:val="211"/>
-        </w:trPr>
-        <w:tc>
-          <w:tcPr>
-            <w:tcW w:w="851" w:type="dxa"/>
-            <w:tcBorders>
-              <w:top w:val="single" w:sz="4" w:space="0" w:color="000000"/>
-              <w:left w:val="single" w:sz="4" w:space="0" w:color="000000"/>
-              <w:bottom w:val="single" w:sz="4" w:space="0" w:color="000000"/>
-              <w:right w:val="single" w:sz="4" w:space="0" w:color="000000"/>
-            </w:tcBorders>
-          </w:tcPr>
-          <w:p>
-            <w:pPr>
-              <w:spacing w:after="0" w:line="240" w:lineRule="auto"/>
-              <w:jc w:val="center"/>
-              <w:rPr>
-                <w:rFonts w:ascii="Arial" w:eastAsia="Times New Roman" w:hAnsi="Arial" w:cs="Arial"/>
-                <w:b/>
-              </w:rPr>
-            </w:pPr>
           </w:p>
         </w:tc>
         <w:tc>
@@ -5113,6 +4245,27 @@
               <w:t>Included</w:t>
             </w:r>
           </w:p>
+        </w:tc>
+      </w:tr>
+      <w:tr>
+        <w:tc>
+          <w:p>
+            <w:r>
+              <w:t xml:space="preserve">{%tr endfor %}</w:t>
+            </w:r>
+          </w:p>
+        </w:tc>
+        <w:tc>
+          <w:p/>
+        </w:tc>
+        <w:tc>
+          <w:p/>
+        </w:tc>
+        <w:tc>
+          <w:p/>
+        </w:tc>
+        <w:tc>
+          <w:p/>
         </w:tc>
       </w:tr>
       <w:tr>

</xml_diff>

<commit_message>
Fix multi-fan config switching bugs and widget state management
Widget state was not being fully cleared when switching between fan
configurations, causing stale values to persist. Session state was also
re-initialized on every rerun, resetting active_config_index to 0. This
adds _clear_widget_state() to purge widget keys on config switch, guards
quote_data initialization to run only once, and fixes the timezone init
script to use current_database() dynamically.

Co-Authored-By: Claude Opus 4.6 <noreply@anthropic.com>
</commit_message>
<xml_diff>
--- a/ui/templates/quote_template.docx
+++ b/ui/templates/quote_template.docx
@@ -1004,7 +1004,23 @@
         <w:pStyle w:val="List Paragraph"/>
       </w:pPr>
       <w:r>
-        <w:t xml:space="preserve">{%p if is_multi_config %}{{ fan_config.label }}{% if fan_config.quantity &gt; 1 %} (x{{ fan_config.quantity }}){% endif %}{%p endif %}</w:t>
+        <w:t xml:space="preserve">{%p if is_multi_config %}</w:t>
+      </w:r>
+    </w:p>
+    <w:p>
+      <w:pPr>
+        <w:pStyle w:val="List Paragraph"/>
+      </w:pPr>
+      <w:r>
+        <w:t xml:space="preserve">{{ fan_config.label }}{% if fan_config.quantity &gt; 1 %} (x{{ fan_config.quantity }}){% endif %}</w:t>
+      </w:r>
+    </w:p>
+    <w:p>
+      <w:pPr>
+        <w:pStyle w:val="List Paragraph"/>
+      </w:pPr>
+      <w:r>
+        <w:t xml:space="preserve">{%p endif %}</w:t>
       </w:r>
     </w:p>
     <w:p>
@@ -1352,15 +1368,9 @@
         <w:rPr>
           <w:rFonts w:ascii="Arial" w:eastAsia="Times New Roman" w:hAnsi="Arial" w:cs="Arial"/>
         </w:rPr>
-        <w:t>{{ comp.name</w:t>
+        <w:t>{{ comp.name }}</w:t>
       </w:r>
       <w:proofErr w:type="gramEnd"/>
-      <w:r>
-        <w:rPr>
-          <w:rFonts w:ascii="Arial" w:eastAsia="Times New Roman" w:hAnsi="Arial" w:cs="Arial"/>
-        </w:rPr>
-        <w:t xml:space="preserve"> }}</w:t>
-      </w:r>
     </w:p>
     <w:p>
       <w:pPr>
@@ -1386,22 +1396,10 @@
         <w:rPr>
           <w:rFonts w:ascii="Arial" w:eastAsia="Times New Roman" w:hAnsi="Arial" w:cs="Arial"/>
         </w:rPr>
-        <w:t xml:space="preserve">{%p </w:t>
+        <w:t>{%p endfor %}</w:t>
       </w:r>
       <w:proofErr w:type="spellStart"/>
-      <w:r>
-        <w:rPr>
-          <w:rFonts w:ascii="Arial" w:eastAsia="Times New Roman" w:hAnsi="Arial" w:cs="Arial"/>
-        </w:rPr>
-        <w:t>endfor</w:t>
-      </w:r>
       <w:proofErr w:type="spellEnd"/>
-      <w:r>
-        <w:rPr>
-          <w:rFonts w:ascii="Arial" w:eastAsia="Times New Roman" w:hAnsi="Arial" w:cs="Arial"/>
-        </w:rPr>
-        <w:t xml:space="preserve"> %}</w:t>
-      </w:r>
     </w:p>
     <w:p>
       <w:pPr>
@@ -2676,23 +2674,9 @@
                 <w:rFonts w:ascii="Arial" w:eastAsia="Times New Roman" w:hAnsi="Arial" w:cs="Arial"/>
                 <w:bCs/>
               </w:rPr>
-              <w:t>{{ comp</w:t>
-            </w:r>
-            <w:r>
-              <w:rPr>
-                <w:rFonts w:ascii="Arial" w:eastAsia="Times New Roman" w:hAnsi="Arial" w:cs="Arial"/>
-                <w:bCs/>
-              </w:rPr>
-              <w:t>.name</w:t>
+              <w:t>{{ comp.name }}</w:t>
             </w:r>
             <w:proofErr w:type="gramEnd"/>
-            <w:r>
-              <w:rPr>
-                <w:rFonts w:ascii="Arial" w:eastAsia="Times New Roman" w:hAnsi="Arial" w:cs="Arial"/>
-                <w:bCs/>
-              </w:rPr>
-              <w:t xml:space="preserve"> }}</w:t>
-            </w:r>
           </w:p>
         </w:tc>
         <w:tc>
@@ -2719,40 +2703,12 @@
                 <w:rFonts w:ascii="Arial" w:eastAsia="Times New Roman" w:hAnsi="Arial" w:cs="Arial"/>
                 <w:b/>
               </w:rPr>
-              <w:t xml:space="preserve">R </w:t>
+              <w:t>R {{ comp.unit_price }}</w:t>
             </w:r>
             <w:proofErr w:type="gramStart"/>
-            <w:r>
-              <w:rPr>
-                <w:rFonts w:ascii="Arial" w:eastAsia="Times New Roman" w:hAnsi="Arial" w:cs="Arial"/>
-                <w:b/>
-              </w:rPr>
-              <w:t xml:space="preserve">{{ </w:t>
-            </w:r>
             <w:proofErr w:type="spellStart"/>
-            <w:r>
-              <w:rPr>
-                <w:rFonts w:ascii="Arial" w:eastAsia="Times New Roman" w:hAnsi="Arial" w:cs="Arial"/>
-                <w:b/>
-              </w:rPr>
-              <w:t>comp</w:t>
-            </w:r>
             <w:proofErr w:type="gramEnd"/>
-            <w:r>
-              <w:rPr>
-                <w:rFonts w:ascii="Arial" w:eastAsia="Times New Roman" w:hAnsi="Arial" w:cs="Arial"/>
-                <w:b/>
-              </w:rPr>
-              <w:t>.unit_price</w:t>
-            </w:r>
             <w:proofErr w:type="spellEnd"/>
-            <w:r>
-              <w:rPr>
-                <w:rFonts w:ascii="Arial" w:eastAsia="Times New Roman" w:hAnsi="Arial" w:cs="Arial"/>
-                <w:b/>
-              </w:rPr>
-              <w:t xml:space="preserve"> }}</w:t>
-            </w:r>
           </w:p>
         </w:tc>
         <w:tc>
@@ -2780,25 +2736,11 @@
                 <w:rFonts w:ascii="Arial" w:eastAsia="Times New Roman" w:hAnsi="Arial" w:cs="Arial"/>
                 <w:b/>
               </w:rPr>
-              <w:t xml:space="preserve">{{ </w:t>
+              <w:t>{{ comp.qty }}</w:t>
             </w:r>
             <w:proofErr w:type="spellStart"/>
-            <w:r>
-              <w:rPr>
-                <w:rFonts w:ascii="Arial" w:eastAsia="Times New Roman" w:hAnsi="Arial" w:cs="Arial"/>
-                <w:b/>
-              </w:rPr>
-              <w:t>comp.qty</w:t>
-            </w:r>
             <w:proofErr w:type="spellEnd"/>
             <w:proofErr w:type="gramEnd"/>
-            <w:r>
-              <w:rPr>
-                <w:rFonts w:ascii="Arial" w:eastAsia="Times New Roman" w:hAnsi="Arial" w:cs="Arial"/>
-                <w:b/>
-              </w:rPr>
-              <w:t xml:space="preserve"> }}</w:t>
-            </w:r>
           </w:p>
         </w:tc>
         <w:tc>
@@ -2825,47 +2767,12 @@
                 <w:rFonts w:ascii="Arial" w:eastAsia="Times New Roman" w:hAnsi="Arial" w:cs="Arial"/>
                 <w:b/>
               </w:rPr>
-              <w:t xml:space="preserve">R </w:t>
+              <w:t>R {{ comp.total_price }}</w:t>
             </w:r>
             <w:proofErr w:type="gramStart"/>
-            <w:r>
-              <w:rPr>
-                <w:rFonts w:ascii="Arial" w:eastAsia="Times New Roman" w:hAnsi="Arial" w:cs="Arial"/>
-                <w:b/>
-              </w:rPr>
-              <w:t xml:space="preserve">{{ </w:t>
-            </w:r>
             <w:proofErr w:type="spellStart"/>
-            <w:r>
-              <w:rPr>
-                <w:rFonts w:ascii="Arial" w:eastAsia="Times New Roman" w:hAnsi="Arial" w:cs="Arial"/>
-                <w:b/>
-              </w:rPr>
-              <w:t>comp</w:t>
-            </w:r>
             <w:proofErr w:type="gramEnd"/>
-            <w:r>
-              <w:rPr>
-                <w:rFonts w:ascii="Arial" w:eastAsia="Times New Roman" w:hAnsi="Arial" w:cs="Arial"/>
-                <w:b/>
-              </w:rPr>
-              <w:t>.</w:t>
-            </w:r>
-            <w:r>
-              <w:rPr>
-                <w:rFonts w:ascii="Arial" w:eastAsia="Times New Roman" w:hAnsi="Arial" w:cs="Arial"/>
-                <w:b/>
-              </w:rPr>
-              <w:t>total_price</w:t>
-            </w:r>
             <w:proofErr w:type="spellEnd"/>
-            <w:r>
-              <w:rPr>
-                <w:rFonts w:ascii="Arial" w:eastAsia="Times New Roman" w:hAnsi="Arial" w:cs="Arial"/>
-                <w:b/>
-              </w:rPr>
-              <w:t xml:space="preserve"> }}</w:t>
-            </w:r>
           </w:p>
         </w:tc>
       </w:tr>
@@ -2917,31 +2824,10 @@
                 <w:rFonts w:ascii="Arial" w:eastAsia="Times New Roman" w:hAnsi="Arial" w:cs="Arial"/>
                 <w:bCs/>
               </w:rPr>
-              <w:t>{</w:t>
-            </w:r>
-            <w:r>
-              <w:rPr>
-                <w:rFonts w:ascii="Arial" w:eastAsia="Times New Roman" w:hAnsi="Arial" w:cs="Arial"/>
-                <w:bCs/>
-              </w:rPr>
-              <w:t xml:space="preserve">%tr </w:t>
+              <w:t>{%tr endfor %}</w:t>
             </w:r>
             <w:proofErr w:type="spellStart"/>
-            <w:r>
-              <w:rPr>
-                <w:rFonts w:ascii="Arial" w:eastAsia="Times New Roman" w:hAnsi="Arial" w:cs="Arial"/>
-                <w:bCs/>
-              </w:rPr>
-              <w:t>endfor</w:t>
-            </w:r>
             <w:proofErr w:type="spellEnd"/>
-            <w:r>
-              <w:rPr>
-                <w:rFonts w:ascii="Arial" w:eastAsia="Times New Roman" w:hAnsi="Arial" w:cs="Arial"/>
-                <w:bCs/>
-              </w:rPr>
-              <w:t xml:space="preserve"> %}</w:t>
-            </w:r>
           </w:p>
         </w:tc>
         <w:tc>
@@ -3621,38 +3507,10 @@
                 <w:rFonts w:ascii="Arial" w:eastAsia="Times New Roman" w:hAnsi="Arial" w:cs="Arial"/>
                 <w:bCs/>
               </w:rPr>
-              <w:t xml:space="preserve">{%tr for </w:t>
-            </w:r>
-            <w:r>
-              <w:rPr>
-                <w:rFonts w:ascii="Arial" w:eastAsia="Times New Roman" w:hAnsi="Arial" w:cs="Arial"/>
-                <w:bCs/>
-              </w:rPr>
-              <w:t>buyout</w:t>
-            </w:r>
-            <w:r>
-              <w:rPr>
-                <w:rFonts w:ascii="Arial" w:eastAsia="Times New Roman" w:hAnsi="Arial" w:cs="Arial"/>
-                <w:bCs/>
-              </w:rPr>
-              <w:t xml:space="preserve"> in </w:t>
+              <w:t>{%tr for buyout in fan_config.buyout_items %}</w:t>
             </w:r>
             <w:proofErr w:type="spellStart"/>
-            <w:r>
-              <w:rPr>
-                <w:rFonts w:ascii="Arial" w:eastAsia="Times New Roman" w:hAnsi="Arial" w:cs="Arial"/>
-                <w:bCs/>
-              </w:rPr>
-              <w:t>fan_config.buyout_items</w:t>
-            </w:r>
             <w:proofErr w:type="spellEnd"/>
-            <w:r>
-              <w:rPr>
-                <w:rFonts w:ascii="Arial" w:eastAsia="Times New Roman" w:hAnsi="Arial" w:cs="Arial"/>
-                <w:bCs/>
-              </w:rPr>
-              <w:t xml:space="preserve"> %}</w:t>
-            </w:r>
           </w:p>
         </w:tc>
         <w:tc>
@@ -3766,30 +3624,9 @@
                 <w:rFonts w:ascii="Arial" w:eastAsia="Times New Roman" w:hAnsi="Arial" w:cs="Arial"/>
                 <w:bCs/>
               </w:rPr>
-              <w:t xml:space="preserve">{{ </w:t>
-            </w:r>
-            <w:r>
-              <w:rPr>
-                <w:rFonts w:ascii="Arial" w:eastAsia="Times New Roman" w:hAnsi="Arial" w:cs="Arial"/>
-                <w:bCs/>
-              </w:rPr>
-              <w:t>buyout</w:t>
-            </w:r>
-            <w:r>
-              <w:rPr>
-                <w:rFonts w:ascii="Arial" w:eastAsia="Times New Roman" w:hAnsi="Arial" w:cs="Arial"/>
-                <w:bCs/>
-              </w:rPr>
-              <w:t>.name</w:t>
+              <w:t>{{ buyout.name }}</w:t>
             </w:r>
             <w:proofErr w:type="gramEnd"/>
-            <w:r>
-              <w:rPr>
-                <w:rFonts w:ascii="Arial" w:eastAsia="Times New Roman" w:hAnsi="Arial" w:cs="Arial"/>
-                <w:bCs/>
-              </w:rPr>
-              <w:t xml:space="preserve"> }}</w:t>
-            </w:r>
           </w:p>
         </w:tc>
         <w:tc>
@@ -3818,44 +3655,12 @@
                 <w:b/>
                 <w:bCs/>
               </w:rPr>
-              <w:t xml:space="preserve">R </w:t>
+              <w:t>R {{ buyout.unit_price }}</w:t>
             </w:r>
             <w:proofErr w:type="gramStart"/>
-            <w:r>
-              <w:rPr>
-                <w:rFonts w:ascii="Arial" w:eastAsia="Times New Roman" w:hAnsi="Arial" w:cs="Arial"/>
-                <w:b/>
-                <w:bCs/>
-              </w:rPr>
-              <w:t xml:space="preserve">{{ </w:t>
-            </w:r>
             <w:proofErr w:type="spellStart"/>
-            <w:r>
-              <w:rPr>
-                <w:rFonts w:ascii="Arial" w:eastAsia="Times New Roman" w:hAnsi="Arial" w:cs="Arial"/>
-                <w:b/>
-                <w:bCs/>
-              </w:rPr>
-              <w:t>buyout</w:t>
-            </w:r>
             <w:proofErr w:type="gramEnd"/>
-            <w:r>
-              <w:rPr>
-                <w:rFonts w:ascii="Arial" w:eastAsia="Times New Roman" w:hAnsi="Arial" w:cs="Arial"/>
-                <w:b/>
-                <w:bCs/>
-              </w:rPr>
-              <w:t>.unit_price</w:t>
-            </w:r>
             <w:proofErr w:type="spellEnd"/>
-            <w:r>
-              <w:rPr>
-                <w:rFonts w:ascii="Arial" w:eastAsia="Times New Roman" w:hAnsi="Arial" w:cs="Arial"/>
-                <w:b/>
-                <w:bCs/>
-              </w:rPr>
-              <w:t xml:space="preserve"> }}</w:t>
-            </w:r>
           </w:p>
         </w:tc>
         <w:tc>
@@ -3883,25 +3688,11 @@
                 <w:rFonts w:ascii="Arial" w:eastAsia="Times New Roman" w:hAnsi="Arial" w:cs="Arial"/>
                 <w:b/>
               </w:rPr>
-              <w:t xml:space="preserve">{{ </w:t>
+              <w:t>{{ buyout.qty }}</w:t>
             </w:r>
             <w:proofErr w:type="spellStart"/>
-            <w:r>
-              <w:rPr>
-                <w:rFonts w:ascii="Arial" w:eastAsia="Times New Roman" w:hAnsi="Arial" w:cs="Arial"/>
-                <w:b/>
-              </w:rPr>
-              <w:t>buyout.qty</w:t>
-            </w:r>
             <w:proofErr w:type="spellEnd"/>
             <w:proofErr w:type="gramEnd"/>
-            <w:r>
-              <w:rPr>
-                <w:rFonts w:ascii="Arial" w:eastAsia="Times New Roman" w:hAnsi="Arial" w:cs="Arial"/>
-                <w:b/>
-              </w:rPr>
-              <w:t xml:space="preserve"> }}</w:t>
-            </w:r>
           </w:p>
         </w:tc>
         <w:tc>
@@ -3928,40 +3719,12 @@
                 <w:rFonts w:ascii="Arial" w:eastAsia="Times New Roman" w:hAnsi="Arial" w:cs="Arial"/>
                 <w:b/>
               </w:rPr>
-              <w:t xml:space="preserve">R </w:t>
+              <w:t>R {{ buyout.total_price }}</w:t>
             </w:r>
             <w:proofErr w:type="gramStart"/>
-            <w:r>
-              <w:rPr>
-                <w:rFonts w:ascii="Arial" w:eastAsia="Times New Roman" w:hAnsi="Arial" w:cs="Arial"/>
-                <w:b/>
-              </w:rPr>
-              <w:t xml:space="preserve">{{ </w:t>
-            </w:r>
             <w:proofErr w:type="spellStart"/>
-            <w:r>
-              <w:rPr>
-                <w:rFonts w:ascii="Arial" w:eastAsia="Times New Roman" w:hAnsi="Arial" w:cs="Arial"/>
-                <w:b/>
-              </w:rPr>
-              <w:t>buyout</w:t>
-            </w:r>
             <w:proofErr w:type="gramEnd"/>
-            <w:r>
-              <w:rPr>
-                <w:rFonts w:ascii="Arial" w:eastAsia="Times New Roman" w:hAnsi="Arial" w:cs="Arial"/>
-                <w:b/>
-              </w:rPr>
-              <w:t>.total_price</w:t>
-            </w:r>
             <w:proofErr w:type="spellEnd"/>
-            <w:r>
-              <w:rPr>
-                <w:rFonts w:ascii="Arial" w:eastAsia="Times New Roman" w:hAnsi="Arial" w:cs="Arial"/>
-                <w:b/>
-              </w:rPr>
-              <w:t xml:space="preserve"> }}</w:t>
-            </w:r>
           </w:p>
         </w:tc>
       </w:tr>
@@ -4012,31 +3775,10 @@
                 <w:rFonts w:ascii="Arial" w:eastAsia="Times New Roman" w:hAnsi="Arial" w:cs="Arial"/>
                 <w:bCs/>
               </w:rPr>
-              <w:t>{</w:t>
-            </w:r>
-            <w:r>
-              <w:rPr>
-                <w:rFonts w:ascii="Arial" w:eastAsia="Times New Roman" w:hAnsi="Arial" w:cs="Arial"/>
-                <w:bCs/>
-              </w:rPr>
-              <w:t xml:space="preserve">%tr </w:t>
+              <w:t>{%tr endfor %}</w:t>
             </w:r>
             <w:proofErr w:type="spellStart"/>
-            <w:r>
-              <w:rPr>
-                <w:rFonts w:ascii="Arial" w:eastAsia="Times New Roman" w:hAnsi="Arial" w:cs="Arial"/>
-                <w:bCs/>
-              </w:rPr>
-              <w:t>endfor</w:t>
-            </w:r>
             <w:proofErr w:type="spellEnd"/>
-            <w:r>
-              <w:rPr>
-                <w:rFonts w:ascii="Arial" w:eastAsia="Times New Roman" w:hAnsi="Arial" w:cs="Arial"/>
-                <w:bCs/>
-              </w:rPr>
-              <w:t xml:space="preserve"> %}</w:t>
-            </w:r>
           </w:p>
         </w:tc>
         <w:tc>
@@ -4399,44 +4141,12 @@
                 <w:b/>
                 <w:color w:val="538135" w:themeColor="accent6" w:themeShade="BF"/>
               </w:rPr>
-              <w:t xml:space="preserve">R </w:t>
+              <w:t>R {{ grand_total_price }}</w:t>
             </w:r>
             <w:proofErr w:type="gramStart"/>
-            <w:r>
-              <w:rPr>
-                <w:rFonts w:ascii="Arial" w:eastAsia="Times New Roman" w:hAnsi="Arial" w:cs="Arial"/>
-                <w:b/>
-                <w:color w:val="538135" w:themeColor="accent6" w:themeShade="BF"/>
-              </w:rPr>
-              <w:t xml:space="preserve">{{ </w:t>
-            </w:r>
             <w:proofErr w:type="spellStart"/>
-            <w:r>
-              <w:rPr>
-                <w:rFonts w:ascii="Arial" w:eastAsia="Times New Roman" w:hAnsi="Arial" w:cs="Arial"/>
-                <w:b/>
-                <w:color w:val="538135" w:themeColor="accent6" w:themeShade="BF"/>
-              </w:rPr>
-              <w:t>grand</w:t>
-            </w:r>
             <w:proofErr w:type="gramEnd"/>
-            <w:r>
-              <w:rPr>
-                <w:rFonts w:ascii="Arial" w:eastAsia="Times New Roman" w:hAnsi="Arial" w:cs="Arial"/>
-                <w:b/>
-                <w:color w:val="538135" w:themeColor="accent6" w:themeShade="BF"/>
-              </w:rPr>
-              <w:t>_total_price</w:t>
-            </w:r>
             <w:proofErr w:type="spellEnd"/>
-            <w:r>
-              <w:rPr>
-                <w:rFonts w:ascii="Arial" w:eastAsia="Times New Roman" w:hAnsi="Arial" w:cs="Arial"/>
-                <w:b/>
-                <w:color w:val="538135" w:themeColor="accent6" w:themeShade="BF"/>
-              </w:rPr>
-              <w:t xml:space="preserve"> }}</w:t>
-            </w:r>
           </w:p>
         </w:tc>
       </w:tr>

</xml_diff>

<commit_message>
Fix Word export for multi-fan quantity and multi-config support
- Update subject line to list all fan config sizes (e.g. "915mm ×4, 762mm ×2 Auxiliary Fan")
- Replace "Fan Config X (xN)" label with "Config X (×N): 915mm Fan, 55.0kW, ..." in OFFER section
- Fix pricing table to use actual fan quantity for components, motor, and buyouts
- Multiply unit prices by quantity to compute correct total prices
- Add merged, shaded config header row in pricing table showing "Config N (×qty): fan_uid"
- Add config-level total row at bottom of each fan config section showing line_total
- Add config_number and subject_fan_sizes to template context

Co-Authored-By: Claude Opus 4.6 <noreply@anthropic.com>
</commit_message>
<xml_diff>
--- a/ui/templates/quote_template.docx
+++ b/ui/templates/quote_template.docx
@@ -41,16 +41,7 @@
           <w:sz w:val="36"/>
           <w:szCs w:val="36"/>
         </w:rPr>
-        <w:t>F</w:t>
-      </w:r>
-      <w:r>
-        <w:rPr>
-          <w:rFonts w:ascii="Arial" w:eastAsia="Times New Roman" w:hAnsi="Arial" w:cs="Arial"/>
-          <w:b/>
-          <w:sz w:val="36"/>
-          <w:szCs w:val="36"/>
-        </w:rPr>
-        <w:t>OR</w:t>
+        <w:t>FOR</w:t>
       </w:r>
     </w:p>
     <w:p>
@@ -68,7 +59,6 @@
           <w:b/>
         </w:rPr>
       </w:pPr>
-      <w:proofErr w:type="gramStart"/>
       <w:r>
         <w:rPr>
           <w:rFonts w:ascii="Arial" w:eastAsia="Times New Roman" w:hAnsi="Arial" w:cs="Arial"/>
@@ -76,75 +66,7 @@
           <w:sz w:val="36"/>
           <w:szCs w:val="36"/>
         </w:rPr>
-        <w:t>{{</w:t>
-      </w:r>
-      <w:r>
-        <w:rPr>
-          <w:rFonts w:ascii="Arial" w:eastAsia="Times New Roman" w:hAnsi="Arial" w:cs="Arial"/>
-          <w:b/>
-          <w:sz w:val="36"/>
-          <w:szCs w:val="36"/>
-        </w:rPr>
-        <w:t xml:space="preserve"> </w:t>
-      </w:r>
-      <w:proofErr w:type="spellStart"/>
-      <w:r>
-        <w:rPr>
-          <w:rFonts w:ascii="Arial" w:eastAsia="Times New Roman" w:hAnsi="Arial" w:cs="Arial"/>
-          <w:b/>
-          <w:sz w:val="36"/>
-          <w:szCs w:val="36"/>
-        </w:rPr>
-        <w:t>quote</w:t>
-      </w:r>
-      <w:proofErr w:type="gramEnd"/>
-      <w:r>
-        <w:rPr>
-          <w:rFonts w:ascii="Arial" w:eastAsia="Times New Roman" w:hAnsi="Arial" w:cs="Arial"/>
-          <w:b/>
-          <w:sz w:val="36"/>
-          <w:szCs w:val="36"/>
-        </w:rPr>
-        <w:t>_</w:t>
-      </w:r>
-      <w:proofErr w:type="gramStart"/>
-      <w:r>
-        <w:rPr>
-          <w:rFonts w:ascii="Arial" w:eastAsia="Times New Roman" w:hAnsi="Arial" w:cs="Arial"/>
-          <w:b/>
-          <w:sz w:val="36"/>
-          <w:szCs w:val="36"/>
-        </w:rPr>
-        <w:t>heading</w:t>
-      </w:r>
-      <w:proofErr w:type="spellEnd"/>
-      <w:r>
-        <w:rPr>
-          <w:rFonts w:ascii="Arial" w:eastAsia="Times New Roman" w:hAnsi="Arial" w:cs="Arial"/>
-          <w:b/>
-          <w:sz w:val="36"/>
-          <w:szCs w:val="36"/>
-        </w:rPr>
-        <w:t xml:space="preserve"> </w:t>
-      </w:r>
-      <w:r>
-        <w:rPr>
-          <w:rFonts w:ascii="Arial" w:eastAsia="Times New Roman" w:hAnsi="Arial" w:cs="Arial"/>
-          <w:b/>
-          <w:sz w:val="36"/>
-          <w:szCs w:val="36"/>
-        </w:rPr>
-        <w:t>}</w:t>
-      </w:r>
-      <w:proofErr w:type="gramEnd"/>
-      <w:r>
-        <w:rPr>
-          <w:rFonts w:ascii="Arial" w:eastAsia="Times New Roman" w:hAnsi="Arial" w:cs="Arial"/>
-          <w:b/>
-          <w:sz w:val="36"/>
-          <w:szCs w:val="36"/>
-        </w:rPr>
-        <w:t>}</w:t>
+        <w:t>{{ quote_heading }}</w:t>
       </w:r>
     </w:p>
     <w:p>
@@ -167,76 +89,8 @@
           <w:b/>
         </w:rPr>
         <w:t>To</w:t>
-      </w:r>
-      <w:r>
-        <w:rPr>
-          <w:rFonts w:ascii="Arial" w:eastAsia="Times New Roman" w:hAnsi="Arial" w:cs="Arial"/>
-          <w:b/>
-        </w:rPr>
         <w:tab/>
-        <w:t xml:space="preserve">: </w:t>
-      </w:r>
-      <w:proofErr w:type="gramStart"/>
-      <w:r>
-        <w:rPr>
-          <w:rFonts w:ascii="Arial" w:eastAsia="Times New Roman" w:hAnsi="Arial" w:cs="Arial"/>
-          <w:b/>
-        </w:rPr>
-        <w:t>{{</w:t>
-      </w:r>
-      <w:r>
-        <w:rPr>
-          <w:rFonts w:ascii="Arial" w:eastAsia="Times New Roman" w:hAnsi="Arial" w:cs="Arial"/>
-          <w:b/>
-        </w:rPr>
-        <w:t xml:space="preserve"> </w:t>
-      </w:r>
-      <w:proofErr w:type="spellStart"/>
-      <w:r>
-        <w:rPr>
-          <w:rFonts w:ascii="Arial" w:eastAsia="Times New Roman" w:hAnsi="Arial" w:cs="Arial"/>
-          <w:b/>
-        </w:rPr>
-        <w:t>client</w:t>
-      </w:r>
-      <w:proofErr w:type="gramEnd"/>
-      <w:r>
-        <w:rPr>
-          <w:rFonts w:ascii="Arial" w:eastAsia="Times New Roman" w:hAnsi="Arial" w:cs="Arial"/>
-          <w:b/>
-        </w:rPr>
-        <w:t>_</w:t>
-      </w:r>
-      <w:proofErr w:type="gramStart"/>
-      <w:r>
-        <w:rPr>
-          <w:rFonts w:ascii="Arial" w:eastAsia="Times New Roman" w:hAnsi="Arial" w:cs="Arial"/>
-          <w:b/>
-        </w:rPr>
-        <w:t>name</w:t>
-      </w:r>
-      <w:proofErr w:type="spellEnd"/>
-      <w:r>
-        <w:rPr>
-          <w:rFonts w:ascii="Arial" w:eastAsia="Times New Roman" w:hAnsi="Arial" w:cs="Arial"/>
-          <w:b/>
-        </w:rPr>
-        <w:t xml:space="preserve"> </w:t>
-      </w:r>
-      <w:r>
-        <w:rPr>
-          <w:rFonts w:ascii="Arial" w:eastAsia="Times New Roman" w:hAnsi="Arial" w:cs="Arial"/>
-          <w:b/>
-        </w:rPr>
-        <w:t>}</w:t>
-      </w:r>
-      <w:proofErr w:type="gramEnd"/>
-      <w:r>
-        <w:rPr>
-          <w:rFonts w:ascii="Arial" w:eastAsia="Times New Roman" w:hAnsi="Arial" w:cs="Arial"/>
-          <w:b/>
-        </w:rPr>
-        <w:t>}</w:t>
+        <w:t>: {{ client_name }}</w:t>
       </w:r>
     </w:p>
     <w:p>
@@ -260,83 +114,16 @@
           <w:b/>
         </w:rPr>
         <w:t>YOUR REF</w:t>
-      </w:r>
-      <w:r>
-        <w:rPr>
-          <w:rFonts w:ascii="Arial" w:eastAsia="Times New Roman" w:hAnsi="Arial" w:cs="Arial"/>
-          <w:b/>
-        </w:rPr>
         <w:tab/>
-        <w:t>:</w:t>
-      </w:r>
-      <w:r>
-        <w:rPr>
-          <w:rFonts w:ascii="Arial" w:eastAsia="Times New Roman" w:hAnsi="Arial" w:cs="Arial"/>
-          <w:b/>
-        </w:rPr>
-        <w:t xml:space="preserve"> </w:t>
-      </w:r>
-      <w:proofErr w:type="gramStart"/>
+        <w:t xml:space="preserve">: </w:t>
+      </w:r>
       <w:r>
         <w:rPr>
           <w:rFonts w:ascii="Arial" w:eastAsia="Times New Roman" w:hAnsi="Arial" w:cs="Arial"/>
           <w:b/>
           <w:bCs/>
         </w:rPr>
-        <w:t xml:space="preserve">{{ </w:t>
-      </w:r>
-      <w:proofErr w:type="spellStart"/>
-      <w:r>
-        <w:rPr>
-          <w:rFonts w:ascii="Arial" w:eastAsia="Times New Roman" w:hAnsi="Arial" w:cs="Arial"/>
-          <w:b/>
-          <w:bCs/>
-        </w:rPr>
-        <w:t>fan</w:t>
-      </w:r>
-      <w:proofErr w:type="gramEnd"/>
-      <w:r>
-        <w:rPr>
-          <w:rFonts w:ascii="Arial" w:eastAsia="Times New Roman" w:hAnsi="Arial" w:cs="Arial"/>
-          <w:b/>
-          <w:bCs/>
-        </w:rPr>
-        <w:t>_size_</w:t>
-      </w:r>
-      <w:proofErr w:type="gramStart"/>
-      <w:r>
-        <w:rPr>
-          <w:rFonts w:ascii="Arial" w:eastAsia="Times New Roman" w:hAnsi="Arial" w:cs="Arial"/>
-          <w:b/>
-          <w:bCs/>
-        </w:rPr>
-        <w:t>mm</w:t>
-      </w:r>
-      <w:proofErr w:type="spellEnd"/>
-      <w:r>
-        <w:rPr>
-          <w:rFonts w:ascii="Arial" w:eastAsia="Times New Roman" w:hAnsi="Arial" w:cs="Arial"/>
-          <w:b/>
-          <w:bCs/>
-        </w:rPr>
-        <w:t xml:space="preserve"> }}m</w:t>
-      </w:r>
-      <w:r>
-        <w:rPr>
-          <w:rFonts w:ascii="Arial" w:eastAsia="Times New Roman" w:hAnsi="Arial" w:cs="Arial"/>
-          <w:b/>
-          <w:bCs/>
-        </w:rPr>
-        <w:t>m</w:t>
-      </w:r>
-      <w:proofErr w:type="gramEnd"/>
-      <w:r>
-        <w:rPr>
-          <w:rFonts w:ascii="Arial" w:eastAsia="Times New Roman" w:hAnsi="Arial" w:cs="Arial"/>
-          <w:b/>
-          <w:bCs/>
-        </w:rPr>
-        <w:t xml:space="preserve"> Auxiliary Fan</w:t>
+        <w:t>{{ subject_fan_sizes }} Auxiliary Fan</w:t>
       </w:r>
     </w:p>
     <w:p>
@@ -359,76 +146,8 @@
           <w:b/>
         </w:rPr>
         <w:t>OUR REF</w:t>
-      </w:r>
-      <w:r>
-        <w:rPr>
-          <w:rFonts w:ascii="Arial" w:eastAsia="Times New Roman" w:hAnsi="Arial" w:cs="Arial"/>
-          <w:b/>
-        </w:rPr>
         <w:tab/>
-        <w:t xml:space="preserve">: </w:t>
-      </w:r>
-      <w:proofErr w:type="gramStart"/>
-      <w:r>
-        <w:rPr>
-          <w:rFonts w:ascii="Arial" w:eastAsia="Times New Roman" w:hAnsi="Arial" w:cs="Arial"/>
-          <w:b/>
-        </w:rPr>
-        <w:t>{{</w:t>
-      </w:r>
-      <w:r>
-        <w:rPr>
-          <w:rFonts w:ascii="Arial" w:eastAsia="Times New Roman" w:hAnsi="Arial" w:cs="Arial"/>
-          <w:b/>
-        </w:rPr>
-        <w:t xml:space="preserve"> </w:t>
-      </w:r>
-      <w:proofErr w:type="spellStart"/>
-      <w:r>
-        <w:rPr>
-          <w:rFonts w:ascii="Arial" w:eastAsia="Times New Roman" w:hAnsi="Arial" w:cs="Arial"/>
-          <w:b/>
-        </w:rPr>
-        <w:t>quote</w:t>
-      </w:r>
-      <w:proofErr w:type="gramEnd"/>
-      <w:r>
-        <w:rPr>
-          <w:rFonts w:ascii="Arial" w:eastAsia="Times New Roman" w:hAnsi="Arial" w:cs="Arial"/>
-          <w:b/>
-        </w:rPr>
-        <w:t>_</w:t>
-      </w:r>
-      <w:proofErr w:type="gramStart"/>
-      <w:r>
-        <w:rPr>
-          <w:rFonts w:ascii="Arial" w:eastAsia="Times New Roman" w:hAnsi="Arial" w:cs="Arial"/>
-          <w:b/>
-        </w:rPr>
-        <w:t>ref</w:t>
-      </w:r>
-      <w:proofErr w:type="spellEnd"/>
-      <w:r>
-        <w:rPr>
-          <w:rFonts w:ascii="Arial" w:eastAsia="Times New Roman" w:hAnsi="Arial" w:cs="Arial"/>
-          <w:b/>
-        </w:rPr>
-        <w:t xml:space="preserve"> </w:t>
-      </w:r>
-      <w:r>
-        <w:rPr>
-          <w:rFonts w:ascii="Arial" w:eastAsia="Times New Roman" w:hAnsi="Arial" w:cs="Arial"/>
-          <w:b/>
-        </w:rPr>
-        <w:t>}</w:t>
-      </w:r>
-      <w:proofErr w:type="gramEnd"/>
-      <w:r>
-        <w:rPr>
-          <w:rFonts w:ascii="Arial" w:eastAsia="Times New Roman" w:hAnsi="Arial" w:cs="Arial"/>
-          <w:b/>
-        </w:rPr>
-        <w:t>}</w:t>
+        <w:t>: {{ quote_ref }}</w:t>
       </w:r>
     </w:p>
     <w:p>
@@ -451,82 +170,8 @@
           <w:b/>
         </w:rPr>
         <w:t>DATE</w:t>
-      </w:r>
-      <w:r>
-        <w:rPr>
-          <w:rFonts w:ascii="Arial" w:eastAsia="Times New Roman" w:hAnsi="Arial" w:cs="Arial"/>
-          <w:b/>
-        </w:rPr>
         <w:tab/>
-        <w:t xml:space="preserve">: </w:t>
-      </w:r>
-      <w:proofErr w:type="gramStart"/>
-      <w:r>
-        <w:rPr>
-          <w:rFonts w:ascii="Arial" w:eastAsia="Times New Roman" w:hAnsi="Arial" w:cs="Arial"/>
-          <w:b/>
-        </w:rPr>
-        <w:t>{{</w:t>
-      </w:r>
-      <w:r>
-        <w:rPr>
-          <w:rFonts w:ascii="Arial" w:eastAsia="Times New Roman" w:hAnsi="Arial" w:cs="Arial"/>
-          <w:b/>
-        </w:rPr>
-        <w:t xml:space="preserve"> </w:t>
-      </w:r>
-      <w:proofErr w:type="spellStart"/>
-      <w:r>
-        <w:rPr>
-          <w:rFonts w:ascii="Arial" w:eastAsia="Times New Roman" w:hAnsi="Arial" w:cs="Arial"/>
-          <w:b/>
-        </w:rPr>
-        <w:t>quote</w:t>
-      </w:r>
-      <w:proofErr w:type="gramEnd"/>
-      <w:r>
-        <w:rPr>
-          <w:rFonts w:ascii="Arial" w:eastAsia="Times New Roman" w:hAnsi="Arial" w:cs="Arial"/>
-          <w:b/>
-        </w:rPr>
-        <w:t>_</w:t>
-      </w:r>
-      <w:proofErr w:type="gramStart"/>
-      <w:r>
-        <w:rPr>
-          <w:rFonts w:ascii="Arial" w:eastAsia="Times New Roman" w:hAnsi="Arial" w:cs="Arial"/>
-          <w:b/>
-        </w:rPr>
-        <w:t>date</w:t>
-      </w:r>
-      <w:proofErr w:type="spellEnd"/>
-      <w:r>
-        <w:rPr>
-          <w:rFonts w:ascii="Arial" w:eastAsia="Times New Roman" w:hAnsi="Arial" w:cs="Arial"/>
-          <w:b/>
-        </w:rPr>
-        <w:t xml:space="preserve"> </w:t>
-      </w:r>
-      <w:r>
-        <w:rPr>
-          <w:rFonts w:ascii="Arial" w:eastAsia="Times New Roman" w:hAnsi="Arial" w:cs="Arial"/>
-          <w:b/>
-        </w:rPr>
-        <w:t>}</w:t>
-      </w:r>
-      <w:proofErr w:type="gramEnd"/>
-      <w:r>
-        <w:rPr>
-          <w:rFonts w:ascii="Arial" w:eastAsia="Times New Roman" w:hAnsi="Arial" w:cs="Arial"/>
-          <w:b/>
-        </w:rPr>
-        <w:t>}</w:t>
-      </w:r>
-      <w:r>
-        <w:rPr>
-          <w:rFonts w:ascii="Arial" w:eastAsia="Times New Roman" w:hAnsi="Arial" w:cs="Arial"/>
-          <w:b/>
-        </w:rPr>
+        <w:t>: {{ quote_date }}</w:t>
         <w:tab/>
       </w:r>
     </w:p>
@@ -550,48 +195,12 @@
           <w:b/>
         </w:rPr>
         <w:t>No of Pages</w:t>
-      </w:r>
-      <w:r>
-        <w:rPr>
-          <w:rFonts w:ascii="Arial" w:eastAsia="Times New Roman" w:hAnsi="Arial" w:cs="Arial"/>
-          <w:b/>
-        </w:rPr>
         <w:tab/>
         <w:t xml:space="preserve">: 1 of </w:t>
-      </w:r>
-      <w:r>
-        <w:rPr>
-          <w:rFonts w:ascii="Arial" w:eastAsia="Times New Roman" w:hAnsi="Arial" w:cs="Arial"/>
-          <w:b/>
-        </w:rPr>
         <w:fldChar w:fldCharType="begin"/>
-      </w:r>
-      <w:r>
-        <w:rPr>
-          <w:rFonts w:ascii="Arial" w:eastAsia="Times New Roman" w:hAnsi="Arial" w:cs="Arial"/>
-          <w:b/>
-        </w:rPr>
         <w:instrText xml:space="preserve"> DOCPROPERTY  Pages  \* MERGEFORMAT </w:instrText>
-      </w:r>
-      <w:r>
-        <w:rPr>
-          <w:rFonts w:ascii="Arial" w:eastAsia="Times New Roman" w:hAnsi="Arial" w:cs="Arial"/>
-          <w:b/>
-        </w:rPr>
         <w:fldChar w:fldCharType="separate"/>
-      </w:r>
-      <w:r>
-        <w:rPr>
-          <w:rFonts w:ascii="Arial" w:eastAsia="Times New Roman" w:hAnsi="Arial" w:cs="Arial"/>
-          <w:b/>
-        </w:rPr>
         <w:t>4</w:t>
-      </w:r>
-      <w:r>
-        <w:rPr>
-          <w:rFonts w:ascii="Arial" w:eastAsia="Times New Roman" w:hAnsi="Arial" w:cs="Arial"/>
-          <w:b/>
-        </w:rPr>
         <w:fldChar w:fldCharType="end"/>
       </w:r>
     </w:p>
@@ -625,153 +234,17 @@
           <w:b/>
         </w:rPr>
         <w:t>SUBJECT</w:t>
-      </w:r>
-      <w:r>
-        <w:rPr>
-          <w:rFonts w:ascii="Arial" w:eastAsia="Times New Roman" w:hAnsi="Arial" w:cs="Arial"/>
-          <w:b/>
-        </w:rPr>
         <w:tab/>
-      </w:r>
-      <w:r>
-        <w:rPr>
-          <w:rFonts w:ascii="Arial" w:eastAsia="Times New Roman" w:hAnsi="Arial" w:cs="Arial"/>
-          <w:b/>
-        </w:rPr>
         <w:tab/>
         <w:t xml:space="preserve">: </w:t>
       </w:r>
-      <w:proofErr w:type="gramStart"/>
       <w:r>
         <w:rPr>
           <w:rFonts w:ascii="Arial" w:eastAsia="Times New Roman" w:hAnsi="Arial" w:cs="Arial"/>
           <w:b/>
           <w:bCs/>
         </w:rPr>
-        <w:t xml:space="preserve">{{ </w:t>
-      </w:r>
-      <w:proofErr w:type="spellStart"/>
-      <w:r>
-        <w:rPr>
-          <w:rFonts w:ascii="Arial" w:eastAsia="Times New Roman" w:hAnsi="Arial" w:cs="Arial"/>
-          <w:b/>
-          <w:bCs/>
-        </w:rPr>
-        <w:t>fan</w:t>
-      </w:r>
-      <w:proofErr w:type="gramEnd"/>
-      <w:r>
-        <w:rPr>
-          <w:rFonts w:ascii="Arial" w:eastAsia="Times New Roman" w:hAnsi="Arial" w:cs="Arial"/>
-          <w:b/>
-          <w:bCs/>
-        </w:rPr>
-        <w:t>_size_</w:t>
-      </w:r>
-      <w:proofErr w:type="gramStart"/>
-      <w:r>
-        <w:rPr>
-          <w:rFonts w:ascii="Arial" w:eastAsia="Times New Roman" w:hAnsi="Arial" w:cs="Arial"/>
-          <w:b/>
-          <w:bCs/>
-        </w:rPr>
-        <w:t>mm</w:t>
-      </w:r>
-      <w:proofErr w:type="spellEnd"/>
-      <w:r>
-        <w:rPr>
-          <w:rFonts w:ascii="Arial" w:eastAsia="Times New Roman" w:hAnsi="Arial" w:cs="Arial"/>
-          <w:b/>
-          <w:bCs/>
-        </w:rPr>
-        <w:t xml:space="preserve"> }}m</w:t>
-      </w:r>
-      <w:r>
-        <w:rPr>
-          <w:rFonts w:ascii="Arial" w:eastAsia="Times New Roman" w:hAnsi="Arial" w:cs="Arial"/>
-          <w:b/>
-          <w:bCs/>
-        </w:rPr>
-        <w:t>m</w:t>
-      </w:r>
-      <w:proofErr w:type="gramEnd"/>
-      <w:r>
-        <w:rPr>
-          <w:rFonts w:ascii="Arial" w:eastAsia="Times New Roman" w:hAnsi="Arial" w:cs="Arial"/>
-          <w:b/>
-          <w:bCs/>
-        </w:rPr>
-        <w:t xml:space="preserve"> Auxiliary Fan </w:t>
-      </w:r>
-      <w:r>
-        <w:rPr>
-          <w:rFonts w:ascii="Arial" w:eastAsia="Times New Roman" w:hAnsi="Arial" w:cs="Arial"/>
-          <w:b/>
-          <w:bCs/>
-        </w:rPr>
-        <w:t xml:space="preserve">– </w:t>
-      </w:r>
-      <w:proofErr w:type="gramStart"/>
-      <w:r>
-        <w:rPr>
-          <w:rFonts w:ascii="Arial" w:eastAsia="Times New Roman" w:hAnsi="Arial" w:cs="Arial"/>
-          <w:b/>
-          <w:bCs/>
-        </w:rPr>
-        <w:t xml:space="preserve">{{ </w:t>
-      </w:r>
-      <w:proofErr w:type="spellStart"/>
-      <w:r>
-        <w:rPr>
-          <w:rFonts w:ascii="Arial" w:eastAsia="Times New Roman" w:hAnsi="Arial" w:cs="Arial"/>
-          <w:b/>
-          <w:bCs/>
-        </w:rPr>
-        <w:t>pro</w:t>
-      </w:r>
-      <w:r>
-        <w:rPr>
-          <w:rFonts w:ascii="Arial" w:eastAsia="Times New Roman" w:hAnsi="Arial" w:cs="Arial"/>
-          <w:b/>
-          <w:bCs/>
-        </w:rPr>
-        <w:t>ject</w:t>
-      </w:r>
-      <w:proofErr w:type="gramEnd"/>
-      <w:r>
-        <w:rPr>
-          <w:rFonts w:ascii="Arial" w:eastAsia="Times New Roman" w:hAnsi="Arial" w:cs="Arial"/>
-          <w:b/>
-          <w:bCs/>
-        </w:rPr>
-        <w:t>_</w:t>
-      </w:r>
-      <w:proofErr w:type="gramStart"/>
-      <w:r>
-        <w:rPr>
-          <w:rFonts w:ascii="Arial" w:eastAsia="Times New Roman" w:hAnsi="Arial" w:cs="Arial"/>
-          <w:b/>
-          <w:bCs/>
-        </w:rPr>
-        <w:t>location</w:t>
-      </w:r>
-      <w:proofErr w:type="spellEnd"/>
-      <w:r>
-        <w:rPr>
-          <w:rFonts w:ascii="Arial" w:eastAsia="Times New Roman" w:hAnsi="Arial" w:cs="Arial"/>
-          <w:b/>
-          <w:bCs/>
-        </w:rPr>
-        <w:t xml:space="preserve"> }</w:t>
-      </w:r>
-      <w:proofErr w:type="gramEnd"/>
-      <w:r>
-        <w:rPr>
-          <w:rFonts w:ascii="Arial" w:eastAsia="Times New Roman" w:hAnsi="Arial" w:cs="Arial"/>
-          <w:b/>
-          <w:bCs/>
-        </w:rPr>
-        <w:t>}</w:t>
+        <w:t>{{ subject_fan_sizes }} Auxiliary Fan – {{ project_location }}</w:t>
       </w:r>
     </w:p>
     <w:p>
@@ -803,77 +276,14 @@
           <w:b/>
           <w:bCs/>
         </w:rPr>
-        <w:t>Dear</w:t>
-      </w:r>
-      <w:r>
-        <w:rPr>
-          <w:rFonts w:ascii="Arial" w:eastAsia="Times New Roman" w:hAnsi="Arial" w:cs="Arial"/>
-          <w:b/>
-          <w:bCs/>
-        </w:rPr>
-        <w:t xml:space="preserve"> </w:t>
-      </w:r>
-      <w:proofErr w:type="gramStart"/>
-      <w:r>
-        <w:rPr>
-          <w:rFonts w:ascii="Arial" w:eastAsia="Times New Roman" w:hAnsi="Arial" w:cs="Arial"/>
-          <w:b/>
-        </w:rPr>
-        <w:t>{{</w:t>
-      </w:r>
-      <w:r>
-        <w:rPr>
-          <w:rFonts w:ascii="Arial" w:eastAsia="Times New Roman" w:hAnsi="Arial" w:cs="Arial"/>
-          <w:b/>
-        </w:rPr>
-        <w:t xml:space="preserve"> </w:t>
-      </w:r>
-      <w:proofErr w:type="spellStart"/>
-      <w:r>
-        <w:rPr>
-          <w:rFonts w:ascii="Arial" w:eastAsia="Times New Roman" w:hAnsi="Arial" w:cs="Arial"/>
-          <w:b/>
-        </w:rPr>
-        <w:t>client</w:t>
-      </w:r>
-      <w:proofErr w:type="gramEnd"/>
-      <w:r>
-        <w:rPr>
-          <w:rFonts w:ascii="Arial" w:eastAsia="Times New Roman" w:hAnsi="Arial" w:cs="Arial"/>
-          <w:b/>
-        </w:rPr>
-        <w:t>_</w:t>
-      </w:r>
-      <w:proofErr w:type="gramStart"/>
-      <w:r>
-        <w:rPr>
-          <w:rFonts w:ascii="Arial" w:eastAsia="Times New Roman" w:hAnsi="Arial" w:cs="Arial"/>
-          <w:b/>
-        </w:rPr>
-        <w:t>name</w:t>
-      </w:r>
-      <w:proofErr w:type="spellEnd"/>
-      <w:r>
-        <w:rPr>
-          <w:rFonts w:ascii="Arial" w:eastAsia="Times New Roman" w:hAnsi="Arial" w:cs="Arial"/>
-          <w:b/>
-        </w:rPr>
-        <w:t xml:space="preserve"> </w:t>
-      </w:r>
-      <w:r>
-        <w:rPr>
-          <w:rFonts w:ascii="Arial" w:eastAsia="Times New Roman" w:hAnsi="Arial" w:cs="Arial"/>
-          <w:b/>
-        </w:rPr>
-        <w:t>}</w:t>
-      </w:r>
-      <w:proofErr w:type="gramEnd"/>
-      <w:r>
-        <w:rPr>
-          <w:rFonts w:ascii="Arial" w:eastAsia="Times New Roman" w:hAnsi="Arial" w:cs="Arial"/>
-          <w:b/>
-        </w:rPr>
-        <w:t>}</w:t>
+        <w:t xml:space="preserve">Dear </w:t>
+      </w:r>
+      <w:r>
+        <w:rPr>
+          <w:rFonts w:ascii="Arial" w:eastAsia="Times New Roman" w:hAnsi="Arial" w:cs="Arial"/>
+          <w:b/>
+        </w:rPr>
+        <w:t>{{ client_name }}</w:t>
       </w:r>
       <w:r>
         <w:rPr>
@@ -905,25 +315,7 @@
         <w:rPr>
           <w:rFonts w:ascii="Arial" w:eastAsia="Times New Roman" w:hAnsi="Arial" w:cs="Arial"/>
         </w:rPr>
-        <w:t xml:space="preserve">We sincerely appreciate your valued </w:t>
-      </w:r>
-      <w:r>
-        <w:rPr>
-          <w:rFonts w:ascii="Arial" w:eastAsia="Times New Roman" w:hAnsi="Arial" w:cs="Arial"/>
-        </w:rPr>
-        <w:t>enquiry,</w:t>
-      </w:r>
-      <w:r>
-        <w:rPr>
-          <w:rFonts w:ascii="Arial" w:eastAsia="Times New Roman" w:hAnsi="Arial" w:cs="Arial"/>
-        </w:rPr>
-        <w:t xml:space="preserve"> and </w:t>
-      </w:r>
-      <w:r>
-        <w:rPr>
-          <w:rFonts w:ascii="Arial" w:eastAsia="Times New Roman" w:hAnsi="Arial" w:cs="Arial"/>
-        </w:rPr>
-        <w:t>it is with great pleasure that we submit our comprehensive proposal as outlined below, carefully prepared to address your requirements and objectives.</w:t>
+        <w:t>We sincerely appreciate your valued enquiry, and it is with great pleasure that we submit our comprehensive proposal as outlined below, carefully prepared to address your requirements and objectives.</w:t>
       </w:r>
     </w:p>
     <w:p>
@@ -1001,30 +393,6 @@
     </w:p>
     <w:p>
       <w:pPr>
-        <w:pStyle w:val="List Paragraph"/>
-      </w:pPr>
-      <w:r>
-        <w:t xml:space="preserve">{%p if is_multi_config %}</w:t>
-      </w:r>
-    </w:p>
-    <w:p>
-      <w:pPr>
-        <w:pStyle w:val="List Paragraph"/>
-      </w:pPr>
-      <w:r>
-        <w:t xml:space="preserve">{{ fan_config.label }}{% if fan_config.quantity &gt; 1 %} (x{{ fan_config.quantity }}){% endif %}</w:t>
-      </w:r>
-    </w:p>
-    <w:p>
-      <w:pPr>
-        <w:pStyle w:val="List Paragraph"/>
-      </w:pPr>
-      <w:r>
-        <w:t xml:space="preserve">{%p endif %}</w:t>
-      </w:r>
-    </w:p>
-    <w:p>
-      <w:pPr>
         <w:pStyle w:val="ListParagraph"/>
         <w:numPr>
           <w:ilvl w:val="0"/>
@@ -1046,26 +414,8 @@
           <w:bCs/>
           <w:u w:val="single"/>
         </w:rPr>
-        <w:t>(1 Unit) – {{ fan_config.fan_size_mm }}mm Fan, {{ fan_config.motor_output }}kW, {{ fan_config.motor_pole }}-pole, 525V Auxiliary Fan:</w:t>
-      </w:r>
-      <w:proofErr w:type="gramStart"/>
-      <w:proofErr w:type="spellStart"/>
-      <w:proofErr w:type="gramEnd"/>
-      <w:proofErr w:type="gramStart"/>
-      <w:proofErr w:type="spellEnd"/>
-      <w:proofErr w:type="gramEnd"/>
-      <w:proofErr w:type="gramStart"/>
-      <w:proofErr w:type="spellStart"/>
-      <w:proofErr w:type="gramEnd"/>
-      <w:proofErr w:type="gramStart"/>
-      <w:proofErr w:type="spellEnd"/>
-      <w:proofErr w:type="gramEnd"/>
-      <w:proofErr w:type="gramStart"/>
-      <w:proofErr w:type="spellStart"/>
-      <w:proofErr w:type="gramEnd"/>
-      <w:proofErr w:type="gramStart"/>
-      <w:proofErr w:type="spellEnd"/>
-      <w:proofErr w:type="gramEnd"/>
+        <w:t>Config {{ fan_config.config_number }} (×{{ fan_config.quantity }}): {{ fan_config.fan_size_mm }}mm Fan, {{ fan_config.motor_output }}kW, {{ fan_config.motor_pole }}-pole, 525V Auxiliary Fan:</w:t>
+      </w:r>
     </w:p>
     <w:p>
       <w:pPr>
@@ -1092,16 +442,7 @@
           <w:bCs/>
           <w:u w:val="single"/>
         </w:rPr>
-        <w:t>Fan Specification</w:t>
-      </w:r>
-      <w:r>
-        <w:rPr>
-          <w:rFonts w:ascii="Arial" w:eastAsia="Times New Roman" w:hAnsi="Arial" w:cs="Arial"/>
-          <w:b/>
-          <w:bCs/>
-          <w:u w:val="single"/>
-        </w:rPr>
-        <w:t xml:space="preserve">:  </w:t>
+        <w:t xml:space="preserve">Fan Specification:  </w:t>
       </w:r>
     </w:p>
     <w:p>
@@ -1130,12 +471,6 @@
         </w:rPr>
         <w:t>Fan Model: {{ fan_config.fan_uid }}</w:t>
       </w:r>
-      <w:proofErr w:type="gramStart"/>
-      <w:proofErr w:type="spellStart"/>
-      <w:proofErr w:type="gramEnd"/>
-      <w:proofErr w:type="gramStart"/>
-      <w:proofErr w:type="spellEnd"/>
-      <w:proofErr w:type="gramEnd"/>
     </w:p>
     <w:p>
       <w:pPr>
@@ -1163,12 +498,6 @@
         </w:rPr>
         <w:t>Fan Size: {{ fan_config.fan_size_mm }}mm</w:t>
       </w:r>
-      <w:proofErr w:type="gramStart"/>
-      <w:proofErr w:type="spellStart"/>
-      <w:proofErr w:type="gramEnd"/>
-      <w:proofErr w:type="gramStart"/>
-      <w:proofErr w:type="spellEnd"/>
-      <w:proofErr w:type="gramEnd"/>
     </w:p>
     <w:p>
       <w:pPr>
@@ -1196,12 +525,6 @@
         </w:rPr>
         <w:t>Blade Sets: {{ fan_config.blade_sets }}</w:t>
       </w:r>
-      <w:proofErr w:type="gramStart"/>
-      <w:proofErr w:type="spellStart"/>
-      <w:proofErr w:type="gramEnd"/>
-      <w:proofErr w:type="gramStart"/>
-      <w:proofErr w:type="spellEnd"/>
-      <w:proofErr w:type="gramEnd"/>
     </w:p>
     <w:p>
       <w:pPr>
@@ -1363,14 +686,12 @@
           <w:rFonts w:ascii="Arial" w:eastAsia="Times New Roman" w:hAnsi="Arial" w:cs="Arial"/>
         </w:rPr>
       </w:pPr>
-      <w:proofErr w:type="gramStart"/>
       <w:r>
         <w:rPr>
           <w:rFonts w:ascii="Arial" w:eastAsia="Times New Roman" w:hAnsi="Arial" w:cs="Arial"/>
         </w:rPr>
         <w:t>{{ comp.name }}</w:t>
       </w:r>
-      <w:proofErr w:type="gramEnd"/>
     </w:p>
     <w:p>
       <w:pPr>
@@ -1398,8 +719,6 @@
         </w:rPr>
         <w:t>{%p endfor %}</w:t>
       </w:r>
-      <w:proofErr w:type="spellStart"/>
-      <w:proofErr w:type="spellEnd"/>
     </w:p>
     <w:p>
       <w:pPr>
@@ -1423,12 +742,6 @@
         </w:rPr>
         <w:t>Mass of all mechanical components (excluding motor): {{ fan_config.total_mass_kg }}kg</w:t>
       </w:r>
-      <w:proofErr w:type="gramStart"/>
-      <w:proofErr w:type="spellStart"/>
-      <w:proofErr w:type="gramEnd"/>
-      <w:proofErr w:type="gramStart"/>
-      <w:proofErr w:type="spellEnd"/>
-      <w:proofErr w:type="gramEnd"/>
     </w:p>
     <w:p>
       <w:pPr>
@@ -1452,12 +765,6 @@
         </w:rPr>
         <w:t>Total length of all mechanical components: {{ fan_config.total_length }}mm</w:t>
       </w:r>
-      <w:proofErr w:type="gramStart"/>
-      <w:proofErr w:type="spellStart"/>
-      <w:proofErr w:type="gramEnd"/>
-      <w:proofErr w:type="gramStart"/>
-      <w:proofErr w:type="spellEnd"/>
-      <w:proofErr w:type="gramEnd"/>
     </w:p>
     <w:p>
       <w:pPr>
@@ -1554,13 +861,7 @@
         <w:t>Power: {{ fan_config.motor_output }}kW</w:t>
       </w:r>
       <w:bookmarkStart w:id="2" w:name="_Hlk210293638"/>
-      <w:proofErr w:type="gramStart"/>
-      <w:proofErr w:type="spellStart"/>
-      <w:proofErr w:type="gramEnd"/>
-      <w:proofErr w:type="gramStart"/>
-      <w:proofErr w:type="spellEnd"/>
       <w:bookmarkEnd w:id="2"/>
-      <w:proofErr w:type="gramEnd"/>
     </w:p>
     <w:p>
       <w:pPr>
@@ -1588,12 +889,6 @@
         </w:rPr>
         <w:t xml:space="preserve">Efficiency: {{ fan_config.motor_product_range }} </w:t>
       </w:r>
-      <w:proofErr w:type="gramStart"/>
-      <w:proofErr w:type="spellStart"/>
-      <w:proofErr w:type="gramEnd"/>
-      <w:proofErr w:type="gramStart"/>
-      <w:proofErr w:type="spellEnd"/>
-      <w:proofErr w:type="gramEnd"/>
     </w:p>
     <w:p>
       <w:pPr>
@@ -1622,19 +917,7 @@
         <w:t xml:space="preserve">Speed: {{ fan_config.motor_pole }}-pole (synchronous speed ~ {{ fan_config.motor_speed }}RPM @50 Hz)  </w:t>
       </w:r>
       <w:bookmarkStart w:id="3" w:name="_Hlk210293681"/>
-      <w:proofErr w:type="gramStart"/>
-      <w:proofErr w:type="spellStart"/>
-      <w:proofErr w:type="gramEnd"/>
-      <w:proofErr w:type="gramStart"/>
-      <w:proofErr w:type="spellEnd"/>
-      <w:proofErr w:type="gramEnd"/>
       <w:bookmarkEnd w:id="3"/>
-      <w:proofErr w:type="gramStart"/>
-      <w:proofErr w:type="spellStart"/>
-      <w:proofErr w:type="gramEnd"/>
-      <w:proofErr w:type="gramStart"/>
-      <w:proofErr w:type="spellEnd"/>
-      <w:proofErr w:type="gramEnd"/>
     </w:p>
     <w:p>
       <w:pPr>
@@ -1660,25 +943,7 @@
         <w:rPr>
           <w:rFonts w:ascii="Arial" w:eastAsia="Times New Roman" w:hAnsi="Arial" w:cs="Arial"/>
         </w:rPr>
-        <w:t xml:space="preserve">Voltage: </w:t>
-      </w:r>
-      <w:r>
-        <w:rPr>
-          <w:rFonts w:ascii="Arial" w:eastAsia="Times New Roman" w:hAnsi="Arial" w:cs="Arial"/>
-        </w:rPr>
-        <w:t>5</w:t>
-      </w:r>
-      <w:r>
-        <w:rPr>
-          <w:rFonts w:ascii="Arial" w:eastAsia="Times New Roman" w:hAnsi="Arial" w:cs="Arial"/>
-        </w:rPr>
-        <w:t>25</w:t>
-      </w:r>
-      <w:r>
-        <w:rPr>
-          <w:rFonts w:ascii="Arial" w:eastAsia="Times New Roman" w:hAnsi="Arial" w:cs="Arial"/>
-        </w:rPr>
-        <w:t>V</w:t>
+        <w:t>Voltage: 525V</w:t>
       </w:r>
     </w:p>
     <w:p>
@@ -1869,23 +1134,7 @@
           <w:rFonts w:ascii="Arial" w:eastAsia="Times New Roman" w:hAnsi="Arial" w:cs="Arial"/>
           <w:bCs/>
         </w:rPr>
-        <w:t xml:space="preserve">Welding procedures will not form part of the data </w:t>
-      </w:r>
-      <w:proofErr w:type="gramStart"/>
-      <w:r>
-        <w:rPr>
-          <w:rFonts w:ascii="Arial" w:eastAsia="Times New Roman" w:hAnsi="Arial" w:cs="Arial"/>
-          <w:bCs/>
-        </w:rPr>
-        <w:t>book, but</w:t>
-      </w:r>
-      <w:proofErr w:type="gramEnd"/>
-      <w:r>
-        <w:rPr>
-          <w:rFonts w:ascii="Arial" w:eastAsia="Times New Roman" w:hAnsi="Arial" w:cs="Arial"/>
-          <w:bCs/>
-        </w:rPr>
-        <w:t xml:space="preserve"> will be available upon request for review / amendment at our factory.</w:t>
+        <w:t>Welding procedures will not form part of the data book, but will be available upon request for review / amendment at our factory.</w:t>
       </w:r>
     </w:p>
     <w:p>
@@ -2099,15 +1348,7 @@
           <w:b/>
           <w:u w:val="single"/>
         </w:rPr>
-        <w:t>P</w:t>
-      </w:r>
-      <w:r>
-        <w:rPr>
-          <w:rFonts w:ascii="Arial" w:eastAsia="Times New Roman" w:hAnsi="Arial" w:cs="Arial"/>
-          <w:b/>
-          <w:u w:val="single"/>
-        </w:rPr>
-        <w:t>ricing</w:t>
+        <w:t>Pricing</w:t>
       </w:r>
       <w:bookmarkEnd w:id="0"/>
       <w:r>
@@ -2322,24 +1563,39 @@
         </w:tc>
       </w:tr>
       <w:tr>
-        <w:tc>
+        <w:trPr>
+          <w:trHeight w:val="70"/>
+        </w:trPr>
+        <w:tc>
+          <w:tcPr>
+            <w:tcW w:w="9785" w:type="dxa"/>
+            <w:gridSpan w:val="5"/>
+            <w:tcBorders>
+              <w:top w:val="single" w:sz="4" w:space="0" w:color="000000"/>
+              <w:left w:val="single" w:sz="4" w:space="0" w:color="000000"/>
+              <w:bottom w:val="single" w:sz="4" w:space="0" w:color="000000"/>
+              <w:right w:val="single" w:sz="4" w:space="0" w:color="000000"/>
+            </w:tcBorders>
+            <w:shd w:val="clear" w:color="auto" w:fill="D9E2F3" w:themeFill="accent1" w:themeFillTint="33"/>
+          </w:tcPr>
           <w:p>
+            <w:pPr>
+              <w:spacing w:after="0" w:line="240" w:lineRule="auto"/>
+              <w:rPr>
+                <w:rFonts w:ascii="Arial" w:eastAsia="Times New Roman" w:hAnsi="Arial" w:cs="Arial"/>
+                <w:b/>
+                <w:bCs/>
+              </w:rPr>
+            </w:pPr>
             <w:r>
-              <w:t xml:space="preserve">{{ fan_config.label }}{% if fan_config.quantity &gt; 1 %} (x{{ fan_config.quantity }}){% endif %}</w:t>
+              <w:rPr>
+                <w:rFonts w:ascii="Arial" w:eastAsia="Times New Roman" w:hAnsi="Arial" w:cs="Arial"/>
+                <w:b/>
+                <w:bCs/>
+              </w:rPr>
+              <w:t>Config {{ fan_config.config_number }} (×{{ fan_config.quantity }}): {{ fan_config.fan_uid }}</w:t>
             </w:r>
           </w:p>
-        </w:tc>
-        <w:tc>
-          <w:p/>
-        </w:tc>
-        <w:tc>
-          <w:p/>
-        </w:tc>
-        <w:tc>
-          <w:p/>
-        </w:tc>
-        <w:tc>
-          <w:p/>
         </w:tc>
       </w:tr>
       <w:tr>
@@ -2424,18 +1680,12 @@
                 <w:bCs/>
               </w:rPr>
             </w:pPr>
-            <w:proofErr w:type="gramStart"/>
             <w:r>
               <w:rPr>
                 <w:rFonts w:ascii="Arial" w:eastAsia="Times New Roman" w:hAnsi="Arial" w:cs="Arial"/>
               </w:rPr>
               <w:t>{{ fan_config.fan_size_mm }}mm Diameter auxiliary fan that includes rotor assembly with a variable pitch rotor and additional selected mechanical components.</w:t>
             </w:r>
-            <w:proofErr w:type="spellStart"/>
-            <w:proofErr w:type="gramEnd"/>
-            <w:proofErr w:type="gramStart"/>
-            <w:proofErr w:type="spellEnd"/>
-            <w:proofErr w:type="gramEnd"/>
           </w:p>
         </w:tc>
         <w:tc>
@@ -2557,8 +1807,6 @@
               </w:rPr>
               <w:t>{%tr for comp in fan_config.component_pricing %}</w:t>
             </w:r>
-            <w:proofErr w:type="spellStart"/>
-            <w:proofErr w:type="spellEnd"/>
           </w:p>
         </w:tc>
         <w:tc>
@@ -2668,7 +1916,6 @@
                 <w:bCs/>
               </w:rPr>
             </w:pPr>
-            <w:proofErr w:type="gramStart"/>
             <w:r>
               <w:rPr>
                 <w:rFonts w:ascii="Arial" w:eastAsia="Times New Roman" w:hAnsi="Arial" w:cs="Arial"/>
@@ -2676,7 +1923,6 @@
               </w:rPr>
               <w:t>{{ comp.name }}</w:t>
             </w:r>
-            <w:proofErr w:type="gramEnd"/>
           </w:p>
         </w:tc>
         <w:tc>
@@ -2705,10 +1951,6 @@
               </w:rPr>
               <w:t>R {{ comp.unit_price }}</w:t>
             </w:r>
-            <w:proofErr w:type="gramStart"/>
-            <w:proofErr w:type="spellStart"/>
-            <w:proofErr w:type="gramEnd"/>
-            <w:proofErr w:type="spellEnd"/>
           </w:p>
         </w:tc>
         <w:tc>
@@ -2730,7 +1972,6 @@
                 <w:b/>
               </w:rPr>
             </w:pPr>
-            <w:proofErr w:type="gramStart"/>
             <w:r>
               <w:rPr>
                 <w:rFonts w:ascii="Arial" w:eastAsia="Times New Roman" w:hAnsi="Arial" w:cs="Arial"/>
@@ -2738,9 +1979,6 @@
               </w:rPr>
               <w:t>{{ comp.qty }}</w:t>
             </w:r>
-            <w:proofErr w:type="spellStart"/>
-            <w:proofErr w:type="spellEnd"/>
-            <w:proofErr w:type="gramEnd"/>
           </w:p>
         </w:tc>
         <w:tc>
@@ -2769,10 +2007,6 @@
               </w:rPr>
               <w:t>R {{ comp.total_price }}</w:t>
             </w:r>
-            <w:proofErr w:type="gramStart"/>
-            <w:proofErr w:type="spellStart"/>
-            <w:proofErr w:type="gramEnd"/>
-            <w:proofErr w:type="spellEnd"/>
           </w:p>
         </w:tc>
       </w:tr>
@@ -2826,8 +2060,6 @@
               </w:rPr>
               <w:t>{%tr endfor %}</w:t>
             </w:r>
-            <w:proofErr w:type="spellStart"/>
-            <w:proofErr w:type="spellEnd"/>
           </w:p>
         </w:tc>
         <w:tc>
@@ -2964,15 +2196,7 @@
                 <w:b/>
                 <w:color w:val="2F5496" w:themeColor="accent1" w:themeShade="BF"/>
               </w:rPr>
-              <w:t>S</w:t>
-            </w:r>
-            <w:r>
-              <w:rPr>
-                <w:rFonts w:ascii="Arial" w:eastAsia="Times New Roman" w:hAnsi="Arial" w:cs="Arial"/>
-                <w:b/>
-                <w:color w:val="2F5496" w:themeColor="accent1" w:themeShade="BF"/>
-              </w:rPr>
-              <w:t>UBTOTAL</w:t>
+              <w:t>SUBTOTAL</w:t>
             </w:r>
           </w:p>
         </w:tc>
@@ -3033,10 +2257,6 @@
               </w:rPr>
               <w:t>R {{ fan_config.component_subtotal }}</w:t>
             </w:r>
-            <w:proofErr w:type="gramStart"/>
-            <w:proofErr w:type="spellStart"/>
-            <w:proofErr w:type="gramEnd"/>
-            <w:proofErr w:type="spellEnd"/>
           </w:p>
         </w:tc>
       </w:tr>
@@ -3212,24 +2432,12 @@
                 <w:rFonts w:ascii="Arial" w:eastAsia="Times New Roman" w:hAnsi="Arial" w:cs="Arial"/>
               </w:rPr>
             </w:pPr>
-            <w:proofErr w:type="gramStart"/>
             <w:r>
               <w:rPr>
                 <w:rFonts w:ascii="Arial" w:eastAsia="Times New Roman" w:hAnsi="Arial" w:cs="Arial"/>
               </w:rPr>
               <w:t>{{ fan_config.motor_output }}kW, {{ fan_config.motor_pole }}-pole, 525V, I.E.3. Motor</w:t>
             </w:r>
-            <w:proofErr w:type="spellStart"/>
-            <w:proofErr w:type="gramEnd"/>
-            <w:proofErr w:type="gramStart"/>
-            <w:proofErr w:type="spellEnd"/>
-            <w:proofErr w:type="gramEnd"/>
-            <w:proofErr w:type="gramStart"/>
-            <w:proofErr w:type="spellStart"/>
-            <w:proofErr w:type="gramEnd"/>
-            <w:proofErr w:type="gramStart"/>
-            <w:proofErr w:type="spellEnd"/>
-            <w:proofErr w:type="gramEnd"/>
           </w:p>
         </w:tc>
         <w:tc>
@@ -3259,10 +2467,6 @@
               </w:rPr>
               <w:t>R {{ fan_config.motor_unit_price }}</w:t>
             </w:r>
-            <w:proofErr w:type="gramStart"/>
-            <w:proofErr w:type="spellStart"/>
-            <w:proofErr w:type="gramEnd"/>
-            <w:proofErr w:type="spellEnd"/>
           </w:p>
         </w:tc>
         <w:tc>
@@ -3284,7 +2488,6 @@
                 <w:b/>
               </w:rPr>
             </w:pPr>
-            <w:proofErr w:type="gramStart"/>
             <w:r>
               <w:rPr>
                 <w:rFonts w:ascii="Arial" w:eastAsia="Times New Roman" w:hAnsi="Arial" w:cs="Arial"/>
@@ -3292,9 +2495,6 @@
               </w:rPr>
               <w:t>{{ fan_config.motor_qty }}</w:t>
             </w:r>
-            <w:proofErr w:type="spellStart"/>
-            <w:proofErr w:type="gramEnd"/>
-            <w:proofErr w:type="spellEnd"/>
           </w:p>
         </w:tc>
         <w:tc>
@@ -3323,10 +2523,6 @@
               </w:rPr>
               <w:t>R {{ fan_config.motor_total_price }}</w:t>
             </w:r>
-            <w:proofErr w:type="gramStart"/>
-            <w:proofErr w:type="spellStart"/>
-            <w:proofErr w:type="gramEnd"/>
-            <w:proofErr w:type="spellEnd"/>
           </w:p>
         </w:tc>
       </w:tr>
@@ -3509,8 +2705,6 @@
               </w:rPr>
               <w:t>{%tr for buyout in fan_config.buyout_items %}</w:t>
             </w:r>
-            <w:proofErr w:type="spellStart"/>
-            <w:proofErr w:type="spellEnd"/>
           </w:p>
         </w:tc>
         <w:tc>
@@ -3618,7 +2812,6 @@
                 <w:rFonts w:ascii="Arial" w:eastAsia="Times New Roman" w:hAnsi="Arial" w:cs="Arial"/>
               </w:rPr>
             </w:pPr>
-            <w:proofErr w:type="gramStart"/>
             <w:r>
               <w:rPr>
                 <w:rFonts w:ascii="Arial" w:eastAsia="Times New Roman" w:hAnsi="Arial" w:cs="Arial"/>
@@ -3626,7 +2819,6 @@
               </w:rPr>
               <w:t>{{ buyout.name }}</w:t>
             </w:r>
-            <w:proofErr w:type="gramEnd"/>
           </w:p>
         </w:tc>
         <w:tc>
@@ -3657,10 +2849,6 @@
               </w:rPr>
               <w:t>R {{ buyout.unit_price }}</w:t>
             </w:r>
-            <w:proofErr w:type="gramStart"/>
-            <w:proofErr w:type="spellStart"/>
-            <w:proofErr w:type="gramEnd"/>
-            <w:proofErr w:type="spellEnd"/>
           </w:p>
         </w:tc>
         <w:tc>
@@ -3682,7 +2870,6 @@
                 <w:b/>
               </w:rPr>
             </w:pPr>
-            <w:proofErr w:type="gramStart"/>
             <w:r>
               <w:rPr>
                 <w:rFonts w:ascii="Arial" w:eastAsia="Times New Roman" w:hAnsi="Arial" w:cs="Arial"/>
@@ -3690,9 +2877,6 @@
               </w:rPr>
               <w:t>{{ buyout.qty }}</w:t>
             </w:r>
-            <w:proofErr w:type="spellStart"/>
-            <w:proofErr w:type="spellEnd"/>
-            <w:proofErr w:type="gramEnd"/>
           </w:p>
         </w:tc>
         <w:tc>
@@ -3721,10 +2905,6 @@
               </w:rPr>
               <w:t>R {{ buyout.total_price }}</w:t>
             </w:r>
-            <w:proofErr w:type="gramStart"/>
-            <w:proofErr w:type="spellStart"/>
-            <w:proofErr w:type="gramEnd"/>
-            <w:proofErr w:type="spellEnd"/>
           </w:p>
         </w:tc>
       </w:tr>
@@ -3777,8 +2957,6 @@
               </w:rPr>
               <w:t>{%tr endfor %}</w:t>
             </w:r>
-            <w:proofErr w:type="spellStart"/>
-            <w:proofErr w:type="spellEnd"/>
           </w:p>
         </w:tc>
         <w:tc>
@@ -3990,6 +3168,147 @@
         </w:tc>
       </w:tr>
       <w:tr>
+        <w:trPr>
+          <w:trHeight w:val="337"/>
+        </w:trPr>
+        <w:tc>
+          <w:tcPr>
+            <w:tcW w:w="851" w:type="dxa"/>
+            <w:tcBorders>
+              <w:top w:val="single" w:sz="4" w:space="0" w:color="000000"/>
+              <w:left w:val="single" w:sz="4" w:space="0" w:color="000000"/>
+              <w:bottom w:val="single" w:sz="4" w:space="0" w:color="000000"/>
+              <w:right w:val="nil"/>
+            </w:tcBorders>
+            <w:shd w:val="clear" w:color="auto" w:fill="D9E2F3" w:themeFill="accent1" w:themeFillTint="33"/>
+          </w:tcPr>
+          <w:p>
+            <w:pPr>
+              <w:spacing w:after="0" w:line="240" w:lineRule="auto"/>
+              <w:jc w:val="center"/>
+              <w:rPr>
+                <w:rFonts w:ascii="Arial" w:eastAsia="Times New Roman" w:hAnsi="Arial" w:cs="Arial"/>
+                <w:b/>
+              </w:rPr>
+            </w:pPr>
+          </w:p>
+        </w:tc>
+        <w:tc>
+          <w:tcPr>
+            <w:tcW w:w="4819" w:type="dxa"/>
+            <w:tcBorders>
+              <w:top w:val="single" w:sz="4" w:space="0" w:color="000000"/>
+              <w:left w:val="nil"/>
+              <w:bottom w:val="single" w:sz="4" w:space="0" w:color="000000"/>
+              <w:right w:val="single" w:sz="4" w:space="0" w:color="000000"/>
+            </w:tcBorders>
+            <w:shd w:val="clear" w:color="auto" w:fill="D9E2F3" w:themeFill="accent1" w:themeFillTint="33"/>
+          </w:tcPr>
+          <w:p>
+            <w:pPr>
+              <w:spacing w:after="0" w:line="240" w:lineRule="auto"/>
+              <w:jc w:val="center"/>
+              <w:rPr>
+                <w:rFonts w:ascii="Arial" w:eastAsia="Times New Roman" w:hAnsi="Arial" w:cs="Arial"/>
+              </w:rPr>
+            </w:pPr>
+          </w:p>
+        </w:tc>
+        <w:tc>
+          <w:tcPr>
+            <w:tcW w:w="1418" w:type="dxa"/>
+            <w:tcBorders>
+              <w:top w:val="single" w:sz="4" w:space="0" w:color="000000"/>
+              <w:left w:val="single" w:sz="4" w:space="0" w:color="000000"/>
+              <w:bottom w:val="single" w:sz="4" w:space="0" w:color="000000"/>
+              <w:right w:val="single" w:sz="4" w:space="0" w:color="000000"/>
+            </w:tcBorders>
+            <w:shd w:val="clear" w:color="auto" w:fill="D9E2F3" w:themeFill="accent1" w:themeFillTint="33"/>
+          </w:tcPr>
+          <w:p>
+            <w:pPr>
+              <w:spacing w:after="0" w:line="240" w:lineRule="auto"/>
+              <w:jc w:val="center"/>
+              <w:rPr>
+                <w:rFonts w:ascii="Arial" w:eastAsia="Times New Roman" w:hAnsi="Arial" w:cs="Arial"/>
+                <w:b/>
+                <w:color w:val="2F5496" w:themeColor="accent1" w:themeShade="BF"/>
+              </w:rPr>
+            </w:pPr>
+            <w:r>
+              <w:rPr>
+                <w:rFonts w:ascii="Arial" w:eastAsia="Times New Roman" w:hAnsi="Arial" w:cs="Arial"/>
+                <w:b/>
+                <w:color w:val="2F5496" w:themeColor="accent1" w:themeShade="BF"/>
+              </w:rPr>
+              <w:t xml:space="preserve">CONFIG {{ fan_config.config_number }} TOTAL</w:t>
+            </w:r>
+          </w:p>
+        </w:tc>
+        <w:tc>
+          <w:tcPr>
+            <w:tcW w:w="709" w:type="dxa"/>
+            <w:tcBorders>
+              <w:top w:val="single" w:sz="4" w:space="0" w:color="000000"/>
+              <w:left w:val="single" w:sz="4" w:space="0" w:color="000000"/>
+              <w:bottom w:val="single" w:sz="4" w:space="0" w:color="000000"/>
+              <w:right w:val="single" w:sz="4" w:space="0" w:color="000000"/>
+            </w:tcBorders>
+            <w:shd w:val="clear" w:color="auto" w:fill="D9E2F3" w:themeFill="accent1" w:themeFillTint="33"/>
+          </w:tcPr>
+          <w:p>
+            <w:pPr>
+              <w:spacing w:after="0" w:line="240" w:lineRule="auto"/>
+              <w:jc w:val="center"/>
+              <w:rPr>
+                <w:rFonts w:ascii="Arial" w:eastAsia="Times New Roman" w:hAnsi="Arial" w:cs="Arial"/>
+                <w:b/>
+                <w:color w:val="2F5496" w:themeColor="accent1" w:themeShade="BF"/>
+              </w:rPr>
+            </w:pPr>
+            <w:r>
+              <w:rPr>
+                <w:rFonts w:ascii="Arial" w:eastAsia="Times New Roman" w:hAnsi="Arial" w:cs="Arial"/>
+                <w:b/>
+                <w:color w:val="2F5496" w:themeColor="accent1" w:themeShade="BF"/>
+              </w:rPr>
+              <w:t>=</w:t>
+            </w:r>
+          </w:p>
+        </w:tc>
+        <w:tc>
+          <w:tcPr>
+            <w:tcW w:w="1988" w:type="dxa"/>
+            <w:tcBorders>
+              <w:top w:val="single" w:sz="4" w:space="0" w:color="000000"/>
+              <w:left w:val="single" w:sz="4" w:space="0" w:color="000000"/>
+              <w:bottom w:val="single" w:sz="4" w:space="0" w:color="000000"/>
+              <w:right w:val="single" w:sz="4" w:space="0" w:color="000000"/>
+            </w:tcBorders>
+            <w:shd w:val="clear" w:color="auto" w:fill="D9E2F3" w:themeFill="accent1" w:themeFillTint="33"/>
+          </w:tcPr>
+          <w:p>
+            <w:pPr>
+              <w:spacing w:after="0" w:line="240" w:lineRule="auto"/>
+              <w:jc w:val="center"/>
+              <w:rPr>
+                <w:rFonts w:ascii="Arial" w:eastAsia="Times New Roman" w:hAnsi="Arial" w:cs="Arial"/>
+                <w:b/>
+                <w:color w:val="2F5496" w:themeColor="accent1" w:themeShade="BF"/>
+              </w:rPr>
+            </w:pPr>
+            <w:r>
+              <w:rPr>
+                <w:rFonts w:ascii="Arial" w:eastAsia="Times New Roman" w:hAnsi="Arial" w:cs="Arial"/>
+                <w:b/>
+                <w:color w:val="2F5496" w:themeColor="accent1" w:themeShade="BF"/>
+              </w:rPr>
+              <w:t>R {{ fan_config.line_total }}</w:t>
+            </w:r>
+          </w:p>
+        </w:tc>
+      </w:tr>
+      <w:tr>
         <w:tc>
           <w:p>
             <w:r>
@@ -4143,10 +3462,6 @@
               </w:rPr>
               <w:t>R {{ grand_total_price }}</w:t>
             </w:r>
-            <w:proofErr w:type="gramStart"/>
-            <w:proofErr w:type="spellStart"/>
-            <w:proofErr w:type="gramEnd"/>
-            <w:proofErr w:type="spellEnd"/>
           </w:p>
         </w:tc>
       </w:tr>
@@ -4358,13 +3673,7 @@
         <w:rPr>
           <w:rFonts w:ascii="Arial" w:eastAsia="Times New Roman" w:hAnsi="Arial" w:cs="Arial"/>
         </w:rPr>
-        <w:t>Deli</w:t>
-      </w:r>
-      <w:r>
-        <w:rPr>
-          <w:rFonts w:ascii="Arial" w:eastAsia="Times New Roman" w:hAnsi="Arial" w:cs="Arial"/>
-        </w:rPr>
-        <w:t>very.</w:t>
+        <w:t>Delivery.</w:t>
       </w:r>
     </w:p>
     <w:p>
@@ -4413,55 +3722,7 @@
           <w:b/>
           <w:u w:val="single"/>
         </w:rPr>
-        <w:t>D</w:t>
-      </w:r>
-      <w:r>
-        <w:rPr>
-          <w:rFonts w:ascii="Arial" w:eastAsia="Times New Roman" w:hAnsi="Arial" w:cs="Arial"/>
-          <w:b/>
-          <w:u w:val="single"/>
-        </w:rPr>
-        <w:t>ELIVERY</w:t>
-      </w:r>
-      <w:r>
-        <w:rPr>
-          <w:rFonts w:ascii="Arial" w:eastAsia="Times New Roman" w:hAnsi="Arial" w:cs="Arial"/>
-          <w:b/>
-          <w:u w:val="single"/>
-        </w:rPr>
-        <w:t xml:space="preserve"> </w:t>
-      </w:r>
-      <w:r>
-        <w:rPr>
-          <w:rFonts w:ascii="Arial" w:eastAsia="Times New Roman" w:hAnsi="Arial" w:cs="Arial"/>
-          <w:b/>
-          <w:u w:val="single"/>
-        </w:rPr>
-        <w:t>AND</w:t>
-      </w:r>
-      <w:r>
-        <w:rPr>
-          <w:rFonts w:ascii="Arial" w:eastAsia="Times New Roman" w:hAnsi="Arial" w:cs="Arial"/>
-          <w:b/>
-          <w:u w:val="single"/>
-        </w:rPr>
-        <w:t xml:space="preserve"> </w:t>
-      </w:r>
-      <w:r>
-        <w:rPr>
-          <w:rFonts w:ascii="Arial" w:eastAsia="Times New Roman" w:hAnsi="Arial" w:cs="Arial"/>
-          <w:b/>
-          <w:u w:val="single"/>
-        </w:rPr>
-        <w:t>DURATIONS:</w:t>
-      </w:r>
-      <w:r>
-        <w:rPr>
-          <w:rFonts w:ascii="Arial" w:eastAsia="Times New Roman" w:hAnsi="Arial" w:cs="Arial"/>
-          <w:b/>
-          <w:u w:val="single"/>
-        </w:rPr>
-        <w:t xml:space="preserve"> </w:t>
+        <w:t xml:space="preserve">DELIVERY AND DURATIONS: </w:t>
       </w:r>
     </w:p>
     <w:p>
@@ -4510,79 +3771,7 @@
         <w:rPr>
           <w:rFonts w:ascii="Arial" w:eastAsia="Times New Roman" w:hAnsi="Arial" w:cs="Arial"/>
         </w:rPr>
-        <w:t xml:space="preserve">Durations </w:t>
-      </w:r>
-      <w:r>
-        <w:rPr>
-          <w:rFonts w:ascii="Arial" w:eastAsia="Times New Roman" w:hAnsi="Arial" w:cs="Arial"/>
-        </w:rPr>
-        <w:t>4</w:t>
-      </w:r>
-      <w:r>
-        <w:rPr>
-          <w:rFonts w:ascii="Arial" w:eastAsia="Times New Roman" w:hAnsi="Arial" w:cs="Arial"/>
-        </w:rPr>
-        <w:t xml:space="preserve"> </w:t>
-      </w:r>
-      <w:r>
-        <w:rPr>
-          <w:rFonts w:ascii="Arial" w:eastAsia="Times New Roman" w:hAnsi="Arial" w:cs="Arial"/>
-        </w:rPr>
-        <w:t>–</w:t>
-      </w:r>
-      <w:r>
-        <w:rPr>
-          <w:rFonts w:ascii="Arial" w:eastAsia="Times New Roman" w:hAnsi="Arial" w:cs="Arial"/>
-        </w:rPr>
-        <w:t xml:space="preserve"> </w:t>
-      </w:r>
-      <w:r>
-        <w:rPr>
-          <w:rFonts w:ascii="Arial" w:eastAsia="Times New Roman" w:hAnsi="Arial" w:cs="Arial"/>
-        </w:rPr>
-        <w:t>6</w:t>
-      </w:r>
-      <w:r>
-        <w:rPr>
-          <w:rFonts w:ascii="Arial" w:eastAsia="Times New Roman" w:hAnsi="Arial" w:cs="Arial"/>
-        </w:rPr>
-        <w:t xml:space="preserve"> </w:t>
-      </w:r>
-      <w:r>
-        <w:rPr>
-          <w:rFonts w:ascii="Arial" w:eastAsia="Times New Roman" w:hAnsi="Arial" w:cs="Arial"/>
-        </w:rPr>
-        <w:t>w</w:t>
-      </w:r>
-      <w:r>
-        <w:rPr>
-          <w:rFonts w:ascii="Arial" w:eastAsia="Times New Roman" w:hAnsi="Arial" w:cs="Arial"/>
-        </w:rPr>
-        <w:t xml:space="preserve">orking </w:t>
-      </w:r>
-      <w:r>
-        <w:rPr>
-          <w:rFonts w:ascii="Arial" w:eastAsia="Times New Roman" w:hAnsi="Arial" w:cs="Arial"/>
-        </w:rPr>
-        <w:t>w</w:t>
-      </w:r>
-      <w:r>
-        <w:rPr>
-          <w:rFonts w:ascii="Arial" w:eastAsia="Times New Roman" w:hAnsi="Arial" w:cs="Arial"/>
-        </w:rPr>
-        <w:t>eeks</w:t>
-      </w:r>
-      <w:r>
-        <w:rPr>
-          <w:rFonts w:ascii="Arial" w:eastAsia="Times New Roman" w:hAnsi="Arial" w:cs="Arial"/>
-        </w:rPr>
-        <w:t xml:space="preserve"> depending on long lead items</w:t>
-      </w:r>
-      <w:r>
-        <w:rPr>
-          <w:rFonts w:ascii="Arial" w:eastAsia="Times New Roman" w:hAnsi="Arial" w:cs="Arial"/>
-        </w:rPr>
-        <w:t xml:space="preserve"> </w:t>
+        <w:t xml:space="preserve">Durations 4 – 6 working weeks depending on long lead items </w:t>
       </w:r>
     </w:p>
     <w:p>
@@ -4610,25 +3799,7 @@
         <w:rPr>
           <w:rFonts w:ascii="Arial" w:eastAsia="Times New Roman" w:hAnsi="Arial" w:cs="Arial"/>
         </w:rPr>
-        <w:t xml:space="preserve">Delivery </w:t>
-      </w:r>
-      <w:r>
-        <w:rPr>
-          <w:rFonts w:ascii="Arial" w:eastAsia="Times New Roman" w:hAnsi="Arial" w:cs="Arial"/>
-        </w:rPr>
-        <w:t xml:space="preserve">available at </w:t>
-      </w:r>
-      <w:r>
-        <w:rPr>
-          <w:rFonts w:ascii="Arial" w:eastAsia="Times New Roman" w:hAnsi="Arial" w:cs="Arial"/>
-        </w:rPr>
-        <w:t>an</w:t>
-      </w:r>
-      <w:r>
-        <w:rPr>
-          <w:rFonts w:ascii="Arial" w:eastAsia="Times New Roman" w:hAnsi="Arial" w:cs="Arial"/>
-        </w:rPr>
-        <w:t xml:space="preserve"> additional cost.</w:t>
+        <w:t>Delivery available at an additional cost.</w:t>
       </w:r>
     </w:p>
     <w:p>
@@ -4676,15 +3847,7 @@
           <w:b/>
           <w:u w:val="single"/>
         </w:rPr>
-        <w:t>PRICE AND VALIDITY</w:t>
-      </w:r>
-      <w:r>
-        <w:rPr>
-          <w:rFonts w:ascii="Arial" w:eastAsia="Times New Roman" w:hAnsi="Arial" w:cs="Arial"/>
-          <w:b/>
-          <w:u w:val="single"/>
-        </w:rPr>
-        <w:t>:</w:t>
+        <w:t>PRICE AND VALIDITY:</w:t>
       </w:r>
     </w:p>
     <w:p>
@@ -4757,16 +3920,7 @@
           <w:bCs/>
           <w:u w:val="single"/>
         </w:rPr>
-        <w:t>TERMS AND CONDITIONS</w:t>
-      </w:r>
-      <w:r>
-        <w:rPr>
-          <w:rFonts w:ascii="Arial" w:eastAsia="Times New Roman" w:hAnsi="Arial" w:cs="Arial"/>
-          <w:b/>
-          <w:bCs/>
-          <w:u w:val="single"/>
-        </w:rPr>
-        <w:t>:</w:t>
+        <w:t>TERMS AND CONDITIONS:</w:t>
       </w:r>
     </w:p>
     <w:p>
@@ -4820,35 +3974,7 @@
         <w:rPr>
           <w:rFonts w:ascii="Arial" w:eastAsia="Times New Roman" w:hAnsi="Arial" w:cs="Arial"/>
         </w:rPr>
-        <w:t xml:space="preserve">These </w:t>
-      </w:r>
-      <w:proofErr w:type="gramStart"/>
-      <w:r>
-        <w:rPr>
-          <w:rFonts w:ascii="Arial" w:eastAsia="Times New Roman" w:hAnsi="Arial" w:cs="Arial"/>
-        </w:rPr>
-        <w:t>include, but</w:t>
-      </w:r>
-      <w:proofErr w:type="gramEnd"/>
-      <w:r>
-        <w:rPr>
-          <w:rFonts w:ascii="Arial" w:eastAsia="Times New Roman" w:hAnsi="Arial" w:cs="Arial"/>
-        </w:rPr>
-        <w:t xml:space="preserve"> shall not be limited to the non-acceptance of consequential damages or losses, and </w:t>
-      </w:r>
-      <w:proofErr w:type="gramStart"/>
-      <w:r>
-        <w:rPr>
-          <w:rFonts w:ascii="Arial" w:eastAsia="Times New Roman" w:hAnsi="Arial" w:cs="Arial"/>
-        </w:rPr>
-        <w:t>any and all</w:t>
-      </w:r>
-      <w:proofErr w:type="gramEnd"/>
-      <w:r>
-        <w:rPr>
-          <w:rFonts w:ascii="Arial" w:eastAsia="Times New Roman" w:hAnsi="Arial" w:cs="Arial"/>
-        </w:rPr>
-        <w:t xml:space="preserve"> liabilities on </w:t>
+        <w:t xml:space="preserve">These include, but shall not be limited to the non-acceptance of consequential damages or losses, and any and all liabilities on </w:t>
       </w:r>
       <w:r>
         <w:rPr>
@@ -4921,15 +4047,7 @@
           <w:b/>
           <w:u w:val="single"/>
         </w:rPr>
-        <w:t>STANDARD WARRANTEE</w:t>
-      </w:r>
-      <w:r>
-        <w:rPr>
-          <w:rFonts w:ascii="Arial" w:eastAsia="Times New Roman" w:hAnsi="Arial" w:cs="Arial"/>
-          <w:b/>
-          <w:u w:val="single"/>
-        </w:rPr>
-        <w:t>:</w:t>
+        <w:t>STANDARD WARRANTEE:</w:t>
       </w:r>
     </w:p>
     <w:p>
@@ -4993,19 +4111,7 @@
         <w:rPr>
           <w:rFonts w:ascii="Arial" w:eastAsia="Times New Roman" w:hAnsi="Arial" w:cs="Arial"/>
         </w:rPr>
-        <w:t xml:space="preserve"> and all its appointed sub-suppliers shall end. Should the </w:t>
-      </w:r>
-      <w:r>
-        <w:rPr>
-          <w:rFonts w:ascii="Arial" w:eastAsia="Times New Roman" w:hAnsi="Arial" w:cs="Arial"/>
-        </w:rPr>
-        <w:t>18-month</w:t>
-      </w:r>
-      <w:r>
-        <w:rPr>
-          <w:rFonts w:ascii="Arial" w:eastAsia="Times New Roman" w:hAnsi="Arial" w:cs="Arial"/>
-        </w:rPr>
-        <w:t xml:space="preserve"> period become a factor for any warrantee claims, written proof of the fan installation date would need to be furnished to </w:t>
+        <w:t xml:space="preserve"> and all its appointed sub-suppliers shall end. Should the 18-month period become a factor for any warrantee claims, written proof of the fan installation date would need to be furnished to </w:t>
       </w:r>
       <w:r>
         <w:rPr>
@@ -5110,15 +4216,7 @@
           <w:b/>
           <w:u w:val="single"/>
         </w:rPr>
-        <w:t>COMPLIANCE</w:t>
-      </w:r>
-      <w:r>
-        <w:rPr>
-          <w:rFonts w:ascii="Arial" w:eastAsia="Times New Roman" w:hAnsi="Arial" w:cs="Arial"/>
-          <w:b/>
-          <w:u w:val="single"/>
-        </w:rPr>
-        <w:t>:</w:t>
+        <w:t>COMPLIANCE:</w:t>
       </w:r>
     </w:p>
     <w:p>
@@ -5225,17 +4323,7 @@
           <w:rFonts w:ascii="Arial" w:eastAsia="Times New Roman" w:hAnsi="Arial" w:cs="Arial"/>
         </w:rPr>
         <w:tab/>
-      </w:r>
-      <w:r>
-        <w:rPr>
-          <w:rFonts w:ascii="Arial" w:eastAsia="Times New Roman" w:hAnsi="Arial" w:cs="Arial"/>
-        </w:rPr>
         <w:tab/>
-      </w:r>
-      <w:r>
-        <w:rPr>
-          <w:rFonts w:ascii="Arial" w:eastAsia="Times New Roman" w:hAnsi="Arial" w:cs="Arial"/>
-        </w:rPr>
         <w:tab/>
       </w:r>
       <w:r>
@@ -5263,85 +4351,14 @@
           <w:b/>
           <w:bCs/>
         </w:rPr>
-        <w:t xml:space="preserve"> </w:t>
-      </w:r>
-      <w:r>
-        <w:rPr>
-          <w:rFonts w:ascii="Arial" w:eastAsia="Times New Roman" w:hAnsi="Arial" w:cs="Arial"/>
-          <w:b/>
-          <w:bCs/>
-        </w:rPr>
-        <w:t xml:space="preserve">       </w:t>
-      </w:r>
-      <w:r>
-        <w:rPr>
-          <w:rFonts w:ascii="Arial" w:eastAsia="Times New Roman" w:hAnsi="Arial" w:cs="Arial"/>
-          <w:b/>
-          <w:bCs/>
-        </w:rPr>
-        <w:t xml:space="preserve"> </w:t>
-      </w:r>
-      <w:proofErr w:type="gramStart"/>
-      <w:r>
-        <w:rPr>
-          <w:rFonts w:ascii="Arial" w:eastAsia="Times New Roman" w:hAnsi="Arial" w:cs="Arial"/>
-          <w:b/>
-        </w:rPr>
-        <w:t>{{</w:t>
-      </w:r>
-      <w:r>
-        <w:rPr>
-          <w:rFonts w:ascii="Arial" w:eastAsia="Times New Roman" w:hAnsi="Arial" w:cs="Arial"/>
-          <w:b/>
-        </w:rPr>
-        <w:t xml:space="preserve"> </w:t>
-      </w:r>
-      <w:proofErr w:type="spellStart"/>
-      <w:r>
-        <w:rPr>
-          <w:rFonts w:ascii="Arial" w:eastAsia="Times New Roman" w:hAnsi="Arial" w:cs="Arial"/>
-          <w:b/>
-        </w:rPr>
-        <w:t>user</w:t>
-      </w:r>
-      <w:proofErr w:type="gramEnd"/>
-      <w:r>
-        <w:rPr>
-          <w:rFonts w:ascii="Arial" w:eastAsia="Times New Roman" w:hAnsi="Arial" w:cs="Arial"/>
-          <w:b/>
-        </w:rPr>
-        <w:t>_</w:t>
-      </w:r>
-      <w:proofErr w:type="gramStart"/>
-      <w:r>
-        <w:rPr>
-          <w:rFonts w:ascii="Arial" w:eastAsia="Times New Roman" w:hAnsi="Arial" w:cs="Arial"/>
-          <w:b/>
-        </w:rPr>
-        <w:t>name</w:t>
-      </w:r>
-      <w:proofErr w:type="spellEnd"/>
-      <w:r>
-        <w:rPr>
-          <w:rFonts w:ascii="Arial" w:eastAsia="Times New Roman" w:hAnsi="Arial" w:cs="Arial"/>
-          <w:b/>
-        </w:rPr>
-        <w:t xml:space="preserve"> </w:t>
-      </w:r>
-      <w:r>
-        <w:rPr>
-          <w:rFonts w:ascii="Arial" w:eastAsia="Times New Roman" w:hAnsi="Arial" w:cs="Arial"/>
-          <w:b/>
-        </w:rPr>
-        <w:t>}</w:t>
-      </w:r>
-      <w:proofErr w:type="gramEnd"/>
-      <w:r>
-        <w:rPr>
-          <w:rFonts w:ascii="Arial" w:eastAsia="Times New Roman" w:hAnsi="Arial" w:cs="Arial"/>
-          <w:b/>
-        </w:rPr>
-        <w:t>}</w:t>
+        <w:t xml:space="preserve">         </w:t>
+      </w:r>
+      <w:r>
+        <w:rPr>
+          <w:rFonts w:ascii="Arial" w:eastAsia="Times New Roman" w:hAnsi="Arial" w:cs="Arial"/>
+          <w:b/>
+        </w:rPr>
+        <w:t>{{ user_name }}</w:t>
       </w:r>
     </w:p>
     <w:p>
@@ -5354,80 +4371,12 @@
           <w:b/>
         </w:rPr>
       </w:pPr>
-      <w:proofErr w:type="gramStart"/>
-      <w:r>
-        <w:rPr>
-          <w:rFonts w:ascii="Arial" w:eastAsia="Times New Roman" w:hAnsi="Arial" w:cs="Arial"/>
-          <w:b/>
-        </w:rPr>
-        <w:t>{{</w:t>
-      </w:r>
-      <w:r>
-        <w:rPr>
-          <w:rFonts w:ascii="Arial" w:eastAsia="Times New Roman" w:hAnsi="Arial" w:cs="Arial"/>
-          <w:b/>
-        </w:rPr>
-        <w:t xml:space="preserve"> </w:t>
-      </w:r>
-      <w:proofErr w:type="spellStart"/>
-      <w:r>
-        <w:rPr>
-          <w:rFonts w:ascii="Arial" w:eastAsia="Times New Roman" w:hAnsi="Arial" w:cs="Arial"/>
-          <w:b/>
-        </w:rPr>
-        <w:t>user</w:t>
-      </w:r>
-      <w:proofErr w:type="gramEnd"/>
-      <w:r>
-        <w:rPr>
-          <w:rFonts w:ascii="Arial" w:eastAsia="Times New Roman" w:hAnsi="Arial" w:cs="Arial"/>
-          <w:b/>
-        </w:rPr>
-        <w:t>_</w:t>
-      </w:r>
-      <w:proofErr w:type="gramStart"/>
-      <w:r>
-        <w:rPr>
-          <w:rFonts w:ascii="Arial" w:eastAsia="Times New Roman" w:hAnsi="Arial" w:cs="Arial"/>
-          <w:b/>
-        </w:rPr>
-        <w:t>position</w:t>
-      </w:r>
-      <w:proofErr w:type="spellEnd"/>
-      <w:r>
-        <w:rPr>
-          <w:rFonts w:ascii="Arial" w:eastAsia="Times New Roman" w:hAnsi="Arial" w:cs="Arial"/>
-          <w:b/>
-        </w:rPr>
-        <w:t xml:space="preserve"> </w:t>
-      </w:r>
-      <w:r>
-        <w:rPr>
-          <w:rFonts w:ascii="Arial" w:eastAsia="Times New Roman" w:hAnsi="Arial" w:cs="Arial"/>
-          <w:b/>
-        </w:rPr>
-        <w:t>}</w:t>
-      </w:r>
-      <w:proofErr w:type="gramEnd"/>
-      <w:r>
-        <w:rPr>
-          <w:rFonts w:ascii="Arial" w:eastAsia="Times New Roman" w:hAnsi="Arial" w:cs="Arial"/>
-          <w:b/>
-        </w:rPr>
-        <w:t>}</w:t>
-      </w:r>
-      <w:r>
-        <w:rPr>
-          <w:rFonts w:ascii="Arial" w:eastAsia="Times New Roman" w:hAnsi="Arial" w:cs="Arial"/>
-          <w:b/>
-        </w:rPr>
-        <w:t xml:space="preserve"> </w:t>
-      </w:r>
-      <w:r>
-        <w:rPr>
-          <w:rFonts w:ascii="Arial" w:eastAsia="Times New Roman" w:hAnsi="Arial" w:cs="Arial"/>
-          <w:b/>
-        </w:rPr>
+      <w:r>
+        <w:rPr>
+          <w:rFonts w:ascii="Arial" w:eastAsia="Times New Roman" w:hAnsi="Arial" w:cs="Arial"/>
+          <w:b/>
+        </w:rPr>
+        <w:t xml:space="preserve">{{ user_position }} </w:t>
         <w:tab/>
       </w:r>
     </w:p>
@@ -5449,29 +4398,8 @@
           <w:bCs/>
         </w:rPr>
         <w:t>Air Blow Fans (Pty) Ltd</w:t>
-      </w:r>
-      <w:r>
-        <w:rPr>
-          <w:rFonts w:ascii="Arial" w:eastAsia="Times New Roman" w:hAnsi="Arial" w:cs="Arial"/>
-          <w:b/>
-          <w:bCs/>
-        </w:rPr>
         <w:tab/>
-      </w:r>
-      <w:r>
-        <w:rPr>
-          <w:rFonts w:ascii="Arial" w:eastAsia="Times New Roman" w:hAnsi="Arial" w:cs="Arial"/>
-          <w:b/>
-          <w:bCs/>
-        </w:rPr>
         <w:tab/>
-      </w:r>
-      <w:r>
-        <w:rPr>
-          <w:rFonts w:ascii="Arial" w:eastAsia="Times New Roman" w:hAnsi="Arial" w:cs="Arial"/>
-          <w:b/>
-          <w:bCs/>
-        </w:rPr>
         <w:tab/>
       </w:r>
     </w:p>
@@ -5496,38 +4424,10 @@
           <w:bCs/>
         </w:rPr>
         <w:t>Tel No</w:t>
-      </w:r>
-      <w:r>
-        <w:rPr>
-          <w:rFonts w:ascii="Arial" w:eastAsia="Times New Roman" w:hAnsi="Arial" w:cs="Arial"/>
-          <w:b/>
-          <w:bCs/>
-        </w:rPr>
         <w:tab/>
-      </w:r>
-      <w:r>
-        <w:rPr>
-          <w:rFonts w:ascii="Arial" w:eastAsia="Times New Roman" w:hAnsi="Arial" w:cs="Arial"/>
-          <w:b/>
-          <w:bCs/>
-        </w:rPr>
         <w:tab/>
         <w:t>: +27 (0) 11 452 0726</w:t>
-      </w:r>
-      <w:r>
-        <w:rPr>
-          <w:rFonts w:ascii="Arial" w:eastAsia="Times New Roman" w:hAnsi="Arial" w:cs="Arial"/>
-          <w:b/>
-          <w:bCs/>
-        </w:rPr>
         <w:tab/>
-      </w:r>
-      <w:r>
-        <w:rPr>
-          <w:rFonts w:ascii="Arial" w:eastAsia="Times New Roman" w:hAnsi="Arial" w:cs="Arial"/>
-          <w:b/>
-          <w:bCs/>
-        </w:rPr>
         <w:tab/>
       </w:r>
     </w:p>
@@ -5551,103 +4451,9 @@
           <w:b/>
           <w:bCs/>
         </w:rPr>
-        <w:t xml:space="preserve">Mobile </w:t>
-      </w:r>
-      <w:proofErr w:type="gramStart"/>
-      <w:r>
-        <w:rPr>
-          <w:rFonts w:ascii="Arial" w:eastAsia="Times New Roman" w:hAnsi="Arial" w:cs="Arial"/>
-          <w:b/>
-          <w:bCs/>
-        </w:rPr>
-        <w:t xml:space="preserve">No  </w:t>
-      </w:r>
-      <w:r>
-        <w:rPr>
-          <w:rFonts w:ascii="Arial" w:eastAsia="Times New Roman" w:hAnsi="Arial" w:cs="Arial"/>
-          <w:b/>
-          <w:bCs/>
-        </w:rPr>
+        <w:t xml:space="preserve">Mobile No  </w:t>
         <w:tab/>
-      </w:r>
-      <w:proofErr w:type="gramEnd"/>
-      <w:r>
-        <w:rPr>
-          <w:rFonts w:ascii="Arial" w:eastAsia="Times New Roman" w:hAnsi="Arial" w:cs="Arial"/>
-          <w:b/>
-          <w:bCs/>
-        </w:rPr>
-        <w:t xml:space="preserve">: </w:t>
-      </w:r>
-      <w:proofErr w:type="gramStart"/>
-      <w:r>
-        <w:rPr>
-          <w:rFonts w:ascii="Arial" w:eastAsia="Times New Roman" w:hAnsi="Arial" w:cs="Arial"/>
-          <w:b/>
-          <w:bCs/>
-        </w:rPr>
-        <w:t>{{</w:t>
-      </w:r>
-      <w:r>
-        <w:rPr>
-          <w:rFonts w:ascii="Arial" w:eastAsia="Times New Roman" w:hAnsi="Arial" w:cs="Arial"/>
-          <w:b/>
-          <w:bCs/>
-        </w:rPr>
-        <w:t xml:space="preserve"> </w:t>
-      </w:r>
-      <w:proofErr w:type="spellStart"/>
-      <w:r>
-        <w:rPr>
-          <w:rFonts w:ascii="Arial" w:eastAsia="Times New Roman" w:hAnsi="Arial" w:cs="Arial"/>
-          <w:b/>
-          <w:bCs/>
-        </w:rPr>
-        <w:t>user</w:t>
-      </w:r>
-      <w:proofErr w:type="gramEnd"/>
-      <w:r>
-        <w:rPr>
-          <w:rFonts w:ascii="Arial" w:eastAsia="Times New Roman" w:hAnsi="Arial" w:cs="Arial"/>
-          <w:b/>
-          <w:bCs/>
-        </w:rPr>
-        <w:t>_tel_</w:t>
-      </w:r>
-      <w:proofErr w:type="gramStart"/>
-      <w:r>
-        <w:rPr>
-          <w:rFonts w:ascii="Arial" w:eastAsia="Times New Roman" w:hAnsi="Arial" w:cs="Arial"/>
-          <w:b/>
-          <w:bCs/>
-        </w:rPr>
-        <w:t>number</w:t>
-      </w:r>
-      <w:proofErr w:type="spellEnd"/>
-      <w:r>
-        <w:rPr>
-          <w:rFonts w:ascii="Arial" w:eastAsia="Times New Roman" w:hAnsi="Arial" w:cs="Arial"/>
-          <w:b/>
-          <w:bCs/>
-        </w:rPr>
-        <w:t xml:space="preserve"> </w:t>
-      </w:r>
-      <w:r>
-        <w:rPr>
-          <w:rFonts w:ascii="Arial" w:eastAsia="Times New Roman" w:hAnsi="Arial" w:cs="Arial"/>
-          <w:b/>
-          <w:bCs/>
-        </w:rPr>
-        <w:t>}</w:t>
-      </w:r>
-      <w:proofErr w:type="gramEnd"/>
-      <w:r>
-        <w:rPr>
-          <w:rFonts w:ascii="Arial" w:eastAsia="Times New Roman" w:hAnsi="Arial" w:cs="Arial"/>
-          <w:b/>
-          <w:bCs/>
-        </w:rPr>
-        <w:t>}</w:t>
+        <w:t>: {{ user_tel_number }}</w:t>
       </w:r>
     </w:p>
     <w:p>
@@ -5671,92 +4477,9 @@
           <w:bCs/>
         </w:rPr>
         <w:t>Email</w:t>
-      </w:r>
-      <w:r>
-        <w:rPr>
-          <w:rFonts w:ascii="Arial" w:eastAsia="Times New Roman" w:hAnsi="Arial" w:cs="Arial"/>
-          <w:b/>
-          <w:bCs/>
-        </w:rPr>
         <w:tab/>
-      </w:r>
-      <w:r>
-        <w:rPr>
-          <w:rFonts w:ascii="Arial" w:eastAsia="Times New Roman" w:hAnsi="Arial" w:cs="Arial"/>
-          <w:b/>
-          <w:bCs/>
-        </w:rPr>
         <w:tab/>
-        <w:t>:</w:t>
-      </w:r>
-      <w:r>
-        <w:rPr>
-          <w:rFonts w:ascii="Arial" w:eastAsia="Times New Roman" w:hAnsi="Arial" w:cs="Arial"/>
-          <w:b/>
-          <w:bCs/>
-        </w:rPr>
-        <w:t xml:space="preserve"> </w:t>
-      </w:r>
-      <w:proofErr w:type="gramStart"/>
-      <w:r>
-        <w:rPr>
-          <w:rFonts w:ascii="Arial" w:eastAsia="Times New Roman" w:hAnsi="Arial" w:cs="Arial"/>
-          <w:b/>
-          <w:bCs/>
-        </w:rPr>
-        <w:t xml:space="preserve">{{ </w:t>
-      </w:r>
-      <w:proofErr w:type="spellStart"/>
-      <w:r>
-        <w:rPr>
-          <w:rFonts w:ascii="Arial" w:eastAsia="Times New Roman" w:hAnsi="Arial" w:cs="Arial"/>
-          <w:b/>
-          <w:bCs/>
-        </w:rPr>
-        <w:t>user</w:t>
-      </w:r>
-      <w:proofErr w:type="gramEnd"/>
-      <w:r>
-        <w:rPr>
-          <w:rFonts w:ascii="Arial" w:eastAsia="Times New Roman" w:hAnsi="Arial" w:cs="Arial"/>
-          <w:b/>
-          <w:bCs/>
-        </w:rPr>
-        <w:t>_</w:t>
-      </w:r>
-      <w:proofErr w:type="gramStart"/>
-      <w:r>
-        <w:rPr>
-          <w:rFonts w:ascii="Arial" w:eastAsia="Times New Roman" w:hAnsi="Arial" w:cs="Arial"/>
-          <w:b/>
-          <w:bCs/>
-        </w:rPr>
-        <w:t>email</w:t>
-      </w:r>
-      <w:proofErr w:type="spellEnd"/>
-      <w:r>
-        <w:rPr>
-          <w:rFonts w:ascii="Arial" w:eastAsia="Times New Roman" w:hAnsi="Arial" w:cs="Arial"/>
-          <w:b/>
-          <w:bCs/>
-        </w:rPr>
-        <w:t xml:space="preserve"> }</w:t>
-      </w:r>
-      <w:proofErr w:type="gramEnd"/>
-      <w:r>
-        <w:rPr>
-          <w:rFonts w:ascii="Arial" w:eastAsia="Times New Roman" w:hAnsi="Arial" w:cs="Arial"/>
-          <w:b/>
-          <w:bCs/>
-        </w:rPr>
-        <w:t>}</w:t>
-      </w:r>
-      <w:r>
-        <w:rPr>
-          <w:rFonts w:ascii="Arial" w:eastAsia="Times New Roman" w:hAnsi="Arial" w:cs="Arial"/>
-          <w:b/>
-          <w:bCs/>
-        </w:rPr>
+        <w:t>: {{ user_email }}</w:t>
         <w:tab/>
       </w:r>
     </w:p>

</xml_diff>

<commit_message>
Add Attention To and Delivery Time fields to quote project info
- Add `attention_to` and `delivery_time` fields to quote schema in common.py
- Add UI widgets in project_info_tab.py (Attention To below Client Name, Delivery Time below Location)
- Expose both fields in export_utils.py for Word template use
- Update quote_template.docx with new fields
- Add .gitattributes to treat Office files as binary (fixes git diff crash)
- Update CLAUDE.md with quote section field docs and docxtpl template patterns

Co-Authored-By: Claude Sonnet 4.6 <noreply@anthropic.com>
</commit_message>
<xml_diff>
--- a/ui/templates/quote_template.docx
+++ b/ui/templates/quote_template.docx
@@ -59,6 +59,7 @@
           <w:b/>
         </w:rPr>
       </w:pPr>
+      <w:proofErr w:type="gramStart"/>
       <w:r>
         <w:rPr>
           <w:rFonts w:ascii="Arial" w:eastAsia="Times New Roman" w:hAnsi="Arial" w:cs="Arial"/>
@@ -66,7 +67,57 @@
           <w:sz w:val="36"/>
           <w:szCs w:val="36"/>
         </w:rPr>
-        <w:t>{{ quote_heading }}</w:t>
+        <w:t xml:space="preserve">{{ </w:t>
+      </w:r>
+      <w:proofErr w:type="spellStart"/>
+      <w:r>
+        <w:rPr>
+          <w:rFonts w:ascii="Arial" w:eastAsia="Times New Roman" w:hAnsi="Arial" w:cs="Arial"/>
+          <w:b/>
+          <w:sz w:val="36"/>
+          <w:szCs w:val="36"/>
+        </w:rPr>
+        <w:t>client</w:t>
+      </w:r>
+      <w:proofErr w:type="gramEnd"/>
+      <w:r>
+        <w:rPr>
+          <w:rFonts w:ascii="Arial" w:eastAsia="Times New Roman" w:hAnsi="Arial" w:cs="Arial"/>
+          <w:b/>
+          <w:sz w:val="36"/>
+          <w:szCs w:val="36"/>
+        </w:rPr>
+        <w:t>_</w:t>
+      </w:r>
+      <w:proofErr w:type="gramStart"/>
+      <w:r>
+        <w:rPr>
+          <w:rFonts w:ascii="Arial" w:eastAsia="Times New Roman" w:hAnsi="Arial" w:cs="Arial"/>
+          <w:b/>
+          <w:sz w:val="36"/>
+          <w:szCs w:val="36"/>
+        </w:rPr>
+        <w:t>name</w:t>
+      </w:r>
+      <w:proofErr w:type="spellEnd"/>
+      <w:r>
+        <w:rPr>
+          <w:rFonts w:ascii="Arial" w:eastAsia="Times New Roman" w:hAnsi="Arial" w:cs="Arial"/>
+          <w:b/>
+          <w:sz w:val="36"/>
+          <w:szCs w:val="36"/>
+        </w:rPr>
+        <w:t xml:space="preserve"> }</w:t>
+      </w:r>
+      <w:proofErr w:type="gramEnd"/>
+      <w:r>
+        <w:rPr>
+          <w:rFonts w:ascii="Arial" w:eastAsia="Times New Roman" w:hAnsi="Arial" w:cs="Arial"/>
+          <w:b/>
+          <w:sz w:val="36"/>
+          <w:szCs w:val="36"/>
+        </w:rPr>
+        <w:t>}</w:t>
       </w:r>
     </w:p>
     <w:p>
@@ -89,8 +140,62 @@
           <w:b/>
         </w:rPr>
         <w:t>To</w:t>
+      </w:r>
+      <w:r>
+        <w:rPr>
+          <w:rFonts w:ascii="Arial" w:eastAsia="Times New Roman" w:hAnsi="Arial" w:cs="Arial"/>
+          <w:b/>
+        </w:rPr>
         <w:tab/>
-        <w:t>: {{ client_name }}</w:t>
+        <w:t xml:space="preserve">: </w:t>
+      </w:r>
+      <w:proofErr w:type="gramStart"/>
+      <w:r>
+        <w:rPr>
+          <w:rFonts w:ascii="Arial" w:eastAsia="Times New Roman" w:hAnsi="Arial" w:cs="Arial"/>
+          <w:b/>
+        </w:rPr>
+        <w:t xml:space="preserve">{{ </w:t>
+      </w:r>
+      <w:proofErr w:type="spellStart"/>
+      <w:r>
+        <w:rPr>
+          <w:rFonts w:ascii="Arial" w:eastAsia="Times New Roman" w:hAnsi="Arial" w:cs="Arial"/>
+          <w:b/>
+        </w:rPr>
+        <w:t>attention</w:t>
+      </w:r>
+      <w:proofErr w:type="gramEnd"/>
+      <w:r>
+        <w:rPr>
+          <w:rFonts w:ascii="Arial" w:eastAsia="Times New Roman" w:hAnsi="Arial" w:cs="Arial"/>
+          <w:b/>
+        </w:rPr>
+        <w:t>_</w:t>
+      </w:r>
+      <w:proofErr w:type="gramStart"/>
+      <w:r>
+        <w:rPr>
+          <w:rFonts w:ascii="Arial" w:eastAsia="Times New Roman" w:hAnsi="Arial" w:cs="Arial"/>
+          <w:b/>
+        </w:rPr>
+        <w:t>to</w:t>
+      </w:r>
+      <w:proofErr w:type="spellEnd"/>
+      <w:r>
+        <w:rPr>
+          <w:rFonts w:ascii="Arial" w:eastAsia="Times New Roman" w:hAnsi="Arial" w:cs="Arial"/>
+          <w:b/>
+        </w:rPr>
+        <w:t xml:space="preserve"> }</w:t>
+      </w:r>
+      <w:proofErr w:type="gramEnd"/>
+      <w:r>
+        <w:rPr>
+          <w:rFonts w:ascii="Arial" w:eastAsia="Times New Roman" w:hAnsi="Arial" w:cs="Arial"/>
+          <w:b/>
+        </w:rPr>
+        <w:t>}</w:t>
       </w:r>
     </w:p>
     <w:p>
@@ -114,16 +219,108 @@
           <w:b/>
         </w:rPr>
         <w:t>YOUR REF</w:t>
+      </w:r>
+      <w:r>
+        <w:rPr>
+          <w:rFonts w:ascii="Arial" w:eastAsia="Times New Roman" w:hAnsi="Arial" w:cs="Arial"/>
+          <w:b/>
+        </w:rPr>
         <w:tab/>
         <w:t xml:space="preserve">: </w:t>
       </w:r>
-      <w:r>
-        <w:rPr>
-          <w:rFonts w:ascii="Arial" w:eastAsia="Times New Roman" w:hAnsi="Arial" w:cs="Arial"/>
-          <w:b/>
-          <w:bCs/>
-        </w:rPr>
-        <w:t>{{ subject_fan_sizes }} Auxiliary Fan</w:t>
+      <w:proofErr w:type="gramStart"/>
+      <w:r>
+        <w:rPr>
+          <w:rFonts w:ascii="Arial" w:eastAsia="Times New Roman" w:hAnsi="Arial" w:cs="Arial"/>
+          <w:b/>
+          <w:bCs/>
+        </w:rPr>
+        <w:t xml:space="preserve">{{ </w:t>
+      </w:r>
+      <w:proofErr w:type="spellStart"/>
+      <w:r>
+        <w:rPr>
+          <w:rFonts w:ascii="Arial" w:eastAsia="Times New Roman" w:hAnsi="Arial" w:cs="Arial"/>
+          <w:b/>
+          <w:bCs/>
+        </w:rPr>
+        <w:t>subject</w:t>
+      </w:r>
+      <w:proofErr w:type="gramEnd"/>
+      <w:r>
+        <w:rPr>
+          <w:rFonts w:ascii="Arial" w:eastAsia="Times New Roman" w:hAnsi="Arial" w:cs="Arial"/>
+          <w:b/>
+          <w:bCs/>
+        </w:rPr>
+        <w:t>_fan_</w:t>
+      </w:r>
+      <w:proofErr w:type="gramStart"/>
+      <w:r>
+        <w:rPr>
+          <w:rFonts w:ascii="Arial" w:eastAsia="Times New Roman" w:hAnsi="Arial" w:cs="Arial"/>
+          <w:b/>
+          <w:bCs/>
+        </w:rPr>
+        <w:t>sizes</w:t>
+      </w:r>
+      <w:proofErr w:type="spellEnd"/>
+      <w:r>
+        <w:rPr>
+          <w:rFonts w:ascii="Arial" w:eastAsia="Times New Roman" w:hAnsi="Arial" w:cs="Arial"/>
+          <w:b/>
+          <w:bCs/>
+        </w:rPr>
+        <w:t xml:space="preserve"> }</w:t>
+      </w:r>
+      <w:proofErr w:type="gramEnd"/>
+      <w:r>
+        <w:rPr>
+          <w:rFonts w:ascii="Arial" w:eastAsia="Times New Roman" w:hAnsi="Arial" w:cs="Arial"/>
+          <w:b/>
+          <w:bCs/>
+        </w:rPr>
+        <w:t xml:space="preserve">} </w:t>
+      </w:r>
+      <w:r>
+        <w:rPr>
+          <w:rFonts w:ascii="Arial" w:eastAsia="Times New Roman" w:hAnsi="Arial" w:cs="Arial"/>
+          <w:b/>
+          <w:bCs/>
+        </w:rPr>
+        <w:t>a</w:t>
+      </w:r>
+      <w:r>
+        <w:rPr>
+          <w:rFonts w:ascii="Arial" w:eastAsia="Times New Roman" w:hAnsi="Arial" w:cs="Arial"/>
+          <w:b/>
+          <w:bCs/>
+        </w:rPr>
+        <w:t xml:space="preserve">uxiliary </w:t>
+      </w:r>
+      <w:r>
+        <w:rPr>
+          <w:rFonts w:ascii="Arial" w:eastAsia="Times New Roman" w:hAnsi="Arial" w:cs="Arial"/>
+          <w:b/>
+          <w:bCs/>
+        </w:rPr>
+        <w:t>f</w:t>
+      </w:r>
+      <w:r>
+        <w:rPr>
+          <w:rFonts w:ascii="Arial" w:eastAsia="Times New Roman" w:hAnsi="Arial" w:cs="Arial"/>
+          <w:b/>
+          <w:bCs/>
+        </w:rPr>
+        <w:t>an</w:t>
+      </w:r>
+      <w:r>
+        <w:rPr>
+          <w:rFonts w:ascii="Arial" w:eastAsia="Times New Roman" w:hAnsi="Arial" w:cs="Arial"/>
+          <w:b/>
+          <w:bCs/>
+        </w:rPr>
+        <w:t>s</w:t>
       </w:r>
     </w:p>
     <w:p>
@@ -146,8 +343,46 @@
           <w:b/>
         </w:rPr>
         <w:t>OUR REF</w:t>
+      </w:r>
+      <w:r>
+        <w:rPr>
+          <w:rFonts w:ascii="Arial" w:eastAsia="Times New Roman" w:hAnsi="Arial" w:cs="Arial"/>
+          <w:b/>
+        </w:rPr>
         <w:tab/>
-        <w:t>: {{ quote_ref }}</w:t>
+        <w:t xml:space="preserve">: </w:t>
+      </w:r>
+      <w:proofErr w:type="gramStart"/>
+      <w:r>
+        <w:rPr>
+          <w:rFonts w:ascii="Arial" w:eastAsia="Times New Roman" w:hAnsi="Arial" w:cs="Arial"/>
+          <w:b/>
+        </w:rPr>
+        <w:t>{{ quote</w:t>
+      </w:r>
+      <w:proofErr w:type="gramEnd"/>
+      <w:r>
+        <w:rPr>
+          <w:rFonts w:ascii="Arial" w:eastAsia="Times New Roman" w:hAnsi="Arial" w:cs="Arial"/>
+          <w:b/>
+        </w:rPr>
+        <w:t>_</w:t>
+      </w:r>
+      <w:proofErr w:type="gramStart"/>
+      <w:r>
+        <w:rPr>
+          <w:rFonts w:ascii="Arial" w:eastAsia="Times New Roman" w:hAnsi="Arial" w:cs="Arial"/>
+          <w:b/>
+        </w:rPr>
+        <w:t>ref }</w:t>
+      </w:r>
+      <w:proofErr w:type="gramEnd"/>
+      <w:r>
+        <w:rPr>
+          <w:rFonts w:ascii="Arial" w:eastAsia="Times New Roman" w:hAnsi="Arial" w:cs="Arial"/>
+          <w:b/>
+        </w:rPr>
+        <w:t>}</w:t>
       </w:r>
     </w:p>
     <w:p>
@@ -170,8 +405,20 @@
           <w:b/>
         </w:rPr>
         <w:t>DATE</w:t>
+      </w:r>
+      <w:r>
+        <w:rPr>
+          <w:rFonts w:ascii="Arial" w:eastAsia="Times New Roman" w:hAnsi="Arial" w:cs="Arial"/>
+          <w:b/>
+        </w:rPr>
         <w:tab/>
         <w:t>: {{ quote_date }}</w:t>
+      </w:r>
+      <w:r>
+        <w:rPr>
+          <w:rFonts w:ascii="Arial" w:eastAsia="Times New Roman" w:hAnsi="Arial" w:cs="Arial"/>
+          <w:b/>
+        </w:rPr>
         <w:tab/>
       </w:r>
     </w:p>
@@ -195,12 +442,48 @@
           <w:b/>
         </w:rPr>
         <w:t>No of Pages</w:t>
+      </w:r>
+      <w:r>
+        <w:rPr>
+          <w:rFonts w:ascii="Arial" w:eastAsia="Times New Roman" w:hAnsi="Arial" w:cs="Arial"/>
+          <w:b/>
+        </w:rPr>
         <w:tab/>
         <w:t xml:space="preserve">: 1 of </w:t>
+      </w:r>
+      <w:r>
+        <w:rPr>
+          <w:rFonts w:ascii="Arial" w:eastAsia="Times New Roman" w:hAnsi="Arial" w:cs="Arial"/>
+          <w:b/>
+        </w:rPr>
         <w:fldChar w:fldCharType="begin"/>
+      </w:r>
+      <w:r>
+        <w:rPr>
+          <w:rFonts w:ascii="Arial" w:eastAsia="Times New Roman" w:hAnsi="Arial" w:cs="Arial"/>
+          <w:b/>
+        </w:rPr>
         <w:instrText xml:space="preserve"> DOCPROPERTY  Pages  \* MERGEFORMAT </w:instrText>
+      </w:r>
+      <w:r>
+        <w:rPr>
+          <w:rFonts w:ascii="Arial" w:eastAsia="Times New Roman" w:hAnsi="Arial" w:cs="Arial"/>
+          <w:b/>
+        </w:rPr>
         <w:fldChar w:fldCharType="separate"/>
+      </w:r>
+      <w:r>
+        <w:rPr>
+          <w:rFonts w:ascii="Arial" w:eastAsia="Times New Roman" w:hAnsi="Arial" w:cs="Arial"/>
+          <w:b/>
+        </w:rPr>
         <w:t>4</w:t>
+      </w:r>
+      <w:r>
+        <w:rPr>
+          <w:rFonts w:ascii="Arial" w:eastAsia="Times New Roman" w:hAnsi="Arial" w:cs="Arial"/>
+          <w:b/>
+        </w:rPr>
         <w:fldChar w:fldCharType="end"/>
       </w:r>
     </w:p>
@@ -234,7 +517,19 @@
           <w:b/>
         </w:rPr>
         <w:t>SUBJECT</w:t>
+      </w:r>
+      <w:r>
+        <w:rPr>
+          <w:rFonts w:ascii="Arial" w:eastAsia="Times New Roman" w:hAnsi="Arial" w:cs="Arial"/>
+          <w:b/>
+        </w:rPr>
         <w:tab/>
+      </w:r>
+      <w:r>
+        <w:rPr>
+          <w:rFonts w:ascii="Arial" w:eastAsia="Times New Roman" w:hAnsi="Arial" w:cs="Arial"/>
+          <w:b/>
+        </w:rPr>
         <w:tab/>
         <w:t xml:space="preserve">: </w:t>
       </w:r>
@@ -244,7 +539,147 @@
           <w:b/>
           <w:bCs/>
         </w:rPr>
-        <w:t>{{ subject_fan_sizes }} Auxiliary Fan – {{ project_location }}</w:t>
+        <w:t>Auxiliary Fan</w:t>
+      </w:r>
+      <w:r>
+        <w:rPr>
+          <w:rFonts w:ascii="Arial" w:eastAsia="Times New Roman" w:hAnsi="Arial" w:cs="Arial"/>
+          <w:b/>
+          <w:bCs/>
+        </w:rPr>
+        <w:t>s:</w:t>
+      </w:r>
+      <w:r>
+        <w:rPr>
+          <w:rFonts w:ascii="Arial" w:eastAsia="Times New Roman" w:hAnsi="Arial" w:cs="Arial"/>
+          <w:b/>
+          <w:bCs/>
+        </w:rPr>
+        <w:t xml:space="preserve"> </w:t>
+      </w:r>
+      <w:proofErr w:type="gramStart"/>
+      <w:r>
+        <w:rPr>
+          <w:rFonts w:ascii="Arial" w:eastAsia="Times New Roman" w:hAnsi="Arial" w:cs="Arial"/>
+          <w:b/>
+          <w:bCs/>
+        </w:rPr>
+        <w:t xml:space="preserve">{{ </w:t>
+      </w:r>
+      <w:proofErr w:type="spellStart"/>
+      <w:r>
+        <w:rPr>
+          <w:rFonts w:ascii="Arial" w:eastAsia="Times New Roman" w:hAnsi="Arial" w:cs="Arial"/>
+          <w:b/>
+          <w:bCs/>
+        </w:rPr>
+        <w:t>subject</w:t>
+      </w:r>
+      <w:proofErr w:type="gramEnd"/>
+      <w:r>
+        <w:rPr>
+          <w:rFonts w:ascii="Arial" w:eastAsia="Times New Roman" w:hAnsi="Arial" w:cs="Arial"/>
+          <w:b/>
+          <w:bCs/>
+        </w:rPr>
+        <w:t>_fan_</w:t>
+      </w:r>
+      <w:proofErr w:type="gramStart"/>
+      <w:r>
+        <w:rPr>
+          <w:rFonts w:ascii="Arial" w:eastAsia="Times New Roman" w:hAnsi="Arial" w:cs="Arial"/>
+          <w:b/>
+          <w:bCs/>
+        </w:rPr>
+        <w:t>sizes</w:t>
+      </w:r>
+      <w:proofErr w:type="spellEnd"/>
+      <w:r>
+        <w:rPr>
+          <w:rFonts w:ascii="Arial" w:eastAsia="Times New Roman" w:hAnsi="Arial" w:cs="Arial"/>
+          <w:b/>
+          <w:bCs/>
+        </w:rPr>
+        <w:t xml:space="preserve"> }</w:t>
+      </w:r>
+      <w:proofErr w:type="gramEnd"/>
+      <w:r>
+        <w:rPr>
+          <w:rFonts w:ascii="Arial" w:eastAsia="Times New Roman" w:hAnsi="Arial" w:cs="Arial"/>
+          <w:b/>
+          <w:bCs/>
+        </w:rPr>
+        <w:t>}</w:t>
+      </w:r>
+      <w:r>
+        <w:rPr>
+          <w:rFonts w:ascii="Arial" w:eastAsia="Times New Roman" w:hAnsi="Arial" w:cs="Arial"/>
+          <w:b/>
+          <w:bCs/>
+        </w:rPr>
+        <w:t xml:space="preserve"> </w:t>
+      </w:r>
+      <w:r>
+        <w:rPr>
+          <w:rFonts w:ascii="Arial" w:eastAsia="Times New Roman" w:hAnsi="Arial" w:cs="Arial"/>
+          <w:b/>
+          <w:bCs/>
+        </w:rPr>
+        <w:t xml:space="preserve">– </w:t>
+      </w:r>
+      <w:proofErr w:type="gramStart"/>
+      <w:r>
+        <w:rPr>
+          <w:rFonts w:ascii="Arial" w:eastAsia="Times New Roman" w:hAnsi="Arial" w:cs="Arial"/>
+          <w:b/>
+          <w:bCs/>
+        </w:rPr>
+        <w:t xml:space="preserve">{{ </w:t>
+      </w:r>
+      <w:proofErr w:type="spellStart"/>
+      <w:r>
+        <w:rPr>
+          <w:rFonts w:ascii="Arial" w:eastAsia="Times New Roman" w:hAnsi="Arial" w:cs="Arial"/>
+          <w:b/>
+          <w:bCs/>
+        </w:rPr>
+        <w:t>project</w:t>
+      </w:r>
+      <w:proofErr w:type="gramEnd"/>
+      <w:r>
+        <w:rPr>
+          <w:rFonts w:ascii="Arial" w:eastAsia="Times New Roman" w:hAnsi="Arial" w:cs="Arial"/>
+          <w:b/>
+          <w:bCs/>
+        </w:rPr>
+        <w:t>_</w:t>
+      </w:r>
+      <w:proofErr w:type="gramStart"/>
+      <w:r>
+        <w:rPr>
+          <w:rFonts w:ascii="Arial" w:eastAsia="Times New Roman" w:hAnsi="Arial" w:cs="Arial"/>
+          <w:b/>
+          <w:bCs/>
+        </w:rPr>
+        <w:t>location</w:t>
+      </w:r>
+      <w:proofErr w:type="spellEnd"/>
+      <w:r>
+        <w:rPr>
+          <w:rFonts w:ascii="Arial" w:eastAsia="Times New Roman" w:hAnsi="Arial" w:cs="Arial"/>
+          <w:b/>
+          <w:bCs/>
+        </w:rPr>
+        <w:t xml:space="preserve"> }</w:t>
+      </w:r>
+      <w:proofErr w:type="gramEnd"/>
+      <w:r>
+        <w:rPr>
+          <w:rFonts w:ascii="Arial" w:eastAsia="Times New Roman" w:hAnsi="Arial" w:cs="Arial"/>
+          <w:b/>
+          <w:bCs/>
+        </w:rPr>
+        <w:t>}</w:t>
       </w:r>
     </w:p>
     <w:p>
@@ -278,12 +713,53 @@
         </w:rPr>
         <w:t xml:space="preserve">Dear </w:t>
       </w:r>
-      <w:r>
-        <w:rPr>
-          <w:rFonts w:ascii="Arial" w:eastAsia="Times New Roman" w:hAnsi="Arial" w:cs="Arial"/>
-          <w:b/>
-        </w:rPr>
-        <w:t>{{ client_name }}</w:t>
+      <w:proofErr w:type="gramStart"/>
+      <w:r>
+        <w:rPr>
+          <w:rFonts w:ascii="Arial" w:eastAsia="Times New Roman" w:hAnsi="Arial" w:cs="Arial"/>
+          <w:b/>
+        </w:rPr>
+        <w:t xml:space="preserve">{{ </w:t>
+      </w:r>
+      <w:proofErr w:type="spellStart"/>
+      <w:r>
+        <w:rPr>
+          <w:rFonts w:ascii="Arial" w:eastAsia="Times New Roman" w:hAnsi="Arial" w:cs="Arial"/>
+          <w:b/>
+        </w:rPr>
+        <w:t>attention</w:t>
+      </w:r>
+      <w:proofErr w:type="gramEnd"/>
+      <w:r>
+        <w:rPr>
+          <w:rFonts w:ascii="Arial" w:eastAsia="Times New Roman" w:hAnsi="Arial" w:cs="Arial"/>
+          <w:b/>
+        </w:rPr>
+        <w:t>_</w:t>
+      </w:r>
+      <w:proofErr w:type="gramStart"/>
+      <w:r>
+        <w:rPr>
+          <w:rFonts w:ascii="Arial" w:eastAsia="Times New Roman" w:hAnsi="Arial" w:cs="Arial"/>
+          <w:b/>
+        </w:rPr>
+        <w:t>to</w:t>
+      </w:r>
+      <w:proofErr w:type="spellEnd"/>
+      <w:r>
+        <w:rPr>
+          <w:rFonts w:ascii="Arial" w:eastAsia="Times New Roman" w:hAnsi="Arial" w:cs="Arial"/>
+          <w:b/>
+        </w:rPr>
+        <w:t xml:space="preserve"> }</w:t>
+      </w:r>
+      <w:proofErr w:type="gramEnd"/>
+      <w:r>
+        <w:rPr>
+          <w:rFonts w:ascii="Arial" w:eastAsia="Times New Roman" w:hAnsi="Arial" w:cs="Arial"/>
+          <w:b/>
+        </w:rPr>
+        <w:t>}</w:t>
       </w:r>
       <w:r>
         <w:rPr>
@@ -384,11 +860,8 @@
       </w:pPr>
     </w:p>
     <w:p>
-      <w:pPr>
-        <w:pStyle w:val="Normal"/>
-      </w:pPr>
-      <w:r>
-        <w:t xml:space="preserve">{%p for fan_config in fan_configs %}</w:t>
+      <w:r>
+        <w:t>{%p for fan_config in fan_configs %}</w:t>
       </w:r>
     </w:p>
     <w:p>
@@ -469,35 +942,44 @@
         <w:rPr>
           <w:rFonts w:ascii="Arial" w:eastAsia="Times New Roman" w:hAnsi="Arial" w:cs="Arial"/>
         </w:rPr>
-        <w:t>Fan Model: {{ fan_config.fan_uid }}</w:t>
-      </w:r>
-    </w:p>
-    <w:p>
-      <w:pPr>
-        <w:pStyle w:val="ListParagraph"/>
-        <w:numPr>
-          <w:ilvl w:val="0"/>
-          <w:numId w:val="10"/>
-        </w:numPr>
-        <w:pBdr>
-          <w:top w:val="none" w:sz="0" w:space="0" w:color="auto"/>
-          <w:left w:val="none" w:sz="0" w:space="0" w:color="auto"/>
-          <w:bottom w:val="none" w:sz="0" w:space="0" w:color="auto"/>
-          <w:right w:val="none" w:sz="0" w:space="0" w:color="auto"/>
-          <w:between w:val="none" w:sz="0" w:space="0" w:color="auto"/>
-          <w:bar w:val="none" w:sz="0" w:color="auto"/>
-        </w:pBdr>
-        <w:spacing w:after="160" w:line="259" w:lineRule="auto"/>
-        <w:rPr>
-          <w:rFonts w:ascii="Arial" w:eastAsia="Times New Roman" w:hAnsi="Arial" w:cs="Arial"/>
-        </w:rPr>
-      </w:pPr>
-      <w:r>
-        <w:rPr>
-          <w:rFonts w:ascii="Arial" w:eastAsia="Times New Roman" w:hAnsi="Arial" w:cs="Arial"/>
-        </w:rPr>
-        <w:t>Fan Size: {{ fan_config.fan_size_mm }}mm</w:t>
-      </w:r>
+        <w:t xml:space="preserve">Fan Size: </w:t>
+      </w:r>
+      <w:proofErr w:type="gramStart"/>
+      <w:r>
+        <w:rPr>
+          <w:rFonts w:ascii="Arial" w:eastAsia="Times New Roman" w:hAnsi="Arial" w:cs="Arial"/>
+        </w:rPr>
+        <w:t xml:space="preserve">{{ </w:t>
+      </w:r>
+      <w:proofErr w:type="spellStart"/>
+      <w:r>
+        <w:rPr>
+          <w:rFonts w:ascii="Arial" w:eastAsia="Times New Roman" w:hAnsi="Arial" w:cs="Arial"/>
+        </w:rPr>
+        <w:t>fan_config.fan</w:t>
+      </w:r>
+      <w:proofErr w:type="gramEnd"/>
+      <w:r>
+        <w:rPr>
+          <w:rFonts w:ascii="Arial" w:eastAsia="Times New Roman" w:hAnsi="Arial" w:cs="Arial"/>
+        </w:rPr>
+        <w:t>_size_</w:t>
+      </w:r>
+      <w:proofErr w:type="gramStart"/>
+      <w:r>
+        <w:rPr>
+          <w:rFonts w:ascii="Arial" w:eastAsia="Times New Roman" w:hAnsi="Arial" w:cs="Arial"/>
+        </w:rPr>
+        <w:t>mm</w:t>
+      </w:r>
+      <w:proofErr w:type="spellEnd"/>
+      <w:r>
+        <w:rPr>
+          <w:rFonts w:ascii="Arial" w:eastAsia="Times New Roman" w:hAnsi="Arial" w:cs="Arial"/>
+        </w:rPr>
+        <w:t xml:space="preserve"> }}mm</w:t>
+      </w:r>
+      <w:proofErr w:type="gramEnd"/>
     </w:p>
     <w:p>
       <w:pPr>
@@ -948,10 +1430,353 @@
     </w:p>
     <w:p>
       <w:pPr>
-        <w:pStyle w:val="Normal"/>
-      </w:pPr>
-      <w:r>
-        <w:t xml:space="preserve">{%p endfor %}</w:t>
+        <w:pBdr>
+          <w:top w:val="none" w:sz="0" w:space="0" w:color="auto"/>
+          <w:left w:val="none" w:sz="0" w:space="0" w:color="auto"/>
+          <w:bottom w:val="none" w:sz="0" w:space="0" w:color="auto"/>
+          <w:right w:val="none" w:sz="0" w:space="0" w:color="auto"/>
+          <w:between w:val="none" w:sz="0" w:space="0" w:color="auto"/>
+          <w:bar w:val="none" w:sz="0" w:color="auto"/>
+        </w:pBdr>
+        <w:spacing w:after="160" w:line="259" w:lineRule="auto"/>
+        <w:rPr>
+          <w:rFonts w:ascii="Arial" w:eastAsia="Times New Roman" w:hAnsi="Arial" w:cs="Arial"/>
+          <w:b/>
+          <w:bCs/>
+          <w:u w:val="single"/>
+        </w:rPr>
+      </w:pPr>
+      <w:r>
+        <w:rPr>
+          <w:rFonts w:ascii="Arial" w:eastAsia="Times New Roman" w:hAnsi="Arial" w:cs="Arial"/>
+          <w:b/>
+          <w:bCs/>
+          <w:u w:val="single"/>
+        </w:rPr>
+        <w:t>Buyout Items</w:t>
+      </w:r>
+      <w:r>
+        <w:rPr>
+          <w:rFonts w:ascii="Arial" w:eastAsia="Times New Roman" w:hAnsi="Arial" w:cs="Arial"/>
+          <w:b/>
+          <w:bCs/>
+          <w:u w:val="single"/>
+        </w:rPr>
+        <w:t xml:space="preserve">:  </w:t>
+      </w:r>
+    </w:p>
+    <w:p>
+      <w:pPr>
+        <w:pStyle w:val="ListParagraph"/>
+        <w:numPr>
+          <w:ilvl w:val="0"/>
+          <w:numId w:val="10"/>
+        </w:numPr>
+        <w:pBdr>
+          <w:top w:val="none" w:sz="0" w:space="0" w:color="auto"/>
+          <w:left w:val="none" w:sz="0" w:space="0" w:color="auto"/>
+          <w:bottom w:val="none" w:sz="0" w:space="0" w:color="auto"/>
+          <w:right w:val="none" w:sz="0" w:space="0" w:color="auto"/>
+          <w:between w:val="none" w:sz="0" w:space="0" w:color="auto"/>
+          <w:bar w:val="none" w:sz="0" w:color="auto"/>
+        </w:pBdr>
+        <w:spacing w:after="160" w:line="259" w:lineRule="auto"/>
+        <w:rPr>
+          <w:rFonts w:ascii="Arial" w:eastAsia="Times New Roman" w:hAnsi="Arial" w:cs="Arial"/>
+        </w:rPr>
+      </w:pPr>
+      <w:r>
+        <w:rPr>
+          <w:rFonts w:ascii="Arial" w:eastAsia="Times New Roman" w:hAnsi="Arial" w:cs="Arial"/>
+        </w:rPr>
+        <w:t xml:space="preserve">{%p for </w:t>
+      </w:r>
+      <w:r>
+        <w:rPr>
+          <w:rFonts w:ascii="Arial" w:eastAsia="Times New Roman" w:hAnsi="Arial" w:cs="Arial"/>
+          <w:bCs/>
+        </w:rPr>
+        <w:t xml:space="preserve">buyout </w:t>
+      </w:r>
+      <w:r>
+        <w:rPr>
+          <w:rFonts w:ascii="Arial" w:eastAsia="Times New Roman" w:hAnsi="Arial" w:cs="Arial"/>
+        </w:rPr>
+        <w:t xml:space="preserve">in </w:t>
+      </w:r>
+      <w:proofErr w:type="spellStart"/>
+      <w:r>
+        <w:rPr>
+          <w:rFonts w:ascii="Arial" w:eastAsia="Times New Roman" w:hAnsi="Arial" w:cs="Arial"/>
+          <w:bCs/>
+        </w:rPr>
+        <w:t>fan_</w:t>
+      </w:r>
+      <w:proofErr w:type="gramStart"/>
+      <w:r>
+        <w:rPr>
+          <w:rFonts w:ascii="Arial" w:eastAsia="Times New Roman" w:hAnsi="Arial" w:cs="Arial"/>
+          <w:bCs/>
+        </w:rPr>
+        <w:t>config.buyout</w:t>
+      </w:r>
+      <w:proofErr w:type="gramEnd"/>
+      <w:r>
+        <w:rPr>
+          <w:rFonts w:ascii="Arial" w:eastAsia="Times New Roman" w:hAnsi="Arial" w:cs="Arial"/>
+          <w:bCs/>
+        </w:rPr>
+        <w:t>_items</w:t>
+      </w:r>
+      <w:proofErr w:type="spellEnd"/>
+      <w:r>
+        <w:rPr>
+          <w:rFonts w:ascii="Arial" w:eastAsia="Times New Roman" w:hAnsi="Arial" w:cs="Arial"/>
+          <w:bCs/>
+        </w:rPr>
+        <w:t xml:space="preserve"> </w:t>
+      </w:r>
+      <w:r>
+        <w:rPr>
+          <w:rFonts w:ascii="Arial" w:eastAsia="Times New Roman" w:hAnsi="Arial" w:cs="Arial"/>
+        </w:rPr>
+        <w:t>%}</w:t>
+      </w:r>
+    </w:p>
+    <w:p>
+      <w:pPr>
+        <w:pStyle w:val="ListParagraph"/>
+        <w:numPr>
+          <w:ilvl w:val="0"/>
+          <w:numId w:val="10"/>
+        </w:numPr>
+        <w:pBdr>
+          <w:top w:val="none" w:sz="0" w:space="0" w:color="auto"/>
+          <w:left w:val="none" w:sz="0" w:space="0" w:color="auto"/>
+          <w:bottom w:val="none" w:sz="0" w:space="0" w:color="auto"/>
+          <w:right w:val="none" w:sz="0" w:space="0" w:color="auto"/>
+          <w:between w:val="none" w:sz="0" w:space="0" w:color="auto"/>
+          <w:bar w:val="none" w:sz="0" w:color="auto"/>
+        </w:pBdr>
+        <w:spacing w:after="160" w:line="259" w:lineRule="auto"/>
+        <w:rPr>
+          <w:rFonts w:ascii="Arial" w:eastAsia="Times New Roman" w:hAnsi="Arial" w:cs="Arial"/>
+        </w:rPr>
+      </w:pPr>
+      <w:proofErr w:type="gramStart"/>
+      <w:r>
+        <w:rPr>
+          <w:rFonts w:ascii="Arial" w:eastAsia="Times New Roman" w:hAnsi="Arial" w:cs="Arial"/>
+        </w:rPr>
+        <w:t xml:space="preserve">{{ </w:t>
+      </w:r>
+      <w:r>
+        <w:rPr>
+          <w:rFonts w:ascii="Arial" w:eastAsia="Times New Roman" w:hAnsi="Arial" w:cs="Arial"/>
+          <w:bCs/>
+        </w:rPr>
+        <w:t>buyout</w:t>
+      </w:r>
+      <w:r>
+        <w:rPr>
+          <w:rFonts w:ascii="Arial" w:eastAsia="Times New Roman" w:hAnsi="Arial" w:cs="Arial"/>
+        </w:rPr>
+        <w:t>.name</w:t>
+      </w:r>
+      <w:proofErr w:type="gramEnd"/>
+      <w:r>
+        <w:rPr>
+          <w:rFonts w:ascii="Arial" w:eastAsia="Times New Roman" w:hAnsi="Arial" w:cs="Arial"/>
+        </w:rPr>
+        <w:t xml:space="preserve"> }}</w:t>
+      </w:r>
+      <w:r>
+        <w:rPr>
+          <w:rFonts w:ascii="Arial" w:eastAsia="Times New Roman" w:hAnsi="Arial" w:cs="Arial"/>
+        </w:rPr>
+        <w:t xml:space="preserve"> x </w:t>
+      </w:r>
+      <w:proofErr w:type="gramStart"/>
+      <w:r>
+        <w:rPr>
+          <w:rFonts w:ascii="Arial" w:eastAsia="Times New Roman" w:hAnsi="Arial" w:cs="Arial"/>
+        </w:rPr>
+        <w:t xml:space="preserve">{{ </w:t>
+      </w:r>
+      <w:proofErr w:type="spellStart"/>
+      <w:r>
+        <w:rPr>
+          <w:rFonts w:ascii="Arial" w:eastAsia="Times New Roman" w:hAnsi="Arial" w:cs="Arial"/>
+          <w:bCs/>
+        </w:rPr>
+        <w:t>buyout</w:t>
+      </w:r>
+      <w:r>
+        <w:rPr>
+          <w:rFonts w:ascii="Arial" w:eastAsia="Times New Roman" w:hAnsi="Arial" w:cs="Arial"/>
+        </w:rPr>
+        <w:t>.</w:t>
+      </w:r>
+      <w:r>
+        <w:rPr>
+          <w:rFonts w:ascii="Arial" w:eastAsia="Times New Roman" w:hAnsi="Arial" w:cs="Arial"/>
+        </w:rPr>
+        <w:t>qty</w:t>
+      </w:r>
+      <w:proofErr w:type="spellEnd"/>
+      <w:proofErr w:type="gramEnd"/>
+      <w:r>
+        <w:rPr>
+          <w:rFonts w:ascii="Arial" w:eastAsia="Times New Roman" w:hAnsi="Arial" w:cs="Arial"/>
+        </w:rPr>
+        <w:t xml:space="preserve"> }}</w:t>
+      </w:r>
+    </w:p>
+    <w:p>
+      <w:pPr>
+        <w:pStyle w:val="ListParagraph"/>
+        <w:numPr>
+          <w:ilvl w:val="0"/>
+          <w:numId w:val="10"/>
+        </w:numPr>
+        <w:pBdr>
+          <w:top w:val="none" w:sz="0" w:space="0" w:color="auto"/>
+          <w:left w:val="none" w:sz="0" w:space="0" w:color="auto"/>
+          <w:bottom w:val="none" w:sz="0" w:space="0" w:color="auto"/>
+          <w:right w:val="none" w:sz="0" w:space="0" w:color="auto"/>
+          <w:between w:val="none" w:sz="0" w:space="0" w:color="auto"/>
+          <w:bar w:val="none" w:sz="0" w:color="auto"/>
+        </w:pBdr>
+        <w:spacing w:after="160" w:line="259" w:lineRule="auto"/>
+        <w:rPr>
+          <w:rFonts w:ascii="Arial" w:eastAsia="Times New Roman" w:hAnsi="Arial" w:cs="Arial"/>
+        </w:rPr>
+      </w:pPr>
+      <w:r>
+        <w:rPr>
+          <w:rFonts w:ascii="Arial" w:eastAsia="Times New Roman" w:hAnsi="Arial" w:cs="Arial"/>
+        </w:rPr>
+        <w:t xml:space="preserve">{%p </w:t>
+      </w:r>
+      <w:proofErr w:type="spellStart"/>
+      <w:r>
+        <w:rPr>
+          <w:rFonts w:ascii="Arial" w:eastAsia="Times New Roman" w:hAnsi="Arial" w:cs="Arial"/>
+        </w:rPr>
+        <w:t>endfor</w:t>
+      </w:r>
+      <w:proofErr w:type="spellEnd"/>
+      <w:r>
+        <w:rPr>
+          <w:rFonts w:ascii="Arial" w:eastAsia="Times New Roman" w:hAnsi="Arial" w:cs="Arial"/>
+        </w:rPr>
+        <w:t xml:space="preserve"> %}</w:t>
+      </w:r>
+    </w:p>
+    <w:p>
+      <w:pPr>
+        <w:pStyle w:val="ListParagraph"/>
+        <w:numPr>
+          <w:ilvl w:val="0"/>
+          <w:numId w:val="10"/>
+        </w:numPr>
+        <w:spacing w:after="160" w:line="259" w:lineRule="auto"/>
+        <w:rPr>
+          <w:rFonts w:ascii="Arial" w:eastAsia="Times New Roman" w:hAnsi="Arial" w:cs="Arial"/>
+        </w:rPr>
+      </w:pPr>
+      <w:r>
+        <w:rPr>
+          <w:rFonts w:ascii="Arial" w:eastAsia="Times New Roman" w:hAnsi="Arial" w:cs="Arial"/>
+        </w:rPr>
+        <w:t xml:space="preserve">{%p if not </w:t>
+      </w:r>
+      <w:proofErr w:type="spellStart"/>
+      <w:r>
+        <w:rPr>
+          <w:rFonts w:ascii="Arial" w:eastAsia="Times New Roman" w:hAnsi="Arial" w:cs="Arial"/>
+        </w:rPr>
+        <w:t>fan_</w:t>
+      </w:r>
+      <w:proofErr w:type="gramStart"/>
+      <w:r>
+        <w:rPr>
+          <w:rFonts w:ascii="Arial" w:eastAsia="Times New Roman" w:hAnsi="Arial" w:cs="Arial"/>
+        </w:rPr>
+        <w:t>config.buyout</w:t>
+      </w:r>
+      <w:proofErr w:type="gramEnd"/>
+      <w:r>
+        <w:rPr>
+          <w:rFonts w:ascii="Arial" w:eastAsia="Times New Roman" w:hAnsi="Arial" w:cs="Arial"/>
+        </w:rPr>
+        <w:t>_items</w:t>
+      </w:r>
+      <w:proofErr w:type="spellEnd"/>
+      <w:r>
+        <w:rPr>
+          <w:rFonts w:ascii="Arial" w:eastAsia="Times New Roman" w:hAnsi="Arial" w:cs="Arial"/>
+        </w:rPr>
+        <w:t xml:space="preserve"> %}</w:t>
+      </w:r>
+    </w:p>
+    <w:p>
+      <w:pPr>
+        <w:pStyle w:val="ListParagraph"/>
+        <w:numPr>
+          <w:ilvl w:val="0"/>
+          <w:numId w:val="10"/>
+        </w:numPr>
+        <w:spacing w:after="160" w:line="259" w:lineRule="auto"/>
+        <w:rPr>
+          <w:rFonts w:ascii="Arial" w:eastAsia="Times New Roman" w:hAnsi="Arial" w:cs="Arial"/>
+        </w:rPr>
+      </w:pPr>
+      <w:r>
+        <w:rPr>
+          <w:rFonts w:ascii="Arial" w:eastAsia="Times New Roman" w:hAnsi="Arial" w:cs="Arial"/>
+        </w:rPr>
+        <w:t>None</w:t>
+      </w:r>
+    </w:p>
+    <w:p>
+      <w:pPr>
+        <w:pStyle w:val="ListParagraph"/>
+        <w:numPr>
+          <w:ilvl w:val="0"/>
+          <w:numId w:val="10"/>
+        </w:numPr>
+        <w:spacing w:after="160" w:line="259" w:lineRule="auto"/>
+        <w:rPr>
+          <w:rFonts w:ascii="Arial" w:eastAsia="Times New Roman" w:hAnsi="Arial" w:cs="Arial"/>
+        </w:rPr>
+      </w:pPr>
+      <w:r>
+        <w:rPr>
+          <w:rFonts w:ascii="Arial" w:eastAsia="Times New Roman" w:hAnsi="Arial" w:cs="Arial"/>
+        </w:rPr>
+        <w:t>{%p endif %}</w:t>
+      </w:r>
+    </w:p>
+    <w:p>
+      <w:pPr>
+        <w:pBdr>
+          <w:top w:val="none" w:sz="0" w:space="0" w:color="auto"/>
+          <w:left w:val="none" w:sz="0" w:space="0" w:color="auto"/>
+          <w:bottom w:val="none" w:sz="0" w:space="0" w:color="auto"/>
+          <w:right w:val="none" w:sz="0" w:space="0" w:color="auto"/>
+          <w:between w:val="none" w:sz="0" w:space="0" w:color="auto"/>
+          <w:bar w:val="none" w:sz="0" w:color="auto"/>
+        </w:pBdr>
+        <w:spacing w:after="160" w:line="259" w:lineRule="auto"/>
+        <w:rPr>
+          <w:rFonts w:ascii="Arial" w:eastAsia="Times New Roman" w:hAnsi="Arial" w:cs="Arial"/>
+        </w:rPr>
+      </w:pPr>
+    </w:p>
+    <w:p>
+      <w:r>
+        <w:t>{%p endfor %}</w:t>
       </w:r>
     </w:p>
     <w:p>
@@ -1543,22 +2368,37 @@
       </w:tr>
       <w:tr>
         <w:tc>
+          <w:tcPr>
+            <w:tcW w:w="851" w:type="dxa"/>
+          </w:tcPr>
           <w:p>
             <w:r>
-              <w:t xml:space="preserve">{%tr for fan_config in fan_configs %}</w:t>
+              <w:t>{%tr for fan_config in fan_configs %}</w:t>
             </w:r>
           </w:p>
         </w:tc>
         <w:tc>
+          <w:tcPr>
+            <w:tcW w:w="4819" w:type="dxa"/>
+          </w:tcPr>
           <w:p/>
         </w:tc>
         <w:tc>
+          <w:tcPr>
+            <w:tcW w:w="1418" w:type="dxa"/>
+          </w:tcPr>
           <w:p/>
         </w:tc>
         <w:tc>
+          <w:tcPr>
+            <w:tcW w:w="709" w:type="dxa"/>
+          </w:tcPr>
           <w:p/>
         </w:tc>
         <w:tc>
+          <w:tcPr>
+            <w:tcW w:w="1988" w:type="dxa"/>
+          </w:tcPr>
           <w:p/>
         </w:tc>
       </w:tr>
@@ -1684,7 +2524,14 @@
               <w:rPr>
                 <w:rFonts w:ascii="Arial" w:eastAsia="Times New Roman" w:hAnsi="Arial" w:cs="Arial"/>
               </w:rPr>
-              <w:t>{{ fan_config.fan_size_mm }}mm Diameter auxiliary fan that includes rotor assembly with a variable pitch rotor and additional selected mechanical components.</w:t>
+              <w:t xml:space="preserve">{{ fan_config.fan_size_mm }}mm Diameter auxiliary fan that includes rotor assembly with a </w:t>
+            </w:r>
+            <w:r>
+              <w:rPr>
+                <w:rFonts w:ascii="Arial" w:eastAsia="Times New Roman" w:hAnsi="Arial" w:cs="Arial"/>
+              </w:rPr>
+              <w:lastRenderedPageBreak/>
+              <w:t>variable pitch rotor and additional selected mechanical components.</w:t>
             </w:r>
           </w:p>
         </w:tc>
@@ -3241,7 +4088,7 @@
                 <w:b/>
                 <w:color w:val="2F5496" w:themeColor="accent1" w:themeShade="BF"/>
               </w:rPr>
-              <w:t xml:space="preserve">CONFIG {{ fan_config.config_number }} TOTAL</w:t>
+              <w:t>CONFIG {{ fan_config.config_number }} TOTAL</w:t>
             </w:r>
           </w:p>
         </w:tc>
@@ -3310,22 +4157,37 @@
       </w:tr>
       <w:tr>
         <w:tc>
+          <w:tcPr>
+            <w:tcW w:w="851" w:type="dxa"/>
+          </w:tcPr>
           <w:p>
             <w:r>
-              <w:t xml:space="preserve">{%tr endfor %}</w:t>
+              <w:t>{%tr endfor %}</w:t>
             </w:r>
           </w:p>
         </w:tc>
         <w:tc>
+          <w:tcPr>
+            <w:tcW w:w="4819" w:type="dxa"/>
+          </w:tcPr>
           <w:p/>
         </w:tc>
         <w:tc>
+          <w:tcPr>
+            <w:tcW w:w="1418" w:type="dxa"/>
+          </w:tcPr>
           <w:p/>
         </w:tc>
         <w:tc>
+          <w:tcPr>
+            <w:tcW w:w="709" w:type="dxa"/>
+          </w:tcPr>
           <w:p/>
         </w:tc>
         <w:tc>
+          <w:tcPr>
+            <w:tcW w:w="1988" w:type="dxa"/>
+          </w:tcPr>
           <w:p/>
         </w:tc>
       </w:tr>
@@ -3499,7 +4361,6 @@
           <w:b/>
           <w:u w:val="single"/>
         </w:rPr>
-        <w:lastRenderedPageBreak/>
         <w:t>EXCLUTIONS:</w:t>
       </w:r>
     </w:p>
@@ -3771,7 +4632,73 @@
         <w:rPr>
           <w:rFonts w:ascii="Arial" w:eastAsia="Times New Roman" w:hAnsi="Arial" w:cs="Arial"/>
         </w:rPr>
-        <w:t xml:space="preserve">Durations 4 – 6 working weeks depending on long lead items </w:t>
+        <w:t>Durations</w:t>
+      </w:r>
+      <w:r>
+        <w:rPr>
+          <w:rFonts w:ascii="Arial" w:eastAsia="Times New Roman" w:hAnsi="Arial" w:cs="Arial"/>
+        </w:rPr>
+        <w:t xml:space="preserve">: </w:t>
+      </w:r>
+      <w:proofErr w:type="gramStart"/>
+      <w:r>
+        <w:rPr>
+          <w:rFonts w:ascii="Arial" w:eastAsia="Times New Roman" w:hAnsi="Arial" w:cs="Arial"/>
+        </w:rPr>
+        <w:t>{{</w:t>
+      </w:r>
+      <w:r>
+        <w:rPr>
+          <w:rFonts w:ascii="Arial" w:eastAsia="Times New Roman" w:hAnsi="Arial" w:cs="Arial"/>
+        </w:rPr>
+        <w:t xml:space="preserve"> </w:t>
+      </w:r>
+      <w:proofErr w:type="spellStart"/>
+      <w:r>
+        <w:rPr>
+          <w:rFonts w:ascii="Arial" w:eastAsia="Times New Roman" w:hAnsi="Arial" w:cs="Arial"/>
+        </w:rPr>
+        <w:t>delivery</w:t>
+      </w:r>
+      <w:proofErr w:type="gramEnd"/>
+      <w:r>
+        <w:rPr>
+          <w:rFonts w:ascii="Arial" w:eastAsia="Times New Roman" w:hAnsi="Arial" w:cs="Arial"/>
+        </w:rPr>
+        <w:t>_</w:t>
+      </w:r>
+      <w:proofErr w:type="gramStart"/>
+      <w:r>
+        <w:rPr>
+          <w:rFonts w:ascii="Arial" w:eastAsia="Times New Roman" w:hAnsi="Arial" w:cs="Arial"/>
+        </w:rPr>
+        <w:t>time</w:t>
+      </w:r>
+      <w:proofErr w:type="spellEnd"/>
+      <w:r>
+        <w:rPr>
+          <w:rFonts w:ascii="Arial" w:eastAsia="Times New Roman" w:hAnsi="Arial" w:cs="Arial"/>
+        </w:rPr>
+        <w:t xml:space="preserve"> </w:t>
+      </w:r>
+      <w:r>
+        <w:rPr>
+          <w:rFonts w:ascii="Arial" w:eastAsia="Times New Roman" w:hAnsi="Arial" w:cs="Arial"/>
+        </w:rPr>
+        <w:t>}</w:t>
+      </w:r>
+      <w:proofErr w:type="gramEnd"/>
+      <w:r>
+        <w:rPr>
+          <w:rFonts w:ascii="Arial" w:eastAsia="Times New Roman" w:hAnsi="Arial" w:cs="Arial"/>
+        </w:rPr>
+        <w:t>}</w:t>
+      </w:r>
+      <w:r>
+        <w:rPr>
+          <w:rFonts w:ascii="Arial" w:eastAsia="Times New Roman" w:hAnsi="Arial" w:cs="Arial"/>
+        </w:rPr>
+        <w:t xml:space="preserve"> depending on long lead items </w:t>
       </w:r>
     </w:p>
     <w:p>
@@ -3847,6 +4774,7 @@
           <w:b/>
           <w:u w:val="single"/>
         </w:rPr>
+        <w:lastRenderedPageBreak/>
         <w:t>PRICE AND VALIDITY:</w:t>
       </w:r>
     </w:p>
@@ -4270,7 +5198,6 @@
         <w:rPr>
           <w:rFonts w:ascii="Arial" w:eastAsia="Times New Roman" w:hAnsi="Arial" w:cs="Arial"/>
         </w:rPr>
-        <w:lastRenderedPageBreak/>
         <w:t>We trust the above proposal meets with your approval. However, should you require any further assistance and or information, please do not hesitate to contact us.</w:t>
       </w:r>
     </w:p>
@@ -4311,6 +5238,39 @@
           <w:b/>
         </w:rPr>
       </w:pPr>
+    </w:p>
+    <w:p>
+      <w:pPr>
+        <w:spacing w:after="0" w:line="240" w:lineRule="auto"/>
+        <w:ind w:firstLine="567"/>
+        <w:jc w:val="both"/>
+        <w:rPr>
+          <w:rFonts w:ascii="Arial" w:eastAsia="Times New Roman" w:hAnsi="Arial" w:cs="Arial"/>
+          <w:b/>
+        </w:rPr>
+      </w:pPr>
+    </w:p>
+    <w:p>
+      <w:pPr>
+        <w:spacing w:after="0" w:line="240" w:lineRule="auto"/>
+        <w:ind w:firstLine="567"/>
+        <w:jc w:val="both"/>
+        <w:rPr>
+          <w:rFonts w:ascii="Arial" w:eastAsia="Times New Roman" w:hAnsi="Arial" w:cs="Arial"/>
+          <w:b/>
+        </w:rPr>
+      </w:pPr>
+    </w:p>
+    <w:p>
+      <w:pPr>
+        <w:spacing w:after="0" w:line="240" w:lineRule="auto"/>
+        <w:ind w:firstLine="567"/>
+        <w:jc w:val="both"/>
+        <w:rPr>
+          <w:rFonts w:ascii="Arial" w:eastAsia="Times New Roman" w:hAnsi="Arial" w:cs="Arial"/>
+          <w:b/>
+        </w:rPr>
+      </w:pPr>
       <w:r>
         <w:rPr>
           <w:rFonts w:ascii="Arial" w:eastAsia="Times New Roman" w:hAnsi="Arial" w:cs="Arial"/>
@@ -4323,7 +5283,17 @@
           <w:rFonts w:ascii="Arial" w:eastAsia="Times New Roman" w:hAnsi="Arial" w:cs="Arial"/>
         </w:rPr>
         <w:tab/>
+      </w:r>
+      <w:r>
+        <w:rPr>
+          <w:rFonts w:ascii="Arial" w:eastAsia="Times New Roman" w:hAnsi="Arial" w:cs="Arial"/>
+        </w:rPr>
         <w:tab/>
+      </w:r>
+      <w:r>
+        <w:rPr>
+          <w:rFonts w:ascii="Arial" w:eastAsia="Times New Roman" w:hAnsi="Arial" w:cs="Arial"/>
+        </w:rPr>
         <w:tab/>
       </w:r>
       <w:r>
@@ -4377,6 +5347,12 @@
           <w:b/>
         </w:rPr>
         <w:t xml:space="preserve">{{ user_position }} </w:t>
+      </w:r>
+      <w:r>
+        <w:rPr>
+          <w:rFonts w:ascii="Arial" w:eastAsia="Times New Roman" w:hAnsi="Arial" w:cs="Arial"/>
+          <w:b/>
+        </w:rPr>
         <w:tab/>
       </w:r>
     </w:p>
@@ -4398,8 +5374,29 @@
           <w:bCs/>
         </w:rPr>
         <w:t>Air Blow Fans (Pty) Ltd</w:t>
+      </w:r>
+      <w:r>
+        <w:rPr>
+          <w:rFonts w:ascii="Arial" w:eastAsia="Times New Roman" w:hAnsi="Arial" w:cs="Arial"/>
+          <w:b/>
+          <w:bCs/>
+        </w:rPr>
         <w:tab/>
+      </w:r>
+      <w:r>
+        <w:rPr>
+          <w:rFonts w:ascii="Arial" w:eastAsia="Times New Roman" w:hAnsi="Arial" w:cs="Arial"/>
+          <w:b/>
+          <w:bCs/>
+        </w:rPr>
         <w:tab/>
+      </w:r>
+      <w:r>
+        <w:rPr>
+          <w:rFonts w:ascii="Arial" w:eastAsia="Times New Roman" w:hAnsi="Arial" w:cs="Arial"/>
+          <w:b/>
+          <w:bCs/>
+        </w:rPr>
         <w:tab/>
       </w:r>
     </w:p>
@@ -4424,10 +5421,38 @@
           <w:bCs/>
         </w:rPr>
         <w:t>Tel No</w:t>
+      </w:r>
+      <w:r>
+        <w:rPr>
+          <w:rFonts w:ascii="Arial" w:eastAsia="Times New Roman" w:hAnsi="Arial" w:cs="Arial"/>
+          <w:b/>
+          <w:bCs/>
+        </w:rPr>
         <w:tab/>
+      </w:r>
+      <w:r>
+        <w:rPr>
+          <w:rFonts w:ascii="Arial" w:eastAsia="Times New Roman" w:hAnsi="Arial" w:cs="Arial"/>
+          <w:b/>
+          <w:bCs/>
+        </w:rPr>
         <w:tab/>
         <w:t>: +27 (0) 11 452 0726</w:t>
+      </w:r>
+      <w:r>
+        <w:rPr>
+          <w:rFonts w:ascii="Arial" w:eastAsia="Times New Roman" w:hAnsi="Arial" w:cs="Arial"/>
+          <w:b/>
+          <w:bCs/>
+        </w:rPr>
         <w:tab/>
+      </w:r>
+      <w:r>
+        <w:rPr>
+          <w:rFonts w:ascii="Arial" w:eastAsia="Times New Roman" w:hAnsi="Arial" w:cs="Arial"/>
+          <w:b/>
+          <w:bCs/>
+        </w:rPr>
         <w:tab/>
       </w:r>
     </w:p>
@@ -4452,6 +5477,13 @@
           <w:bCs/>
         </w:rPr>
         <w:t xml:space="preserve">Mobile No  </w:t>
+      </w:r>
+      <w:r>
+        <w:rPr>
+          <w:rFonts w:ascii="Arial" w:eastAsia="Times New Roman" w:hAnsi="Arial" w:cs="Arial"/>
+          <w:b/>
+          <w:bCs/>
+        </w:rPr>
         <w:tab/>
         <w:t>: {{ user_tel_number }}</w:t>
       </w:r>
@@ -4477,9 +5509,30 @@
           <w:bCs/>
         </w:rPr>
         <w:t>Email</w:t>
+      </w:r>
+      <w:r>
+        <w:rPr>
+          <w:rFonts w:ascii="Arial" w:eastAsia="Times New Roman" w:hAnsi="Arial" w:cs="Arial"/>
+          <w:b/>
+          <w:bCs/>
+        </w:rPr>
         <w:tab/>
+      </w:r>
+      <w:r>
+        <w:rPr>
+          <w:rFonts w:ascii="Arial" w:eastAsia="Times New Roman" w:hAnsi="Arial" w:cs="Arial"/>
+          <w:b/>
+          <w:bCs/>
+        </w:rPr>
         <w:tab/>
         <w:t>: {{ user_email }}</w:t>
+      </w:r>
+      <w:r>
+        <w:rPr>
+          <w:rFonts w:ascii="Arial" w:eastAsia="Times New Roman" w:hAnsi="Arial" w:cs="Arial"/>
+          <w:b/>
+          <w:bCs/>
+        </w:rPr>
         <w:tab/>
       </w:r>
     </w:p>
@@ -6981,7 +8034,7 @@
   <w:style w:type="paragraph" w:default="1" w:styleId="Normal">
     <w:name w:val="Normal"/>
     <w:qFormat/>
-    <w:rsid w:val="00A7569F"/>
+    <w:rsid w:val="000E0AC2"/>
     <w:pPr>
       <w:pBdr>
         <w:top w:val="nil"/>
@@ -7053,7 +8106,6 @@
   <w:style w:type="character" w:default="1" w:styleId="DefaultParagraphFont">
     <w:name w:val="Default Paragraph Font"/>
     <w:uiPriority w:val="1"/>
-    <w:semiHidden/>
     <w:unhideWhenUsed/>
   </w:style>
   <w:style w:type="table" w:default="1" w:styleId="TableNormal">
@@ -7660,15 +8712,21 @@
 </file>
 
 <file path=customXml/item1.xml><?xml version="1.0" encoding="utf-8"?>
-<?mso-contentType ?>
-<FormTemplates xmlns="http://schemas.microsoft.com/sharepoint/v3/contenttype/forms">
-  <Display>DocumentLibraryForm</Display>
-  <Edit>DocumentLibraryForm</Edit>
-  <New>DocumentLibraryForm</New>
-</FormTemplates>
+<b:Sources xmlns:b="http://schemas.openxmlformats.org/officeDocument/2006/bibliography" xmlns="http://schemas.openxmlformats.org/officeDocument/2006/bibliography" SelectedStyle="\APASixthEditionOfficeOnline.xsl" StyleName="APA" Version="6"/>
 </file>
 
 <file path=customXml/item2.xml><?xml version="1.0" encoding="utf-8"?>
+<p:properties xmlns:p="http://schemas.microsoft.com/office/2006/metadata/properties" xmlns:xsi="http://www.w3.org/2001/XMLSchema-instance" xmlns:pc="http://schemas.microsoft.com/office/infopath/2007/PartnerControls">
+  <documentManagement>
+    <lcf76f155ced4ddcb4097134ff3c332f xmlns="ae64ee24-a287-4487-8358-6fe4ea9a2751">
+      <Terms xmlns="http://schemas.microsoft.com/office/infopath/2007/PartnerControls"/>
+    </lcf76f155ced4ddcb4097134ff3c332f>
+    <TaxCatchAll xmlns="fd1ea970-496a-445f-a0ac-9e633861af08" xsi:nil="true"/>
+  </documentManagement>
+</p:properties>
+</file>
+
+<file path=customXml/item3.xml><?xml version="1.0" encoding="utf-8"?>
 <ct:contentTypeSchema xmlns:ct="http://schemas.microsoft.com/office/2006/metadata/contentType" xmlns:ma="http://schemas.microsoft.com/office/2006/metadata/properties/metaAttributes" ct:_="" ma:_="" ma:contentTypeName="Document" ma:contentTypeID="0x0101008312ED833466FB4CAC852177FFA9EDB4" ma:contentTypeVersion="15" ma:contentTypeDescription="Create a new document." ma:contentTypeScope="" ma:versionID="00ba274f931c318c10f29e2e1d6d74c0">
   <xsd:schema xmlns:xsd="http://www.w3.org/2001/XMLSchema" xmlns:xs="http://www.w3.org/2001/XMLSchema" xmlns:p="http://schemas.microsoft.com/office/2006/metadata/properties" xmlns:ns2="ae64ee24-a287-4487-8358-6fe4ea9a2751" xmlns:ns3="fd1ea970-496a-445f-a0ac-9e633861af08" targetNamespace="http://schemas.microsoft.com/office/2006/metadata/properties" ma:root="true" ma:fieldsID="00de92738e7b8d6b1fdb5cc528c1afed" ns2:_="" ns3:_="">
     <xsd:import namespace="ae64ee24-a287-4487-8358-6fe4ea9a2751"/>
@@ -7903,30 +8961,35 @@
 </ct:contentTypeSchema>
 </file>
 
-<file path=customXml/item3.xml><?xml version="1.0" encoding="utf-8"?>
-<p:properties xmlns:p="http://schemas.microsoft.com/office/2006/metadata/properties" xmlns:xsi="http://www.w3.org/2001/XMLSchema-instance" xmlns:pc="http://schemas.microsoft.com/office/infopath/2007/PartnerControls">
-  <documentManagement>
-    <lcf76f155ced4ddcb4097134ff3c332f xmlns="ae64ee24-a287-4487-8358-6fe4ea9a2751">
-      <Terms xmlns="http://schemas.microsoft.com/office/infopath/2007/PartnerControls"/>
-    </lcf76f155ced4ddcb4097134ff3c332f>
-    <TaxCatchAll xmlns="fd1ea970-496a-445f-a0ac-9e633861af08" xsi:nil="true"/>
-  </documentManagement>
-</p:properties>
-</file>
-
 <file path=customXml/item4.xml><?xml version="1.0" encoding="utf-8"?>
-<b:Sources xmlns:b="http://schemas.openxmlformats.org/officeDocument/2006/bibliography" xmlns="http://schemas.openxmlformats.org/officeDocument/2006/bibliography" SelectedStyle="\APASixthEditionOfficeOnline.xsl" StyleName="APA" Version="6"/>
+<?mso-contentType ?>
+<FormTemplates xmlns="http://schemas.microsoft.com/sharepoint/v3/contenttype/forms">
+  <Display>DocumentLibraryForm</Display>
+  <Edit>DocumentLibraryForm</Edit>
+  <New>DocumentLibraryForm</New>
+</FormTemplates>
 </file>
 
 <file path=customXml/itemProps1.xml><?xml version="1.0" encoding="utf-8"?>
-<ds:datastoreItem xmlns:ds="http://schemas.openxmlformats.org/officeDocument/2006/customXml" ds:itemID="{8321DDA5-16E0-4606-B32A-7029020DA1BE}">
+<ds:datastoreItem xmlns:ds="http://schemas.openxmlformats.org/officeDocument/2006/customXml" ds:itemID="{6B87BA90-45F4-4413-8553-4E37FB89445A}">
   <ds:schemaRefs>
-    <ds:schemaRef ds:uri="http://schemas.microsoft.com/sharepoint/v3/contenttype/forms"/>
+    <ds:schemaRef ds:uri="http://schemas.openxmlformats.org/officeDocument/2006/bibliography"/>
   </ds:schemaRefs>
 </ds:datastoreItem>
 </file>
 
 <file path=customXml/itemProps2.xml><?xml version="1.0" encoding="utf-8"?>
+<ds:datastoreItem xmlns:ds="http://schemas.openxmlformats.org/officeDocument/2006/customXml" ds:itemID="{FAD17780-133F-40F1-8599-9A3527331F37}">
+  <ds:schemaRefs>
+    <ds:schemaRef ds:uri="http://schemas.microsoft.com/office/2006/metadata/properties"/>
+    <ds:schemaRef ds:uri="http://schemas.microsoft.com/office/infopath/2007/PartnerControls"/>
+    <ds:schemaRef ds:uri="ae64ee24-a287-4487-8358-6fe4ea9a2751"/>
+    <ds:schemaRef ds:uri="fd1ea970-496a-445f-a0ac-9e633861af08"/>
+  </ds:schemaRefs>
+</ds:datastoreItem>
+</file>
+
+<file path=customXml/itemProps3.xml><?xml version="1.0" encoding="utf-8"?>
 <ds:datastoreItem xmlns:ds="http://schemas.openxmlformats.org/officeDocument/2006/customXml" ds:itemID="{0084AE77-644A-4249-A0DE-270BF17CEEE1}">
   <ds:schemaRefs>
     <ds:schemaRef ds:uri="http://schemas.microsoft.com/office/2006/metadata/contentType"/>
@@ -7945,21 +9008,10 @@
 </ds:datastoreItem>
 </file>
 
-<file path=customXml/itemProps3.xml><?xml version="1.0" encoding="utf-8"?>
-<ds:datastoreItem xmlns:ds="http://schemas.openxmlformats.org/officeDocument/2006/customXml" ds:itemID="{FAD17780-133F-40F1-8599-9A3527331F37}">
+<file path=customXml/itemProps4.xml><?xml version="1.0" encoding="utf-8"?>
+<ds:datastoreItem xmlns:ds="http://schemas.openxmlformats.org/officeDocument/2006/customXml" ds:itemID="{8321DDA5-16E0-4606-B32A-7029020DA1BE}">
   <ds:schemaRefs>
-    <ds:schemaRef ds:uri="http://schemas.microsoft.com/office/2006/metadata/properties"/>
-    <ds:schemaRef ds:uri="http://schemas.microsoft.com/office/infopath/2007/PartnerControls"/>
-    <ds:schemaRef ds:uri="ae64ee24-a287-4487-8358-6fe4ea9a2751"/>
-    <ds:schemaRef ds:uri="fd1ea970-496a-445f-a0ac-9e633861af08"/>
-  </ds:schemaRefs>
-</ds:datastoreItem>
-</file>
-
-<file path=customXml/itemProps4.xml><?xml version="1.0" encoding="utf-8"?>
-<ds:datastoreItem xmlns:ds="http://schemas.openxmlformats.org/officeDocument/2006/customXml" ds:itemID="{6B87BA90-45F4-4413-8553-4E37FB89445A}">
-  <ds:schemaRefs>
-    <ds:schemaRef ds:uri="http://schemas.openxmlformats.org/officeDocument/2006/bibliography"/>
+    <ds:schemaRef ds:uri="http://schemas.microsoft.com/sharepoint/v3/contenttype/forms"/>
   </ds:schemaRefs>
 </ds:datastoreItem>
 </file>
</xml_diff>

<commit_message>
Add component grouping option to Word document export
Users can now choose between individual line items or a grouped view
when downloading the pricing schedule. Grouped mode merges screen
inlets, conical inlet, inlet track, rotor, motor barrel, and diffuser
into a single lump-sum row; silencers and SCD remain separate.

Co-Authored-By: Claude Sonnet 4.6 <noreply@anthropic.com>
</commit_message>
<xml_diff>
--- a/ui/templates/quote_template.docx
+++ b/ui/templates/quote_template.docx
@@ -59,7 +59,6 @@
           <w:b/>
         </w:rPr>
       </w:pPr>
-      <w:proofErr w:type="gramStart"/>
       <w:r>
         <w:rPr>
           <w:rFonts w:ascii="Arial" w:eastAsia="Times New Roman" w:hAnsi="Arial" w:cs="Arial"/>
@@ -69,7 +68,6 @@
         </w:rPr>
         <w:t xml:space="preserve">{{ </w:t>
       </w:r>
-      <w:proofErr w:type="spellStart"/>
       <w:r>
         <w:rPr>
           <w:rFonts w:ascii="Arial" w:eastAsia="Times New Roman" w:hAnsi="Arial" w:cs="Arial"/>
@@ -77,9 +75,8 @@
           <w:sz w:val="36"/>
           <w:szCs w:val="36"/>
         </w:rPr>
-        <w:t>client</w:t>
-      </w:r>
-      <w:proofErr w:type="gramEnd"/>
+        <w:t>client_name</w:t>
+      </w:r>
       <w:r>
         <w:rPr>
           <w:rFonts w:ascii="Arial" w:eastAsia="Times New Roman" w:hAnsi="Arial" w:cs="Arial"/>
@@ -87,37 +84,7 @@
           <w:sz w:val="36"/>
           <w:szCs w:val="36"/>
         </w:rPr>
-        <w:t>_</w:t>
-      </w:r>
-      <w:proofErr w:type="gramStart"/>
-      <w:r>
-        <w:rPr>
-          <w:rFonts w:ascii="Arial" w:eastAsia="Times New Roman" w:hAnsi="Arial" w:cs="Arial"/>
-          <w:b/>
-          <w:sz w:val="36"/>
-          <w:szCs w:val="36"/>
-        </w:rPr>
-        <w:t>name</w:t>
-      </w:r>
-      <w:proofErr w:type="spellEnd"/>
-      <w:r>
-        <w:rPr>
-          <w:rFonts w:ascii="Arial" w:eastAsia="Times New Roman" w:hAnsi="Arial" w:cs="Arial"/>
-          <w:b/>
-          <w:sz w:val="36"/>
-          <w:szCs w:val="36"/>
-        </w:rPr>
-        <w:t xml:space="preserve"> }</w:t>
-      </w:r>
-      <w:proofErr w:type="gramEnd"/>
-      <w:r>
-        <w:rPr>
-          <w:rFonts w:ascii="Arial" w:eastAsia="Times New Roman" w:hAnsi="Arial" w:cs="Arial"/>
-          <w:b/>
-          <w:sz w:val="36"/>
-          <w:szCs w:val="36"/>
-        </w:rPr>
-        <w:t>}</w:t>
+        <w:t xml:space="preserve"> }}</w:t>
       </w:r>
     </w:p>
     <w:p>
@@ -147,55 +114,21 @@
           <w:b/>
         </w:rPr>
         <w:tab/>
-        <w:t xml:space="preserve">: </w:t>
-      </w:r>
-      <w:proofErr w:type="gramStart"/>
-      <w:r>
-        <w:rPr>
-          <w:rFonts w:ascii="Arial" w:eastAsia="Times New Roman" w:hAnsi="Arial" w:cs="Arial"/>
-          <w:b/>
-        </w:rPr>
-        <w:t xml:space="preserve">{{ </w:t>
-      </w:r>
-      <w:proofErr w:type="spellStart"/>
-      <w:r>
-        <w:rPr>
-          <w:rFonts w:ascii="Arial" w:eastAsia="Times New Roman" w:hAnsi="Arial" w:cs="Arial"/>
-          <w:b/>
-        </w:rPr>
-        <w:t>attention</w:t>
-      </w:r>
-      <w:proofErr w:type="gramEnd"/>
-      <w:r>
-        <w:rPr>
-          <w:rFonts w:ascii="Arial" w:eastAsia="Times New Roman" w:hAnsi="Arial" w:cs="Arial"/>
-          <w:b/>
-        </w:rPr>
-        <w:t>_</w:t>
-      </w:r>
-      <w:proofErr w:type="gramStart"/>
-      <w:r>
-        <w:rPr>
-          <w:rFonts w:ascii="Arial" w:eastAsia="Times New Roman" w:hAnsi="Arial" w:cs="Arial"/>
-          <w:b/>
-        </w:rPr>
-        <w:t>to</w:t>
-      </w:r>
-      <w:proofErr w:type="spellEnd"/>
-      <w:r>
-        <w:rPr>
-          <w:rFonts w:ascii="Arial" w:eastAsia="Times New Roman" w:hAnsi="Arial" w:cs="Arial"/>
-          <w:b/>
-        </w:rPr>
-        <w:t xml:space="preserve"> }</w:t>
-      </w:r>
-      <w:proofErr w:type="gramEnd"/>
-      <w:r>
-        <w:rPr>
-          <w:rFonts w:ascii="Arial" w:eastAsia="Times New Roman" w:hAnsi="Arial" w:cs="Arial"/>
-          <w:b/>
-        </w:rPr>
-        <w:t>}</w:t>
+        <w:t xml:space="preserve">: {{ </w:t>
+      </w:r>
+      <w:r>
+        <w:rPr>
+          <w:rFonts w:ascii="Arial" w:eastAsia="Times New Roman" w:hAnsi="Arial" w:cs="Arial"/>
+          <w:b/>
+        </w:rPr>
+        <w:t>attention_to</w:t>
+      </w:r>
+      <w:r>
+        <w:rPr>
+          <w:rFonts w:ascii="Arial" w:eastAsia="Times New Roman" w:hAnsi="Arial" w:cs="Arial"/>
+          <w:b/>
+        </w:rPr>
+        <w:t xml:space="preserve"> }}</w:t>
       </w:r>
     </w:p>
     <w:p>
@@ -228,59 +161,13 @@
         <w:tab/>
         <w:t xml:space="preserve">: </w:t>
       </w:r>
-      <w:proofErr w:type="gramStart"/>
       <w:r>
         <w:rPr>
           <w:rFonts w:ascii="Arial" w:eastAsia="Times New Roman" w:hAnsi="Arial" w:cs="Arial"/>
           <w:b/>
           <w:bCs/>
         </w:rPr>
-        <w:t xml:space="preserve">{{ </w:t>
-      </w:r>
-      <w:proofErr w:type="spellStart"/>
-      <w:r>
-        <w:rPr>
-          <w:rFonts w:ascii="Arial" w:eastAsia="Times New Roman" w:hAnsi="Arial" w:cs="Arial"/>
-          <w:b/>
-          <w:bCs/>
-        </w:rPr>
-        <w:t>subject</w:t>
-      </w:r>
-      <w:proofErr w:type="gramEnd"/>
-      <w:r>
-        <w:rPr>
-          <w:rFonts w:ascii="Arial" w:eastAsia="Times New Roman" w:hAnsi="Arial" w:cs="Arial"/>
-          <w:b/>
-          <w:bCs/>
-        </w:rPr>
-        <w:t>_fan_</w:t>
-      </w:r>
-      <w:proofErr w:type="gramStart"/>
-      <w:r>
-        <w:rPr>
-          <w:rFonts w:ascii="Arial" w:eastAsia="Times New Roman" w:hAnsi="Arial" w:cs="Arial"/>
-          <w:b/>
-          <w:bCs/>
-        </w:rPr>
-        <w:t>sizes</w:t>
-      </w:r>
-      <w:proofErr w:type="spellEnd"/>
-      <w:r>
-        <w:rPr>
-          <w:rFonts w:ascii="Arial" w:eastAsia="Times New Roman" w:hAnsi="Arial" w:cs="Arial"/>
-          <w:b/>
-          <w:bCs/>
-        </w:rPr>
-        <w:t xml:space="preserve"> }</w:t>
-      </w:r>
-      <w:proofErr w:type="gramEnd"/>
-      <w:r>
-        <w:rPr>
-          <w:rFonts w:ascii="Arial" w:eastAsia="Times New Roman" w:hAnsi="Arial" w:cs="Arial"/>
-          <w:b/>
-          <w:bCs/>
-        </w:rPr>
-        <w:t xml:space="preserve">} </w:t>
+        <w:t xml:space="preserve">{{ subject_fan_sizes }} </w:t>
       </w:r>
       <w:r>
         <w:rPr>
@@ -350,39 +237,7 @@
           <w:b/>
         </w:rPr>
         <w:tab/>
-        <w:t xml:space="preserve">: </w:t>
-      </w:r>
-      <w:proofErr w:type="gramStart"/>
-      <w:r>
-        <w:rPr>
-          <w:rFonts w:ascii="Arial" w:eastAsia="Times New Roman" w:hAnsi="Arial" w:cs="Arial"/>
-          <w:b/>
-        </w:rPr>
-        <w:t>{{ quote</w:t>
-      </w:r>
-      <w:proofErr w:type="gramEnd"/>
-      <w:r>
-        <w:rPr>
-          <w:rFonts w:ascii="Arial" w:eastAsia="Times New Roman" w:hAnsi="Arial" w:cs="Arial"/>
-          <w:b/>
-        </w:rPr>
-        <w:t>_</w:t>
-      </w:r>
-      <w:proofErr w:type="gramStart"/>
-      <w:r>
-        <w:rPr>
-          <w:rFonts w:ascii="Arial" w:eastAsia="Times New Roman" w:hAnsi="Arial" w:cs="Arial"/>
-          <w:b/>
-        </w:rPr>
-        <w:t>ref }</w:t>
-      </w:r>
-      <w:proofErr w:type="gramEnd"/>
-      <w:r>
-        <w:rPr>
-          <w:rFonts w:ascii="Arial" w:eastAsia="Times New Roman" w:hAnsi="Arial" w:cs="Arial"/>
-          <w:b/>
-        </w:rPr>
-        <w:t>}</w:t>
+        <w:t>: {{ quote_ref }}</w:t>
       </w:r>
     </w:p>
     <w:p>
@@ -557,129 +412,29 @@
         </w:rPr>
         <w:t xml:space="preserve"> </w:t>
       </w:r>
-      <w:proofErr w:type="gramStart"/>
       <w:r>
         <w:rPr>
           <w:rFonts w:ascii="Arial" w:eastAsia="Times New Roman" w:hAnsi="Arial" w:cs="Arial"/>
           <w:b/>
           <w:bCs/>
         </w:rPr>
-        <w:t xml:space="preserve">{{ </w:t>
-      </w:r>
-      <w:proofErr w:type="spellStart"/>
+        <w:t>{{ subject_fan_sizes }}</w:t>
+      </w:r>
       <w:r>
         <w:rPr>
           <w:rFonts w:ascii="Arial" w:eastAsia="Times New Roman" w:hAnsi="Arial" w:cs="Arial"/>
           <w:b/>
           <w:bCs/>
         </w:rPr>
-        <w:t>subject</w:t>
-      </w:r>
-      <w:proofErr w:type="gramEnd"/>
+        <w:t xml:space="preserve"> </w:t>
+      </w:r>
       <w:r>
         <w:rPr>
           <w:rFonts w:ascii="Arial" w:eastAsia="Times New Roman" w:hAnsi="Arial" w:cs="Arial"/>
           <w:b/>
           <w:bCs/>
         </w:rPr>
-        <w:t>_fan_</w:t>
-      </w:r>
-      <w:proofErr w:type="gramStart"/>
-      <w:r>
-        <w:rPr>
-          <w:rFonts w:ascii="Arial" w:eastAsia="Times New Roman" w:hAnsi="Arial" w:cs="Arial"/>
-          <w:b/>
-          <w:bCs/>
-        </w:rPr>
-        <w:t>sizes</w:t>
-      </w:r>
-      <w:proofErr w:type="spellEnd"/>
-      <w:r>
-        <w:rPr>
-          <w:rFonts w:ascii="Arial" w:eastAsia="Times New Roman" w:hAnsi="Arial" w:cs="Arial"/>
-          <w:b/>
-          <w:bCs/>
-        </w:rPr>
-        <w:t xml:space="preserve"> }</w:t>
-      </w:r>
-      <w:proofErr w:type="gramEnd"/>
-      <w:r>
-        <w:rPr>
-          <w:rFonts w:ascii="Arial" w:eastAsia="Times New Roman" w:hAnsi="Arial" w:cs="Arial"/>
-          <w:b/>
-          <w:bCs/>
-        </w:rPr>
-        <w:t>}</w:t>
-      </w:r>
-      <w:r>
-        <w:rPr>
-          <w:rFonts w:ascii="Arial" w:eastAsia="Times New Roman" w:hAnsi="Arial" w:cs="Arial"/>
-          <w:b/>
-          <w:bCs/>
-        </w:rPr>
-        <w:t xml:space="preserve"> </w:t>
-      </w:r>
-      <w:r>
-        <w:rPr>
-          <w:rFonts w:ascii="Arial" w:eastAsia="Times New Roman" w:hAnsi="Arial" w:cs="Arial"/>
-          <w:b/>
-          <w:bCs/>
-        </w:rPr>
-        <w:t xml:space="preserve">– </w:t>
-      </w:r>
-      <w:proofErr w:type="gramStart"/>
-      <w:r>
-        <w:rPr>
-          <w:rFonts w:ascii="Arial" w:eastAsia="Times New Roman" w:hAnsi="Arial" w:cs="Arial"/>
-          <w:b/>
-          <w:bCs/>
-        </w:rPr>
-        <w:t xml:space="preserve">{{ </w:t>
-      </w:r>
-      <w:proofErr w:type="spellStart"/>
-      <w:r>
-        <w:rPr>
-          <w:rFonts w:ascii="Arial" w:eastAsia="Times New Roman" w:hAnsi="Arial" w:cs="Arial"/>
-          <w:b/>
-          <w:bCs/>
-        </w:rPr>
-        <w:t>project</w:t>
-      </w:r>
-      <w:proofErr w:type="gramEnd"/>
-      <w:r>
-        <w:rPr>
-          <w:rFonts w:ascii="Arial" w:eastAsia="Times New Roman" w:hAnsi="Arial" w:cs="Arial"/>
-          <w:b/>
-          <w:bCs/>
-        </w:rPr>
-        <w:t>_</w:t>
-      </w:r>
-      <w:proofErr w:type="gramStart"/>
-      <w:r>
-        <w:rPr>
-          <w:rFonts w:ascii="Arial" w:eastAsia="Times New Roman" w:hAnsi="Arial" w:cs="Arial"/>
-          <w:b/>
-          <w:bCs/>
-        </w:rPr>
-        <w:t>location</w:t>
-      </w:r>
-      <w:proofErr w:type="spellEnd"/>
-      <w:r>
-        <w:rPr>
-          <w:rFonts w:ascii="Arial" w:eastAsia="Times New Roman" w:hAnsi="Arial" w:cs="Arial"/>
-          <w:b/>
-          <w:bCs/>
-        </w:rPr>
-        <w:t xml:space="preserve"> }</w:t>
-      </w:r>
-      <w:proofErr w:type="gramEnd"/>
-      <w:r>
-        <w:rPr>
-          <w:rFonts w:ascii="Arial" w:eastAsia="Times New Roman" w:hAnsi="Arial" w:cs="Arial"/>
-          <w:b/>
-          <w:bCs/>
-        </w:rPr>
-        <w:t>}</w:t>
+        <w:t>– {{ project_location }}</w:t>
       </w:r>
     </w:p>
     <w:p>
@@ -713,7 +468,6 @@
         </w:rPr>
         <w:t xml:space="preserve">Dear </w:t>
       </w:r>
-      <w:proofErr w:type="gramStart"/>
       <w:r>
         <w:rPr>
           <w:rFonts w:ascii="Arial" w:eastAsia="Times New Roman" w:hAnsi="Arial" w:cs="Arial"/>
@@ -721,45 +475,19 @@
         </w:rPr>
         <w:t xml:space="preserve">{{ </w:t>
       </w:r>
-      <w:proofErr w:type="spellStart"/>
-      <w:r>
-        <w:rPr>
-          <w:rFonts w:ascii="Arial" w:eastAsia="Times New Roman" w:hAnsi="Arial" w:cs="Arial"/>
-          <w:b/>
-        </w:rPr>
-        <w:t>attention</w:t>
-      </w:r>
-      <w:proofErr w:type="gramEnd"/>
-      <w:r>
-        <w:rPr>
-          <w:rFonts w:ascii="Arial" w:eastAsia="Times New Roman" w:hAnsi="Arial" w:cs="Arial"/>
-          <w:b/>
-        </w:rPr>
-        <w:t>_</w:t>
-      </w:r>
-      <w:proofErr w:type="gramStart"/>
-      <w:r>
-        <w:rPr>
-          <w:rFonts w:ascii="Arial" w:eastAsia="Times New Roman" w:hAnsi="Arial" w:cs="Arial"/>
-          <w:b/>
-        </w:rPr>
-        <w:t>to</w:t>
-      </w:r>
-      <w:proofErr w:type="spellEnd"/>
-      <w:r>
-        <w:rPr>
-          <w:rFonts w:ascii="Arial" w:eastAsia="Times New Roman" w:hAnsi="Arial" w:cs="Arial"/>
-          <w:b/>
-        </w:rPr>
-        <w:t xml:space="preserve"> }</w:t>
-      </w:r>
-      <w:proofErr w:type="gramEnd"/>
-      <w:r>
-        <w:rPr>
-          <w:rFonts w:ascii="Arial" w:eastAsia="Times New Roman" w:hAnsi="Arial" w:cs="Arial"/>
-          <w:b/>
-        </w:rPr>
-        <w:t>}</w:t>
+      <w:r>
+        <w:rPr>
+          <w:rFonts w:ascii="Arial" w:eastAsia="Times New Roman" w:hAnsi="Arial" w:cs="Arial"/>
+          <w:b/>
+        </w:rPr>
+        <w:t>attention_to</w:t>
+      </w:r>
+      <w:r>
+        <w:rPr>
+          <w:rFonts w:ascii="Arial" w:eastAsia="Times New Roman" w:hAnsi="Arial" w:cs="Arial"/>
+          <w:b/>
+        </w:rPr>
+        <w:t xml:space="preserve"> }}</w:t>
       </w:r>
       <w:r>
         <w:rPr>
@@ -942,44 +670,8 @@
         <w:rPr>
           <w:rFonts w:ascii="Arial" w:eastAsia="Times New Roman" w:hAnsi="Arial" w:cs="Arial"/>
         </w:rPr>
-        <w:t xml:space="preserve">Fan Size: </w:t>
-      </w:r>
-      <w:proofErr w:type="gramStart"/>
-      <w:r>
-        <w:rPr>
-          <w:rFonts w:ascii="Arial" w:eastAsia="Times New Roman" w:hAnsi="Arial" w:cs="Arial"/>
-        </w:rPr>
-        <w:t xml:space="preserve">{{ </w:t>
-      </w:r>
-      <w:proofErr w:type="spellStart"/>
-      <w:r>
-        <w:rPr>
-          <w:rFonts w:ascii="Arial" w:eastAsia="Times New Roman" w:hAnsi="Arial" w:cs="Arial"/>
-        </w:rPr>
-        <w:t>fan_config.fan</w:t>
-      </w:r>
-      <w:proofErr w:type="gramEnd"/>
-      <w:r>
-        <w:rPr>
-          <w:rFonts w:ascii="Arial" w:eastAsia="Times New Roman" w:hAnsi="Arial" w:cs="Arial"/>
-        </w:rPr>
-        <w:t>_size_</w:t>
-      </w:r>
-      <w:proofErr w:type="gramStart"/>
-      <w:r>
-        <w:rPr>
-          <w:rFonts w:ascii="Arial" w:eastAsia="Times New Roman" w:hAnsi="Arial" w:cs="Arial"/>
-        </w:rPr>
-        <w:t>mm</w:t>
-      </w:r>
-      <w:proofErr w:type="spellEnd"/>
-      <w:r>
-        <w:rPr>
-          <w:rFonts w:ascii="Arial" w:eastAsia="Times New Roman" w:hAnsi="Arial" w:cs="Arial"/>
-        </w:rPr>
-        <w:t xml:space="preserve"> }}mm</w:t>
-      </w:r>
-      <w:proofErr w:type="gramEnd"/>
+        <w:t>Fan Size: {{ fan_config.fan_size_mm }}mm</w:t>
+      </w:r>
     </w:p>
     <w:p>
       <w:pPr>
@@ -1298,6 +990,10 @@
     <w:p>
       <w:pPr>
         <w:pStyle w:val="ListParagraph"/>
+        <w:numPr>
+          <w:ilvl w:val="0"/>
+          <w:numId w:val="12"/>
+        </w:numPr>
         <w:pBdr>
           <w:top w:val="none" w:sz="0" w:space="0" w:color="auto"/>
           <w:left w:val="none" w:sz="0" w:space="0" w:color="auto"/>
@@ -1307,14 +1003,19 @@
           <w:bar w:val="none" w:sz="0" w:color="auto"/>
         </w:pBdr>
         <w:spacing w:after="160" w:line="259" w:lineRule="auto"/>
-        <w:ind w:left="0"/>
-        <w:rPr>
-          <w:rFonts w:ascii="Arial" w:eastAsia="Times New Roman" w:hAnsi="Arial" w:cs="Arial"/>
-          <w:b/>
-          <w:bCs/>
-          <w:u w:val="single"/>
-        </w:rPr>
-      </w:pPr>
+        <w:rPr>
+          <w:rFonts w:ascii="Arial" w:eastAsia="Times New Roman" w:hAnsi="Arial" w:cs="Arial"/>
+        </w:rPr>
+      </w:pPr>
+      <w:r>
+        <w:rPr>
+          <w:rFonts w:ascii="Arial" w:eastAsia="Times New Roman" w:hAnsi="Arial" w:cs="Arial"/>
+        </w:rPr>
+        <w:lastRenderedPageBreak/>
+        <w:t>Power: {{ fan_config.motor_output }}kW</w:t>
+      </w:r>
+      <w:bookmarkStart w:id="2" w:name="_Hlk210293638"/>
+      <w:bookmarkEnd w:id="2"/>
     </w:p>
     <w:p>
       <w:pPr>
@@ -1340,10 +1041,8 @@
         <w:rPr>
           <w:rFonts w:ascii="Arial" w:eastAsia="Times New Roman" w:hAnsi="Arial" w:cs="Arial"/>
         </w:rPr>
-        <w:t>Power: {{ fan_config.motor_output }}kW</w:t>
-      </w:r>
-      <w:bookmarkStart w:id="2" w:name="_Hlk210293638"/>
-      <w:bookmarkEnd w:id="2"/>
+        <w:t xml:space="preserve">Efficiency: {{ fan_config.motor_product_range }} </w:t>
+      </w:r>
     </w:p>
     <w:p>
       <w:pPr>
@@ -1369,8 +1068,10 @@
         <w:rPr>
           <w:rFonts w:ascii="Arial" w:eastAsia="Times New Roman" w:hAnsi="Arial" w:cs="Arial"/>
         </w:rPr>
-        <w:t xml:space="preserve">Efficiency: {{ fan_config.motor_product_range }} </w:t>
-      </w:r>
+        <w:t xml:space="preserve">Speed: {{ fan_config.motor_pole }}-pole (synchronous speed ~ {{ fan_config.motor_speed }}RPM @50 Hz)  </w:t>
+      </w:r>
+      <w:bookmarkStart w:id="3" w:name="_Hlk210293681"/>
+      <w:bookmarkEnd w:id="3"/>
     </w:p>
     <w:p>
       <w:pPr>
@@ -1396,18 +1097,11 @@
         <w:rPr>
           <w:rFonts w:ascii="Arial" w:eastAsia="Times New Roman" w:hAnsi="Arial" w:cs="Arial"/>
         </w:rPr>
-        <w:t xml:space="preserve">Speed: {{ fan_config.motor_pole }}-pole (synchronous speed ~ {{ fan_config.motor_speed }}RPM @50 Hz)  </w:t>
-      </w:r>
-      <w:bookmarkStart w:id="3" w:name="_Hlk210293681"/>
-      <w:bookmarkEnd w:id="3"/>
-    </w:p>
-    <w:p>
-      <w:pPr>
-        <w:pStyle w:val="ListParagraph"/>
-        <w:numPr>
-          <w:ilvl w:val="0"/>
-          <w:numId w:val="12"/>
-        </w:numPr>
+        <w:t>Voltage: 525V</w:t>
+      </w:r>
+    </w:p>
+    <w:p>
+      <w:pPr>
         <w:pBdr>
           <w:top w:val="none" w:sz="0" w:space="0" w:color="auto"/>
           <w:left w:val="none" w:sz="0" w:space="0" w:color="auto"/>
@@ -1419,28 +1113,6 @@
         <w:spacing w:after="160" w:line="259" w:lineRule="auto"/>
         <w:rPr>
           <w:rFonts w:ascii="Arial" w:eastAsia="Times New Roman" w:hAnsi="Arial" w:cs="Arial"/>
-        </w:rPr>
-      </w:pPr>
-      <w:r>
-        <w:rPr>
-          <w:rFonts w:ascii="Arial" w:eastAsia="Times New Roman" w:hAnsi="Arial" w:cs="Arial"/>
-        </w:rPr>
-        <w:t>Voltage: 525V</w:t>
-      </w:r>
-    </w:p>
-    <w:p>
-      <w:pPr>
-        <w:pBdr>
-          <w:top w:val="none" w:sz="0" w:space="0" w:color="auto"/>
-          <w:left w:val="none" w:sz="0" w:space="0" w:color="auto"/>
-          <w:bottom w:val="none" w:sz="0" w:space="0" w:color="auto"/>
-          <w:right w:val="none" w:sz="0" w:space="0" w:color="auto"/>
-          <w:between w:val="none" w:sz="0" w:space="0" w:color="auto"/>
-          <w:bar w:val="none" w:sz="0" w:color="auto"/>
-        </w:pBdr>
-        <w:spacing w:after="160" w:line="259" w:lineRule="auto"/>
-        <w:rPr>
-          <w:rFonts w:ascii="Arial" w:eastAsia="Times New Roman" w:hAnsi="Arial" w:cs="Arial"/>
           <w:b/>
           <w:bCs/>
           <w:u w:val="single"/>
@@ -1453,16 +1125,7 @@
           <w:bCs/>
           <w:u w:val="single"/>
         </w:rPr>
-        <w:t>Buyout Items</w:t>
-      </w:r>
-      <w:r>
-        <w:rPr>
-          <w:rFonts w:ascii="Arial" w:eastAsia="Times New Roman" w:hAnsi="Arial" w:cs="Arial"/>
-          <w:b/>
-          <w:bCs/>
-          <w:u w:val="single"/>
-        </w:rPr>
-        <w:t xml:space="preserve">:  </w:t>
+        <w:t xml:space="preserve">Buyout Items:  </w:t>
       </w:r>
     </w:p>
     <w:p>
@@ -1504,37 +1167,12 @@
         </w:rPr>
         <w:t xml:space="preserve">in </w:t>
       </w:r>
-      <w:proofErr w:type="spellStart"/>
       <w:r>
         <w:rPr>
           <w:rFonts w:ascii="Arial" w:eastAsia="Times New Roman" w:hAnsi="Arial" w:cs="Arial"/>
           <w:bCs/>
         </w:rPr>
-        <w:t>fan_</w:t>
-      </w:r>
-      <w:proofErr w:type="gramStart"/>
-      <w:r>
-        <w:rPr>
-          <w:rFonts w:ascii="Arial" w:eastAsia="Times New Roman" w:hAnsi="Arial" w:cs="Arial"/>
-          <w:bCs/>
-        </w:rPr>
-        <w:t>config.buyout</w:t>
-      </w:r>
-      <w:proofErr w:type="gramEnd"/>
-      <w:r>
-        <w:rPr>
-          <w:rFonts w:ascii="Arial" w:eastAsia="Times New Roman" w:hAnsi="Arial" w:cs="Arial"/>
-          <w:bCs/>
-        </w:rPr>
-        <w:t>_items</w:t>
-      </w:r>
-      <w:proofErr w:type="spellEnd"/>
-      <w:r>
-        <w:rPr>
-          <w:rFonts w:ascii="Arial" w:eastAsia="Times New Roman" w:hAnsi="Arial" w:cs="Arial"/>
-          <w:bCs/>
-        </w:rPr>
-        <w:t xml:space="preserve"> </w:t>
+        <w:t xml:space="preserve">fan_config.buyout_items </w:t>
       </w:r>
       <w:r>
         <w:rPr>
@@ -1563,7 +1201,6 @@
           <w:rFonts w:ascii="Arial" w:eastAsia="Times New Roman" w:hAnsi="Arial" w:cs="Arial"/>
         </w:rPr>
       </w:pPr>
-      <w:proofErr w:type="gramStart"/>
       <w:r>
         <w:rPr>
           <w:rFonts w:ascii="Arial" w:eastAsia="Times New Roman" w:hAnsi="Arial" w:cs="Arial"/>
@@ -1581,29 +1218,14 @@
         <w:rPr>
           <w:rFonts w:ascii="Arial" w:eastAsia="Times New Roman" w:hAnsi="Arial" w:cs="Arial"/>
         </w:rPr>
-        <w:t>.name</w:t>
-      </w:r>
-      <w:proofErr w:type="gramEnd"/>
-      <w:r>
-        <w:rPr>
-          <w:rFonts w:ascii="Arial" w:eastAsia="Times New Roman" w:hAnsi="Arial" w:cs="Arial"/>
-        </w:rPr>
-        <w:t xml:space="preserve"> }}</w:t>
-      </w:r>
-      <w:r>
-        <w:rPr>
-          <w:rFonts w:ascii="Arial" w:eastAsia="Times New Roman" w:hAnsi="Arial" w:cs="Arial"/>
-        </w:rPr>
-        <w:t xml:space="preserve"> x </w:t>
-      </w:r>
-      <w:proofErr w:type="gramStart"/>
-      <w:r>
-        <w:rPr>
-          <w:rFonts w:ascii="Arial" w:eastAsia="Times New Roman" w:hAnsi="Arial" w:cs="Arial"/>
-        </w:rPr>
-        <w:t xml:space="preserve">{{ </w:t>
-      </w:r>
-      <w:proofErr w:type="spellStart"/>
+        <w:t>.name }}</w:t>
+      </w:r>
+      <w:r>
+        <w:rPr>
+          <w:rFonts w:ascii="Arial" w:eastAsia="Times New Roman" w:hAnsi="Arial" w:cs="Arial"/>
+        </w:rPr>
+        <w:t xml:space="preserve"> x {{ </w:t>
+      </w:r>
       <w:r>
         <w:rPr>
           <w:rFonts w:ascii="Arial" w:eastAsia="Times New Roman" w:hAnsi="Arial" w:cs="Arial"/>
@@ -1615,21 +1237,7 @@
         <w:rPr>
           <w:rFonts w:ascii="Arial" w:eastAsia="Times New Roman" w:hAnsi="Arial" w:cs="Arial"/>
         </w:rPr>
-        <w:t>.</w:t>
-      </w:r>
-      <w:r>
-        <w:rPr>
-          <w:rFonts w:ascii="Arial" w:eastAsia="Times New Roman" w:hAnsi="Arial" w:cs="Arial"/>
-        </w:rPr>
-        <w:t>qty</w:t>
-      </w:r>
-      <w:proofErr w:type="spellEnd"/>
-      <w:proofErr w:type="gramEnd"/>
-      <w:r>
-        <w:rPr>
-          <w:rFonts w:ascii="Arial" w:eastAsia="Times New Roman" w:hAnsi="Arial" w:cs="Arial"/>
-        </w:rPr>
-        <w:t xml:space="preserve"> }}</w:t>
+        <w:t>.qty }}</w:t>
       </w:r>
     </w:p>
     <w:p>
@@ -1656,21 +1264,7 @@
         <w:rPr>
           <w:rFonts w:ascii="Arial" w:eastAsia="Times New Roman" w:hAnsi="Arial" w:cs="Arial"/>
         </w:rPr>
-        <w:t xml:space="preserve">{%p </w:t>
-      </w:r>
-      <w:proofErr w:type="spellStart"/>
-      <w:r>
-        <w:rPr>
-          <w:rFonts w:ascii="Arial" w:eastAsia="Times New Roman" w:hAnsi="Arial" w:cs="Arial"/>
-        </w:rPr>
-        <w:t>endfor</w:t>
-      </w:r>
-      <w:proofErr w:type="spellEnd"/>
-      <w:r>
-        <w:rPr>
-          <w:rFonts w:ascii="Arial" w:eastAsia="Times New Roman" w:hAnsi="Arial" w:cs="Arial"/>
-        </w:rPr>
-        <w:t xml:space="preserve"> %}</w:t>
+        <w:t>{%p endfor %}</w:t>
       </w:r>
     </w:p>
     <w:p>
@@ -1689,35 +1283,7 @@
         <w:rPr>
           <w:rFonts w:ascii="Arial" w:eastAsia="Times New Roman" w:hAnsi="Arial" w:cs="Arial"/>
         </w:rPr>
-        <w:t xml:space="preserve">{%p if not </w:t>
-      </w:r>
-      <w:proofErr w:type="spellStart"/>
-      <w:r>
-        <w:rPr>
-          <w:rFonts w:ascii="Arial" w:eastAsia="Times New Roman" w:hAnsi="Arial" w:cs="Arial"/>
-        </w:rPr>
-        <w:t>fan_</w:t>
-      </w:r>
-      <w:proofErr w:type="gramStart"/>
-      <w:r>
-        <w:rPr>
-          <w:rFonts w:ascii="Arial" w:eastAsia="Times New Roman" w:hAnsi="Arial" w:cs="Arial"/>
-        </w:rPr>
-        <w:t>config.buyout</w:t>
-      </w:r>
-      <w:proofErr w:type="gramEnd"/>
-      <w:r>
-        <w:rPr>
-          <w:rFonts w:ascii="Arial" w:eastAsia="Times New Roman" w:hAnsi="Arial" w:cs="Arial"/>
-        </w:rPr>
-        <w:t>_items</w:t>
-      </w:r>
-      <w:proofErr w:type="spellEnd"/>
-      <w:r>
-        <w:rPr>
-          <w:rFonts w:ascii="Arial" w:eastAsia="Times New Roman" w:hAnsi="Arial" w:cs="Arial"/>
-        </w:rPr>
-        <w:t xml:space="preserve"> %}</w:t>
+        <w:t>{%p if not fan_config.buyout_items %}</w:t>
       </w:r>
     </w:p>
     <w:p>
@@ -4640,7 +4206,6 @@
         </w:rPr>
         <w:t xml:space="preserve">: </w:t>
       </w:r>
-      <w:proofErr w:type="gramStart"/>
       <w:r>
         <w:rPr>
           <w:rFonts w:ascii="Arial" w:eastAsia="Times New Roman" w:hAnsi="Arial" w:cs="Arial"/>
@@ -4653,28 +4218,12 @@
         </w:rPr>
         <w:t xml:space="preserve"> </w:t>
       </w:r>
-      <w:proofErr w:type="spellStart"/>
-      <w:r>
-        <w:rPr>
-          <w:rFonts w:ascii="Arial" w:eastAsia="Times New Roman" w:hAnsi="Arial" w:cs="Arial"/>
-        </w:rPr>
-        <w:t>delivery</w:t>
-      </w:r>
-      <w:proofErr w:type="gramEnd"/>
-      <w:r>
-        <w:rPr>
-          <w:rFonts w:ascii="Arial" w:eastAsia="Times New Roman" w:hAnsi="Arial" w:cs="Arial"/>
-        </w:rPr>
-        <w:t>_</w:t>
-      </w:r>
-      <w:proofErr w:type="gramStart"/>
-      <w:r>
-        <w:rPr>
-          <w:rFonts w:ascii="Arial" w:eastAsia="Times New Roman" w:hAnsi="Arial" w:cs="Arial"/>
-        </w:rPr>
-        <w:t>time</w:t>
-      </w:r>
-      <w:proofErr w:type="spellEnd"/>
+      <w:r>
+        <w:rPr>
+          <w:rFonts w:ascii="Arial" w:eastAsia="Times New Roman" w:hAnsi="Arial" w:cs="Arial"/>
+        </w:rPr>
+        <w:t>delivery_time</w:t>
+      </w:r>
       <w:r>
         <w:rPr>
           <w:rFonts w:ascii="Arial" w:eastAsia="Times New Roman" w:hAnsi="Arial" w:cs="Arial"/>
@@ -4685,14 +4234,7 @@
         <w:rPr>
           <w:rFonts w:ascii="Arial" w:eastAsia="Times New Roman" w:hAnsi="Arial" w:cs="Arial"/>
         </w:rPr>
-        <w:t>}</w:t>
-      </w:r>
-      <w:proofErr w:type="gramEnd"/>
-      <w:r>
-        <w:rPr>
-          <w:rFonts w:ascii="Arial" w:eastAsia="Times New Roman" w:hAnsi="Arial" w:cs="Arial"/>
-        </w:rPr>
-        <w:t>}</w:t>
+        <w:t>}}</w:t>
       </w:r>
       <w:r>
         <w:rPr>
@@ -5755,18 +5297,8 @@
         <w:sz w:val="20"/>
         <w:szCs w:val="20"/>
       </w:rPr>
-      <w:t xml:space="preserve">Air Blow Fans (Pty) Ltd. | ICC Medical Building, Irene Corporate Corner, Irene, Centurion </w:t>
+      <w:t>Air Blow Fans (Pty) Ltd. | ICC Medical Building, Irene Corporate Corner, Irene, Centurion |  www.airblowfans.co.za</w:t>
     </w:r>
-    <w:proofErr w:type="gramStart"/>
-    <w:r>
-      <w:rPr>
-        <w:rFonts w:ascii="Praktika" w:hAnsi="Praktika" w:cs="Praktika Medium"/>
-        <w:sz w:val="20"/>
-        <w:szCs w:val="20"/>
-      </w:rPr>
-      <w:t>|  www.airblowfans.co.za</w:t>
-    </w:r>
-    <w:proofErr w:type="gramEnd"/>
   </w:p>
   <w:p>
     <w:pPr>
@@ -8106,6 +7638,7 @@
   <w:style w:type="character" w:default="1" w:styleId="DefaultParagraphFont">
     <w:name w:val="Default Paragraph Font"/>
     <w:uiPriority w:val="1"/>
+    <w:semiHidden/>
     <w:unhideWhenUsed/>
   </w:style>
   <w:style w:type="table" w:default="1" w:styleId="TableNormal">
@@ -8712,21 +8245,15 @@
 </file>
 
 <file path=customXml/item1.xml><?xml version="1.0" encoding="utf-8"?>
-<b:Sources xmlns:b="http://schemas.openxmlformats.org/officeDocument/2006/bibliography" xmlns="http://schemas.openxmlformats.org/officeDocument/2006/bibliography" SelectedStyle="\APASixthEditionOfficeOnline.xsl" StyleName="APA" Version="6"/>
+<?mso-contentType ?>
+<FormTemplates xmlns="http://schemas.microsoft.com/sharepoint/v3/contenttype/forms">
+  <Display>DocumentLibraryForm</Display>
+  <Edit>DocumentLibraryForm</Edit>
+  <New>DocumentLibraryForm</New>
+</FormTemplates>
 </file>
 
 <file path=customXml/item2.xml><?xml version="1.0" encoding="utf-8"?>
-<p:properties xmlns:p="http://schemas.microsoft.com/office/2006/metadata/properties" xmlns:xsi="http://www.w3.org/2001/XMLSchema-instance" xmlns:pc="http://schemas.microsoft.com/office/infopath/2007/PartnerControls">
-  <documentManagement>
-    <lcf76f155ced4ddcb4097134ff3c332f xmlns="ae64ee24-a287-4487-8358-6fe4ea9a2751">
-      <Terms xmlns="http://schemas.microsoft.com/office/infopath/2007/PartnerControls"/>
-    </lcf76f155ced4ddcb4097134ff3c332f>
-    <TaxCatchAll xmlns="fd1ea970-496a-445f-a0ac-9e633861af08" xsi:nil="true"/>
-  </documentManagement>
-</p:properties>
-</file>
-
-<file path=customXml/item3.xml><?xml version="1.0" encoding="utf-8"?>
 <ct:contentTypeSchema xmlns:ct="http://schemas.microsoft.com/office/2006/metadata/contentType" xmlns:ma="http://schemas.microsoft.com/office/2006/metadata/properties/metaAttributes" ct:_="" ma:_="" ma:contentTypeName="Document" ma:contentTypeID="0x0101008312ED833466FB4CAC852177FFA9EDB4" ma:contentTypeVersion="15" ma:contentTypeDescription="Create a new document." ma:contentTypeScope="" ma:versionID="00ba274f931c318c10f29e2e1d6d74c0">
   <xsd:schema xmlns:xsd="http://www.w3.org/2001/XMLSchema" xmlns:xs="http://www.w3.org/2001/XMLSchema" xmlns:p="http://schemas.microsoft.com/office/2006/metadata/properties" xmlns:ns2="ae64ee24-a287-4487-8358-6fe4ea9a2751" xmlns:ns3="fd1ea970-496a-445f-a0ac-9e633861af08" targetNamespace="http://schemas.microsoft.com/office/2006/metadata/properties" ma:root="true" ma:fieldsID="00de92738e7b8d6b1fdb5cc528c1afed" ns2:_="" ns3:_="">
     <xsd:import namespace="ae64ee24-a287-4487-8358-6fe4ea9a2751"/>
@@ -8961,35 +8488,30 @@
 </ct:contentTypeSchema>
 </file>
 
+<file path=customXml/item3.xml><?xml version="1.0" encoding="utf-8"?>
+<p:properties xmlns:p="http://schemas.microsoft.com/office/2006/metadata/properties" xmlns:xsi="http://www.w3.org/2001/XMLSchema-instance" xmlns:pc="http://schemas.microsoft.com/office/infopath/2007/PartnerControls">
+  <documentManagement>
+    <lcf76f155ced4ddcb4097134ff3c332f xmlns="ae64ee24-a287-4487-8358-6fe4ea9a2751">
+      <Terms xmlns="http://schemas.microsoft.com/office/infopath/2007/PartnerControls"/>
+    </lcf76f155ced4ddcb4097134ff3c332f>
+    <TaxCatchAll xmlns="fd1ea970-496a-445f-a0ac-9e633861af08" xsi:nil="true"/>
+  </documentManagement>
+</p:properties>
+</file>
+
 <file path=customXml/item4.xml><?xml version="1.0" encoding="utf-8"?>
-<?mso-contentType ?>
-<FormTemplates xmlns="http://schemas.microsoft.com/sharepoint/v3/contenttype/forms">
-  <Display>DocumentLibraryForm</Display>
-  <Edit>DocumentLibraryForm</Edit>
-  <New>DocumentLibraryForm</New>
-</FormTemplates>
+<b:Sources xmlns:b="http://schemas.openxmlformats.org/officeDocument/2006/bibliography" xmlns="http://schemas.openxmlformats.org/officeDocument/2006/bibliography" SelectedStyle="\APASixthEditionOfficeOnline.xsl" StyleName="APA" Version="6"/>
 </file>
 
 <file path=customXml/itemProps1.xml><?xml version="1.0" encoding="utf-8"?>
-<ds:datastoreItem xmlns:ds="http://schemas.openxmlformats.org/officeDocument/2006/customXml" ds:itemID="{6B87BA90-45F4-4413-8553-4E37FB89445A}">
+<ds:datastoreItem xmlns:ds="http://schemas.openxmlformats.org/officeDocument/2006/customXml" ds:itemID="{8321DDA5-16E0-4606-B32A-7029020DA1BE}">
   <ds:schemaRefs>
-    <ds:schemaRef ds:uri="http://schemas.openxmlformats.org/officeDocument/2006/bibliography"/>
+    <ds:schemaRef ds:uri="http://schemas.microsoft.com/sharepoint/v3/contenttype/forms"/>
   </ds:schemaRefs>
 </ds:datastoreItem>
 </file>
 
 <file path=customXml/itemProps2.xml><?xml version="1.0" encoding="utf-8"?>
-<ds:datastoreItem xmlns:ds="http://schemas.openxmlformats.org/officeDocument/2006/customXml" ds:itemID="{FAD17780-133F-40F1-8599-9A3527331F37}">
-  <ds:schemaRefs>
-    <ds:schemaRef ds:uri="http://schemas.microsoft.com/office/2006/metadata/properties"/>
-    <ds:schemaRef ds:uri="http://schemas.microsoft.com/office/infopath/2007/PartnerControls"/>
-    <ds:schemaRef ds:uri="ae64ee24-a287-4487-8358-6fe4ea9a2751"/>
-    <ds:schemaRef ds:uri="fd1ea970-496a-445f-a0ac-9e633861af08"/>
-  </ds:schemaRefs>
-</ds:datastoreItem>
-</file>
-
-<file path=customXml/itemProps3.xml><?xml version="1.0" encoding="utf-8"?>
 <ds:datastoreItem xmlns:ds="http://schemas.openxmlformats.org/officeDocument/2006/customXml" ds:itemID="{0084AE77-644A-4249-A0DE-270BF17CEEE1}">
   <ds:schemaRefs>
     <ds:schemaRef ds:uri="http://schemas.microsoft.com/office/2006/metadata/contentType"/>
@@ -9008,10 +8530,21 @@
 </ds:datastoreItem>
 </file>
 
+<file path=customXml/itemProps3.xml><?xml version="1.0" encoding="utf-8"?>
+<ds:datastoreItem xmlns:ds="http://schemas.openxmlformats.org/officeDocument/2006/customXml" ds:itemID="{FAD17780-133F-40F1-8599-9A3527331F37}">
+  <ds:schemaRefs>
+    <ds:schemaRef ds:uri="http://schemas.microsoft.com/office/2006/metadata/properties"/>
+    <ds:schemaRef ds:uri="http://schemas.microsoft.com/office/infopath/2007/PartnerControls"/>
+    <ds:schemaRef ds:uri="ae64ee24-a287-4487-8358-6fe4ea9a2751"/>
+    <ds:schemaRef ds:uri="fd1ea970-496a-445f-a0ac-9e633861af08"/>
+  </ds:schemaRefs>
+</ds:datastoreItem>
+</file>
+
 <file path=customXml/itemProps4.xml><?xml version="1.0" encoding="utf-8"?>
-<ds:datastoreItem xmlns:ds="http://schemas.openxmlformats.org/officeDocument/2006/customXml" ds:itemID="{8321DDA5-16E0-4606-B32A-7029020DA1BE}">
+<ds:datastoreItem xmlns:ds="http://schemas.openxmlformats.org/officeDocument/2006/customXml" ds:itemID="{6B87BA90-45F4-4413-8553-4E37FB89445A}">
   <ds:schemaRefs>
-    <ds:schemaRef ds:uri="http://schemas.microsoft.com/sharepoint/v3/contenttype/forms"/>
+    <ds:schemaRef ds:uri="http://schemas.openxmlformats.org/officeDocument/2006/bibliography"/>
   </ds:schemaRefs>
 </ds:datastoreItem>
 </file>
</xml_diff>

<commit_message>
Update motor table sort order and quote template page count
- Sort motor selection table by kW rating ascending (lowest first)
- Add Word NUMPAGES field to quote template for automatic page count

Co-Authored-By: Claude Sonnet 4.6 <noreply@anthropic.com>
</commit_message>
<xml_diff>
--- a/ui/templates/quote_template.docx
+++ b/ui/templates/quote_template.docx
@@ -59,6 +59,7 @@
           <w:b/>
         </w:rPr>
       </w:pPr>
+      <w:proofErr w:type="gramStart"/>
       <w:r>
         <w:rPr>
           <w:rFonts w:ascii="Arial" w:eastAsia="Times New Roman" w:hAnsi="Arial" w:cs="Arial"/>
@@ -68,6 +69,7 @@
         </w:rPr>
         <w:t xml:space="preserve">{{ </w:t>
       </w:r>
+      <w:proofErr w:type="spellStart"/>
       <w:r>
         <w:rPr>
           <w:rFonts w:ascii="Arial" w:eastAsia="Times New Roman" w:hAnsi="Arial" w:cs="Arial"/>
@@ -75,8 +77,9 @@
           <w:sz w:val="36"/>
           <w:szCs w:val="36"/>
         </w:rPr>
-        <w:t>client_name</w:t>
-      </w:r>
+        <w:t>client</w:t>
+      </w:r>
+      <w:proofErr w:type="gramEnd"/>
       <w:r>
         <w:rPr>
           <w:rFonts w:ascii="Arial" w:eastAsia="Times New Roman" w:hAnsi="Arial" w:cs="Arial"/>
@@ -84,7 +87,37 @@
           <w:sz w:val="36"/>
           <w:szCs w:val="36"/>
         </w:rPr>
-        <w:t xml:space="preserve"> }}</w:t>
+        <w:t>_</w:t>
+      </w:r>
+      <w:proofErr w:type="gramStart"/>
+      <w:r>
+        <w:rPr>
+          <w:rFonts w:ascii="Arial" w:eastAsia="Times New Roman" w:hAnsi="Arial" w:cs="Arial"/>
+          <w:b/>
+          <w:sz w:val="36"/>
+          <w:szCs w:val="36"/>
+        </w:rPr>
+        <w:t>name</w:t>
+      </w:r>
+      <w:proofErr w:type="spellEnd"/>
+      <w:r>
+        <w:rPr>
+          <w:rFonts w:ascii="Arial" w:eastAsia="Times New Roman" w:hAnsi="Arial" w:cs="Arial"/>
+          <w:b/>
+          <w:sz w:val="36"/>
+          <w:szCs w:val="36"/>
+        </w:rPr>
+        <w:t xml:space="preserve"> }</w:t>
+      </w:r>
+      <w:proofErr w:type="gramEnd"/>
+      <w:r>
+        <w:rPr>
+          <w:rFonts w:ascii="Arial" w:eastAsia="Times New Roman" w:hAnsi="Arial" w:cs="Arial"/>
+          <w:b/>
+          <w:sz w:val="36"/>
+          <w:szCs w:val="36"/>
+        </w:rPr>
+        <w:t>}</w:t>
       </w:r>
     </w:p>
     <w:p>
@@ -114,21 +147,55 @@
           <w:b/>
         </w:rPr>
         <w:tab/>
-        <w:t xml:space="preserve">: {{ </w:t>
-      </w:r>
-      <w:r>
-        <w:rPr>
-          <w:rFonts w:ascii="Arial" w:eastAsia="Times New Roman" w:hAnsi="Arial" w:cs="Arial"/>
-          <w:b/>
-        </w:rPr>
-        <w:t>attention_to</w:t>
-      </w:r>
-      <w:r>
-        <w:rPr>
-          <w:rFonts w:ascii="Arial" w:eastAsia="Times New Roman" w:hAnsi="Arial" w:cs="Arial"/>
-          <w:b/>
-        </w:rPr>
-        <w:t xml:space="preserve"> }}</w:t>
+        <w:t xml:space="preserve">: </w:t>
+      </w:r>
+      <w:proofErr w:type="gramStart"/>
+      <w:r>
+        <w:rPr>
+          <w:rFonts w:ascii="Arial" w:eastAsia="Times New Roman" w:hAnsi="Arial" w:cs="Arial"/>
+          <w:b/>
+        </w:rPr>
+        <w:t xml:space="preserve">{{ </w:t>
+      </w:r>
+      <w:proofErr w:type="spellStart"/>
+      <w:r>
+        <w:rPr>
+          <w:rFonts w:ascii="Arial" w:eastAsia="Times New Roman" w:hAnsi="Arial" w:cs="Arial"/>
+          <w:b/>
+        </w:rPr>
+        <w:t>attention</w:t>
+      </w:r>
+      <w:proofErr w:type="gramEnd"/>
+      <w:r>
+        <w:rPr>
+          <w:rFonts w:ascii="Arial" w:eastAsia="Times New Roman" w:hAnsi="Arial" w:cs="Arial"/>
+          <w:b/>
+        </w:rPr>
+        <w:t>_</w:t>
+      </w:r>
+      <w:proofErr w:type="gramStart"/>
+      <w:r>
+        <w:rPr>
+          <w:rFonts w:ascii="Arial" w:eastAsia="Times New Roman" w:hAnsi="Arial" w:cs="Arial"/>
+          <w:b/>
+        </w:rPr>
+        <w:t>to</w:t>
+      </w:r>
+      <w:proofErr w:type="spellEnd"/>
+      <w:r>
+        <w:rPr>
+          <w:rFonts w:ascii="Arial" w:eastAsia="Times New Roman" w:hAnsi="Arial" w:cs="Arial"/>
+          <w:b/>
+        </w:rPr>
+        <w:t xml:space="preserve"> }</w:t>
+      </w:r>
+      <w:proofErr w:type="gramEnd"/>
+      <w:r>
+        <w:rPr>
+          <w:rFonts w:ascii="Arial" w:eastAsia="Times New Roman" w:hAnsi="Arial" w:cs="Arial"/>
+          <w:b/>
+        </w:rPr>
+        <w:t>}</w:t>
       </w:r>
     </w:p>
     <w:p>
@@ -161,13 +228,59 @@
         <w:tab/>
         <w:t xml:space="preserve">: </w:t>
       </w:r>
-      <w:r>
-        <w:rPr>
-          <w:rFonts w:ascii="Arial" w:eastAsia="Times New Roman" w:hAnsi="Arial" w:cs="Arial"/>
-          <w:b/>
-          <w:bCs/>
-        </w:rPr>
-        <w:t xml:space="preserve">{{ subject_fan_sizes }} </w:t>
+      <w:proofErr w:type="gramStart"/>
+      <w:r>
+        <w:rPr>
+          <w:rFonts w:ascii="Arial" w:eastAsia="Times New Roman" w:hAnsi="Arial" w:cs="Arial"/>
+          <w:b/>
+          <w:bCs/>
+        </w:rPr>
+        <w:t xml:space="preserve">{{ </w:t>
+      </w:r>
+      <w:proofErr w:type="spellStart"/>
+      <w:r>
+        <w:rPr>
+          <w:rFonts w:ascii="Arial" w:eastAsia="Times New Roman" w:hAnsi="Arial" w:cs="Arial"/>
+          <w:b/>
+          <w:bCs/>
+        </w:rPr>
+        <w:t>subject</w:t>
+      </w:r>
+      <w:proofErr w:type="gramEnd"/>
+      <w:r>
+        <w:rPr>
+          <w:rFonts w:ascii="Arial" w:eastAsia="Times New Roman" w:hAnsi="Arial" w:cs="Arial"/>
+          <w:b/>
+          <w:bCs/>
+        </w:rPr>
+        <w:t>_fan_</w:t>
+      </w:r>
+      <w:proofErr w:type="gramStart"/>
+      <w:r>
+        <w:rPr>
+          <w:rFonts w:ascii="Arial" w:eastAsia="Times New Roman" w:hAnsi="Arial" w:cs="Arial"/>
+          <w:b/>
+          <w:bCs/>
+        </w:rPr>
+        <w:t>sizes</w:t>
+      </w:r>
+      <w:proofErr w:type="spellEnd"/>
+      <w:r>
+        <w:rPr>
+          <w:rFonts w:ascii="Arial" w:eastAsia="Times New Roman" w:hAnsi="Arial" w:cs="Arial"/>
+          <w:b/>
+          <w:bCs/>
+        </w:rPr>
+        <w:t xml:space="preserve"> }</w:t>
+      </w:r>
+      <w:proofErr w:type="gramEnd"/>
+      <w:r>
+        <w:rPr>
+          <w:rFonts w:ascii="Arial" w:eastAsia="Times New Roman" w:hAnsi="Arial" w:cs="Arial"/>
+          <w:b/>
+          <w:bCs/>
+        </w:rPr>
+        <w:t xml:space="preserve">} </w:t>
       </w:r>
       <w:r>
         <w:rPr>
@@ -237,7 +350,55 @@
           <w:b/>
         </w:rPr>
         <w:tab/>
-        <w:t>: {{ quote_ref }}</w:t>
+        <w:t xml:space="preserve">: </w:t>
+      </w:r>
+      <w:proofErr w:type="gramStart"/>
+      <w:r>
+        <w:rPr>
+          <w:rFonts w:ascii="Arial" w:eastAsia="Times New Roman" w:hAnsi="Arial" w:cs="Arial"/>
+          <w:b/>
+        </w:rPr>
+        <w:t xml:space="preserve">{{ </w:t>
+      </w:r>
+      <w:proofErr w:type="spellStart"/>
+      <w:r>
+        <w:rPr>
+          <w:rFonts w:ascii="Arial" w:eastAsia="Times New Roman" w:hAnsi="Arial" w:cs="Arial"/>
+          <w:b/>
+        </w:rPr>
+        <w:t>quote</w:t>
+      </w:r>
+      <w:proofErr w:type="gramEnd"/>
+      <w:r>
+        <w:rPr>
+          <w:rFonts w:ascii="Arial" w:eastAsia="Times New Roman" w:hAnsi="Arial" w:cs="Arial"/>
+          <w:b/>
+        </w:rPr>
+        <w:t>_</w:t>
+      </w:r>
+      <w:proofErr w:type="gramStart"/>
+      <w:r>
+        <w:rPr>
+          <w:rFonts w:ascii="Arial" w:eastAsia="Times New Roman" w:hAnsi="Arial" w:cs="Arial"/>
+          <w:b/>
+        </w:rPr>
+        <w:t>ref</w:t>
+      </w:r>
+      <w:proofErr w:type="spellEnd"/>
+      <w:r>
+        <w:rPr>
+          <w:rFonts w:ascii="Arial" w:eastAsia="Times New Roman" w:hAnsi="Arial" w:cs="Arial"/>
+          <w:b/>
+        </w:rPr>
+        <w:t xml:space="preserve"> }</w:t>
+      </w:r>
+      <w:proofErr w:type="gramEnd"/>
+      <w:r>
+        <w:rPr>
+          <w:rFonts w:ascii="Arial" w:eastAsia="Times New Roman" w:hAnsi="Arial" w:cs="Arial"/>
+          <w:b/>
+        </w:rPr>
+        <w:t>}</w:t>
       </w:r>
     </w:p>
     <w:p>
@@ -267,7 +428,55 @@
           <w:b/>
         </w:rPr>
         <w:tab/>
-        <w:t>: {{ quote_date }}</w:t>
+        <w:t xml:space="preserve">: </w:t>
+      </w:r>
+      <w:proofErr w:type="gramStart"/>
+      <w:r>
+        <w:rPr>
+          <w:rFonts w:ascii="Arial" w:eastAsia="Times New Roman" w:hAnsi="Arial" w:cs="Arial"/>
+          <w:b/>
+        </w:rPr>
+        <w:t xml:space="preserve">{{ </w:t>
+      </w:r>
+      <w:proofErr w:type="spellStart"/>
+      <w:r>
+        <w:rPr>
+          <w:rFonts w:ascii="Arial" w:eastAsia="Times New Roman" w:hAnsi="Arial" w:cs="Arial"/>
+          <w:b/>
+        </w:rPr>
+        <w:t>quote</w:t>
+      </w:r>
+      <w:proofErr w:type="gramEnd"/>
+      <w:r>
+        <w:rPr>
+          <w:rFonts w:ascii="Arial" w:eastAsia="Times New Roman" w:hAnsi="Arial" w:cs="Arial"/>
+          <w:b/>
+        </w:rPr>
+        <w:t>_</w:t>
+      </w:r>
+      <w:proofErr w:type="gramStart"/>
+      <w:r>
+        <w:rPr>
+          <w:rFonts w:ascii="Arial" w:eastAsia="Times New Roman" w:hAnsi="Arial" w:cs="Arial"/>
+          <w:b/>
+        </w:rPr>
+        <w:t>date</w:t>
+      </w:r>
+      <w:proofErr w:type="spellEnd"/>
+      <w:r>
+        <w:rPr>
+          <w:rFonts w:ascii="Arial" w:eastAsia="Times New Roman" w:hAnsi="Arial" w:cs="Arial"/>
+          <w:b/>
+        </w:rPr>
+        <w:t xml:space="preserve"> }</w:t>
+      </w:r>
+      <w:proofErr w:type="gramEnd"/>
+      <w:r>
+        <w:rPr>
+          <w:rFonts w:ascii="Arial" w:eastAsia="Times New Roman" w:hAnsi="Arial" w:cs="Arial"/>
+          <w:b/>
+        </w:rPr>
+        <w:t>}</w:t>
       </w:r>
       <w:r>
         <w:rPr>
@@ -304,7 +513,14 @@
           <w:b/>
         </w:rPr>
         <w:tab/>
-        <w:t xml:space="preserve">: 1 of </w:t>
+        <w:t>: 1 of</w:t>
+      </w:r>
+      <w:r>
+        <w:rPr>
+          <w:rFonts w:ascii="Arial" w:eastAsia="Times New Roman" w:hAnsi="Arial" w:cs="Arial"/>
+          <w:b/>
+        </w:rPr>
+        <w:t xml:space="preserve"> </w:t>
       </w:r>
       <w:r>
         <w:rPr>
@@ -318,7 +534,7 @@
           <w:rFonts w:ascii="Arial" w:eastAsia="Times New Roman" w:hAnsi="Arial" w:cs="Arial"/>
           <w:b/>
         </w:rPr>
-        <w:instrText xml:space="preserve"> DOCPROPERTY  Pages  \* MERGEFORMAT </w:instrText>
+        <w:instrText xml:space="preserve"> NUMPAGES  \* Arabic  \* MERGEFORMAT </w:instrText>
       </w:r>
       <w:r>
         <w:rPr>
@@ -331,8 +547,9 @@
         <w:rPr>
           <w:rFonts w:ascii="Arial" w:eastAsia="Times New Roman" w:hAnsi="Arial" w:cs="Arial"/>
           <w:b/>
-        </w:rPr>
-        <w:t>4</w:t>
+          <w:noProof/>
+        </w:rPr>
+        <w:t>5</w:t>
       </w:r>
       <w:r>
         <w:rPr>
@@ -412,13 +629,59 @@
         </w:rPr>
         <w:t xml:space="preserve"> </w:t>
       </w:r>
-      <w:r>
-        <w:rPr>
-          <w:rFonts w:ascii="Arial" w:eastAsia="Times New Roman" w:hAnsi="Arial" w:cs="Arial"/>
-          <w:b/>
-          <w:bCs/>
-        </w:rPr>
-        <w:t>{{ subject_fan_sizes }}</w:t>
+      <w:proofErr w:type="gramStart"/>
+      <w:r>
+        <w:rPr>
+          <w:rFonts w:ascii="Arial" w:eastAsia="Times New Roman" w:hAnsi="Arial" w:cs="Arial"/>
+          <w:b/>
+          <w:bCs/>
+        </w:rPr>
+        <w:t xml:space="preserve">{{ </w:t>
+      </w:r>
+      <w:proofErr w:type="spellStart"/>
+      <w:r>
+        <w:rPr>
+          <w:rFonts w:ascii="Arial" w:eastAsia="Times New Roman" w:hAnsi="Arial" w:cs="Arial"/>
+          <w:b/>
+          <w:bCs/>
+        </w:rPr>
+        <w:t>subject</w:t>
+      </w:r>
+      <w:proofErr w:type="gramEnd"/>
+      <w:r>
+        <w:rPr>
+          <w:rFonts w:ascii="Arial" w:eastAsia="Times New Roman" w:hAnsi="Arial" w:cs="Arial"/>
+          <w:b/>
+          <w:bCs/>
+        </w:rPr>
+        <w:t>_fan_</w:t>
+      </w:r>
+      <w:proofErr w:type="gramStart"/>
+      <w:r>
+        <w:rPr>
+          <w:rFonts w:ascii="Arial" w:eastAsia="Times New Roman" w:hAnsi="Arial" w:cs="Arial"/>
+          <w:b/>
+          <w:bCs/>
+        </w:rPr>
+        <w:t>sizes</w:t>
+      </w:r>
+      <w:proofErr w:type="spellEnd"/>
+      <w:r>
+        <w:rPr>
+          <w:rFonts w:ascii="Arial" w:eastAsia="Times New Roman" w:hAnsi="Arial" w:cs="Arial"/>
+          <w:b/>
+          <w:bCs/>
+        </w:rPr>
+        <w:t xml:space="preserve"> }</w:t>
+      </w:r>
+      <w:proofErr w:type="gramEnd"/>
+      <w:r>
+        <w:rPr>
+          <w:rFonts w:ascii="Arial" w:eastAsia="Times New Roman" w:hAnsi="Arial" w:cs="Arial"/>
+          <w:b/>
+          <w:bCs/>
+        </w:rPr>
+        <w:t>}</w:t>
       </w:r>
       <w:r>
         <w:rPr>
@@ -434,7 +697,61 @@
           <w:b/>
           <w:bCs/>
         </w:rPr>
-        <w:t>– {{ project_location }}</w:t>
+        <w:t xml:space="preserve">– </w:t>
+      </w:r>
+      <w:proofErr w:type="gramStart"/>
+      <w:r>
+        <w:rPr>
+          <w:rFonts w:ascii="Arial" w:eastAsia="Times New Roman" w:hAnsi="Arial" w:cs="Arial"/>
+          <w:b/>
+          <w:bCs/>
+        </w:rPr>
+        <w:t xml:space="preserve">{{ </w:t>
+      </w:r>
+      <w:proofErr w:type="spellStart"/>
+      <w:r>
+        <w:rPr>
+          <w:rFonts w:ascii="Arial" w:eastAsia="Times New Roman" w:hAnsi="Arial" w:cs="Arial"/>
+          <w:b/>
+          <w:bCs/>
+        </w:rPr>
+        <w:t>project</w:t>
+      </w:r>
+      <w:proofErr w:type="gramEnd"/>
+      <w:r>
+        <w:rPr>
+          <w:rFonts w:ascii="Arial" w:eastAsia="Times New Roman" w:hAnsi="Arial" w:cs="Arial"/>
+          <w:b/>
+          <w:bCs/>
+        </w:rPr>
+        <w:t>_</w:t>
+      </w:r>
+      <w:proofErr w:type="gramStart"/>
+      <w:r>
+        <w:rPr>
+          <w:rFonts w:ascii="Arial" w:eastAsia="Times New Roman" w:hAnsi="Arial" w:cs="Arial"/>
+          <w:b/>
+          <w:bCs/>
+        </w:rPr>
+        <w:t>location</w:t>
+      </w:r>
+      <w:proofErr w:type="spellEnd"/>
+      <w:r>
+        <w:rPr>
+          <w:rFonts w:ascii="Arial" w:eastAsia="Times New Roman" w:hAnsi="Arial" w:cs="Arial"/>
+          <w:b/>
+          <w:bCs/>
+        </w:rPr>
+        <w:t xml:space="preserve"> }</w:t>
+      </w:r>
+      <w:proofErr w:type="gramEnd"/>
+      <w:r>
+        <w:rPr>
+          <w:rFonts w:ascii="Arial" w:eastAsia="Times New Roman" w:hAnsi="Arial" w:cs="Arial"/>
+          <w:b/>
+          <w:bCs/>
+        </w:rPr>
+        <w:t>}</w:t>
       </w:r>
     </w:p>
     <w:p>
@@ -468,6 +785,7 @@
         </w:rPr>
         <w:t xml:space="preserve">Dear </w:t>
       </w:r>
+      <w:proofErr w:type="gramStart"/>
       <w:r>
         <w:rPr>
           <w:rFonts w:ascii="Arial" w:eastAsia="Times New Roman" w:hAnsi="Arial" w:cs="Arial"/>
@@ -475,19 +793,45 @@
         </w:rPr>
         <w:t xml:space="preserve">{{ </w:t>
       </w:r>
-      <w:r>
-        <w:rPr>
-          <w:rFonts w:ascii="Arial" w:eastAsia="Times New Roman" w:hAnsi="Arial" w:cs="Arial"/>
-          <w:b/>
-        </w:rPr>
-        <w:t>attention_to</w:t>
-      </w:r>
-      <w:r>
-        <w:rPr>
-          <w:rFonts w:ascii="Arial" w:eastAsia="Times New Roman" w:hAnsi="Arial" w:cs="Arial"/>
-          <w:b/>
-        </w:rPr>
-        <w:t xml:space="preserve"> }}</w:t>
+      <w:proofErr w:type="spellStart"/>
+      <w:r>
+        <w:rPr>
+          <w:rFonts w:ascii="Arial" w:eastAsia="Times New Roman" w:hAnsi="Arial" w:cs="Arial"/>
+          <w:b/>
+        </w:rPr>
+        <w:t>attention</w:t>
+      </w:r>
+      <w:proofErr w:type="gramEnd"/>
+      <w:r>
+        <w:rPr>
+          <w:rFonts w:ascii="Arial" w:eastAsia="Times New Roman" w:hAnsi="Arial" w:cs="Arial"/>
+          <w:b/>
+        </w:rPr>
+        <w:t>_</w:t>
+      </w:r>
+      <w:proofErr w:type="gramStart"/>
+      <w:r>
+        <w:rPr>
+          <w:rFonts w:ascii="Arial" w:eastAsia="Times New Roman" w:hAnsi="Arial" w:cs="Arial"/>
+          <w:b/>
+        </w:rPr>
+        <w:t>to</w:t>
+      </w:r>
+      <w:proofErr w:type="spellEnd"/>
+      <w:r>
+        <w:rPr>
+          <w:rFonts w:ascii="Arial" w:eastAsia="Times New Roman" w:hAnsi="Arial" w:cs="Arial"/>
+          <w:b/>
+        </w:rPr>
+        <w:t xml:space="preserve"> }</w:t>
+      </w:r>
+      <w:proofErr w:type="gramEnd"/>
+      <w:r>
+        <w:rPr>
+          <w:rFonts w:ascii="Arial" w:eastAsia="Times New Roman" w:hAnsi="Arial" w:cs="Arial"/>
+          <w:b/>
+        </w:rPr>
+        <w:t>}</w:t>
       </w:r>
       <w:r>
         <w:rPr>
@@ -589,7 +933,23 @@
     </w:p>
     <w:p>
       <w:r>
-        <w:t>{%p for fan_config in fan_configs %}</w:t>
+        <w:t xml:space="preserve">{%p for </w:t>
+      </w:r>
+      <w:proofErr w:type="spellStart"/>
+      <w:r>
+        <w:t>fan_config</w:t>
+      </w:r>
+      <w:proofErr w:type="spellEnd"/>
+      <w:r>
+        <w:t xml:space="preserve"> in </w:t>
+      </w:r>
+      <w:proofErr w:type="spellStart"/>
+      <w:r>
+        <w:t>fan_configs</w:t>
+      </w:r>
+      <w:proofErr w:type="spellEnd"/>
+      <w:r>
+        <w:t xml:space="preserve"> %}</w:t>
       </w:r>
     </w:p>
     <w:p>
@@ -615,7 +975,352 @@
           <w:bCs/>
           <w:u w:val="single"/>
         </w:rPr>
-        <w:t>Config {{ fan_config.config_number }} (×{{ fan_config.quantity }}): {{ fan_config.fan_size_mm }}mm Fan, {{ fan_config.motor_output }}kW, {{ fan_config.motor_pole }}-pole, 525V Auxiliary Fan:</w:t>
+        <w:t xml:space="preserve">Config </w:t>
+      </w:r>
+      <w:proofErr w:type="gramStart"/>
+      <w:r>
+        <w:rPr>
+          <w:rFonts w:ascii="Arial" w:eastAsia="Times New Roman" w:hAnsi="Arial" w:cs="Arial"/>
+          <w:b/>
+          <w:bCs/>
+          <w:u w:val="single"/>
+        </w:rPr>
+        <w:t xml:space="preserve">{{ </w:t>
+      </w:r>
+      <w:proofErr w:type="spellStart"/>
+      <w:r>
+        <w:rPr>
+          <w:rFonts w:ascii="Arial" w:eastAsia="Times New Roman" w:hAnsi="Arial" w:cs="Arial"/>
+          <w:b/>
+          <w:bCs/>
+          <w:u w:val="single"/>
+        </w:rPr>
+        <w:t>fan</w:t>
+      </w:r>
+      <w:proofErr w:type="gramEnd"/>
+      <w:r>
+        <w:rPr>
+          <w:rFonts w:ascii="Arial" w:eastAsia="Times New Roman" w:hAnsi="Arial" w:cs="Arial"/>
+          <w:b/>
+          <w:bCs/>
+          <w:u w:val="single"/>
+        </w:rPr>
+        <w:t>_config.config_</w:t>
+      </w:r>
+      <w:proofErr w:type="gramStart"/>
+      <w:r>
+        <w:rPr>
+          <w:rFonts w:ascii="Arial" w:eastAsia="Times New Roman" w:hAnsi="Arial" w:cs="Arial"/>
+          <w:b/>
+          <w:bCs/>
+          <w:u w:val="single"/>
+        </w:rPr>
+        <w:t>number</w:t>
+      </w:r>
+      <w:proofErr w:type="spellEnd"/>
+      <w:r>
+        <w:rPr>
+          <w:rFonts w:ascii="Arial" w:eastAsia="Times New Roman" w:hAnsi="Arial" w:cs="Arial"/>
+          <w:b/>
+          <w:bCs/>
+          <w:u w:val="single"/>
+        </w:rPr>
+        <w:t xml:space="preserve"> }</w:t>
+      </w:r>
+      <w:proofErr w:type="gramEnd"/>
+      <w:r>
+        <w:rPr>
+          <w:rFonts w:ascii="Arial" w:eastAsia="Times New Roman" w:hAnsi="Arial" w:cs="Arial"/>
+          <w:b/>
+          <w:bCs/>
+          <w:u w:val="single"/>
+        </w:rPr>
+        <w:t>} (</w:t>
+      </w:r>
+      <w:proofErr w:type="gramStart"/>
+      <w:r>
+        <w:rPr>
+          <w:rFonts w:ascii="Arial" w:eastAsia="Times New Roman" w:hAnsi="Arial" w:cs="Arial"/>
+          <w:b/>
+          <w:bCs/>
+          <w:color w:val="4472C4" w:themeColor="accent1"/>
+          <w:u w:val="single"/>
+        </w:rPr>
+        <w:t xml:space="preserve">×{{ </w:t>
+      </w:r>
+      <w:proofErr w:type="spellStart"/>
+      <w:r>
+        <w:rPr>
+          <w:rFonts w:ascii="Arial" w:eastAsia="Times New Roman" w:hAnsi="Arial" w:cs="Arial"/>
+          <w:b/>
+          <w:bCs/>
+          <w:color w:val="4472C4" w:themeColor="accent1"/>
+          <w:u w:val="single"/>
+        </w:rPr>
+        <w:t>fan</w:t>
+      </w:r>
+      <w:proofErr w:type="gramEnd"/>
+      <w:r>
+        <w:rPr>
+          <w:rFonts w:ascii="Arial" w:eastAsia="Times New Roman" w:hAnsi="Arial" w:cs="Arial"/>
+          <w:b/>
+          <w:bCs/>
+          <w:color w:val="4472C4" w:themeColor="accent1"/>
+          <w:u w:val="single"/>
+        </w:rPr>
+        <w:t>_</w:t>
+      </w:r>
+      <w:proofErr w:type="gramStart"/>
+      <w:r>
+        <w:rPr>
+          <w:rFonts w:ascii="Arial" w:eastAsia="Times New Roman" w:hAnsi="Arial" w:cs="Arial"/>
+          <w:b/>
+          <w:bCs/>
+          <w:color w:val="4472C4" w:themeColor="accent1"/>
+          <w:u w:val="single"/>
+        </w:rPr>
+        <w:t>config.quantity</w:t>
+      </w:r>
+      <w:proofErr w:type="spellEnd"/>
+      <w:proofErr w:type="gramEnd"/>
+      <w:r>
+        <w:rPr>
+          <w:rFonts w:ascii="Arial" w:eastAsia="Times New Roman" w:hAnsi="Arial" w:cs="Arial"/>
+          <w:b/>
+          <w:bCs/>
+          <w:color w:val="4472C4" w:themeColor="accent1"/>
+          <w:u w:val="single"/>
+        </w:rPr>
+        <w:t xml:space="preserve"> }}</w:t>
+      </w:r>
+      <w:r>
+        <w:rPr>
+          <w:rFonts w:ascii="Arial" w:eastAsia="Times New Roman" w:hAnsi="Arial" w:cs="Arial"/>
+          <w:b/>
+          <w:bCs/>
+          <w:u w:val="single"/>
+        </w:rPr>
+        <w:t xml:space="preserve">): </w:t>
+      </w:r>
+      <w:proofErr w:type="gramStart"/>
+      <w:r>
+        <w:rPr>
+          <w:rFonts w:ascii="Arial" w:eastAsia="Times New Roman" w:hAnsi="Arial" w:cs="Arial"/>
+          <w:b/>
+          <w:bCs/>
+          <w:u w:val="single"/>
+        </w:rPr>
+        <w:t xml:space="preserve">{{ </w:t>
+      </w:r>
+      <w:proofErr w:type="spellStart"/>
+      <w:r>
+        <w:rPr>
+          <w:rFonts w:ascii="Arial" w:eastAsia="Times New Roman" w:hAnsi="Arial" w:cs="Arial"/>
+          <w:b/>
+          <w:bCs/>
+          <w:u w:val="single"/>
+        </w:rPr>
+        <w:t>fan_config.fan</w:t>
+      </w:r>
+      <w:proofErr w:type="gramEnd"/>
+      <w:r>
+        <w:rPr>
+          <w:rFonts w:ascii="Arial" w:eastAsia="Times New Roman" w:hAnsi="Arial" w:cs="Arial"/>
+          <w:b/>
+          <w:bCs/>
+          <w:u w:val="single"/>
+        </w:rPr>
+        <w:t>_size_</w:t>
+      </w:r>
+      <w:proofErr w:type="gramStart"/>
+      <w:r>
+        <w:rPr>
+          <w:rFonts w:ascii="Arial" w:eastAsia="Times New Roman" w:hAnsi="Arial" w:cs="Arial"/>
+          <w:b/>
+          <w:bCs/>
+          <w:u w:val="single"/>
+        </w:rPr>
+        <w:t>mm</w:t>
+      </w:r>
+      <w:proofErr w:type="spellEnd"/>
+      <w:r>
+        <w:rPr>
+          <w:rFonts w:ascii="Arial" w:eastAsia="Times New Roman" w:hAnsi="Arial" w:cs="Arial"/>
+          <w:b/>
+          <w:bCs/>
+          <w:u w:val="single"/>
+        </w:rPr>
+        <w:t xml:space="preserve"> }}mm</w:t>
+      </w:r>
+      <w:proofErr w:type="gramEnd"/>
+      <w:r>
+        <w:rPr>
+          <w:rFonts w:ascii="Arial" w:eastAsia="Times New Roman" w:hAnsi="Arial" w:cs="Arial"/>
+          <w:b/>
+          <w:bCs/>
+          <w:u w:val="single"/>
+        </w:rPr>
+        <w:t xml:space="preserve"> Fan, </w:t>
+      </w:r>
+      <w:proofErr w:type="gramStart"/>
+      <w:r>
+        <w:rPr>
+          <w:rFonts w:ascii="Arial" w:eastAsia="Times New Roman" w:hAnsi="Arial" w:cs="Arial"/>
+          <w:b/>
+          <w:bCs/>
+          <w:u w:val="single"/>
+        </w:rPr>
+        <w:t xml:space="preserve">{{ </w:t>
+      </w:r>
+      <w:proofErr w:type="spellStart"/>
+      <w:r>
+        <w:rPr>
+          <w:rFonts w:ascii="Arial" w:eastAsia="Times New Roman" w:hAnsi="Arial" w:cs="Arial"/>
+          <w:b/>
+          <w:bCs/>
+          <w:u w:val="single"/>
+        </w:rPr>
+        <w:t>fan</w:t>
+      </w:r>
+      <w:proofErr w:type="gramEnd"/>
+      <w:r>
+        <w:rPr>
+          <w:rFonts w:ascii="Arial" w:eastAsia="Times New Roman" w:hAnsi="Arial" w:cs="Arial"/>
+          <w:b/>
+          <w:bCs/>
+          <w:u w:val="single"/>
+        </w:rPr>
+        <w:t>_</w:t>
+      </w:r>
+      <w:proofErr w:type="gramStart"/>
+      <w:r>
+        <w:rPr>
+          <w:rFonts w:ascii="Arial" w:eastAsia="Times New Roman" w:hAnsi="Arial" w:cs="Arial"/>
+          <w:b/>
+          <w:bCs/>
+          <w:u w:val="single"/>
+        </w:rPr>
+        <w:t>config.motor</w:t>
+      </w:r>
+      <w:proofErr w:type="gramEnd"/>
+      <w:r>
+        <w:rPr>
+          <w:rFonts w:ascii="Arial" w:eastAsia="Times New Roman" w:hAnsi="Arial" w:cs="Arial"/>
+          <w:b/>
+          <w:bCs/>
+          <w:u w:val="single"/>
+        </w:rPr>
+        <w:t>_</w:t>
+      </w:r>
+      <w:proofErr w:type="gramStart"/>
+      <w:r>
+        <w:rPr>
+          <w:rFonts w:ascii="Arial" w:eastAsia="Times New Roman" w:hAnsi="Arial" w:cs="Arial"/>
+          <w:b/>
+          <w:bCs/>
+          <w:u w:val="single"/>
+        </w:rPr>
+        <w:t>output</w:t>
+      </w:r>
+      <w:proofErr w:type="spellEnd"/>
+      <w:r>
+        <w:rPr>
+          <w:rFonts w:ascii="Arial" w:eastAsia="Times New Roman" w:hAnsi="Arial" w:cs="Arial"/>
+          <w:b/>
+          <w:bCs/>
+          <w:u w:val="single"/>
+        </w:rPr>
+        <w:t xml:space="preserve"> }}kW</w:t>
+      </w:r>
+      <w:proofErr w:type="gramEnd"/>
+      <w:r>
+        <w:rPr>
+          <w:rFonts w:ascii="Arial" w:eastAsia="Times New Roman" w:hAnsi="Arial" w:cs="Arial"/>
+          <w:b/>
+          <w:bCs/>
+          <w:u w:val="single"/>
+        </w:rPr>
+        <w:t xml:space="preserve">, </w:t>
+      </w:r>
+      <w:proofErr w:type="gramStart"/>
+      <w:r>
+        <w:rPr>
+          <w:rFonts w:ascii="Arial" w:eastAsia="Times New Roman" w:hAnsi="Arial" w:cs="Arial"/>
+          <w:b/>
+          <w:bCs/>
+          <w:u w:val="single"/>
+        </w:rPr>
+        <w:t xml:space="preserve">{{ </w:t>
+      </w:r>
+      <w:proofErr w:type="spellStart"/>
+      <w:r>
+        <w:rPr>
+          <w:rFonts w:ascii="Arial" w:eastAsia="Times New Roman" w:hAnsi="Arial" w:cs="Arial"/>
+          <w:b/>
+          <w:bCs/>
+          <w:u w:val="single"/>
+        </w:rPr>
+        <w:t>fan</w:t>
+      </w:r>
+      <w:proofErr w:type="gramEnd"/>
+      <w:r>
+        <w:rPr>
+          <w:rFonts w:ascii="Arial" w:eastAsia="Times New Roman" w:hAnsi="Arial" w:cs="Arial"/>
+          <w:b/>
+          <w:bCs/>
+          <w:u w:val="single"/>
+        </w:rPr>
+        <w:t>_</w:t>
+      </w:r>
+      <w:proofErr w:type="gramStart"/>
+      <w:r>
+        <w:rPr>
+          <w:rFonts w:ascii="Arial" w:eastAsia="Times New Roman" w:hAnsi="Arial" w:cs="Arial"/>
+          <w:b/>
+          <w:bCs/>
+          <w:u w:val="single"/>
+        </w:rPr>
+        <w:t>config.motor</w:t>
+      </w:r>
+      <w:proofErr w:type="gramEnd"/>
+      <w:r>
+        <w:rPr>
+          <w:rFonts w:ascii="Arial" w:eastAsia="Times New Roman" w:hAnsi="Arial" w:cs="Arial"/>
+          <w:b/>
+          <w:bCs/>
+          <w:u w:val="single"/>
+        </w:rPr>
+        <w:t>_</w:t>
+      </w:r>
+      <w:proofErr w:type="gramStart"/>
+      <w:r>
+        <w:rPr>
+          <w:rFonts w:ascii="Arial" w:eastAsia="Times New Roman" w:hAnsi="Arial" w:cs="Arial"/>
+          <w:b/>
+          <w:bCs/>
+          <w:u w:val="single"/>
+        </w:rPr>
+        <w:t>pole</w:t>
+      </w:r>
+      <w:proofErr w:type="spellEnd"/>
+      <w:r>
+        <w:rPr>
+          <w:rFonts w:ascii="Arial" w:eastAsia="Times New Roman" w:hAnsi="Arial" w:cs="Arial"/>
+          <w:b/>
+          <w:bCs/>
+          <w:u w:val="single"/>
+        </w:rPr>
+        <w:t xml:space="preserve"> }}-</w:t>
+      </w:r>
+      <w:proofErr w:type="gramEnd"/>
+      <w:r>
+        <w:rPr>
+          <w:rFonts w:ascii="Arial" w:eastAsia="Times New Roman" w:hAnsi="Arial" w:cs="Arial"/>
+          <w:b/>
+          <w:bCs/>
+          <w:u w:val="single"/>
+        </w:rPr>
+        <w:t>pole, 525V Auxiliary Fan:</w:t>
       </w:r>
     </w:p>
     <w:p>
@@ -670,8 +1375,44 @@
         <w:rPr>
           <w:rFonts w:ascii="Arial" w:eastAsia="Times New Roman" w:hAnsi="Arial" w:cs="Arial"/>
         </w:rPr>
-        <w:t>Fan Size: {{ fan_config.fan_size_mm }}mm</w:t>
-      </w:r>
+        <w:t xml:space="preserve">Fan Size: </w:t>
+      </w:r>
+      <w:proofErr w:type="gramStart"/>
+      <w:r>
+        <w:rPr>
+          <w:rFonts w:ascii="Arial" w:eastAsia="Times New Roman" w:hAnsi="Arial" w:cs="Arial"/>
+        </w:rPr>
+        <w:t xml:space="preserve">{{ </w:t>
+      </w:r>
+      <w:proofErr w:type="spellStart"/>
+      <w:r>
+        <w:rPr>
+          <w:rFonts w:ascii="Arial" w:eastAsia="Times New Roman" w:hAnsi="Arial" w:cs="Arial"/>
+        </w:rPr>
+        <w:t>fan_config.fan</w:t>
+      </w:r>
+      <w:proofErr w:type="gramEnd"/>
+      <w:r>
+        <w:rPr>
+          <w:rFonts w:ascii="Arial" w:eastAsia="Times New Roman" w:hAnsi="Arial" w:cs="Arial"/>
+        </w:rPr>
+        <w:t>_size_</w:t>
+      </w:r>
+      <w:proofErr w:type="gramStart"/>
+      <w:r>
+        <w:rPr>
+          <w:rFonts w:ascii="Arial" w:eastAsia="Times New Roman" w:hAnsi="Arial" w:cs="Arial"/>
+        </w:rPr>
+        <w:t>mm</w:t>
+      </w:r>
+      <w:proofErr w:type="spellEnd"/>
+      <w:r>
+        <w:rPr>
+          <w:rFonts w:ascii="Arial" w:eastAsia="Times New Roman" w:hAnsi="Arial" w:cs="Arial"/>
+        </w:rPr>
+        <w:t xml:space="preserve"> }}mm</w:t>
+      </w:r>
+      <w:proofErr w:type="gramEnd"/>
     </w:p>
     <w:p>
       <w:pPr>
@@ -697,7 +1438,63 @@
         <w:rPr>
           <w:rFonts w:ascii="Arial" w:eastAsia="Times New Roman" w:hAnsi="Arial" w:cs="Arial"/>
         </w:rPr>
-        <w:t>Blade Sets: {{ fan_config.blade_sets }}</w:t>
+        <w:t xml:space="preserve">Blade Sets: </w:t>
+      </w:r>
+      <w:proofErr w:type="gramStart"/>
+      <w:r>
+        <w:rPr>
+          <w:rFonts w:ascii="Arial" w:eastAsia="Times New Roman" w:hAnsi="Arial" w:cs="Arial"/>
+        </w:rPr>
+        <w:t xml:space="preserve">{{ </w:t>
+      </w:r>
+      <w:proofErr w:type="spellStart"/>
+      <w:r>
+        <w:rPr>
+          <w:rFonts w:ascii="Arial" w:eastAsia="Times New Roman" w:hAnsi="Arial" w:cs="Arial"/>
+        </w:rPr>
+        <w:t>fan</w:t>
+      </w:r>
+      <w:proofErr w:type="gramEnd"/>
+      <w:r>
+        <w:rPr>
+          <w:rFonts w:ascii="Arial" w:eastAsia="Times New Roman" w:hAnsi="Arial" w:cs="Arial"/>
+        </w:rPr>
+        <w:t>_</w:t>
+      </w:r>
+      <w:proofErr w:type="gramStart"/>
+      <w:r>
+        <w:rPr>
+          <w:rFonts w:ascii="Arial" w:eastAsia="Times New Roman" w:hAnsi="Arial" w:cs="Arial"/>
+        </w:rPr>
+        <w:t>config.blade</w:t>
+      </w:r>
+      <w:proofErr w:type="gramEnd"/>
+      <w:r>
+        <w:rPr>
+          <w:rFonts w:ascii="Arial" w:eastAsia="Times New Roman" w:hAnsi="Arial" w:cs="Arial"/>
+        </w:rPr>
+        <w:t>_</w:t>
+      </w:r>
+      <w:proofErr w:type="gramStart"/>
+      <w:r>
+        <w:rPr>
+          <w:rFonts w:ascii="Arial" w:eastAsia="Times New Roman" w:hAnsi="Arial" w:cs="Arial"/>
+        </w:rPr>
+        <w:t>sets</w:t>
+      </w:r>
+      <w:proofErr w:type="spellEnd"/>
+      <w:r>
+        <w:rPr>
+          <w:rFonts w:ascii="Arial" w:eastAsia="Times New Roman" w:hAnsi="Arial" w:cs="Arial"/>
+        </w:rPr>
+        <w:t xml:space="preserve"> }</w:t>
+      </w:r>
+      <w:proofErr w:type="gramEnd"/>
+      <w:r>
+        <w:rPr>
+          <w:rFonts w:ascii="Arial" w:eastAsia="Times New Roman" w:hAnsi="Arial" w:cs="Arial"/>
+        </w:rPr>
+        <w:t>}</w:t>
       </w:r>
     </w:p>
     <w:p>
@@ -837,7 +1634,29 @@
         <w:rPr>
           <w:rFonts w:ascii="Arial" w:eastAsia="Times New Roman" w:hAnsi="Arial" w:cs="Arial"/>
         </w:rPr>
-        <w:t>{%p for comp in fan_config.components %}</w:t>
+        <w:t xml:space="preserve">{%p for comp in </w:t>
+      </w:r>
+      <w:proofErr w:type="spellStart"/>
+      <w:r>
+        <w:rPr>
+          <w:rFonts w:ascii="Arial" w:eastAsia="Times New Roman" w:hAnsi="Arial" w:cs="Arial"/>
+        </w:rPr>
+        <w:t>fan_</w:t>
+      </w:r>
+      <w:proofErr w:type="gramStart"/>
+      <w:r>
+        <w:rPr>
+          <w:rFonts w:ascii="Arial" w:eastAsia="Times New Roman" w:hAnsi="Arial" w:cs="Arial"/>
+        </w:rPr>
+        <w:t>config.components</w:t>
+      </w:r>
+      <w:proofErr w:type="spellEnd"/>
+      <w:proofErr w:type="gramEnd"/>
+      <w:r>
+        <w:rPr>
+          <w:rFonts w:ascii="Arial" w:eastAsia="Times New Roman" w:hAnsi="Arial" w:cs="Arial"/>
+        </w:rPr>
+        <w:t xml:space="preserve"> %}</w:t>
       </w:r>
     </w:p>
     <w:p>
@@ -860,11 +1679,19 @@
           <w:rFonts w:ascii="Arial" w:eastAsia="Times New Roman" w:hAnsi="Arial" w:cs="Arial"/>
         </w:rPr>
       </w:pPr>
-      <w:r>
-        <w:rPr>
-          <w:rFonts w:ascii="Arial" w:eastAsia="Times New Roman" w:hAnsi="Arial" w:cs="Arial"/>
-        </w:rPr>
-        <w:t>{{ comp.name }}</w:t>
+      <w:proofErr w:type="gramStart"/>
+      <w:r>
+        <w:rPr>
+          <w:rFonts w:ascii="Arial" w:eastAsia="Times New Roman" w:hAnsi="Arial" w:cs="Arial"/>
+        </w:rPr>
+        <w:t>{{ comp.name</w:t>
+      </w:r>
+      <w:proofErr w:type="gramEnd"/>
+      <w:r>
+        <w:rPr>
+          <w:rFonts w:ascii="Arial" w:eastAsia="Times New Roman" w:hAnsi="Arial" w:cs="Arial"/>
+        </w:rPr>
+        <w:t xml:space="preserve"> }}</w:t>
       </w:r>
     </w:p>
     <w:p>
@@ -891,7 +1718,21 @@
         <w:rPr>
           <w:rFonts w:ascii="Arial" w:eastAsia="Times New Roman" w:hAnsi="Arial" w:cs="Arial"/>
         </w:rPr>
-        <w:t>{%p endfor %}</w:t>
+        <w:t xml:space="preserve">{%p </w:t>
+      </w:r>
+      <w:proofErr w:type="spellStart"/>
+      <w:r>
+        <w:rPr>
+          <w:rFonts w:ascii="Arial" w:eastAsia="Times New Roman" w:hAnsi="Arial" w:cs="Arial"/>
+        </w:rPr>
+        <w:t>endfor</w:t>
+      </w:r>
+      <w:proofErr w:type="spellEnd"/>
+      <w:r>
+        <w:rPr>
+          <w:rFonts w:ascii="Arial" w:eastAsia="Times New Roman" w:hAnsi="Arial" w:cs="Arial"/>
+        </w:rPr>
+        <w:t xml:space="preserve"> %}</w:t>
       </w:r>
     </w:p>
     <w:p>
@@ -914,8 +1755,58 @@
         <w:rPr>
           <w:rFonts w:ascii="Arial" w:eastAsia="Times New Roman" w:hAnsi="Arial" w:cs="Arial"/>
         </w:rPr>
-        <w:t>Mass of all mechanical components (excluding motor): {{ fan_config.total_mass_kg }}kg</w:t>
-      </w:r>
+        <w:t xml:space="preserve">Mass of all mechanical components (excluding motor): </w:t>
+      </w:r>
+      <w:proofErr w:type="gramStart"/>
+      <w:r>
+        <w:rPr>
+          <w:rFonts w:ascii="Arial" w:eastAsia="Times New Roman" w:hAnsi="Arial" w:cs="Arial"/>
+        </w:rPr>
+        <w:t xml:space="preserve">{{ </w:t>
+      </w:r>
+      <w:proofErr w:type="spellStart"/>
+      <w:r>
+        <w:rPr>
+          <w:rFonts w:ascii="Arial" w:eastAsia="Times New Roman" w:hAnsi="Arial" w:cs="Arial"/>
+        </w:rPr>
+        <w:t>fan</w:t>
+      </w:r>
+      <w:proofErr w:type="gramEnd"/>
+      <w:r>
+        <w:rPr>
+          <w:rFonts w:ascii="Arial" w:eastAsia="Times New Roman" w:hAnsi="Arial" w:cs="Arial"/>
+        </w:rPr>
+        <w:t>_</w:t>
+      </w:r>
+      <w:proofErr w:type="gramStart"/>
+      <w:r>
+        <w:rPr>
+          <w:rFonts w:ascii="Arial" w:eastAsia="Times New Roman" w:hAnsi="Arial" w:cs="Arial"/>
+        </w:rPr>
+        <w:t>config.total</w:t>
+      </w:r>
+      <w:proofErr w:type="gramEnd"/>
+      <w:r>
+        <w:rPr>
+          <w:rFonts w:ascii="Arial" w:eastAsia="Times New Roman" w:hAnsi="Arial" w:cs="Arial"/>
+        </w:rPr>
+        <w:t>_mass_</w:t>
+      </w:r>
+      <w:proofErr w:type="gramStart"/>
+      <w:r>
+        <w:rPr>
+          <w:rFonts w:ascii="Arial" w:eastAsia="Times New Roman" w:hAnsi="Arial" w:cs="Arial"/>
+        </w:rPr>
+        <w:t>kg</w:t>
+      </w:r>
+      <w:proofErr w:type="spellEnd"/>
+      <w:r>
+        <w:rPr>
+          <w:rFonts w:ascii="Arial" w:eastAsia="Times New Roman" w:hAnsi="Arial" w:cs="Arial"/>
+        </w:rPr>
+        <w:t xml:space="preserve"> }}kg</w:t>
+      </w:r>
+      <w:proofErr w:type="gramEnd"/>
     </w:p>
     <w:p>
       <w:pPr>
@@ -937,8 +1828,58 @@
         <w:rPr>
           <w:rFonts w:ascii="Arial" w:eastAsia="Times New Roman" w:hAnsi="Arial" w:cs="Arial"/>
         </w:rPr>
-        <w:t>Total length of all mechanical components: {{ fan_config.total_length }}mm</w:t>
-      </w:r>
+        <w:t xml:space="preserve">Total length of all mechanical components: </w:t>
+      </w:r>
+      <w:proofErr w:type="gramStart"/>
+      <w:r>
+        <w:rPr>
+          <w:rFonts w:ascii="Arial" w:eastAsia="Times New Roman" w:hAnsi="Arial" w:cs="Arial"/>
+        </w:rPr>
+        <w:t xml:space="preserve">{{ </w:t>
+      </w:r>
+      <w:proofErr w:type="spellStart"/>
+      <w:r>
+        <w:rPr>
+          <w:rFonts w:ascii="Arial" w:eastAsia="Times New Roman" w:hAnsi="Arial" w:cs="Arial"/>
+        </w:rPr>
+        <w:t>fan</w:t>
+      </w:r>
+      <w:proofErr w:type="gramEnd"/>
+      <w:r>
+        <w:rPr>
+          <w:rFonts w:ascii="Arial" w:eastAsia="Times New Roman" w:hAnsi="Arial" w:cs="Arial"/>
+        </w:rPr>
+        <w:t>_</w:t>
+      </w:r>
+      <w:proofErr w:type="gramStart"/>
+      <w:r>
+        <w:rPr>
+          <w:rFonts w:ascii="Arial" w:eastAsia="Times New Roman" w:hAnsi="Arial" w:cs="Arial"/>
+        </w:rPr>
+        <w:t>config.total</w:t>
+      </w:r>
+      <w:proofErr w:type="gramEnd"/>
+      <w:r>
+        <w:rPr>
+          <w:rFonts w:ascii="Arial" w:eastAsia="Times New Roman" w:hAnsi="Arial" w:cs="Arial"/>
+        </w:rPr>
+        <w:t>_</w:t>
+      </w:r>
+      <w:proofErr w:type="gramStart"/>
+      <w:r>
+        <w:rPr>
+          <w:rFonts w:ascii="Arial" w:eastAsia="Times New Roman" w:hAnsi="Arial" w:cs="Arial"/>
+        </w:rPr>
+        <w:t>length</w:t>
+      </w:r>
+      <w:proofErr w:type="spellEnd"/>
+      <w:r>
+        <w:rPr>
+          <w:rFonts w:ascii="Arial" w:eastAsia="Times New Roman" w:hAnsi="Arial" w:cs="Arial"/>
+        </w:rPr>
+        <w:t xml:space="preserve"> }}mm</w:t>
+      </w:r>
+      <w:proofErr w:type="gramEnd"/>
     </w:p>
     <w:p>
       <w:pPr>
@@ -1012,10 +1953,60 @@
           <w:rFonts w:ascii="Arial" w:eastAsia="Times New Roman" w:hAnsi="Arial" w:cs="Arial"/>
         </w:rPr>
         <w:lastRenderedPageBreak/>
-        <w:t>Power: {{ fan_config.motor_output }}kW</w:t>
+        <w:t xml:space="preserve">Power: </w:t>
+      </w:r>
+      <w:proofErr w:type="gramStart"/>
+      <w:r>
+        <w:rPr>
+          <w:rFonts w:ascii="Arial" w:eastAsia="Times New Roman" w:hAnsi="Arial" w:cs="Arial"/>
+        </w:rPr>
+        <w:t xml:space="preserve">{{ </w:t>
+      </w:r>
+      <w:proofErr w:type="spellStart"/>
+      <w:r>
+        <w:rPr>
+          <w:rFonts w:ascii="Arial" w:eastAsia="Times New Roman" w:hAnsi="Arial" w:cs="Arial"/>
+        </w:rPr>
+        <w:t>fan</w:t>
+      </w:r>
+      <w:proofErr w:type="gramEnd"/>
+      <w:r>
+        <w:rPr>
+          <w:rFonts w:ascii="Arial" w:eastAsia="Times New Roman" w:hAnsi="Arial" w:cs="Arial"/>
+        </w:rPr>
+        <w:t>_</w:t>
+      </w:r>
+      <w:proofErr w:type="gramStart"/>
+      <w:r>
+        <w:rPr>
+          <w:rFonts w:ascii="Arial" w:eastAsia="Times New Roman" w:hAnsi="Arial" w:cs="Arial"/>
+        </w:rPr>
+        <w:t>config.motor</w:t>
+      </w:r>
+      <w:proofErr w:type="gramEnd"/>
+      <w:r>
+        <w:rPr>
+          <w:rFonts w:ascii="Arial" w:eastAsia="Times New Roman" w:hAnsi="Arial" w:cs="Arial"/>
+        </w:rPr>
+        <w:t>_</w:t>
+      </w:r>
+      <w:proofErr w:type="gramStart"/>
+      <w:r>
+        <w:rPr>
+          <w:rFonts w:ascii="Arial" w:eastAsia="Times New Roman" w:hAnsi="Arial" w:cs="Arial"/>
+        </w:rPr>
+        <w:t>output</w:t>
+      </w:r>
+      <w:proofErr w:type="spellEnd"/>
+      <w:r>
+        <w:rPr>
+          <w:rFonts w:ascii="Arial" w:eastAsia="Times New Roman" w:hAnsi="Arial" w:cs="Arial"/>
+        </w:rPr>
+        <w:t xml:space="preserve"> }}kW</w:t>
       </w:r>
       <w:bookmarkStart w:id="2" w:name="_Hlk210293638"/>
       <w:bookmarkEnd w:id="2"/>
+      <w:proofErr w:type="gramEnd"/>
     </w:p>
     <w:p>
       <w:pPr>
@@ -1041,7 +2032,63 @@
         <w:rPr>
           <w:rFonts w:ascii="Arial" w:eastAsia="Times New Roman" w:hAnsi="Arial" w:cs="Arial"/>
         </w:rPr>
-        <w:t xml:space="preserve">Efficiency: {{ fan_config.motor_product_range }} </w:t>
+        <w:t xml:space="preserve">Efficiency: </w:t>
+      </w:r>
+      <w:proofErr w:type="gramStart"/>
+      <w:r>
+        <w:rPr>
+          <w:rFonts w:ascii="Arial" w:eastAsia="Times New Roman" w:hAnsi="Arial" w:cs="Arial"/>
+        </w:rPr>
+        <w:t xml:space="preserve">{{ </w:t>
+      </w:r>
+      <w:proofErr w:type="spellStart"/>
+      <w:r>
+        <w:rPr>
+          <w:rFonts w:ascii="Arial" w:eastAsia="Times New Roman" w:hAnsi="Arial" w:cs="Arial"/>
+        </w:rPr>
+        <w:t>fan</w:t>
+      </w:r>
+      <w:proofErr w:type="gramEnd"/>
+      <w:r>
+        <w:rPr>
+          <w:rFonts w:ascii="Arial" w:eastAsia="Times New Roman" w:hAnsi="Arial" w:cs="Arial"/>
+        </w:rPr>
+        <w:t>_</w:t>
+      </w:r>
+      <w:proofErr w:type="gramStart"/>
+      <w:r>
+        <w:rPr>
+          <w:rFonts w:ascii="Arial" w:eastAsia="Times New Roman" w:hAnsi="Arial" w:cs="Arial"/>
+        </w:rPr>
+        <w:t>config.motor</w:t>
+      </w:r>
+      <w:proofErr w:type="gramEnd"/>
+      <w:r>
+        <w:rPr>
+          <w:rFonts w:ascii="Arial" w:eastAsia="Times New Roman" w:hAnsi="Arial" w:cs="Arial"/>
+        </w:rPr>
+        <w:t>_product_</w:t>
+      </w:r>
+      <w:proofErr w:type="gramStart"/>
+      <w:r>
+        <w:rPr>
+          <w:rFonts w:ascii="Arial" w:eastAsia="Times New Roman" w:hAnsi="Arial" w:cs="Arial"/>
+        </w:rPr>
+        <w:t>range</w:t>
+      </w:r>
+      <w:proofErr w:type="spellEnd"/>
+      <w:r>
+        <w:rPr>
+          <w:rFonts w:ascii="Arial" w:eastAsia="Times New Roman" w:hAnsi="Arial" w:cs="Arial"/>
+        </w:rPr>
+        <w:t xml:space="preserve"> }</w:t>
+      </w:r>
+      <w:proofErr w:type="gramEnd"/>
+      <w:r>
+        <w:rPr>
+          <w:rFonts w:ascii="Arial" w:eastAsia="Times New Roman" w:hAnsi="Arial" w:cs="Arial"/>
+        </w:rPr>
+        <w:t xml:space="preserve">} </w:t>
       </w:r>
     </w:p>
     <w:p>
@@ -1068,7 +2115,119 @@
         <w:rPr>
           <w:rFonts w:ascii="Arial" w:eastAsia="Times New Roman" w:hAnsi="Arial" w:cs="Arial"/>
         </w:rPr>
-        <w:t xml:space="preserve">Speed: {{ fan_config.motor_pole }}-pole (synchronous speed ~ {{ fan_config.motor_speed }}RPM @50 Hz)  </w:t>
+        <w:t xml:space="preserve">Speed: </w:t>
+      </w:r>
+      <w:proofErr w:type="gramStart"/>
+      <w:r>
+        <w:rPr>
+          <w:rFonts w:ascii="Arial" w:eastAsia="Times New Roman" w:hAnsi="Arial" w:cs="Arial"/>
+        </w:rPr>
+        <w:t xml:space="preserve">{{ </w:t>
+      </w:r>
+      <w:proofErr w:type="spellStart"/>
+      <w:r>
+        <w:rPr>
+          <w:rFonts w:ascii="Arial" w:eastAsia="Times New Roman" w:hAnsi="Arial" w:cs="Arial"/>
+        </w:rPr>
+        <w:t>fan</w:t>
+      </w:r>
+      <w:proofErr w:type="gramEnd"/>
+      <w:r>
+        <w:rPr>
+          <w:rFonts w:ascii="Arial" w:eastAsia="Times New Roman" w:hAnsi="Arial" w:cs="Arial"/>
+        </w:rPr>
+        <w:t>_</w:t>
+      </w:r>
+      <w:proofErr w:type="gramStart"/>
+      <w:r>
+        <w:rPr>
+          <w:rFonts w:ascii="Arial" w:eastAsia="Times New Roman" w:hAnsi="Arial" w:cs="Arial"/>
+        </w:rPr>
+        <w:t>config.motor</w:t>
+      </w:r>
+      <w:proofErr w:type="gramEnd"/>
+      <w:r>
+        <w:rPr>
+          <w:rFonts w:ascii="Arial" w:eastAsia="Times New Roman" w:hAnsi="Arial" w:cs="Arial"/>
+        </w:rPr>
+        <w:t>_</w:t>
+      </w:r>
+      <w:proofErr w:type="gramStart"/>
+      <w:r>
+        <w:rPr>
+          <w:rFonts w:ascii="Arial" w:eastAsia="Times New Roman" w:hAnsi="Arial" w:cs="Arial"/>
+        </w:rPr>
+        <w:t>pole</w:t>
+      </w:r>
+      <w:proofErr w:type="spellEnd"/>
+      <w:r>
+        <w:rPr>
+          <w:rFonts w:ascii="Arial" w:eastAsia="Times New Roman" w:hAnsi="Arial" w:cs="Arial"/>
+        </w:rPr>
+        <w:t xml:space="preserve"> }}-</w:t>
+      </w:r>
+      <w:proofErr w:type="gramEnd"/>
+      <w:r>
+        <w:rPr>
+          <w:rFonts w:ascii="Arial" w:eastAsia="Times New Roman" w:hAnsi="Arial" w:cs="Arial"/>
+        </w:rPr>
+        <w:t xml:space="preserve">pole (synchronous speed ~ </w:t>
+      </w:r>
+      <w:proofErr w:type="gramStart"/>
+      <w:r>
+        <w:rPr>
+          <w:rFonts w:ascii="Arial" w:eastAsia="Times New Roman" w:hAnsi="Arial" w:cs="Arial"/>
+        </w:rPr>
+        <w:t xml:space="preserve">{{ </w:t>
+      </w:r>
+      <w:proofErr w:type="spellStart"/>
+      <w:r>
+        <w:rPr>
+          <w:rFonts w:ascii="Arial" w:eastAsia="Times New Roman" w:hAnsi="Arial" w:cs="Arial"/>
+        </w:rPr>
+        <w:t>fan</w:t>
+      </w:r>
+      <w:proofErr w:type="gramEnd"/>
+      <w:r>
+        <w:rPr>
+          <w:rFonts w:ascii="Arial" w:eastAsia="Times New Roman" w:hAnsi="Arial" w:cs="Arial"/>
+        </w:rPr>
+        <w:t>_</w:t>
+      </w:r>
+      <w:proofErr w:type="gramStart"/>
+      <w:r>
+        <w:rPr>
+          <w:rFonts w:ascii="Arial" w:eastAsia="Times New Roman" w:hAnsi="Arial" w:cs="Arial"/>
+        </w:rPr>
+        <w:t>config.motor</w:t>
+      </w:r>
+      <w:proofErr w:type="gramEnd"/>
+      <w:r>
+        <w:rPr>
+          <w:rFonts w:ascii="Arial" w:eastAsia="Times New Roman" w:hAnsi="Arial" w:cs="Arial"/>
+        </w:rPr>
+        <w:t>_</w:t>
+      </w:r>
+      <w:proofErr w:type="gramStart"/>
+      <w:r>
+        <w:rPr>
+          <w:rFonts w:ascii="Arial" w:eastAsia="Times New Roman" w:hAnsi="Arial" w:cs="Arial"/>
+        </w:rPr>
+        <w:t>speed</w:t>
+      </w:r>
+      <w:proofErr w:type="spellEnd"/>
+      <w:r>
+        <w:rPr>
+          <w:rFonts w:ascii="Arial" w:eastAsia="Times New Roman" w:hAnsi="Arial" w:cs="Arial"/>
+        </w:rPr>
+        <w:t xml:space="preserve"> }}RPM</w:t>
+      </w:r>
+      <w:proofErr w:type="gramEnd"/>
+      <w:r>
+        <w:rPr>
+          <w:rFonts w:ascii="Arial" w:eastAsia="Times New Roman" w:hAnsi="Arial" w:cs="Arial"/>
+        </w:rPr>
+        <w:t xml:space="preserve"> @50 Hz)  </w:t>
       </w:r>
       <w:bookmarkStart w:id="3" w:name="_Hlk210293681"/>
       <w:bookmarkEnd w:id="3"/>
@@ -1167,12 +2326,37 @@
         </w:rPr>
         <w:t xml:space="preserve">in </w:t>
       </w:r>
-      <w:r>
-        <w:rPr>
-          <w:rFonts w:ascii="Arial" w:eastAsia="Times New Roman" w:hAnsi="Arial" w:cs="Arial"/>
-          <w:bCs/>
-        </w:rPr>
-        <w:t xml:space="preserve">fan_config.buyout_items </w:t>
+      <w:proofErr w:type="spellStart"/>
+      <w:r>
+        <w:rPr>
+          <w:rFonts w:ascii="Arial" w:eastAsia="Times New Roman" w:hAnsi="Arial" w:cs="Arial"/>
+          <w:bCs/>
+        </w:rPr>
+        <w:t>fan_</w:t>
+      </w:r>
+      <w:proofErr w:type="gramStart"/>
+      <w:r>
+        <w:rPr>
+          <w:rFonts w:ascii="Arial" w:eastAsia="Times New Roman" w:hAnsi="Arial" w:cs="Arial"/>
+          <w:bCs/>
+        </w:rPr>
+        <w:t>config.buyout</w:t>
+      </w:r>
+      <w:proofErr w:type="gramEnd"/>
+      <w:r>
+        <w:rPr>
+          <w:rFonts w:ascii="Arial" w:eastAsia="Times New Roman" w:hAnsi="Arial" w:cs="Arial"/>
+          <w:bCs/>
+        </w:rPr>
+        <w:t>_items</w:t>
+      </w:r>
+      <w:proofErr w:type="spellEnd"/>
+      <w:r>
+        <w:rPr>
+          <w:rFonts w:ascii="Arial" w:eastAsia="Times New Roman" w:hAnsi="Arial" w:cs="Arial"/>
+          <w:bCs/>
+        </w:rPr>
+        <w:t xml:space="preserve"> </w:t>
       </w:r>
       <w:r>
         <w:rPr>
@@ -1201,6 +2385,7 @@
           <w:rFonts w:ascii="Arial" w:eastAsia="Times New Roman" w:hAnsi="Arial" w:cs="Arial"/>
         </w:rPr>
       </w:pPr>
+      <w:proofErr w:type="gramStart"/>
       <w:r>
         <w:rPr>
           <w:rFonts w:ascii="Arial" w:eastAsia="Times New Roman" w:hAnsi="Arial" w:cs="Arial"/>
@@ -1218,14 +2403,29 @@
         <w:rPr>
           <w:rFonts w:ascii="Arial" w:eastAsia="Times New Roman" w:hAnsi="Arial" w:cs="Arial"/>
         </w:rPr>
-        <w:t>.name }}</w:t>
-      </w:r>
-      <w:r>
-        <w:rPr>
-          <w:rFonts w:ascii="Arial" w:eastAsia="Times New Roman" w:hAnsi="Arial" w:cs="Arial"/>
-        </w:rPr>
-        <w:t xml:space="preserve"> x {{ </w:t>
-      </w:r>
+        <w:t>.name</w:t>
+      </w:r>
+      <w:proofErr w:type="gramEnd"/>
+      <w:r>
+        <w:rPr>
+          <w:rFonts w:ascii="Arial" w:eastAsia="Times New Roman" w:hAnsi="Arial" w:cs="Arial"/>
+        </w:rPr>
+        <w:t xml:space="preserve"> }}</w:t>
+      </w:r>
+      <w:r>
+        <w:rPr>
+          <w:rFonts w:ascii="Arial" w:eastAsia="Times New Roman" w:hAnsi="Arial" w:cs="Arial"/>
+        </w:rPr>
+        <w:t xml:space="preserve"> x </w:t>
+      </w:r>
+      <w:proofErr w:type="gramStart"/>
+      <w:r>
+        <w:rPr>
+          <w:rFonts w:ascii="Arial" w:eastAsia="Times New Roman" w:hAnsi="Arial" w:cs="Arial"/>
+        </w:rPr>
+        <w:t xml:space="preserve">{{ </w:t>
+      </w:r>
+      <w:proofErr w:type="spellStart"/>
       <w:r>
         <w:rPr>
           <w:rFonts w:ascii="Arial" w:eastAsia="Times New Roman" w:hAnsi="Arial" w:cs="Arial"/>
@@ -1237,7 +2437,15 @@
         <w:rPr>
           <w:rFonts w:ascii="Arial" w:eastAsia="Times New Roman" w:hAnsi="Arial" w:cs="Arial"/>
         </w:rPr>
-        <w:t>.qty }}</w:t>
+        <w:t>.qty</w:t>
+      </w:r>
+      <w:proofErr w:type="spellEnd"/>
+      <w:proofErr w:type="gramEnd"/>
+      <w:r>
+        <w:rPr>
+          <w:rFonts w:ascii="Arial" w:eastAsia="Times New Roman" w:hAnsi="Arial" w:cs="Arial"/>
+        </w:rPr>
+        <w:t xml:space="preserve"> }}</w:t>
       </w:r>
     </w:p>
     <w:p>
@@ -1264,7 +2472,21 @@
         <w:rPr>
           <w:rFonts w:ascii="Arial" w:eastAsia="Times New Roman" w:hAnsi="Arial" w:cs="Arial"/>
         </w:rPr>
-        <w:t>{%p endfor %}</w:t>
+        <w:t xml:space="preserve">{%p </w:t>
+      </w:r>
+      <w:proofErr w:type="spellStart"/>
+      <w:r>
+        <w:rPr>
+          <w:rFonts w:ascii="Arial" w:eastAsia="Times New Roman" w:hAnsi="Arial" w:cs="Arial"/>
+        </w:rPr>
+        <w:t>endfor</w:t>
+      </w:r>
+      <w:proofErr w:type="spellEnd"/>
+      <w:r>
+        <w:rPr>
+          <w:rFonts w:ascii="Arial" w:eastAsia="Times New Roman" w:hAnsi="Arial" w:cs="Arial"/>
+        </w:rPr>
+        <w:t xml:space="preserve"> %}</w:t>
       </w:r>
     </w:p>
     <w:p>
@@ -1283,7 +2505,35 @@
         <w:rPr>
           <w:rFonts w:ascii="Arial" w:eastAsia="Times New Roman" w:hAnsi="Arial" w:cs="Arial"/>
         </w:rPr>
-        <w:t>{%p if not fan_config.buyout_items %}</w:t>
+        <w:t xml:space="preserve">{%p if not </w:t>
+      </w:r>
+      <w:proofErr w:type="spellStart"/>
+      <w:r>
+        <w:rPr>
+          <w:rFonts w:ascii="Arial" w:eastAsia="Times New Roman" w:hAnsi="Arial" w:cs="Arial"/>
+        </w:rPr>
+        <w:t>fan_</w:t>
+      </w:r>
+      <w:proofErr w:type="gramStart"/>
+      <w:r>
+        <w:rPr>
+          <w:rFonts w:ascii="Arial" w:eastAsia="Times New Roman" w:hAnsi="Arial" w:cs="Arial"/>
+        </w:rPr>
+        <w:t>config.buyout</w:t>
+      </w:r>
+      <w:proofErr w:type="gramEnd"/>
+      <w:r>
+        <w:rPr>
+          <w:rFonts w:ascii="Arial" w:eastAsia="Times New Roman" w:hAnsi="Arial" w:cs="Arial"/>
+        </w:rPr>
+        <w:t>_items</w:t>
+      </w:r>
+      <w:proofErr w:type="spellEnd"/>
+      <w:r>
+        <w:rPr>
+          <w:rFonts w:ascii="Arial" w:eastAsia="Times New Roman" w:hAnsi="Arial" w:cs="Arial"/>
+        </w:rPr>
+        <w:t xml:space="preserve"> %}</w:t>
       </w:r>
     </w:p>
     <w:p>
@@ -1342,7 +2592,15 @@
     </w:p>
     <w:p>
       <w:r>
-        <w:t>{%p endfor %}</w:t>
+        <w:t xml:space="preserve">{%p </w:t>
+      </w:r>
+      <w:proofErr w:type="spellStart"/>
+      <w:r>
+        <w:t>endfor</w:t>
+      </w:r>
+      <w:proofErr w:type="spellEnd"/>
+      <w:r>
+        <w:t xml:space="preserve"> %}</w:t>
       </w:r>
     </w:p>
     <w:p>
@@ -1525,7 +2783,23 @@
           <w:rFonts w:ascii="Arial" w:eastAsia="Times New Roman" w:hAnsi="Arial" w:cs="Arial"/>
           <w:bCs/>
         </w:rPr>
-        <w:t>Welding procedures will not form part of the data book, but will be available upon request for review / amendment at our factory.</w:t>
+        <w:t xml:space="preserve">Welding procedures will not form part of the data </w:t>
+      </w:r>
+      <w:proofErr w:type="gramStart"/>
+      <w:r>
+        <w:rPr>
+          <w:rFonts w:ascii="Arial" w:eastAsia="Times New Roman" w:hAnsi="Arial" w:cs="Arial"/>
+          <w:bCs/>
+        </w:rPr>
+        <w:t>book, but</w:t>
+      </w:r>
+      <w:proofErr w:type="gramEnd"/>
+      <w:r>
+        <w:rPr>
+          <w:rFonts w:ascii="Arial" w:eastAsia="Times New Roman" w:hAnsi="Arial" w:cs="Arial"/>
+          <w:bCs/>
+        </w:rPr>
+        <w:t xml:space="preserve"> will be available upon request for review / amendment at our factory.</w:t>
       </w:r>
     </w:p>
     <w:p>
@@ -1939,7 +3213,23 @@
           </w:tcPr>
           <w:p>
             <w:r>
-              <w:t>{%tr for fan_config in fan_configs %}</w:t>
+              <w:t xml:space="preserve">{%tr for </w:t>
+            </w:r>
+            <w:proofErr w:type="spellStart"/>
+            <w:r>
+              <w:t>fan_config</w:t>
+            </w:r>
+            <w:proofErr w:type="spellEnd"/>
+            <w:r>
+              <w:t xml:space="preserve"> in </w:t>
+            </w:r>
+            <w:proofErr w:type="spellStart"/>
+            <w:r>
+              <w:t>fan_configs</w:t>
+            </w:r>
+            <w:proofErr w:type="spellEnd"/>
+            <w:r>
+              <w:t xml:space="preserve"> %}</w:t>
             </w:r>
           </w:p>
         </w:tc>
@@ -1999,7 +3289,156 @@
                 <w:b/>
                 <w:bCs/>
               </w:rPr>
-              <w:t>Config {{ fan_config.config_number }} (×{{ fan_config.quantity }}): {{ fan_config.fan_uid }}</w:t>
+              <w:t xml:space="preserve">Config </w:t>
+            </w:r>
+            <w:proofErr w:type="gramStart"/>
+            <w:r>
+              <w:rPr>
+                <w:rFonts w:ascii="Arial" w:eastAsia="Times New Roman" w:hAnsi="Arial" w:cs="Arial"/>
+                <w:b/>
+                <w:bCs/>
+              </w:rPr>
+              <w:t xml:space="preserve">{{ </w:t>
+            </w:r>
+            <w:proofErr w:type="spellStart"/>
+            <w:r>
+              <w:rPr>
+                <w:rFonts w:ascii="Arial" w:eastAsia="Times New Roman" w:hAnsi="Arial" w:cs="Arial"/>
+                <w:b/>
+                <w:bCs/>
+              </w:rPr>
+              <w:t>fan</w:t>
+            </w:r>
+            <w:proofErr w:type="gramEnd"/>
+            <w:r>
+              <w:rPr>
+                <w:rFonts w:ascii="Arial" w:eastAsia="Times New Roman" w:hAnsi="Arial" w:cs="Arial"/>
+                <w:b/>
+                <w:bCs/>
+              </w:rPr>
+              <w:t>_config.config_</w:t>
+            </w:r>
+            <w:proofErr w:type="gramStart"/>
+            <w:r>
+              <w:rPr>
+                <w:rFonts w:ascii="Arial" w:eastAsia="Times New Roman" w:hAnsi="Arial" w:cs="Arial"/>
+                <w:b/>
+                <w:bCs/>
+              </w:rPr>
+              <w:t>number</w:t>
+            </w:r>
+            <w:proofErr w:type="spellEnd"/>
+            <w:r>
+              <w:rPr>
+                <w:rFonts w:ascii="Arial" w:eastAsia="Times New Roman" w:hAnsi="Arial" w:cs="Arial"/>
+                <w:b/>
+                <w:bCs/>
+              </w:rPr>
+              <w:t xml:space="preserve"> }</w:t>
+            </w:r>
+            <w:proofErr w:type="gramEnd"/>
+            <w:r>
+              <w:rPr>
+                <w:rFonts w:ascii="Arial" w:eastAsia="Times New Roman" w:hAnsi="Arial" w:cs="Arial"/>
+                <w:b/>
+                <w:bCs/>
+              </w:rPr>
+              <w:t>} (</w:t>
+            </w:r>
+            <w:proofErr w:type="gramStart"/>
+            <w:r>
+              <w:rPr>
+                <w:rFonts w:ascii="Arial" w:eastAsia="Times New Roman" w:hAnsi="Arial" w:cs="Arial"/>
+                <w:b/>
+                <w:bCs/>
+                <w:color w:val="4472C4" w:themeColor="accent1"/>
+              </w:rPr>
+              <w:t xml:space="preserve">×{{ </w:t>
+            </w:r>
+            <w:proofErr w:type="spellStart"/>
+            <w:r>
+              <w:rPr>
+                <w:rFonts w:ascii="Arial" w:eastAsia="Times New Roman" w:hAnsi="Arial" w:cs="Arial"/>
+                <w:b/>
+                <w:bCs/>
+                <w:color w:val="4472C4" w:themeColor="accent1"/>
+              </w:rPr>
+              <w:t>fan</w:t>
+            </w:r>
+            <w:proofErr w:type="gramEnd"/>
+            <w:r>
+              <w:rPr>
+                <w:rFonts w:ascii="Arial" w:eastAsia="Times New Roman" w:hAnsi="Arial" w:cs="Arial"/>
+                <w:b/>
+                <w:bCs/>
+                <w:color w:val="4472C4" w:themeColor="accent1"/>
+              </w:rPr>
+              <w:t>_</w:t>
+            </w:r>
+            <w:proofErr w:type="gramStart"/>
+            <w:r>
+              <w:rPr>
+                <w:rFonts w:ascii="Arial" w:eastAsia="Times New Roman" w:hAnsi="Arial" w:cs="Arial"/>
+                <w:b/>
+                <w:bCs/>
+                <w:color w:val="4472C4" w:themeColor="accent1"/>
+              </w:rPr>
+              <w:t>config.quantity</w:t>
+            </w:r>
+            <w:proofErr w:type="spellEnd"/>
+            <w:proofErr w:type="gramEnd"/>
+            <w:r>
+              <w:rPr>
+                <w:rFonts w:ascii="Arial" w:eastAsia="Times New Roman" w:hAnsi="Arial" w:cs="Arial"/>
+                <w:b/>
+                <w:bCs/>
+                <w:color w:val="4472C4" w:themeColor="accent1"/>
+              </w:rPr>
+              <w:t xml:space="preserve"> }}</w:t>
+            </w:r>
+            <w:r>
+              <w:rPr>
+                <w:rFonts w:ascii="Arial" w:eastAsia="Times New Roman" w:hAnsi="Arial" w:cs="Arial"/>
+                <w:b/>
+                <w:bCs/>
+              </w:rPr>
+              <w:t xml:space="preserve">): </w:t>
+            </w:r>
+            <w:proofErr w:type="gramStart"/>
+            <w:r>
+              <w:rPr>
+                <w:rFonts w:ascii="Arial" w:eastAsia="Times New Roman" w:hAnsi="Arial" w:cs="Arial"/>
+                <w:b/>
+                <w:bCs/>
+              </w:rPr>
+              <w:t xml:space="preserve">{{ </w:t>
+            </w:r>
+            <w:proofErr w:type="spellStart"/>
+            <w:r>
+              <w:rPr>
+                <w:rFonts w:ascii="Arial" w:eastAsia="Times New Roman" w:hAnsi="Arial" w:cs="Arial"/>
+                <w:b/>
+                <w:bCs/>
+              </w:rPr>
+              <w:t>fan_config.fan</w:t>
+            </w:r>
+            <w:proofErr w:type="gramEnd"/>
+            <w:r>
+              <w:rPr>
+                <w:rFonts w:ascii="Arial" w:eastAsia="Times New Roman" w:hAnsi="Arial" w:cs="Arial"/>
+                <w:b/>
+                <w:bCs/>
+              </w:rPr>
+              <w:t>_uid</w:t>
+            </w:r>
+            <w:proofErr w:type="spellEnd"/>
+            <w:r>
+              <w:rPr>
+                <w:rFonts w:ascii="Arial" w:eastAsia="Times New Roman" w:hAnsi="Arial" w:cs="Arial"/>
+                <w:b/>
+                <w:bCs/>
+              </w:rPr>
+              <w:t xml:space="preserve"> }}</w:t>
             </w:r>
           </w:p>
         </w:tc>
@@ -2086,11 +3525,47 @@
                 <w:bCs/>
               </w:rPr>
             </w:pPr>
-            <w:r>
-              <w:rPr>
-                <w:rFonts w:ascii="Arial" w:eastAsia="Times New Roman" w:hAnsi="Arial" w:cs="Arial"/>
-              </w:rPr>
-              <w:t xml:space="preserve">{{ fan_config.fan_size_mm }}mm Diameter auxiliary fan that includes rotor assembly with a </w:t>
+            <w:proofErr w:type="gramStart"/>
+            <w:r>
+              <w:rPr>
+                <w:rFonts w:ascii="Arial" w:eastAsia="Times New Roman" w:hAnsi="Arial" w:cs="Arial"/>
+              </w:rPr>
+              <w:t xml:space="preserve">{{ </w:t>
+            </w:r>
+            <w:proofErr w:type="spellStart"/>
+            <w:r>
+              <w:rPr>
+                <w:rFonts w:ascii="Arial" w:eastAsia="Times New Roman" w:hAnsi="Arial" w:cs="Arial"/>
+              </w:rPr>
+              <w:t>fan_config.fan</w:t>
+            </w:r>
+            <w:proofErr w:type="gramEnd"/>
+            <w:r>
+              <w:rPr>
+                <w:rFonts w:ascii="Arial" w:eastAsia="Times New Roman" w:hAnsi="Arial" w:cs="Arial"/>
+              </w:rPr>
+              <w:t>_size_</w:t>
+            </w:r>
+            <w:proofErr w:type="gramStart"/>
+            <w:r>
+              <w:rPr>
+                <w:rFonts w:ascii="Arial" w:eastAsia="Times New Roman" w:hAnsi="Arial" w:cs="Arial"/>
+              </w:rPr>
+              <w:t>mm</w:t>
+            </w:r>
+            <w:proofErr w:type="spellEnd"/>
+            <w:r>
+              <w:rPr>
+                <w:rFonts w:ascii="Arial" w:eastAsia="Times New Roman" w:hAnsi="Arial" w:cs="Arial"/>
+              </w:rPr>
+              <w:t xml:space="preserve"> }}mm</w:t>
+            </w:r>
+            <w:proofErr w:type="gramEnd"/>
+            <w:r>
+              <w:rPr>
+                <w:rFonts w:ascii="Arial" w:eastAsia="Times New Roman" w:hAnsi="Arial" w:cs="Arial"/>
+              </w:rPr>
+              <w:t xml:space="preserve"> Diameter auxiliary fan that includes rotor assembly with a </w:t>
             </w:r>
             <w:r>
               <w:rPr>
@@ -2218,7 +3693,39 @@
                 <w:rFonts w:ascii="Arial" w:eastAsia="Times New Roman" w:hAnsi="Arial" w:cs="Arial"/>
                 <w:bCs/>
               </w:rPr>
-              <w:t>{%tr for comp in fan_config.component_pricing %}</w:t>
+              <w:t xml:space="preserve">{%tr for comp in </w:t>
+            </w:r>
+            <w:proofErr w:type="spellStart"/>
+            <w:r>
+              <w:rPr>
+                <w:rFonts w:ascii="Arial" w:eastAsia="Times New Roman" w:hAnsi="Arial" w:cs="Arial"/>
+                <w:bCs/>
+              </w:rPr>
+              <w:t>fan_</w:t>
+            </w:r>
+            <w:proofErr w:type="gramStart"/>
+            <w:r>
+              <w:rPr>
+                <w:rFonts w:ascii="Arial" w:eastAsia="Times New Roman" w:hAnsi="Arial" w:cs="Arial"/>
+                <w:bCs/>
+              </w:rPr>
+              <w:t>config.component</w:t>
+            </w:r>
+            <w:proofErr w:type="gramEnd"/>
+            <w:r>
+              <w:rPr>
+                <w:rFonts w:ascii="Arial" w:eastAsia="Times New Roman" w:hAnsi="Arial" w:cs="Arial"/>
+                <w:bCs/>
+              </w:rPr>
+              <w:t>_pricing</w:t>
+            </w:r>
+            <w:proofErr w:type="spellEnd"/>
+            <w:r>
+              <w:rPr>
+                <w:rFonts w:ascii="Arial" w:eastAsia="Times New Roman" w:hAnsi="Arial" w:cs="Arial"/>
+                <w:bCs/>
+              </w:rPr>
+              <w:t xml:space="preserve"> %}</w:t>
             </w:r>
           </w:p>
         </w:tc>
@@ -2329,12 +3836,21 @@
                 <w:bCs/>
               </w:rPr>
             </w:pPr>
+            <w:proofErr w:type="gramStart"/>
             <w:r>
               <w:rPr>
                 <w:rFonts w:ascii="Arial" w:eastAsia="Times New Roman" w:hAnsi="Arial" w:cs="Arial"/>
                 <w:bCs/>
               </w:rPr>
-              <w:t>{{ comp.name }}</w:t>
+              <w:t>{{ comp.name</w:t>
+            </w:r>
+            <w:proofErr w:type="gramEnd"/>
+            <w:r>
+              <w:rPr>
+                <w:rFonts w:ascii="Arial" w:eastAsia="Times New Roman" w:hAnsi="Arial" w:cs="Arial"/>
+                <w:bCs/>
+              </w:rPr>
+              <w:t xml:space="preserve"> }}</w:t>
             </w:r>
           </w:p>
         </w:tc>
@@ -2362,7 +3878,39 @@
                 <w:rFonts w:ascii="Arial" w:eastAsia="Times New Roman" w:hAnsi="Arial" w:cs="Arial"/>
                 <w:b/>
               </w:rPr>
-              <w:t>R {{ comp.unit_price }}</w:t>
+              <w:t xml:space="preserve">R </w:t>
+            </w:r>
+            <w:proofErr w:type="gramStart"/>
+            <w:r>
+              <w:rPr>
+                <w:rFonts w:ascii="Arial" w:eastAsia="Times New Roman" w:hAnsi="Arial" w:cs="Arial"/>
+                <w:b/>
+              </w:rPr>
+              <w:t xml:space="preserve">{{ </w:t>
+            </w:r>
+            <w:proofErr w:type="spellStart"/>
+            <w:r>
+              <w:rPr>
+                <w:rFonts w:ascii="Arial" w:eastAsia="Times New Roman" w:hAnsi="Arial" w:cs="Arial"/>
+                <w:b/>
+              </w:rPr>
+              <w:t>comp</w:t>
+            </w:r>
+            <w:proofErr w:type="gramEnd"/>
+            <w:r>
+              <w:rPr>
+                <w:rFonts w:ascii="Arial" w:eastAsia="Times New Roman" w:hAnsi="Arial" w:cs="Arial"/>
+                <w:b/>
+              </w:rPr>
+              <w:t>.unit_price</w:t>
+            </w:r>
+            <w:proofErr w:type="spellEnd"/>
+            <w:r>
+              <w:rPr>
+                <w:rFonts w:ascii="Arial" w:eastAsia="Times New Roman" w:hAnsi="Arial" w:cs="Arial"/>
+                <w:b/>
+              </w:rPr>
+              <w:t xml:space="preserve"> }}</w:t>
             </w:r>
           </w:p>
         </w:tc>
@@ -2385,12 +3933,30 @@
                 <w:b/>
               </w:rPr>
             </w:pPr>
-            <w:r>
-              <w:rPr>
-                <w:rFonts w:ascii="Arial" w:eastAsia="Times New Roman" w:hAnsi="Arial" w:cs="Arial"/>
-                <w:b/>
-              </w:rPr>
-              <w:t>{{ comp.qty }}</w:t>
+            <w:proofErr w:type="gramStart"/>
+            <w:r>
+              <w:rPr>
+                <w:rFonts w:ascii="Arial" w:eastAsia="Times New Roman" w:hAnsi="Arial" w:cs="Arial"/>
+                <w:b/>
+              </w:rPr>
+              <w:t xml:space="preserve">{{ </w:t>
+            </w:r>
+            <w:proofErr w:type="spellStart"/>
+            <w:r>
+              <w:rPr>
+                <w:rFonts w:ascii="Arial" w:eastAsia="Times New Roman" w:hAnsi="Arial" w:cs="Arial"/>
+                <w:b/>
+              </w:rPr>
+              <w:t>comp.qty</w:t>
+            </w:r>
+            <w:proofErr w:type="spellEnd"/>
+            <w:proofErr w:type="gramEnd"/>
+            <w:r>
+              <w:rPr>
+                <w:rFonts w:ascii="Arial" w:eastAsia="Times New Roman" w:hAnsi="Arial" w:cs="Arial"/>
+                <w:b/>
+              </w:rPr>
+              <w:t xml:space="preserve"> }}</w:t>
             </w:r>
           </w:p>
         </w:tc>
@@ -2418,7 +3984,39 @@
                 <w:rFonts w:ascii="Arial" w:eastAsia="Times New Roman" w:hAnsi="Arial" w:cs="Arial"/>
                 <w:b/>
               </w:rPr>
-              <w:t>R {{ comp.total_price }}</w:t>
+              <w:t xml:space="preserve">R </w:t>
+            </w:r>
+            <w:proofErr w:type="gramStart"/>
+            <w:r>
+              <w:rPr>
+                <w:rFonts w:ascii="Arial" w:eastAsia="Times New Roman" w:hAnsi="Arial" w:cs="Arial"/>
+                <w:b/>
+              </w:rPr>
+              <w:t xml:space="preserve">{{ </w:t>
+            </w:r>
+            <w:proofErr w:type="spellStart"/>
+            <w:r>
+              <w:rPr>
+                <w:rFonts w:ascii="Arial" w:eastAsia="Times New Roman" w:hAnsi="Arial" w:cs="Arial"/>
+                <w:b/>
+              </w:rPr>
+              <w:t>comp</w:t>
+            </w:r>
+            <w:proofErr w:type="gramEnd"/>
+            <w:r>
+              <w:rPr>
+                <w:rFonts w:ascii="Arial" w:eastAsia="Times New Roman" w:hAnsi="Arial" w:cs="Arial"/>
+                <w:b/>
+              </w:rPr>
+              <w:t>.total_price</w:t>
+            </w:r>
+            <w:proofErr w:type="spellEnd"/>
+            <w:r>
+              <w:rPr>
+                <w:rFonts w:ascii="Arial" w:eastAsia="Times New Roman" w:hAnsi="Arial" w:cs="Arial"/>
+                <w:b/>
+              </w:rPr>
+              <w:t xml:space="preserve"> }}</w:t>
             </w:r>
           </w:p>
         </w:tc>
@@ -2471,7 +4069,23 @@
                 <w:rFonts w:ascii="Arial" w:eastAsia="Times New Roman" w:hAnsi="Arial" w:cs="Arial"/>
                 <w:bCs/>
               </w:rPr>
-              <w:t>{%tr endfor %}</w:t>
+              <w:t xml:space="preserve">{%tr </w:t>
+            </w:r>
+            <w:proofErr w:type="spellStart"/>
+            <w:r>
+              <w:rPr>
+                <w:rFonts w:ascii="Arial" w:eastAsia="Times New Roman" w:hAnsi="Arial" w:cs="Arial"/>
+                <w:bCs/>
+              </w:rPr>
+              <w:t>endfor</w:t>
+            </w:r>
+            <w:proofErr w:type="spellEnd"/>
+            <w:r>
+              <w:rPr>
+                <w:rFonts w:ascii="Arial" w:eastAsia="Times New Roman" w:hAnsi="Arial" w:cs="Arial"/>
+                <w:bCs/>
+              </w:rPr>
+              <w:t xml:space="preserve"> %}</w:t>
             </w:r>
           </w:p>
         </w:tc>
@@ -2668,7 +4282,61 @@
                 <w:b/>
                 <w:color w:val="2F5496" w:themeColor="accent1" w:themeShade="BF"/>
               </w:rPr>
-              <w:t>R {{ fan_config.component_subtotal }}</w:t>
+              <w:t xml:space="preserve">R </w:t>
+            </w:r>
+            <w:proofErr w:type="gramStart"/>
+            <w:r>
+              <w:rPr>
+                <w:rFonts w:ascii="Arial" w:eastAsia="Times New Roman" w:hAnsi="Arial" w:cs="Arial"/>
+                <w:b/>
+                <w:color w:val="2F5496" w:themeColor="accent1" w:themeShade="BF"/>
+              </w:rPr>
+              <w:t xml:space="preserve">{{ </w:t>
+            </w:r>
+            <w:proofErr w:type="spellStart"/>
+            <w:r>
+              <w:rPr>
+                <w:rFonts w:ascii="Arial" w:eastAsia="Times New Roman" w:hAnsi="Arial" w:cs="Arial"/>
+                <w:b/>
+                <w:color w:val="2F5496" w:themeColor="accent1" w:themeShade="BF"/>
+              </w:rPr>
+              <w:t>fan</w:t>
+            </w:r>
+            <w:proofErr w:type="gramEnd"/>
+            <w:r>
+              <w:rPr>
+                <w:rFonts w:ascii="Arial" w:eastAsia="Times New Roman" w:hAnsi="Arial" w:cs="Arial"/>
+                <w:b/>
+                <w:color w:val="2F5496" w:themeColor="accent1" w:themeShade="BF"/>
+              </w:rPr>
+              <w:t>_</w:t>
+            </w:r>
+            <w:proofErr w:type="gramStart"/>
+            <w:r>
+              <w:rPr>
+                <w:rFonts w:ascii="Arial" w:eastAsia="Times New Roman" w:hAnsi="Arial" w:cs="Arial"/>
+                <w:b/>
+                <w:color w:val="2F5496" w:themeColor="accent1" w:themeShade="BF"/>
+              </w:rPr>
+              <w:t>config.component</w:t>
+            </w:r>
+            <w:proofErr w:type="gramEnd"/>
+            <w:r>
+              <w:rPr>
+                <w:rFonts w:ascii="Arial" w:eastAsia="Times New Roman" w:hAnsi="Arial" w:cs="Arial"/>
+                <w:b/>
+                <w:color w:val="2F5496" w:themeColor="accent1" w:themeShade="BF"/>
+              </w:rPr>
+              <w:t>_subtotal</w:t>
+            </w:r>
+            <w:proofErr w:type="spellEnd"/>
+            <w:r>
+              <w:rPr>
+                <w:rFonts w:ascii="Arial" w:eastAsia="Times New Roman" w:hAnsi="Arial" w:cs="Arial"/>
+                <w:b/>
+                <w:color w:val="2F5496" w:themeColor="accent1" w:themeShade="BF"/>
+              </w:rPr>
+              <w:t xml:space="preserve"> }}</w:t>
             </w:r>
           </w:p>
         </w:tc>
@@ -2845,11 +4513,117 @@
                 <w:rFonts w:ascii="Arial" w:eastAsia="Times New Roman" w:hAnsi="Arial" w:cs="Arial"/>
               </w:rPr>
             </w:pPr>
-            <w:r>
-              <w:rPr>
-                <w:rFonts w:ascii="Arial" w:eastAsia="Times New Roman" w:hAnsi="Arial" w:cs="Arial"/>
-              </w:rPr>
-              <w:t>{{ fan_config.motor_output }}kW, {{ fan_config.motor_pole }}-pole, 525V, I.E.3. Motor</w:t>
+            <w:proofErr w:type="gramStart"/>
+            <w:r>
+              <w:rPr>
+                <w:rFonts w:ascii="Arial" w:eastAsia="Times New Roman" w:hAnsi="Arial" w:cs="Arial"/>
+              </w:rPr>
+              <w:t xml:space="preserve">{{ </w:t>
+            </w:r>
+            <w:proofErr w:type="spellStart"/>
+            <w:r>
+              <w:rPr>
+                <w:rFonts w:ascii="Arial" w:eastAsia="Times New Roman" w:hAnsi="Arial" w:cs="Arial"/>
+              </w:rPr>
+              <w:t>fan</w:t>
+            </w:r>
+            <w:proofErr w:type="gramEnd"/>
+            <w:r>
+              <w:rPr>
+                <w:rFonts w:ascii="Arial" w:eastAsia="Times New Roman" w:hAnsi="Arial" w:cs="Arial"/>
+              </w:rPr>
+              <w:t>_</w:t>
+            </w:r>
+            <w:proofErr w:type="gramStart"/>
+            <w:r>
+              <w:rPr>
+                <w:rFonts w:ascii="Arial" w:eastAsia="Times New Roman" w:hAnsi="Arial" w:cs="Arial"/>
+              </w:rPr>
+              <w:t>config.motor</w:t>
+            </w:r>
+            <w:proofErr w:type="gramEnd"/>
+            <w:r>
+              <w:rPr>
+                <w:rFonts w:ascii="Arial" w:eastAsia="Times New Roman" w:hAnsi="Arial" w:cs="Arial"/>
+              </w:rPr>
+              <w:t>_</w:t>
+            </w:r>
+            <w:proofErr w:type="gramStart"/>
+            <w:r>
+              <w:rPr>
+                <w:rFonts w:ascii="Arial" w:eastAsia="Times New Roman" w:hAnsi="Arial" w:cs="Arial"/>
+              </w:rPr>
+              <w:t>output</w:t>
+            </w:r>
+            <w:proofErr w:type="spellEnd"/>
+            <w:r>
+              <w:rPr>
+                <w:rFonts w:ascii="Arial" w:eastAsia="Times New Roman" w:hAnsi="Arial" w:cs="Arial"/>
+              </w:rPr>
+              <w:t xml:space="preserve"> }}kW</w:t>
+            </w:r>
+            <w:proofErr w:type="gramEnd"/>
+            <w:r>
+              <w:rPr>
+                <w:rFonts w:ascii="Arial" w:eastAsia="Times New Roman" w:hAnsi="Arial" w:cs="Arial"/>
+              </w:rPr>
+              <w:t xml:space="preserve">, </w:t>
+            </w:r>
+            <w:proofErr w:type="gramStart"/>
+            <w:r>
+              <w:rPr>
+                <w:rFonts w:ascii="Arial" w:eastAsia="Times New Roman" w:hAnsi="Arial" w:cs="Arial"/>
+              </w:rPr>
+              <w:t xml:space="preserve">{{ </w:t>
+            </w:r>
+            <w:proofErr w:type="spellStart"/>
+            <w:r>
+              <w:rPr>
+                <w:rFonts w:ascii="Arial" w:eastAsia="Times New Roman" w:hAnsi="Arial" w:cs="Arial"/>
+              </w:rPr>
+              <w:t>fan</w:t>
+            </w:r>
+            <w:proofErr w:type="gramEnd"/>
+            <w:r>
+              <w:rPr>
+                <w:rFonts w:ascii="Arial" w:eastAsia="Times New Roman" w:hAnsi="Arial" w:cs="Arial"/>
+              </w:rPr>
+              <w:t>_</w:t>
+            </w:r>
+            <w:proofErr w:type="gramStart"/>
+            <w:r>
+              <w:rPr>
+                <w:rFonts w:ascii="Arial" w:eastAsia="Times New Roman" w:hAnsi="Arial" w:cs="Arial"/>
+              </w:rPr>
+              <w:t>config.motor</w:t>
+            </w:r>
+            <w:proofErr w:type="gramEnd"/>
+            <w:r>
+              <w:rPr>
+                <w:rFonts w:ascii="Arial" w:eastAsia="Times New Roman" w:hAnsi="Arial" w:cs="Arial"/>
+              </w:rPr>
+              <w:t>_</w:t>
+            </w:r>
+            <w:proofErr w:type="gramStart"/>
+            <w:r>
+              <w:rPr>
+                <w:rFonts w:ascii="Arial" w:eastAsia="Times New Roman" w:hAnsi="Arial" w:cs="Arial"/>
+              </w:rPr>
+              <w:t>pole</w:t>
+            </w:r>
+            <w:proofErr w:type="spellEnd"/>
+            <w:r>
+              <w:rPr>
+                <w:rFonts w:ascii="Arial" w:eastAsia="Times New Roman" w:hAnsi="Arial" w:cs="Arial"/>
+              </w:rPr>
+              <w:t xml:space="preserve"> }}-</w:t>
+            </w:r>
+            <w:proofErr w:type="gramEnd"/>
+            <w:r>
+              <w:rPr>
+                <w:rFonts w:ascii="Arial" w:eastAsia="Times New Roman" w:hAnsi="Arial" w:cs="Arial"/>
+              </w:rPr>
+              <w:t>pole, 525V, I.E.3. Motor</w:t>
             </w:r>
           </w:p>
         </w:tc>
@@ -2878,7 +4652,61 @@
                 <w:b/>
                 <w:bCs/>
               </w:rPr>
-              <w:t>R {{ fan_config.motor_unit_price }}</w:t>
+              <w:t xml:space="preserve">R </w:t>
+            </w:r>
+            <w:proofErr w:type="gramStart"/>
+            <w:r>
+              <w:rPr>
+                <w:rFonts w:ascii="Arial" w:eastAsia="Times New Roman" w:hAnsi="Arial" w:cs="Arial"/>
+                <w:b/>
+                <w:bCs/>
+              </w:rPr>
+              <w:t xml:space="preserve">{{ </w:t>
+            </w:r>
+            <w:proofErr w:type="spellStart"/>
+            <w:r>
+              <w:rPr>
+                <w:rFonts w:ascii="Arial" w:eastAsia="Times New Roman" w:hAnsi="Arial" w:cs="Arial"/>
+                <w:b/>
+                <w:bCs/>
+              </w:rPr>
+              <w:t>fan</w:t>
+            </w:r>
+            <w:proofErr w:type="gramEnd"/>
+            <w:r>
+              <w:rPr>
+                <w:rFonts w:ascii="Arial" w:eastAsia="Times New Roman" w:hAnsi="Arial" w:cs="Arial"/>
+                <w:b/>
+                <w:bCs/>
+              </w:rPr>
+              <w:t>_</w:t>
+            </w:r>
+            <w:proofErr w:type="gramStart"/>
+            <w:r>
+              <w:rPr>
+                <w:rFonts w:ascii="Arial" w:eastAsia="Times New Roman" w:hAnsi="Arial" w:cs="Arial"/>
+                <w:b/>
+                <w:bCs/>
+              </w:rPr>
+              <w:t>config.motor</w:t>
+            </w:r>
+            <w:proofErr w:type="gramEnd"/>
+            <w:r>
+              <w:rPr>
+                <w:rFonts w:ascii="Arial" w:eastAsia="Times New Roman" w:hAnsi="Arial" w:cs="Arial"/>
+                <w:b/>
+                <w:bCs/>
+              </w:rPr>
+              <w:t>_unit_price</w:t>
+            </w:r>
+            <w:proofErr w:type="spellEnd"/>
+            <w:r>
+              <w:rPr>
+                <w:rFonts w:ascii="Arial" w:eastAsia="Times New Roman" w:hAnsi="Arial" w:cs="Arial"/>
+                <w:b/>
+                <w:bCs/>
+              </w:rPr>
+              <w:t xml:space="preserve"> }}</w:t>
             </w:r>
           </w:p>
         </w:tc>
@@ -2901,12 +4729,53 @@
                 <w:b/>
               </w:rPr>
             </w:pPr>
-            <w:r>
-              <w:rPr>
-                <w:rFonts w:ascii="Arial" w:eastAsia="Times New Roman" w:hAnsi="Arial" w:cs="Arial"/>
-                <w:b/>
-              </w:rPr>
-              <w:t>{{ fan_config.motor_qty }}</w:t>
+            <w:proofErr w:type="gramStart"/>
+            <w:r>
+              <w:rPr>
+                <w:rFonts w:ascii="Arial" w:eastAsia="Times New Roman" w:hAnsi="Arial" w:cs="Arial"/>
+                <w:b/>
+              </w:rPr>
+              <w:t xml:space="preserve">{{ </w:t>
+            </w:r>
+            <w:proofErr w:type="spellStart"/>
+            <w:r>
+              <w:rPr>
+                <w:rFonts w:ascii="Arial" w:eastAsia="Times New Roman" w:hAnsi="Arial" w:cs="Arial"/>
+                <w:b/>
+              </w:rPr>
+              <w:t>fan</w:t>
+            </w:r>
+            <w:proofErr w:type="gramEnd"/>
+            <w:r>
+              <w:rPr>
+                <w:rFonts w:ascii="Arial" w:eastAsia="Times New Roman" w:hAnsi="Arial" w:cs="Arial"/>
+                <w:b/>
+              </w:rPr>
+              <w:t>_</w:t>
+            </w:r>
+            <w:proofErr w:type="gramStart"/>
+            <w:r>
+              <w:rPr>
+                <w:rFonts w:ascii="Arial" w:eastAsia="Times New Roman" w:hAnsi="Arial" w:cs="Arial"/>
+                <w:b/>
+              </w:rPr>
+              <w:t>config.motor</w:t>
+            </w:r>
+            <w:proofErr w:type="gramEnd"/>
+            <w:r>
+              <w:rPr>
+                <w:rFonts w:ascii="Arial" w:eastAsia="Times New Roman" w:hAnsi="Arial" w:cs="Arial"/>
+                <w:b/>
+              </w:rPr>
+              <w:t>_qty</w:t>
+            </w:r>
+            <w:proofErr w:type="spellEnd"/>
+            <w:r>
+              <w:rPr>
+                <w:rFonts w:ascii="Arial" w:eastAsia="Times New Roman" w:hAnsi="Arial" w:cs="Arial"/>
+                <w:b/>
+              </w:rPr>
+              <w:t xml:space="preserve"> }}</w:t>
             </w:r>
           </w:p>
         </w:tc>
@@ -2934,7 +4803,55 @@
                 <w:rFonts w:ascii="Arial" w:eastAsia="Times New Roman" w:hAnsi="Arial" w:cs="Arial"/>
                 <w:b/>
               </w:rPr>
-              <w:t>R {{ fan_config.motor_total_price }}</w:t>
+              <w:t xml:space="preserve">R </w:t>
+            </w:r>
+            <w:proofErr w:type="gramStart"/>
+            <w:r>
+              <w:rPr>
+                <w:rFonts w:ascii="Arial" w:eastAsia="Times New Roman" w:hAnsi="Arial" w:cs="Arial"/>
+                <w:b/>
+              </w:rPr>
+              <w:t xml:space="preserve">{{ </w:t>
+            </w:r>
+            <w:proofErr w:type="spellStart"/>
+            <w:r>
+              <w:rPr>
+                <w:rFonts w:ascii="Arial" w:eastAsia="Times New Roman" w:hAnsi="Arial" w:cs="Arial"/>
+                <w:b/>
+              </w:rPr>
+              <w:t>fan</w:t>
+            </w:r>
+            <w:proofErr w:type="gramEnd"/>
+            <w:r>
+              <w:rPr>
+                <w:rFonts w:ascii="Arial" w:eastAsia="Times New Roman" w:hAnsi="Arial" w:cs="Arial"/>
+                <w:b/>
+              </w:rPr>
+              <w:t>_</w:t>
+            </w:r>
+            <w:proofErr w:type="gramStart"/>
+            <w:r>
+              <w:rPr>
+                <w:rFonts w:ascii="Arial" w:eastAsia="Times New Roman" w:hAnsi="Arial" w:cs="Arial"/>
+                <w:b/>
+              </w:rPr>
+              <w:t>config.motor</w:t>
+            </w:r>
+            <w:proofErr w:type="gramEnd"/>
+            <w:r>
+              <w:rPr>
+                <w:rFonts w:ascii="Arial" w:eastAsia="Times New Roman" w:hAnsi="Arial" w:cs="Arial"/>
+                <w:b/>
+              </w:rPr>
+              <w:t>_total_price</w:t>
+            </w:r>
+            <w:proofErr w:type="spellEnd"/>
+            <w:r>
+              <w:rPr>
+                <w:rFonts w:ascii="Arial" w:eastAsia="Times New Roman" w:hAnsi="Arial" w:cs="Arial"/>
+                <w:b/>
+              </w:rPr>
+              <w:t xml:space="preserve"> }}</w:t>
             </w:r>
           </w:p>
         </w:tc>
@@ -3116,7 +5033,39 @@
                 <w:rFonts w:ascii="Arial" w:eastAsia="Times New Roman" w:hAnsi="Arial" w:cs="Arial"/>
                 <w:bCs/>
               </w:rPr>
-              <w:t>{%tr for buyout in fan_config.buyout_items %}</w:t>
+              <w:t xml:space="preserve">{%tr for buyout in </w:t>
+            </w:r>
+            <w:proofErr w:type="spellStart"/>
+            <w:r>
+              <w:rPr>
+                <w:rFonts w:ascii="Arial" w:eastAsia="Times New Roman" w:hAnsi="Arial" w:cs="Arial"/>
+                <w:bCs/>
+              </w:rPr>
+              <w:t>fan_</w:t>
+            </w:r>
+            <w:proofErr w:type="gramStart"/>
+            <w:r>
+              <w:rPr>
+                <w:rFonts w:ascii="Arial" w:eastAsia="Times New Roman" w:hAnsi="Arial" w:cs="Arial"/>
+                <w:bCs/>
+              </w:rPr>
+              <w:t>config.buyout</w:t>
+            </w:r>
+            <w:proofErr w:type="gramEnd"/>
+            <w:r>
+              <w:rPr>
+                <w:rFonts w:ascii="Arial" w:eastAsia="Times New Roman" w:hAnsi="Arial" w:cs="Arial"/>
+                <w:bCs/>
+              </w:rPr>
+              <w:t>_items</w:t>
+            </w:r>
+            <w:proofErr w:type="spellEnd"/>
+            <w:r>
+              <w:rPr>
+                <w:rFonts w:ascii="Arial" w:eastAsia="Times New Roman" w:hAnsi="Arial" w:cs="Arial"/>
+                <w:bCs/>
+              </w:rPr>
+              <w:t xml:space="preserve"> %}</w:t>
             </w:r>
           </w:p>
         </w:tc>
@@ -3225,12 +5174,21 @@
                 <w:rFonts w:ascii="Arial" w:eastAsia="Times New Roman" w:hAnsi="Arial" w:cs="Arial"/>
               </w:rPr>
             </w:pPr>
+            <w:proofErr w:type="gramStart"/>
             <w:r>
               <w:rPr>
                 <w:rFonts w:ascii="Arial" w:eastAsia="Times New Roman" w:hAnsi="Arial" w:cs="Arial"/>
                 <w:bCs/>
               </w:rPr>
-              <w:t>{{ buyout.name }}</w:t>
+              <w:t>{{ buyout.name</w:t>
+            </w:r>
+            <w:proofErr w:type="gramEnd"/>
+            <w:r>
+              <w:rPr>
+                <w:rFonts w:ascii="Arial" w:eastAsia="Times New Roman" w:hAnsi="Arial" w:cs="Arial"/>
+                <w:bCs/>
+              </w:rPr>
+              <w:t xml:space="preserve"> }}</w:t>
             </w:r>
           </w:p>
         </w:tc>
@@ -3260,7 +5218,43 @@
                 <w:b/>
                 <w:bCs/>
               </w:rPr>
-              <w:t>R {{ buyout.unit_price }}</w:t>
+              <w:t xml:space="preserve">R </w:t>
+            </w:r>
+            <w:proofErr w:type="gramStart"/>
+            <w:r>
+              <w:rPr>
+                <w:rFonts w:ascii="Arial" w:eastAsia="Times New Roman" w:hAnsi="Arial" w:cs="Arial"/>
+                <w:b/>
+                <w:bCs/>
+              </w:rPr>
+              <w:t xml:space="preserve">{{ </w:t>
+            </w:r>
+            <w:proofErr w:type="spellStart"/>
+            <w:r>
+              <w:rPr>
+                <w:rFonts w:ascii="Arial" w:eastAsia="Times New Roman" w:hAnsi="Arial" w:cs="Arial"/>
+                <w:b/>
+                <w:bCs/>
+              </w:rPr>
+              <w:t>buyout</w:t>
+            </w:r>
+            <w:proofErr w:type="gramEnd"/>
+            <w:r>
+              <w:rPr>
+                <w:rFonts w:ascii="Arial" w:eastAsia="Times New Roman" w:hAnsi="Arial" w:cs="Arial"/>
+                <w:b/>
+                <w:bCs/>
+              </w:rPr>
+              <w:t>.unit_price</w:t>
+            </w:r>
+            <w:proofErr w:type="spellEnd"/>
+            <w:r>
+              <w:rPr>
+                <w:rFonts w:ascii="Arial" w:eastAsia="Times New Roman" w:hAnsi="Arial" w:cs="Arial"/>
+                <w:b/>
+                <w:bCs/>
+              </w:rPr>
+              <w:t xml:space="preserve"> }}</w:t>
             </w:r>
           </w:p>
         </w:tc>
@@ -3283,12 +5277,30 @@
                 <w:b/>
               </w:rPr>
             </w:pPr>
-            <w:r>
-              <w:rPr>
-                <w:rFonts w:ascii="Arial" w:eastAsia="Times New Roman" w:hAnsi="Arial" w:cs="Arial"/>
-                <w:b/>
-              </w:rPr>
-              <w:t>{{ buyout.qty }}</w:t>
+            <w:proofErr w:type="gramStart"/>
+            <w:r>
+              <w:rPr>
+                <w:rFonts w:ascii="Arial" w:eastAsia="Times New Roman" w:hAnsi="Arial" w:cs="Arial"/>
+                <w:b/>
+              </w:rPr>
+              <w:t xml:space="preserve">{{ </w:t>
+            </w:r>
+            <w:proofErr w:type="spellStart"/>
+            <w:r>
+              <w:rPr>
+                <w:rFonts w:ascii="Arial" w:eastAsia="Times New Roman" w:hAnsi="Arial" w:cs="Arial"/>
+                <w:b/>
+              </w:rPr>
+              <w:t>buyout.qty</w:t>
+            </w:r>
+            <w:proofErr w:type="spellEnd"/>
+            <w:proofErr w:type="gramEnd"/>
+            <w:r>
+              <w:rPr>
+                <w:rFonts w:ascii="Arial" w:eastAsia="Times New Roman" w:hAnsi="Arial" w:cs="Arial"/>
+                <w:b/>
+              </w:rPr>
+              <w:t xml:space="preserve"> }}</w:t>
             </w:r>
           </w:p>
         </w:tc>
@@ -3316,7 +5328,39 @@
                 <w:rFonts w:ascii="Arial" w:eastAsia="Times New Roman" w:hAnsi="Arial" w:cs="Arial"/>
                 <w:b/>
               </w:rPr>
-              <w:t>R {{ buyout.total_price }}</w:t>
+              <w:t xml:space="preserve">R </w:t>
+            </w:r>
+            <w:proofErr w:type="gramStart"/>
+            <w:r>
+              <w:rPr>
+                <w:rFonts w:ascii="Arial" w:eastAsia="Times New Roman" w:hAnsi="Arial" w:cs="Arial"/>
+                <w:b/>
+              </w:rPr>
+              <w:t xml:space="preserve">{{ </w:t>
+            </w:r>
+            <w:proofErr w:type="spellStart"/>
+            <w:r>
+              <w:rPr>
+                <w:rFonts w:ascii="Arial" w:eastAsia="Times New Roman" w:hAnsi="Arial" w:cs="Arial"/>
+                <w:b/>
+              </w:rPr>
+              <w:t>buyout</w:t>
+            </w:r>
+            <w:proofErr w:type="gramEnd"/>
+            <w:r>
+              <w:rPr>
+                <w:rFonts w:ascii="Arial" w:eastAsia="Times New Roman" w:hAnsi="Arial" w:cs="Arial"/>
+                <w:b/>
+              </w:rPr>
+              <w:t>.total_price</w:t>
+            </w:r>
+            <w:proofErr w:type="spellEnd"/>
+            <w:r>
+              <w:rPr>
+                <w:rFonts w:ascii="Arial" w:eastAsia="Times New Roman" w:hAnsi="Arial" w:cs="Arial"/>
+                <w:b/>
+              </w:rPr>
+              <w:t xml:space="preserve"> }}</w:t>
             </w:r>
           </w:p>
         </w:tc>
@@ -3368,7 +5412,23 @@
                 <w:rFonts w:ascii="Arial" w:eastAsia="Times New Roman" w:hAnsi="Arial" w:cs="Arial"/>
                 <w:bCs/>
               </w:rPr>
-              <w:t>{%tr endfor %}</w:t>
+              <w:t xml:space="preserve">{%tr </w:t>
+            </w:r>
+            <w:proofErr w:type="spellStart"/>
+            <w:r>
+              <w:rPr>
+                <w:rFonts w:ascii="Arial" w:eastAsia="Times New Roman" w:hAnsi="Arial" w:cs="Arial"/>
+                <w:bCs/>
+              </w:rPr>
+              <w:t>endfor</w:t>
+            </w:r>
+            <w:proofErr w:type="spellEnd"/>
+            <w:r>
+              <w:rPr>
+                <w:rFonts w:ascii="Arial" w:eastAsia="Times New Roman" w:hAnsi="Arial" w:cs="Arial"/>
+                <w:bCs/>
+              </w:rPr>
+              <w:t xml:space="preserve"> %}</w:t>
             </w:r>
           </w:p>
         </w:tc>
@@ -3654,7 +5714,61 @@
                 <w:b/>
                 <w:color w:val="2F5496" w:themeColor="accent1" w:themeShade="BF"/>
               </w:rPr>
-              <w:t>CONFIG {{ fan_config.config_number }} TOTAL</w:t>
+              <w:t xml:space="preserve">CONFIG </w:t>
+            </w:r>
+            <w:proofErr w:type="gramStart"/>
+            <w:r>
+              <w:rPr>
+                <w:rFonts w:ascii="Arial" w:eastAsia="Times New Roman" w:hAnsi="Arial" w:cs="Arial"/>
+                <w:b/>
+                <w:color w:val="2F5496" w:themeColor="accent1" w:themeShade="BF"/>
+              </w:rPr>
+              <w:t xml:space="preserve">{{ </w:t>
+            </w:r>
+            <w:proofErr w:type="spellStart"/>
+            <w:r>
+              <w:rPr>
+                <w:rFonts w:ascii="Arial" w:eastAsia="Times New Roman" w:hAnsi="Arial" w:cs="Arial"/>
+                <w:b/>
+                <w:color w:val="2F5496" w:themeColor="accent1" w:themeShade="BF"/>
+              </w:rPr>
+              <w:t>fan</w:t>
+            </w:r>
+            <w:proofErr w:type="gramEnd"/>
+            <w:r>
+              <w:rPr>
+                <w:rFonts w:ascii="Arial" w:eastAsia="Times New Roman" w:hAnsi="Arial" w:cs="Arial"/>
+                <w:b/>
+                <w:color w:val="2F5496" w:themeColor="accent1" w:themeShade="BF"/>
+              </w:rPr>
+              <w:t>_config.config_</w:t>
+            </w:r>
+            <w:proofErr w:type="gramStart"/>
+            <w:r>
+              <w:rPr>
+                <w:rFonts w:ascii="Arial" w:eastAsia="Times New Roman" w:hAnsi="Arial" w:cs="Arial"/>
+                <w:b/>
+                <w:color w:val="2F5496" w:themeColor="accent1" w:themeShade="BF"/>
+              </w:rPr>
+              <w:t>number</w:t>
+            </w:r>
+            <w:proofErr w:type="spellEnd"/>
+            <w:r>
+              <w:rPr>
+                <w:rFonts w:ascii="Arial" w:eastAsia="Times New Roman" w:hAnsi="Arial" w:cs="Arial"/>
+                <w:b/>
+                <w:color w:val="2F5496" w:themeColor="accent1" w:themeShade="BF"/>
+              </w:rPr>
+              <w:t xml:space="preserve"> }</w:t>
+            </w:r>
+            <w:proofErr w:type="gramEnd"/>
+            <w:r>
+              <w:rPr>
+                <w:rFonts w:ascii="Arial" w:eastAsia="Times New Roman" w:hAnsi="Arial" w:cs="Arial"/>
+                <w:b/>
+                <w:color w:val="2F5496" w:themeColor="accent1" w:themeShade="BF"/>
+              </w:rPr>
+              <w:t>} TOTAL</w:t>
             </w:r>
           </w:p>
         </w:tc>
@@ -3716,7 +5830,61 @@
                 <w:b/>
                 <w:color w:val="2F5496" w:themeColor="accent1" w:themeShade="BF"/>
               </w:rPr>
-              <w:t>R {{ fan_config.line_total }}</w:t>
+              <w:t xml:space="preserve">R </w:t>
+            </w:r>
+            <w:proofErr w:type="gramStart"/>
+            <w:r>
+              <w:rPr>
+                <w:rFonts w:ascii="Arial" w:eastAsia="Times New Roman" w:hAnsi="Arial" w:cs="Arial"/>
+                <w:b/>
+                <w:color w:val="2F5496" w:themeColor="accent1" w:themeShade="BF"/>
+              </w:rPr>
+              <w:t xml:space="preserve">{{ </w:t>
+            </w:r>
+            <w:proofErr w:type="spellStart"/>
+            <w:r>
+              <w:rPr>
+                <w:rFonts w:ascii="Arial" w:eastAsia="Times New Roman" w:hAnsi="Arial" w:cs="Arial"/>
+                <w:b/>
+                <w:color w:val="2F5496" w:themeColor="accent1" w:themeShade="BF"/>
+              </w:rPr>
+              <w:t>fan</w:t>
+            </w:r>
+            <w:proofErr w:type="gramEnd"/>
+            <w:r>
+              <w:rPr>
+                <w:rFonts w:ascii="Arial" w:eastAsia="Times New Roman" w:hAnsi="Arial" w:cs="Arial"/>
+                <w:b/>
+                <w:color w:val="2F5496" w:themeColor="accent1" w:themeShade="BF"/>
+              </w:rPr>
+              <w:t>_</w:t>
+            </w:r>
+            <w:proofErr w:type="gramStart"/>
+            <w:r>
+              <w:rPr>
+                <w:rFonts w:ascii="Arial" w:eastAsia="Times New Roman" w:hAnsi="Arial" w:cs="Arial"/>
+                <w:b/>
+                <w:color w:val="2F5496" w:themeColor="accent1" w:themeShade="BF"/>
+              </w:rPr>
+              <w:t>config.line</w:t>
+            </w:r>
+            <w:proofErr w:type="gramEnd"/>
+            <w:r>
+              <w:rPr>
+                <w:rFonts w:ascii="Arial" w:eastAsia="Times New Roman" w:hAnsi="Arial" w:cs="Arial"/>
+                <w:b/>
+                <w:color w:val="2F5496" w:themeColor="accent1" w:themeShade="BF"/>
+              </w:rPr>
+              <w:t>_total</w:t>
+            </w:r>
+            <w:proofErr w:type="spellEnd"/>
+            <w:r>
+              <w:rPr>
+                <w:rFonts w:ascii="Arial" w:eastAsia="Times New Roman" w:hAnsi="Arial" w:cs="Arial"/>
+                <w:b/>
+                <w:color w:val="2F5496" w:themeColor="accent1" w:themeShade="BF"/>
+              </w:rPr>
+              <w:t xml:space="preserve"> }}</w:t>
             </w:r>
           </w:p>
         </w:tc>
@@ -3728,7 +5896,15 @@
           </w:tcPr>
           <w:p>
             <w:r>
-              <w:t>{%tr endfor %}</w:t>
+              <w:t xml:space="preserve">{%tr </w:t>
+            </w:r>
+            <w:proofErr w:type="spellStart"/>
+            <w:r>
+              <w:t>endfor</w:t>
+            </w:r>
+            <w:proofErr w:type="spellEnd"/>
+            <w:r>
+              <w:t xml:space="preserve"> %}</w:t>
             </w:r>
           </w:p>
         </w:tc>
@@ -3888,7 +6064,43 @@
                 <w:b/>
                 <w:color w:val="538135" w:themeColor="accent6" w:themeShade="BF"/>
               </w:rPr>
-              <w:t>R {{ grand_total_price }}</w:t>
+              <w:t xml:space="preserve">R </w:t>
+            </w:r>
+            <w:proofErr w:type="gramStart"/>
+            <w:r>
+              <w:rPr>
+                <w:rFonts w:ascii="Arial" w:eastAsia="Times New Roman" w:hAnsi="Arial" w:cs="Arial"/>
+                <w:b/>
+                <w:color w:val="538135" w:themeColor="accent6" w:themeShade="BF"/>
+              </w:rPr>
+              <w:t xml:space="preserve">{{ </w:t>
+            </w:r>
+            <w:proofErr w:type="spellStart"/>
+            <w:r>
+              <w:rPr>
+                <w:rFonts w:ascii="Arial" w:eastAsia="Times New Roman" w:hAnsi="Arial" w:cs="Arial"/>
+                <w:b/>
+                <w:color w:val="538135" w:themeColor="accent6" w:themeShade="BF"/>
+              </w:rPr>
+              <w:t>grand</w:t>
+            </w:r>
+            <w:proofErr w:type="gramEnd"/>
+            <w:r>
+              <w:rPr>
+                <w:rFonts w:ascii="Arial" w:eastAsia="Times New Roman" w:hAnsi="Arial" w:cs="Arial"/>
+                <w:b/>
+                <w:color w:val="538135" w:themeColor="accent6" w:themeShade="BF"/>
+              </w:rPr>
+              <w:t>_total_price</w:t>
+            </w:r>
+            <w:proofErr w:type="spellEnd"/>
+            <w:r>
+              <w:rPr>
+                <w:rFonts w:ascii="Arial" w:eastAsia="Times New Roman" w:hAnsi="Arial" w:cs="Arial"/>
+                <w:b/>
+                <w:color w:val="538135" w:themeColor="accent6" w:themeShade="BF"/>
+              </w:rPr>
+              <w:t xml:space="preserve"> }}</w:t>
             </w:r>
           </w:p>
         </w:tc>
@@ -4206,6 +6418,7 @@
         </w:rPr>
         <w:t xml:space="preserve">: </w:t>
       </w:r>
+      <w:proofErr w:type="gramStart"/>
       <w:r>
         <w:rPr>
           <w:rFonts w:ascii="Arial" w:eastAsia="Times New Roman" w:hAnsi="Arial" w:cs="Arial"/>
@@ -4218,12 +6431,28 @@
         </w:rPr>
         <w:t xml:space="preserve"> </w:t>
       </w:r>
-      <w:r>
-        <w:rPr>
-          <w:rFonts w:ascii="Arial" w:eastAsia="Times New Roman" w:hAnsi="Arial" w:cs="Arial"/>
-        </w:rPr>
-        <w:t>delivery_time</w:t>
-      </w:r>
+      <w:proofErr w:type="spellStart"/>
+      <w:r>
+        <w:rPr>
+          <w:rFonts w:ascii="Arial" w:eastAsia="Times New Roman" w:hAnsi="Arial" w:cs="Arial"/>
+        </w:rPr>
+        <w:t>delivery</w:t>
+      </w:r>
+      <w:proofErr w:type="gramEnd"/>
+      <w:r>
+        <w:rPr>
+          <w:rFonts w:ascii="Arial" w:eastAsia="Times New Roman" w:hAnsi="Arial" w:cs="Arial"/>
+        </w:rPr>
+        <w:t>_</w:t>
+      </w:r>
+      <w:proofErr w:type="gramStart"/>
+      <w:r>
+        <w:rPr>
+          <w:rFonts w:ascii="Arial" w:eastAsia="Times New Roman" w:hAnsi="Arial" w:cs="Arial"/>
+        </w:rPr>
+        <w:t>time</w:t>
+      </w:r>
+      <w:proofErr w:type="spellEnd"/>
       <w:r>
         <w:rPr>
           <w:rFonts w:ascii="Arial" w:eastAsia="Times New Roman" w:hAnsi="Arial" w:cs="Arial"/>
@@ -4234,7 +6463,14 @@
         <w:rPr>
           <w:rFonts w:ascii="Arial" w:eastAsia="Times New Roman" w:hAnsi="Arial" w:cs="Arial"/>
         </w:rPr>
-        <w:t>}}</w:t>
+        <w:t>}</w:t>
+      </w:r>
+      <w:proofErr w:type="gramEnd"/>
+      <w:r>
+        <w:rPr>
+          <w:rFonts w:ascii="Arial" w:eastAsia="Times New Roman" w:hAnsi="Arial" w:cs="Arial"/>
+        </w:rPr>
+        <w:t>}</w:t>
       </w:r>
       <w:r>
         <w:rPr>
@@ -4444,7 +6680,35 @@
         <w:rPr>
           <w:rFonts w:ascii="Arial" w:eastAsia="Times New Roman" w:hAnsi="Arial" w:cs="Arial"/>
         </w:rPr>
-        <w:t xml:space="preserve">These include, but shall not be limited to the non-acceptance of consequential damages or losses, and any and all liabilities on </w:t>
+        <w:t xml:space="preserve">These </w:t>
+      </w:r>
+      <w:proofErr w:type="gramStart"/>
+      <w:r>
+        <w:rPr>
+          <w:rFonts w:ascii="Arial" w:eastAsia="Times New Roman" w:hAnsi="Arial" w:cs="Arial"/>
+        </w:rPr>
+        <w:t>include, but</w:t>
+      </w:r>
+      <w:proofErr w:type="gramEnd"/>
+      <w:r>
+        <w:rPr>
+          <w:rFonts w:ascii="Arial" w:eastAsia="Times New Roman" w:hAnsi="Arial" w:cs="Arial"/>
+        </w:rPr>
+        <w:t xml:space="preserve"> shall not be limited to the non-acceptance of consequential damages or losses, and </w:t>
+      </w:r>
+      <w:proofErr w:type="gramStart"/>
+      <w:r>
+        <w:rPr>
+          <w:rFonts w:ascii="Arial" w:eastAsia="Times New Roman" w:hAnsi="Arial" w:cs="Arial"/>
+        </w:rPr>
+        <w:t>any and all</w:t>
+      </w:r>
+      <w:proofErr w:type="gramEnd"/>
+      <w:r>
+        <w:rPr>
+          <w:rFonts w:ascii="Arial" w:eastAsia="Times New Roman" w:hAnsi="Arial" w:cs="Arial"/>
+        </w:rPr>
+        <w:t xml:space="preserve"> liabilities on </w:t>
       </w:r>
       <w:r>
         <w:rPr>
@@ -4865,12 +7129,53 @@
         </w:rPr>
         <w:t xml:space="preserve">         </w:t>
       </w:r>
-      <w:r>
-        <w:rPr>
-          <w:rFonts w:ascii="Arial" w:eastAsia="Times New Roman" w:hAnsi="Arial" w:cs="Arial"/>
-          <w:b/>
-        </w:rPr>
-        <w:t>{{ user_name }}</w:t>
+      <w:proofErr w:type="gramStart"/>
+      <w:r>
+        <w:rPr>
+          <w:rFonts w:ascii="Arial" w:eastAsia="Times New Roman" w:hAnsi="Arial" w:cs="Arial"/>
+          <w:b/>
+        </w:rPr>
+        <w:t xml:space="preserve">{{ </w:t>
+      </w:r>
+      <w:proofErr w:type="spellStart"/>
+      <w:r>
+        <w:rPr>
+          <w:rFonts w:ascii="Arial" w:eastAsia="Times New Roman" w:hAnsi="Arial" w:cs="Arial"/>
+          <w:b/>
+        </w:rPr>
+        <w:t>user</w:t>
+      </w:r>
+      <w:proofErr w:type="gramEnd"/>
+      <w:r>
+        <w:rPr>
+          <w:rFonts w:ascii="Arial" w:eastAsia="Times New Roman" w:hAnsi="Arial" w:cs="Arial"/>
+          <w:b/>
+        </w:rPr>
+        <w:t>_</w:t>
+      </w:r>
+      <w:proofErr w:type="gramStart"/>
+      <w:r>
+        <w:rPr>
+          <w:rFonts w:ascii="Arial" w:eastAsia="Times New Roman" w:hAnsi="Arial" w:cs="Arial"/>
+          <w:b/>
+        </w:rPr>
+        <w:t>name</w:t>
+      </w:r>
+      <w:proofErr w:type="spellEnd"/>
+      <w:r>
+        <w:rPr>
+          <w:rFonts w:ascii="Arial" w:eastAsia="Times New Roman" w:hAnsi="Arial" w:cs="Arial"/>
+          <w:b/>
+        </w:rPr>
+        <w:t xml:space="preserve"> }</w:t>
+      </w:r>
+      <w:proofErr w:type="gramEnd"/>
+      <w:r>
+        <w:rPr>
+          <w:rFonts w:ascii="Arial" w:eastAsia="Times New Roman" w:hAnsi="Arial" w:cs="Arial"/>
+          <w:b/>
+        </w:rPr>
+        <w:t>}</w:t>
       </w:r>
     </w:p>
     <w:p>
@@ -4883,12 +7188,53 @@
           <w:b/>
         </w:rPr>
       </w:pPr>
-      <w:r>
-        <w:rPr>
-          <w:rFonts w:ascii="Arial" w:eastAsia="Times New Roman" w:hAnsi="Arial" w:cs="Arial"/>
-          <w:b/>
-        </w:rPr>
-        <w:t xml:space="preserve">{{ user_position }} </w:t>
+      <w:proofErr w:type="gramStart"/>
+      <w:r>
+        <w:rPr>
+          <w:rFonts w:ascii="Arial" w:eastAsia="Times New Roman" w:hAnsi="Arial" w:cs="Arial"/>
+          <w:b/>
+        </w:rPr>
+        <w:t xml:space="preserve">{{ </w:t>
+      </w:r>
+      <w:proofErr w:type="spellStart"/>
+      <w:r>
+        <w:rPr>
+          <w:rFonts w:ascii="Arial" w:eastAsia="Times New Roman" w:hAnsi="Arial" w:cs="Arial"/>
+          <w:b/>
+        </w:rPr>
+        <w:t>user</w:t>
+      </w:r>
+      <w:proofErr w:type="gramEnd"/>
+      <w:r>
+        <w:rPr>
+          <w:rFonts w:ascii="Arial" w:eastAsia="Times New Roman" w:hAnsi="Arial" w:cs="Arial"/>
+          <w:b/>
+        </w:rPr>
+        <w:t>_</w:t>
+      </w:r>
+      <w:proofErr w:type="gramStart"/>
+      <w:r>
+        <w:rPr>
+          <w:rFonts w:ascii="Arial" w:eastAsia="Times New Roman" w:hAnsi="Arial" w:cs="Arial"/>
+          <w:b/>
+        </w:rPr>
+        <w:t>position</w:t>
+      </w:r>
+      <w:proofErr w:type="spellEnd"/>
+      <w:r>
+        <w:rPr>
+          <w:rFonts w:ascii="Arial" w:eastAsia="Times New Roman" w:hAnsi="Arial" w:cs="Arial"/>
+          <w:b/>
+        </w:rPr>
+        <w:t xml:space="preserve"> }</w:t>
+      </w:r>
+      <w:proofErr w:type="gramEnd"/>
+      <w:r>
+        <w:rPr>
+          <w:rFonts w:ascii="Arial" w:eastAsia="Times New Roman" w:hAnsi="Arial" w:cs="Arial"/>
+          <w:b/>
+        </w:rPr>
+        <w:t xml:space="preserve">} </w:t>
       </w:r>
       <w:r>
         <w:rPr>
@@ -5018,7 +7364,16 @@
           <w:b/>
           <w:bCs/>
         </w:rPr>
-        <w:t xml:space="preserve">Mobile No  </w:t>
+        <w:t xml:space="preserve">Mobile </w:t>
+      </w:r>
+      <w:proofErr w:type="gramStart"/>
+      <w:r>
+        <w:rPr>
+          <w:rFonts w:ascii="Arial" w:eastAsia="Times New Roman" w:hAnsi="Arial" w:cs="Arial"/>
+          <w:b/>
+          <w:bCs/>
+        </w:rPr>
+        <w:t xml:space="preserve">No  </w:t>
       </w:r>
       <w:r>
         <w:rPr>
@@ -5027,7 +7382,69 @@
           <w:bCs/>
         </w:rPr>
         <w:tab/>
-        <w:t>: {{ user_tel_number }}</w:t>
+      </w:r>
+      <w:proofErr w:type="gramEnd"/>
+      <w:r>
+        <w:rPr>
+          <w:rFonts w:ascii="Arial" w:eastAsia="Times New Roman" w:hAnsi="Arial" w:cs="Arial"/>
+          <w:b/>
+          <w:bCs/>
+        </w:rPr>
+        <w:t xml:space="preserve">: </w:t>
+      </w:r>
+      <w:proofErr w:type="gramStart"/>
+      <w:r>
+        <w:rPr>
+          <w:rFonts w:ascii="Arial" w:eastAsia="Times New Roman" w:hAnsi="Arial" w:cs="Arial"/>
+          <w:b/>
+          <w:bCs/>
+        </w:rPr>
+        <w:t xml:space="preserve">{{ </w:t>
+      </w:r>
+      <w:proofErr w:type="spellStart"/>
+      <w:r>
+        <w:rPr>
+          <w:rFonts w:ascii="Arial" w:eastAsia="Times New Roman" w:hAnsi="Arial" w:cs="Arial"/>
+          <w:b/>
+          <w:bCs/>
+        </w:rPr>
+        <w:t>user</w:t>
+      </w:r>
+      <w:proofErr w:type="gramEnd"/>
+      <w:r>
+        <w:rPr>
+          <w:rFonts w:ascii="Arial" w:eastAsia="Times New Roman" w:hAnsi="Arial" w:cs="Arial"/>
+          <w:b/>
+          <w:bCs/>
+        </w:rPr>
+        <w:t>_tel_</w:t>
+      </w:r>
+      <w:proofErr w:type="gramStart"/>
+      <w:r>
+        <w:rPr>
+          <w:rFonts w:ascii="Arial" w:eastAsia="Times New Roman" w:hAnsi="Arial" w:cs="Arial"/>
+          <w:b/>
+          <w:bCs/>
+        </w:rPr>
+        <w:t>number</w:t>
+      </w:r>
+      <w:proofErr w:type="spellEnd"/>
+      <w:r>
+        <w:rPr>
+          <w:rFonts w:ascii="Arial" w:eastAsia="Times New Roman" w:hAnsi="Arial" w:cs="Arial"/>
+          <w:b/>
+          <w:bCs/>
+        </w:rPr>
+        <w:t xml:space="preserve"> }</w:t>
+      </w:r>
+      <w:proofErr w:type="gramEnd"/>
+      <w:r>
+        <w:rPr>
+          <w:rFonts w:ascii="Arial" w:eastAsia="Times New Roman" w:hAnsi="Arial" w:cs="Arial"/>
+          <w:b/>
+          <w:bCs/>
+        </w:rPr>
+        <w:t>}</w:t>
       </w:r>
     </w:p>
     <w:p>
@@ -5067,7 +7484,61 @@
           <w:bCs/>
         </w:rPr>
         <w:tab/>
-        <w:t>: {{ user_email }}</w:t>
+        <w:t xml:space="preserve">: </w:t>
+      </w:r>
+      <w:proofErr w:type="gramStart"/>
+      <w:r>
+        <w:rPr>
+          <w:rFonts w:ascii="Arial" w:eastAsia="Times New Roman" w:hAnsi="Arial" w:cs="Arial"/>
+          <w:b/>
+          <w:bCs/>
+        </w:rPr>
+        <w:t xml:space="preserve">{{ </w:t>
+      </w:r>
+      <w:proofErr w:type="spellStart"/>
+      <w:r>
+        <w:rPr>
+          <w:rFonts w:ascii="Arial" w:eastAsia="Times New Roman" w:hAnsi="Arial" w:cs="Arial"/>
+          <w:b/>
+          <w:bCs/>
+        </w:rPr>
+        <w:t>user</w:t>
+      </w:r>
+      <w:proofErr w:type="gramEnd"/>
+      <w:r>
+        <w:rPr>
+          <w:rFonts w:ascii="Arial" w:eastAsia="Times New Roman" w:hAnsi="Arial" w:cs="Arial"/>
+          <w:b/>
+          <w:bCs/>
+        </w:rPr>
+        <w:t>_</w:t>
+      </w:r>
+      <w:proofErr w:type="gramStart"/>
+      <w:r>
+        <w:rPr>
+          <w:rFonts w:ascii="Arial" w:eastAsia="Times New Roman" w:hAnsi="Arial" w:cs="Arial"/>
+          <w:b/>
+          <w:bCs/>
+        </w:rPr>
+        <w:t>email</w:t>
+      </w:r>
+      <w:proofErr w:type="spellEnd"/>
+      <w:r>
+        <w:rPr>
+          <w:rFonts w:ascii="Arial" w:eastAsia="Times New Roman" w:hAnsi="Arial" w:cs="Arial"/>
+          <w:b/>
+          <w:bCs/>
+        </w:rPr>
+        <w:t xml:space="preserve"> }</w:t>
+      </w:r>
+      <w:proofErr w:type="gramEnd"/>
+      <w:r>
+        <w:rPr>
+          <w:rFonts w:ascii="Arial" w:eastAsia="Times New Roman" w:hAnsi="Arial" w:cs="Arial"/>
+          <w:b/>
+          <w:bCs/>
+        </w:rPr>
+        <w:t>}</w:t>
       </w:r>
       <w:r>
         <w:rPr>
@@ -5297,8 +7768,18 @@
         <w:sz w:val="20"/>
         <w:szCs w:val="20"/>
       </w:rPr>
-      <w:t>Air Blow Fans (Pty) Ltd. | ICC Medical Building, Irene Corporate Corner, Irene, Centurion |  www.airblowfans.co.za</w:t>
+      <w:t xml:space="preserve">Air Blow Fans (Pty) Ltd. | ICC Medical Building, Irene Corporate Corner, Irene, Centurion </w:t>
     </w:r>
+    <w:proofErr w:type="gramStart"/>
+    <w:r>
+      <w:rPr>
+        <w:rFonts w:ascii="Praktika" w:hAnsi="Praktika" w:cs="Praktika Medium"/>
+        <w:sz w:val="20"/>
+        <w:szCs w:val="20"/>
+      </w:rPr>
+      <w:t>|  www.airblowfans.co.za</w:t>
+    </w:r>
+    <w:proofErr w:type="gramEnd"/>
   </w:p>
   <w:p>
     <w:pPr>
@@ -8245,15 +10726,21 @@
 </file>
 
 <file path=customXml/item1.xml><?xml version="1.0" encoding="utf-8"?>
-<?mso-contentType ?>
-<FormTemplates xmlns="http://schemas.microsoft.com/sharepoint/v3/contenttype/forms">
-  <Display>DocumentLibraryForm</Display>
-  <Edit>DocumentLibraryForm</Edit>
-  <New>DocumentLibraryForm</New>
-</FormTemplates>
+<b:Sources xmlns:b="http://schemas.openxmlformats.org/officeDocument/2006/bibliography" xmlns="http://schemas.openxmlformats.org/officeDocument/2006/bibliography" SelectedStyle="\APASixthEditionOfficeOnline.xsl" StyleName="APA" Version="6"/>
 </file>
 
 <file path=customXml/item2.xml><?xml version="1.0" encoding="utf-8"?>
+<p:properties xmlns:p="http://schemas.microsoft.com/office/2006/metadata/properties" xmlns:xsi="http://www.w3.org/2001/XMLSchema-instance" xmlns:pc="http://schemas.microsoft.com/office/infopath/2007/PartnerControls">
+  <documentManagement>
+    <lcf76f155ced4ddcb4097134ff3c332f xmlns="ae64ee24-a287-4487-8358-6fe4ea9a2751">
+      <Terms xmlns="http://schemas.microsoft.com/office/infopath/2007/PartnerControls"/>
+    </lcf76f155ced4ddcb4097134ff3c332f>
+    <TaxCatchAll xmlns="fd1ea970-496a-445f-a0ac-9e633861af08" xsi:nil="true"/>
+  </documentManagement>
+</p:properties>
+</file>
+
+<file path=customXml/item3.xml><?xml version="1.0" encoding="utf-8"?>
 <ct:contentTypeSchema xmlns:ct="http://schemas.microsoft.com/office/2006/metadata/contentType" xmlns:ma="http://schemas.microsoft.com/office/2006/metadata/properties/metaAttributes" ct:_="" ma:_="" ma:contentTypeName="Document" ma:contentTypeID="0x0101008312ED833466FB4CAC852177FFA9EDB4" ma:contentTypeVersion="15" ma:contentTypeDescription="Create a new document." ma:contentTypeScope="" ma:versionID="00ba274f931c318c10f29e2e1d6d74c0">
   <xsd:schema xmlns:xsd="http://www.w3.org/2001/XMLSchema" xmlns:xs="http://www.w3.org/2001/XMLSchema" xmlns:p="http://schemas.microsoft.com/office/2006/metadata/properties" xmlns:ns2="ae64ee24-a287-4487-8358-6fe4ea9a2751" xmlns:ns3="fd1ea970-496a-445f-a0ac-9e633861af08" targetNamespace="http://schemas.microsoft.com/office/2006/metadata/properties" ma:root="true" ma:fieldsID="00de92738e7b8d6b1fdb5cc528c1afed" ns2:_="" ns3:_="">
     <xsd:import namespace="ae64ee24-a287-4487-8358-6fe4ea9a2751"/>
@@ -8488,30 +10975,35 @@
 </ct:contentTypeSchema>
 </file>
 
-<file path=customXml/item3.xml><?xml version="1.0" encoding="utf-8"?>
-<p:properties xmlns:p="http://schemas.microsoft.com/office/2006/metadata/properties" xmlns:xsi="http://www.w3.org/2001/XMLSchema-instance" xmlns:pc="http://schemas.microsoft.com/office/infopath/2007/PartnerControls">
-  <documentManagement>
-    <lcf76f155ced4ddcb4097134ff3c332f xmlns="ae64ee24-a287-4487-8358-6fe4ea9a2751">
-      <Terms xmlns="http://schemas.microsoft.com/office/infopath/2007/PartnerControls"/>
-    </lcf76f155ced4ddcb4097134ff3c332f>
-    <TaxCatchAll xmlns="fd1ea970-496a-445f-a0ac-9e633861af08" xsi:nil="true"/>
-  </documentManagement>
-</p:properties>
-</file>
-
 <file path=customXml/item4.xml><?xml version="1.0" encoding="utf-8"?>
-<b:Sources xmlns:b="http://schemas.openxmlformats.org/officeDocument/2006/bibliography" xmlns="http://schemas.openxmlformats.org/officeDocument/2006/bibliography" SelectedStyle="\APASixthEditionOfficeOnline.xsl" StyleName="APA" Version="6"/>
+<?mso-contentType ?>
+<FormTemplates xmlns="http://schemas.microsoft.com/sharepoint/v3/contenttype/forms">
+  <Display>DocumentLibraryForm</Display>
+  <Edit>DocumentLibraryForm</Edit>
+  <New>DocumentLibraryForm</New>
+</FormTemplates>
 </file>
 
 <file path=customXml/itemProps1.xml><?xml version="1.0" encoding="utf-8"?>
-<ds:datastoreItem xmlns:ds="http://schemas.openxmlformats.org/officeDocument/2006/customXml" ds:itemID="{8321DDA5-16E0-4606-B32A-7029020DA1BE}">
+<ds:datastoreItem xmlns:ds="http://schemas.openxmlformats.org/officeDocument/2006/customXml" ds:itemID="{6B87BA90-45F4-4413-8553-4E37FB89445A}">
   <ds:schemaRefs>
-    <ds:schemaRef ds:uri="http://schemas.microsoft.com/sharepoint/v3/contenttype/forms"/>
+    <ds:schemaRef ds:uri="http://schemas.openxmlformats.org/officeDocument/2006/bibliography"/>
   </ds:schemaRefs>
 </ds:datastoreItem>
 </file>
 
 <file path=customXml/itemProps2.xml><?xml version="1.0" encoding="utf-8"?>
+<ds:datastoreItem xmlns:ds="http://schemas.openxmlformats.org/officeDocument/2006/customXml" ds:itemID="{FAD17780-133F-40F1-8599-9A3527331F37}">
+  <ds:schemaRefs>
+    <ds:schemaRef ds:uri="http://schemas.microsoft.com/office/2006/metadata/properties"/>
+    <ds:schemaRef ds:uri="http://schemas.microsoft.com/office/infopath/2007/PartnerControls"/>
+    <ds:schemaRef ds:uri="ae64ee24-a287-4487-8358-6fe4ea9a2751"/>
+    <ds:schemaRef ds:uri="fd1ea970-496a-445f-a0ac-9e633861af08"/>
+  </ds:schemaRefs>
+</ds:datastoreItem>
+</file>
+
+<file path=customXml/itemProps3.xml><?xml version="1.0" encoding="utf-8"?>
 <ds:datastoreItem xmlns:ds="http://schemas.openxmlformats.org/officeDocument/2006/customXml" ds:itemID="{0084AE77-644A-4249-A0DE-270BF17CEEE1}">
   <ds:schemaRefs>
     <ds:schemaRef ds:uri="http://schemas.microsoft.com/office/2006/metadata/contentType"/>
@@ -8530,21 +11022,10 @@
 </ds:datastoreItem>
 </file>
 
-<file path=customXml/itemProps3.xml><?xml version="1.0" encoding="utf-8"?>
-<ds:datastoreItem xmlns:ds="http://schemas.openxmlformats.org/officeDocument/2006/customXml" ds:itemID="{FAD17780-133F-40F1-8599-9A3527331F37}">
+<file path=customXml/itemProps4.xml><?xml version="1.0" encoding="utf-8"?>
+<ds:datastoreItem xmlns:ds="http://schemas.openxmlformats.org/officeDocument/2006/customXml" ds:itemID="{8321DDA5-16E0-4606-B32A-7029020DA1BE}">
   <ds:schemaRefs>
-    <ds:schemaRef ds:uri="http://schemas.microsoft.com/office/2006/metadata/properties"/>
-    <ds:schemaRef ds:uri="http://schemas.microsoft.com/office/infopath/2007/PartnerControls"/>
-    <ds:schemaRef ds:uri="ae64ee24-a287-4487-8358-6fe4ea9a2751"/>
-    <ds:schemaRef ds:uri="fd1ea970-496a-445f-a0ac-9e633861af08"/>
-  </ds:schemaRefs>
-</ds:datastoreItem>
-</file>
-
-<file path=customXml/itemProps4.xml><?xml version="1.0" encoding="utf-8"?>
-<ds:datastoreItem xmlns:ds="http://schemas.openxmlformats.org/officeDocument/2006/customXml" ds:itemID="{6B87BA90-45F4-4413-8553-4E37FB89445A}">
-  <ds:schemaRefs>
-    <ds:schemaRef ds:uri="http://schemas.openxmlformats.org/officeDocument/2006/bibliography"/>
+    <ds:schemaRef ds:uri="http://schemas.microsoft.com/sharepoint/v3/contenttype/forms"/>
   </ds:schemaRefs>
 </ds:datastoreItem>
 </file>
</xml_diff>

<commit_message>
Fix Word export: zero decimal places for fan length, add blade spec variable
- Format total_length as whole number (no decimal places) in Word export
- Add blade_spec template variable (e.g. "Aluminium cast blade") derived from fan_configuration.blade_material
- Hoist blade_spec to top-level context for single-config templates
- Document blade_spec in TEMPLATE_VARIABLES.md

Co-Authored-By: Claude Sonnet 4.6 <noreply@anthropic.com>
</commit_message>
<xml_diff>
--- a/ui/templates/quote_template.docx
+++ b/ui/templates/quote_template.docx
@@ -69,7 +69,6 @@
         </w:rPr>
         <w:t xml:space="preserve">{{ </w:t>
       </w:r>
-      <w:proofErr w:type="spellStart"/>
       <w:r>
         <w:rPr>
           <w:rFonts w:ascii="Arial" w:eastAsia="Times New Roman" w:hAnsi="Arial" w:cs="Arial"/>
@@ -99,7 +98,6 @@
         </w:rPr>
         <w:t>name</w:t>
       </w:r>
-      <w:proofErr w:type="spellEnd"/>
       <w:r>
         <w:rPr>
           <w:rFonts w:ascii="Arial" w:eastAsia="Times New Roman" w:hAnsi="Arial" w:cs="Arial"/>
@@ -157,7 +155,6 @@
         </w:rPr>
         <w:t xml:space="preserve">{{ </w:t>
       </w:r>
-      <w:proofErr w:type="spellStart"/>
       <w:r>
         <w:rPr>
           <w:rFonts w:ascii="Arial" w:eastAsia="Times New Roman" w:hAnsi="Arial" w:cs="Arial"/>
@@ -181,7 +178,6 @@
         </w:rPr>
         <w:t>to</w:t>
       </w:r>
-      <w:proofErr w:type="spellEnd"/>
       <w:r>
         <w:rPr>
           <w:rFonts w:ascii="Arial" w:eastAsia="Times New Roman" w:hAnsi="Arial" w:cs="Arial"/>
@@ -235,16 +231,7 @@
           <w:b/>
           <w:bCs/>
         </w:rPr>
-        <w:t xml:space="preserve">{{ </w:t>
-      </w:r>
-      <w:proofErr w:type="spellStart"/>
-      <w:r>
-        <w:rPr>
-          <w:rFonts w:ascii="Arial" w:eastAsia="Times New Roman" w:hAnsi="Arial" w:cs="Arial"/>
-          <w:b/>
-          <w:bCs/>
-        </w:rPr>
-        <w:t>subject</w:t>
+        <w:t>{{ subject</w:t>
       </w:r>
       <w:proofErr w:type="gramEnd"/>
       <w:r>
@@ -262,16 +249,7 @@
           <w:b/>
           <w:bCs/>
         </w:rPr>
-        <w:t>sizes</w:t>
-      </w:r>
-      <w:proofErr w:type="spellEnd"/>
-      <w:r>
-        <w:rPr>
-          <w:rFonts w:ascii="Arial" w:eastAsia="Times New Roman" w:hAnsi="Arial" w:cs="Arial"/>
-          <w:b/>
-          <w:bCs/>
-        </w:rPr>
-        <w:t xml:space="preserve"> }</w:t>
+        <w:t>sizes }</w:t>
       </w:r>
       <w:proofErr w:type="gramEnd"/>
       <w:r>
@@ -358,15 +336,7 @@
           <w:rFonts w:ascii="Arial" w:eastAsia="Times New Roman" w:hAnsi="Arial" w:cs="Arial"/>
           <w:b/>
         </w:rPr>
-        <w:t xml:space="preserve">{{ </w:t>
-      </w:r>
-      <w:proofErr w:type="spellStart"/>
-      <w:r>
-        <w:rPr>
-          <w:rFonts w:ascii="Arial" w:eastAsia="Times New Roman" w:hAnsi="Arial" w:cs="Arial"/>
-          <w:b/>
-        </w:rPr>
-        <w:t>quote</w:t>
+        <w:t>{{ quote</w:t>
       </w:r>
       <w:proofErr w:type="gramEnd"/>
       <w:r>
@@ -382,15 +352,7 @@
           <w:rFonts w:ascii="Arial" w:eastAsia="Times New Roman" w:hAnsi="Arial" w:cs="Arial"/>
           <w:b/>
         </w:rPr>
-        <w:t>ref</w:t>
-      </w:r>
-      <w:proofErr w:type="spellEnd"/>
-      <w:r>
-        <w:rPr>
-          <w:rFonts w:ascii="Arial" w:eastAsia="Times New Roman" w:hAnsi="Arial" w:cs="Arial"/>
-          <w:b/>
-        </w:rPr>
-        <w:t xml:space="preserve"> }</w:t>
+        <w:t>ref }</w:t>
       </w:r>
       <w:proofErr w:type="gramEnd"/>
       <w:r>
@@ -436,15 +398,7 @@
           <w:rFonts w:ascii="Arial" w:eastAsia="Times New Roman" w:hAnsi="Arial" w:cs="Arial"/>
           <w:b/>
         </w:rPr>
-        <w:t xml:space="preserve">{{ </w:t>
-      </w:r>
-      <w:proofErr w:type="spellStart"/>
-      <w:r>
-        <w:rPr>
-          <w:rFonts w:ascii="Arial" w:eastAsia="Times New Roman" w:hAnsi="Arial" w:cs="Arial"/>
-          <w:b/>
-        </w:rPr>
-        <w:t>quote</w:t>
+        <w:t>{{ quote</w:t>
       </w:r>
       <w:proofErr w:type="gramEnd"/>
       <w:r>
@@ -460,15 +414,7 @@
           <w:rFonts w:ascii="Arial" w:eastAsia="Times New Roman" w:hAnsi="Arial" w:cs="Arial"/>
           <w:b/>
         </w:rPr>
-        <w:t>date</w:t>
-      </w:r>
-      <w:proofErr w:type="spellEnd"/>
-      <w:r>
-        <w:rPr>
-          <w:rFonts w:ascii="Arial" w:eastAsia="Times New Roman" w:hAnsi="Arial" w:cs="Arial"/>
-          <w:b/>
-        </w:rPr>
-        <w:t xml:space="preserve"> }</w:t>
+        <w:t>date }</w:t>
       </w:r>
       <w:proofErr w:type="gramEnd"/>
       <w:r>
@@ -636,16 +582,7 @@
           <w:b/>
           <w:bCs/>
         </w:rPr>
-        <w:t xml:space="preserve">{{ </w:t>
-      </w:r>
-      <w:proofErr w:type="spellStart"/>
-      <w:r>
-        <w:rPr>
-          <w:rFonts w:ascii="Arial" w:eastAsia="Times New Roman" w:hAnsi="Arial" w:cs="Arial"/>
-          <w:b/>
-          <w:bCs/>
-        </w:rPr>
-        <w:t>subject</w:t>
+        <w:t>{{ subject</w:t>
       </w:r>
       <w:proofErr w:type="gramEnd"/>
       <w:r>
@@ -663,16 +600,7 @@
           <w:b/>
           <w:bCs/>
         </w:rPr>
-        <w:t>sizes</w:t>
-      </w:r>
-      <w:proofErr w:type="spellEnd"/>
-      <w:r>
-        <w:rPr>
-          <w:rFonts w:ascii="Arial" w:eastAsia="Times New Roman" w:hAnsi="Arial" w:cs="Arial"/>
-          <w:b/>
-          <w:bCs/>
-        </w:rPr>
-        <w:t xml:space="preserve"> }</w:t>
+        <w:t>sizes }</w:t>
       </w:r>
       <w:proofErr w:type="gramEnd"/>
       <w:r>
@@ -706,16 +634,7 @@
           <w:b/>
           <w:bCs/>
         </w:rPr>
-        <w:t xml:space="preserve">{{ </w:t>
-      </w:r>
-      <w:proofErr w:type="spellStart"/>
-      <w:r>
-        <w:rPr>
-          <w:rFonts w:ascii="Arial" w:eastAsia="Times New Roman" w:hAnsi="Arial" w:cs="Arial"/>
-          <w:b/>
-          <w:bCs/>
-        </w:rPr>
-        <w:t>project</w:t>
+        <w:t>{{ project</w:t>
       </w:r>
       <w:proofErr w:type="gramEnd"/>
       <w:r>
@@ -733,16 +652,7 @@
           <w:b/>
           <w:bCs/>
         </w:rPr>
-        <w:t>location</w:t>
-      </w:r>
-      <w:proofErr w:type="spellEnd"/>
-      <w:r>
-        <w:rPr>
-          <w:rFonts w:ascii="Arial" w:eastAsia="Times New Roman" w:hAnsi="Arial" w:cs="Arial"/>
-          <w:b/>
-          <w:bCs/>
-        </w:rPr>
-        <w:t xml:space="preserve"> }</w:t>
+        <w:t>location }</w:t>
       </w:r>
       <w:proofErr w:type="gramEnd"/>
       <w:r>
@@ -793,7 +703,6 @@
         </w:rPr>
         <w:t xml:space="preserve">{{ </w:t>
       </w:r>
-      <w:proofErr w:type="spellStart"/>
       <w:r>
         <w:rPr>
           <w:rFonts w:ascii="Arial" w:eastAsia="Times New Roman" w:hAnsi="Arial" w:cs="Arial"/>
@@ -817,7 +726,6 @@
         </w:rPr>
         <w:t>to</w:t>
       </w:r>
-      <w:proofErr w:type="spellEnd"/>
       <w:r>
         <w:rPr>
           <w:rFonts w:ascii="Arial" w:eastAsia="Times New Roman" w:hAnsi="Arial" w:cs="Arial"/>
@@ -933,23 +841,7 @@
     </w:p>
     <w:p>
       <w:r>
-        <w:t xml:space="preserve">{%p for </w:t>
-      </w:r>
-      <w:proofErr w:type="spellStart"/>
-      <w:r>
-        <w:t>fan_config</w:t>
-      </w:r>
-      <w:proofErr w:type="spellEnd"/>
-      <w:r>
-        <w:t xml:space="preserve"> in </w:t>
-      </w:r>
-      <w:proofErr w:type="spellStart"/>
-      <w:r>
-        <w:t>fan_configs</w:t>
-      </w:r>
-      <w:proofErr w:type="spellEnd"/>
-      <w:r>
-        <w:t xml:space="preserve"> %}</w:t>
+        <w:t>{%p for fan_config in fan_configs %}</w:t>
       </w:r>
     </w:p>
     <w:p>
@@ -985,9 +877,9 @@
           <w:bCs/>
           <w:u w:val="single"/>
         </w:rPr>
-        <w:t xml:space="preserve">{{ </w:t>
-      </w:r>
-      <w:proofErr w:type="spellStart"/>
+        <w:t>{{ fan</w:t>
+      </w:r>
+      <w:proofErr w:type="gramEnd"/>
       <w:r>
         <w:rPr>
           <w:rFonts w:ascii="Arial" w:eastAsia="Times New Roman" w:hAnsi="Arial" w:cs="Arial"/>
@@ -995,9 +887,9 @@
           <w:bCs/>
           <w:u w:val="single"/>
         </w:rPr>
-        <w:t>fan</w:t>
-      </w:r>
-      <w:proofErr w:type="gramEnd"/>
+        <w:t>_config.config_</w:t>
+      </w:r>
+      <w:proofErr w:type="gramStart"/>
       <w:r>
         <w:rPr>
           <w:rFonts w:ascii="Arial" w:eastAsia="Times New Roman" w:hAnsi="Arial" w:cs="Arial"/>
@@ -1005,27 +897,7 @@
           <w:bCs/>
           <w:u w:val="single"/>
         </w:rPr>
-        <w:t>_config.config_</w:t>
-      </w:r>
-      <w:proofErr w:type="gramStart"/>
-      <w:r>
-        <w:rPr>
-          <w:rFonts w:ascii="Arial" w:eastAsia="Times New Roman" w:hAnsi="Arial" w:cs="Arial"/>
-          <w:b/>
-          <w:bCs/>
-          <w:u w:val="single"/>
-        </w:rPr>
-        <w:t>number</w:t>
-      </w:r>
-      <w:proofErr w:type="spellEnd"/>
-      <w:r>
-        <w:rPr>
-          <w:rFonts w:ascii="Arial" w:eastAsia="Times New Roman" w:hAnsi="Arial" w:cs="Arial"/>
-          <w:b/>
-          <w:bCs/>
-          <w:u w:val="single"/>
-        </w:rPr>
-        <w:t xml:space="preserve"> }</w:t>
+        <w:t>number }</w:t>
       </w:r>
       <w:proofErr w:type="gramEnd"/>
       <w:r>
@@ -1046,9 +918,9 @@
           <w:color w:val="4472C4" w:themeColor="accent1"/>
           <w:u w:val="single"/>
         </w:rPr>
-        <w:t xml:space="preserve">×{{ </w:t>
-      </w:r>
-      <w:proofErr w:type="spellStart"/>
+        <w:t>×{{ fan</w:t>
+      </w:r>
+      <w:proofErr w:type="gramEnd"/>
       <w:r>
         <w:rPr>
           <w:rFonts w:ascii="Arial" w:eastAsia="Times New Roman" w:hAnsi="Arial" w:cs="Arial"/>
@@ -1057,9 +929,9 @@
           <w:color w:val="4472C4" w:themeColor="accent1"/>
           <w:u w:val="single"/>
         </w:rPr>
-        <w:t>fan</w:t>
-      </w:r>
-      <w:proofErr w:type="gramEnd"/>
+        <w:t>_</w:t>
+      </w:r>
+      <w:proofErr w:type="gramStart"/>
       <w:r>
         <w:rPr>
           <w:rFonts w:ascii="Arial" w:eastAsia="Times New Roman" w:hAnsi="Arial" w:cs="Arial"/>
@@ -1068,9 +940,9 @@
           <w:color w:val="4472C4" w:themeColor="accent1"/>
           <w:u w:val="single"/>
         </w:rPr>
-        <w:t>_</w:t>
-      </w:r>
-      <w:proofErr w:type="gramStart"/>
+        <w:t>config.quantity</w:t>
+      </w:r>
+      <w:proofErr w:type="gramEnd"/>
       <w:r>
         <w:rPr>
           <w:rFonts w:ascii="Arial" w:eastAsia="Times New Roman" w:hAnsi="Arial" w:cs="Arial"/>
@@ -1079,20 +951,38 @@
           <w:color w:val="4472C4" w:themeColor="accent1"/>
           <w:u w:val="single"/>
         </w:rPr>
-        <w:t>config.quantity</w:t>
-      </w:r>
-      <w:proofErr w:type="spellEnd"/>
+        <w:t xml:space="preserve"> }}</w:t>
+      </w:r>
+      <w:r>
+        <w:rPr>
+          <w:rFonts w:ascii="Arial" w:eastAsia="Times New Roman" w:hAnsi="Arial" w:cs="Arial"/>
+          <w:b/>
+          <w:bCs/>
+          <w:u w:val="single"/>
+        </w:rPr>
+        <w:t xml:space="preserve">): </w:t>
+      </w:r>
+      <w:proofErr w:type="gramStart"/>
+      <w:r>
+        <w:rPr>
+          <w:rFonts w:ascii="Arial" w:eastAsia="Times New Roman" w:hAnsi="Arial" w:cs="Arial"/>
+          <w:b/>
+          <w:bCs/>
+          <w:u w:val="single"/>
+        </w:rPr>
+        <w:t>{{ fan_config.fan</w:t>
+      </w:r>
       <w:proofErr w:type="gramEnd"/>
       <w:r>
         <w:rPr>
           <w:rFonts w:ascii="Arial" w:eastAsia="Times New Roman" w:hAnsi="Arial" w:cs="Arial"/>
           <w:b/>
           <w:bCs/>
-          <w:color w:val="4472C4" w:themeColor="accent1"/>
           <w:u w:val="single"/>
         </w:rPr>
-        <w:t xml:space="preserve"> }}</w:t>
-      </w:r>
+        <w:t>_size_</w:t>
+      </w:r>
+      <w:proofErr w:type="gramStart"/>
       <w:r>
         <w:rPr>
           <w:rFonts w:ascii="Arial" w:eastAsia="Times New Roman" w:hAnsi="Arial" w:cs="Arial"/>
@@ -1100,7 +990,17 @@
           <w:bCs/>
           <w:u w:val="single"/>
         </w:rPr>
-        <w:t xml:space="preserve">): </w:t>
+        <w:t>mm }}mm</w:t>
+      </w:r>
+      <w:proofErr w:type="gramEnd"/>
+      <w:r>
+        <w:rPr>
+          <w:rFonts w:ascii="Arial" w:eastAsia="Times New Roman" w:hAnsi="Arial" w:cs="Arial"/>
+          <w:b/>
+          <w:bCs/>
+          <w:u w:val="single"/>
+        </w:rPr>
+        <w:t xml:space="preserve"> Fan, </w:t>
       </w:r>
       <w:proofErr w:type="gramStart"/>
       <w:r>
@@ -1110,9 +1010,9 @@
           <w:bCs/>
           <w:u w:val="single"/>
         </w:rPr>
-        <w:t xml:space="preserve">{{ </w:t>
-      </w:r>
-      <w:proofErr w:type="spellStart"/>
+        <w:t>{{ fan</w:t>
+      </w:r>
+      <w:proofErr w:type="gramEnd"/>
       <w:r>
         <w:rPr>
           <w:rFonts w:ascii="Arial" w:eastAsia="Times New Roman" w:hAnsi="Arial" w:cs="Arial"/>
@@ -1120,7 +1020,17 @@
           <w:bCs/>
           <w:u w:val="single"/>
         </w:rPr>
-        <w:t>fan_config.fan</w:t>
+        <w:t>_</w:t>
+      </w:r>
+      <w:proofErr w:type="gramStart"/>
+      <w:r>
+        <w:rPr>
+          <w:rFonts w:ascii="Arial" w:eastAsia="Times New Roman" w:hAnsi="Arial" w:cs="Arial"/>
+          <w:b/>
+          <w:bCs/>
+          <w:u w:val="single"/>
+        </w:rPr>
+        <w:t>config.motor</w:t>
       </w:r>
       <w:proofErr w:type="gramEnd"/>
       <w:r>
@@ -1130,7 +1040,7 @@
           <w:bCs/>
           <w:u w:val="single"/>
         </w:rPr>
-        <w:t>_size_</w:t>
+        <w:t>_</w:t>
       </w:r>
       <w:proofErr w:type="gramStart"/>
       <w:r>
@@ -1140,9 +1050,9 @@
           <w:bCs/>
           <w:u w:val="single"/>
         </w:rPr>
-        <w:t>mm</w:t>
-      </w:r>
-      <w:proofErr w:type="spellEnd"/>
+        <w:t>output }}kW</w:t>
+      </w:r>
+      <w:proofErr w:type="gramEnd"/>
       <w:r>
         <w:rPr>
           <w:rFonts w:ascii="Arial" w:eastAsia="Times New Roman" w:hAnsi="Arial" w:cs="Arial"/>
@@ -1150,7 +1060,17 @@
           <w:bCs/>
           <w:u w:val="single"/>
         </w:rPr>
-        <w:t xml:space="preserve"> }}mm</w:t>
+        <w:t xml:space="preserve">, </w:t>
+      </w:r>
+      <w:proofErr w:type="gramStart"/>
+      <w:r>
+        <w:rPr>
+          <w:rFonts w:ascii="Arial" w:eastAsia="Times New Roman" w:hAnsi="Arial" w:cs="Arial"/>
+          <w:b/>
+          <w:bCs/>
+          <w:u w:val="single"/>
+        </w:rPr>
+        <w:t>{{ fan</w:t>
       </w:r>
       <w:proofErr w:type="gramEnd"/>
       <w:r>
@@ -1160,7 +1080,7 @@
           <w:bCs/>
           <w:u w:val="single"/>
         </w:rPr>
-        <w:t xml:space="preserve"> Fan, </w:t>
+        <w:t>_</w:t>
       </w:r>
       <w:proofErr w:type="gramStart"/>
       <w:r>
@@ -1170,9 +1090,9 @@
           <w:bCs/>
           <w:u w:val="single"/>
         </w:rPr>
-        <w:t xml:space="preserve">{{ </w:t>
-      </w:r>
-      <w:proofErr w:type="spellStart"/>
+        <w:t>config.motor</w:t>
+      </w:r>
+      <w:proofErr w:type="gramEnd"/>
       <w:r>
         <w:rPr>
           <w:rFonts w:ascii="Arial" w:eastAsia="Times New Roman" w:hAnsi="Arial" w:cs="Arial"/>
@@ -1180,9 +1100,9 @@
           <w:bCs/>
           <w:u w:val="single"/>
         </w:rPr>
-        <w:t>fan</w:t>
-      </w:r>
-      <w:proofErr w:type="gramEnd"/>
+        <w:t>_</w:t>
+      </w:r>
+      <w:proofErr w:type="gramStart"/>
       <w:r>
         <w:rPr>
           <w:rFonts w:ascii="Arial" w:eastAsia="Times New Roman" w:hAnsi="Arial" w:cs="Arial"/>
@@ -1190,127 +1110,7 @@
           <w:bCs/>
           <w:u w:val="single"/>
         </w:rPr>
-        <w:t>_</w:t>
-      </w:r>
-      <w:proofErr w:type="gramStart"/>
-      <w:r>
-        <w:rPr>
-          <w:rFonts w:ascii="Arial" w:eastAsia="Times New Roman" w:hAnsi="Arial" w:cs="Arial"/>
-          <w:b/>
-          <w:bCs/>
-          <w:u w:val="single"/>
-        </w:rPr>
-        <w:t>config.motor</w:t>
-      </w:r>
-      <w:proofErr w:type="gramEnd"/>
-      <w:r>
-        <w:rPr>
-          <w:rFonts w:ascii="Arial" w:eastAsia="Times New Roman" w:hAnsi="Arial" w:cs="Arial"/>
-          <w:b/>
-          <w:bCs/>
-          <w:u w:val="single"/>
-        </w:rPr>
-        <w:t>_</w:t>
-      </w:r>
-      <w:proofErr w:type="gramStart"/>
-      <w:r>
-        <w:rPr>
-          <w:rFonts w:ascii="Arial" w:eastAsia="Times New Roman" w:hAnsi="Arial" w:cs="Arial"/>
-          <w:b/>
-          <w:bCs/>
-          <w:u w:val="single"/>
-        </w:rPr>
-        <w:t>output</w:t>
-      </w:r>
-      <w:proofErr w:type="spellEnd"/>
-      <w:r>
-        <w:rPr>
-          <w:rFonts w:ascii="Arial" w:eastAsia="Times New Roman" w:hAnsi="Arial" w:cs="Arial"/>
-          <w:b/>
-          <w:bCs/>
-          <w:u w:val="single"/>
-        </w:rPr>
-        <w:t xml:space="preserve"> }}kW</w:t>
-      </w:r>
-      <w:proofErr w:type="gramEnd"/>
-      <w:r>
-        <w:rPr>
-          <w:rFonts w:ascii="Arial" w:eastAsia="Times New Roman" w:hAnsi="Arial" w:cs="Arial"/>
-          <w:b/>
-          <w:bCs/>
-          <w:u w:val="single"/>
-        </w:rPr>
-        <w:t xml:space="preserve">, </w:t>
-      </w:r>
-      <w:proofErr w:type="gramStart"/>
-      <w:r>
-        <w:rPr>
-          <w:rFonts w:ascii="Arial" w:eastAsia="Times New Roman" w:hAnsi="Arial" w:cs="Arial"/>
-          <w:b/>
-          <w:bCs/>
-          <w:u w:val="single"/>
-        </w:rPr>
-        <w:t xml:space="preserve">{{ </w:t>
-      </w:r>
-      <w:proofErr w:type="spellStart"/>
-      <w:r>
-        <w:rPr>
-          <w:rFonts w:ascii="Arial" w:eastAsia="Times New Roman" w:hAnsi="Arial" w:cs="Arial"/>
-          <w:b/>
-          <w:bCs/>
-          <w:u w:val="single"/>
-        </w:rPr>
-        <w:t>fan</w:t>
-      </w:r>
-      <w:proofErr w:type="gramEnd"/>
-      <w:r>
-        <w:rPr>
-          <w:rFonts w:ascii="Arial" w:eastAsia="Times New Roman" w:hAnsi="Arial" w:cs="Arial"/>
-          <w:b/>
-          <w:bCs/>
-          <w:u w:val="single"/>
-        </w:rPr>
-        <w:t>_</w:t>
-      </w:r>
-      <w:proofErr w:type="gramStart"/>
-      <w:r>
-        <w:rPr>
-          <w:rFonts w:ascii="Arial" w:eastAsia="Times New Roman" w:hAnsi="Arial" w:cs="Arial"/>
-          <w:b/>
-          <w:bCs/>
-          <w:u w:val="single"/>
-        </w:rPr>
-        <w:t>config.motor</w:t>
-      </w:r>
-      <w:proofErr w:type="gramEnd"/>
-      <w:r>
-        <w:rPr>
-          <w:rFonts w:ascii="Arial" w:eastAsia="Times New Roman" w:hAnsi="Arial" w:cs="Arial"/>
-          <w:b/>
-          <w:bCs/>
-          <w:u w:val="single"/>
-        </w:rPr>
-        <w:t>_</w:t>
-      </w:r>
-      <w:proofErr w:type="gramStart"/>
-      <w:r>
-        <w:rPr>
-          <w:rFonts w:ascii="Arial" w:eastAsia="Times New Roman" w:hAnsi="Arial" w:cs="Arial"/>
-          <w:b/>
-          <w:bCs/>
-          <w:u w:val="single"/>
-        </w:rPr>
-        <w:t>pole</w:t>
-      </w:r>
-      <w:proofErr w:type="spellEnd"/>
-      <w:r>
-        <w:rPr>
-          <w:rFonts w:ascii="Arial" w:eastAsia="Times New Roman" w:hAnsi="Arial" w:cs="Arial"/>
-          <w:b/>
-          <w:bCs/>
-          <w:u w:val="single"/>
-        </w:rPr>
-        <w:t xml:space="preserve"> }}-</w:t>
+        <w:t>pole }}-</w:t>
       </w:r>
       <w:proofErr w:type="gramEnd"/>
       <w:r>
@@ -1382,14 +1182,7 @@
         <w:rPr>
           <w:rFonts w:ascii="Arial" w:eastAsia="Times New Roman" w:hAnsi="Arial" w:cs="Arial"/>
         </w:rPr>
-        <w:t xml:space="preserve">{{ </w:t>
-      </w:r>
-      <w:proofErr w:type="spellStart"/>
-      <w:r>
-        <w:rPr>
-          <w:rFonts w:ascii="Arial" w:eastAsia="Times New Roman" w:hAnsi="Arial" w:cs="Arial"/>
-        </w:rPr>
-        <w:t>fan_config.fan</w:t>
+        <w:t>{{ fan_config.fan</w:t>
       </w:r>
       <w:proofErr w:type="gramEnd"/>
       <w:r>
@@ -1403,14 +1196,7 @@
         <w:rPr>
           <w:rFonts w:ascii="Arial" w:eastAsia="Times New Roman" w:hAnsi="Arial" w:cs="Arial"/>
         </w:rPr>
-        <w:t>mm</w:t>
-      </w:r>
-      <w:proofErr w:type="spellEnd"/>
-      <w:r>
-        <w:rPr>
-          <w:rFonts w:ascii="Arial" w:eastAsia="Times New Roman" w:hAnsi="Arial" w:cs="Arial"/>
-        </w:rPr>
-        <w:t xml:space="preserve"> }}mm</w:t>
+        <w:t>mm }}mm</w:t>
       </w:r>
       <w:proofErr w:type="gramEnd"/>
     </w:p>
@@ -1445,14 +1231,7 @@
         <w:rPr>
           <w:rFonts w:ascii="Arial" w:eastAsia="Times New Roman" w:hAnsi="Arial" w:cs="Arial"/>
         </w:rPr>
-        <w:t xml:space="preserve">{{ </w:t>
-      </w:r>
-      <w:proofErr w:type="spellStart"/>
-      <w:r>
-        <w:rPr>
-          <w:rFonts w:ascii="Arial" w:eastAsia="Times New Roman" w:hAnsi="Arial" w:cs="Arial"/>
-        </w:rPr>
-        <w:t>fan</w:t>
+        <w:t>{{ fan</w:t>
       </w:r>
       <w:proofErr w:type="gramEnd"/>
       <w:r>
@@ -1480,14 +1259,7 @@
         <w:rPr>
           <w:rFonts w:ascii="Arial" w:eastAsia="Times New Roman" w:hAnsi="Arial" w:cs="Arial"/>
         </w:rPr>
-        <w:t>sets</w:t>
-      </w:r>
-      <w:proofErr w:type="spellEnd"/>
-      <w:r>
-        <w:rPr>
-          <w:rFonts w:ascii="Arial" w:eastAsia="Times New Roman" w:hAnsi="Arial" w:cs="Arial"/>
-        </w:rPr>
-        <w:t xml:space="preserve"> }</w:t>
+        <w:t>sets }</w:t>
       </w:r>
       <w:proofErr w:type="gramEnd"/>
       <w:r>
@@ -1579,6 +1351,62 @@
         <w:rPr>
           <w:rFonts w:ascii="Arial" w:eastAsia="Times New Roman" w:hAnsi="Arial" w:cs="Arial"/>
         </w:rPr>
+        <w:t xml:space="preserve">Blade Type: </w:t>
+      </w:r>
+      <w:proofErr w:type="gramStart"/>
+      <w:r>
+        <w:rPr>
+          <w:rFonts w:ascii="Arial" w:eastAsia="Times New Roman" w:hAnsi="Arial" w:cs="Arial"/>
+        </w:rPr>
+        <w:t>{{ blade</w:t>
+      </w:r>
+      <w:proofErr w:type="gramEnd"/>
+      <w:r>
+        <w:rPr>
+          <w:rFonts w:ascii="Arial" w:eastAsia="Times New Roman" w:hAnsi="Arial" w:cs="Arial"/>
+        </w:rPr>
+        <w:t>_</w:t>
+      </w:r>
+      <w:proofErr w:type="gramStart"/>
+      <w:r>
+        <w:rPr>
+          <w:rFonts w:ascii="Arial" w:eastAsia="Times New Roman" w:hAnsi="Arial" w:cs="Arial"/>
+        </w:rPr>
+        <w:t>spec }</w:t>
+      </w:r>
+      <w:proofErr w:type="gramEnd"/>
+      <w:r>
+        <w:rPr>
+          <w:rFonts w:ascii="Arial" w:eastAsia="Times New Roman" w:hAnsi="Arial" w:cs="Arial"/>
+        </w:rPr>
+        <w:t>}</w:t>
+      </w:r>
+    </w:p>
+    <w:p>
+      <w:pPr>
+        <w:pStyle w:val="ListParagraph"/>
+        <w:numPr>
+          <w:ilvl w:val="0"/>
+          <w:numId w:val="11"/>
+        </w:numPr>
+        <w:pBdr>
+          <w:top w:val="none" w:sz="0" w:space="0" w:color="auto"/>
+          <w:left w:val="none" w:sz="0" w:space="0" w:color="auto"/>
+          <w:bottom w:val="none" w:sz="0" w:space="0" w:color="auto"/>
+          <w:right w:val="none" w:sz="0" w:space="0" w:color="auto"/>
+          <w:between w:val="none" w:sz="0" w:space="0" w:color="auto"/>
+          <w:bar w:val="none" w:sz="0" w:color="auto"/>
+        </w:pBdr>
+        <w:spacing w:after="160" w:line="259" w:lineRule="auto"/>
+        <w:ind w:left="1080"/>
+        <w:rPr>
+          <w:rFonts w:ascii="Arial" w:eastAsia="Times New Roman" w:hAnsi="Arial" w:cs="Arial"/>
+        </w:rPr>
+      </w:pPr>
+      <w:r>
+        <w:rPr>
+          <w:rFonts w:ascii="Arial" w:eastAsia="Times New Roman" w:hAnsi="Arial" w:cs="Arial"/>
+        </w:rPr>
         <w:t xml:space="preserve">Designed with adjustable blade angles to optimize performance based on operational conditions, improving efficiency and adaptability. </w:t>
       </w:r>
     </w:p>
@@ -1634,14 +1462,7 @@
         <w:rPr>
           <w:rFonts w:ascii="Arial" w:eastAsia="Times New Roman" w:hAnsi="Arial" w:cs="Arial"/>
         </w:rPr>
-        <w:t xml:space="preserve">{%p for comp in </w:t>
-      </w:r>
-      <w:proofErr w:type="spellStart"/>
-      <w:r>
-        <w:rPr>
-          <w:rFonts w:ascii="Arial" w:eastAsia="Times New Roman" w:hAnsi="Arial" w:cs="Arial"/>
-        </w:rPr>
-        <w:t>fan_</w:t>
+        <w:t>{%p for comp in fan_</w:t>
       </w:r>
       <w:proofErr w:type="gramStart"/>
       <w:r>
@@ -1650,7 +1471,6 @@
         </w:rPr>
         <w:t>config.components</w:t>
       </w:r>
-      <w:proofErr w:type="spellEnd"/>
       <w:proofErr w:type="gramEnd"/>
       <w:r>
         <w:rPr>
@@ -1718,21 +1538,7 @@
         <w:rPr>
           <w:rFonts w:ascii="Arial" w:eastAsia="Times New Roman" w:hAnsi="Arial" w:cs="Arial"/>
         </w:rPr>
-        <w:t xml:space="preserve">{%p </w:t>
-      </w:r>
-      <w:proofErr w:type="spellStart"/>
-      <w:r>
-        <w:rPr>
-          <w:rFonts w:ascii="Arial" w:eastAsia="Times New Roman" w:hAnsi="Arial" w:cs="Arial"/>
-        </w:rPr>
-        <w:t>endfor</w:t>
-      </w:r>
-      <w:proofErr w:type="spellEnd"/>
-      <w:r>
-        <w:rPr>
-          <w:rFonts w:ascii="Arial" w:eastAsia="Times New Roman" w:hAnsi="Arial" w:cs="Arial"/>
-        </w:rPr>
-        <w:t xml:space="preserve"> %}</w:t>
+        <w:t>{%p endfor %}</w:t>
       </w:r>
     </w:p>
     <w:p>
@@ -1762,14 +1568,7 @@
         <w:rPr>
           <w:rFonts w:ascii="Arial" w:eastAsia="Times New Roman" w:hAnsi="Arial" w:cs="Arial"/>
         </w:rPr>
-        <w:t xml:space="preserve">{{ </w:t>
-      </w:r>
-      <w:proofErr w:type="spellStart"/>
-      <w:r>
-        <w:rPr>
-          <w:rFonts w:ascii="Arial" w:eastAsia="Times New Roman" w:hAnsi="Arial" w:cs="Arial"/>
-        </w:rPr>
-        <w:t>fan</w:t>
+        <w:t>{{ fan</w:t>
       </w:r>
       <w:proofErr w:type="gramEnd"/>
       <w:r>
@@ -1797,14 +1596,7 @@
         <w:rPr>
           <w:rFonts w:ascii="Arial" w:eastAsia="Times New Roman" w:hAnsi="Arial" w:cs="Arial"/>
         </w:rPr>
-        <w:t>kg</w:t>
-      </w:r>
-      <w:proofErr w:type="spellEnd"/>
-      <w:r>
-        <w:rPr>
-          <w:rFonts w:ascii="Arial" w:eastAsia="Times New Roman" w:hAnsi="Arial" w:cs="Arial"/>
-        </w:rPr>
-        <w:t xml:space="preserve"> }}kg</w:t>
+        <w:t>kg }}kg</w:t>
       </w:r>
       <w:proofErr w:type="gramEnd"/>
     </w:p>
@@ -1835,14 +1627,7 @@
         <w:rPr>
           <w:rFonts w:ascii="Arial" w:eastAsia="Times New Roman" w:hAnsi="Arial" w:cs="Arial"/>
         </w:rPr>
-        <w:t xml:space="preserve">{{ </w:t>
-      </w:r>
-      <w:proofErr w:type="spellStart"/>
-      <w:r>
-        <w:rPr>
-          <w:rFonts w:ascii="Arial" w:eastAsia="Times New Roman" w:hAnsi="Arial" w:cs="Arial"/>
-        </w:rPr>
-        <w:t>fan</w:t>
+        <w:t>{{ fan</w:t>
       </w:r>
       <w:proofErr w:type="gramEnd"/>
       <w:r>
@@ -1870,14 +1655,7 @@
         <w:rPr>
           <w:rFonts w:ascii="Arial" w:eastAsia="Times New Roman" w:hAnsi="Arial" w:cs="Arial"/>
         </w:rPr>
-        <w:t>length</w:t>
-      </w:r>
-      <w:proofErr w:type="spellEnd"/>
-      <w:r>
-        <w:rPr>
-          <w:rFonts w:ascii="Arial" w:eastAsia="Times New Roman" w:hAnsi="Arial" w:cs="Arial"/>
-        </w:rPr>
-        <w:t xml:space="preserve"> }}mm</w:t>
+        <w:t>length }}mm</w:t>
       </w:r>
       <w:proofErr w:type="gramEnd"/>
     </w:p>
@@ -1925,6 +1703,7 @@
           <w:bCs/>
           <w:u w:val="single"/>
         </w:rPr>
+        <w:lastRenderedPageBreak/>
         <w:t xml:space="preserve">Motor Specification:  </w:t>
       </w:r>
     </w:p>
@@ -1952,7 +1731,6 @@
         <w:rPr>
           <w:rFonts w:ascii="Arial" w:eastAsia="Times New Roman" w:hAnsi="Arial" w:cs="Arial"/>
         </w:rPr>
-        <w:lastRenderedPageBreak/>
         <w:t xml:space="preserve">Power: </w:t>
       </w:r>
       <w:proofErr w:type="gramStart"/>
@@ -1960,14 +1738,7 @@
         <w:rPr>
           <w:rFonts w:ascii="Arial" w:eastAsia="Times New Roman" w:hAnsi="Arial" w:cs="Arial"/>
         </w:rPr>
-        <w:t xml:space="preserve">{{ </w:t>
-      </w:r>
-      <w:proofErr w:type="spellStart"/>
-      <w:r>
-        <w:rPr>
-          <w:rFonts w:ascii="Arial" w:eastAsia="Times New Roman" w:hAnsi="Arial" w:cs="Arial"/>
-        </w:rPr>
-        <w:t>fan</w:t>
+        <w:t>{{ fan</w:t>
       </w:r>
       <w:proofErr w:type="gramEnd"/>
       <w:r>
@@ -1995,14 +1766,7 @@
         <w:rPr>
           <w:rFonts w:ascii="Arial" w:eastAsia="Times New Roman" w:hAnsi="Arial" w:cs="Arial"/>
         </w:rPr>
-        <w:t>output</w:t>
-      </w:r>
-      <w:proofErr w:type="spellEnd"/>
-      <w:r>
-        <w:rPr>
-          <w:rFonts w:ascii="Arial" w:eastAsia="Times New Roman" w:hAnsi="Arial" w:cs="Arial"/>
-        </w:rPr>
-        <w:t xml:space="preserve"> }}kW</w:t>
+        <w:t>output }}kW</w:t>
       </w:r>
       <w:bookmarkStart w:id="2" w:name="_Hlk210293638"/>
       <w:bookmarkEnd w:id="2"/>
@@ -2039,14 +1803,7 @@
         <w:rPr>
           <w:rFonts w:ascii="Arial" w:eastAsia="Times New Roman" w:hAnsi="Arial" w:cs="Arial"/>
         </w:rPr>
-        <w:t xml:space="preserve">{{ </w:t>
-      </w:r>
-      <w:proofErr w:type="spellStart"/>
-      <w:r>
-        <w:rPr>
-          <w:rFonts w:ascii="Arial" w:eastAsia="Times New Roman" w:hAnsi="Arial" w:cs="Arial"/>
-        </w:rPr>
-        <w:t>fan</w:t>
+        <w:t>{{ fan</w:t>
       </w:r>
       <w:proofErr w:type="gramEnd"/>
       <w:r>
@@ -2074,14 +1831,7 @@
         <w:rPr>
           <w:rFonts w:ascii="Arial" w:eastAsia="Times New Roman" w:hAnsi="Arial" w:cs="Arial"/>
         </w:rPr>
-        <w:t>range</w:t>
-      </w:r>
-      <w:proofErr w:type="spellEnd"/>
-      <w:r>
-        <w:rPr>
-          <w:rFonts w:ascii="Arial" w:eastAsia="Times New Roman" w:hAnsi="Arial" w:cs="Arial"/>
-        </w:rPr>
-        <w:t xml:space="preserve"> }</w:t>
+        <w:t>range }</w:t>
       </w:r>
       <w:proofErr w:type="gramEnd"/>
       <w:r>
@@ -2122,14 +1872,7 @@
         <w:rPr>
           <w:rFonts w:ascii="Arial" w:eastAsia="Times New Roman" w:hAnsi="Arial" w:cs="Arial"/>
         </w:rPr>
-        <w:t xml:space="preserve">{{ </w:t>
-      </w:r>
-      <w:proofErr w:type="spellStart"/>
-      <w:r>
-        <w:rPr>
-          <w:rFonts w:ascii="Arial" w:eastAsia="Times New Roman" w:hAnsi="Arial" w:cs="Arial"/>
-        </w:rPr>
-        <w:t>fan</w:t>
+        <w:t>{{ fan</w:t>
       </w:r>
       <w:proofErr w:type="gramEnd"/>
       <w:r>
@@ -2157,14 +1900,7 @@
         <w:rPr>
           <w:rFonts w:ascii="Arial" w:eastAsia="Times New Roman" w:hAnsi="Arial" w:cs="Arial"/>
         </w:rPr>
-        <w:t>pole</w:t>
-      </w:r>
-      <w:proofErr w:type="spellEnd"/>
-      <w:r>
-        <w:rPr>
-          <w:rFonts w:ascii="Arial" w:eastAsia="Times New Roman" w:hAnsi="Arial" w:cs="Arial"/>
-        </w:rPr>
-        <w:t xml:space="preserve"> }}-</w:t>
+        <w:t>pole }}-</w:t>
       </w:r>
       <w:proofErr w:type="gramEnd"/>
       <w:r>
@@ -2178,14 +1914,7 @@
         <w:rPr>
           <w:rFonts w:ascii="Arial" w:eastAsia="Times New Roman" w:hAnsi="Arial" w:cs="Arial"/>
         </w:rPr>
-        <w:t xml:space="preserve">{{ </w:t>
-      </w:r>
-      <w:proofErr w:type="spellStart"/>
-      <w:r>
-        <w:rPr>
-          <w:rFonts w:ascii="Arial" w:eastAsia="Times New Roman" w:hAnsi="Arial" w:cs="Arial"/>
-        </w:rPr>
-        <w:t>fan</w:t>
+        <w:t>{{ fan</w:t>
       </w:r>
       <w:proofErr w:type="gramEnd"/>
       <w:r>
@@ -2213,14 +1942,7 @@
         <w:rPr>
           <w:rFonts w:ascii="Arial" w:eastAsia="Times New Roman" w:hAnsi="Arial" w:cs="Arial"/>
         </w:rPr>
-        <w:t>speed</w:t>
-      </w:r>
-      <w:proofErr w:type="spellEnd"/>
-      <w:r>
-        <w:rPr>
-          <w:rFonts w:ascii="Arial" w:eastAsia="Times New Roman" w:hAnsi="Arial" w:cs="Arial"/>
-        </w:rPr>
-        <w:t xml:space="preserve"> }}RPM</w:t>
+        <w:t>speed }}RPM</w:t>
       </w:r>
       <w:proofErr w:type="gramEnd"/>
       <w:r>
@@ -2326,7 +2048,6 @@
         </w:rPr>
         <w:t xml:space="preserve">in </w:t>
       </w:r>
-      <w:proofErr w:type="spellStart"/>
       <w:r>
         <w:rPr>
           <w:rFonts w:ascii="Arial" w:eastAsia="Times New Roman" w:hAnsi="Arial" w:cs="Arial"/>
@@ -2348,15 +2069,7 @@
           <w:rFonts w:ascii="Arial" w:eastAsia="Times New Roman" w:hAnsi="Arial" w:cs="Arial"/>
           <w:bCs/>
         </w:rPr>
-        <w:t>_items</w:t>
-      </w:r>
-      <w:proofErr w:type="spellEnd"/>
-      <w:r>
-        <w:rPr>
-          <w:rFonts w:ascii="Arial" w:eastAsia="Times New Roman" w:hAnsi="Arial" w:cs="Arial"/>
-          <w:bCs/>
-        </w:rPr>
-        <w:t xml:space="preserve"> </w:t>
+        <w:t xml:space="preserve">_items </w:t>
       </w:r>
       <w:r>
         <w:rPr>
@@ -2425,7 +2138,6 @@
         </w:rPr>
         <w:t xml:space="preserve">{{ </w:t>
       </w:r>
-      <w:proofErr w:type="spellStart"/>
       <w:r>
         <w:rPr>
           <w:rFonts w:ascii="Arial" w:eastAsia="Times New Roman" w:hAnsi="Arial" w:cs="Arial"/>
@@ -2439,7 +2151,6 @@
         </w:rPr>
         <w:t>.qty</w:t>
       </w:r>
-      <w:proofErr w:type="spellEnd"/>
       <w:proofErr w:type="gramEnd"/>
       <w:r>
         <w:rPr>
@@ -2472,21 +2183,7 @@
         <w:rPr>
           <w:rFonts w:ascii="Arial" w:eastAsia="Times New Roman" w:hAnsi="Arial" w:cs="Arial"/>
         </w:rPr>
-        <w:t xml:space="preserve">{%p </w:t>
-      </w:r>
-      <w:proofErr w:type="spellStart"/>
-      <w:r>
-        <w:rPr>
-          <w:rFonts w:ascii="Arial" w:eastAsia="Times New Roman" w:hAnsi="Arial" w:cs="Arial"/>
-        </w:rPr>
-        <w:t>endfor</w:t>
-      </w:r>
-      <w:proofErr w:type="spellEnd"/>
-      <w:r>
-        <w:rPr>
-          <w:rFonts w:ascii="Arial" w:eastAsia="Times New Roman" w:hAnsi="Arial" w:cs="Arial"/>
-        </w:rPr>
-        <w:t xml:space="preserve"> %}</w:t>
+        <w:t>{%p endfor %}</w:t>
       </w:r>
     </w:p>
     <w:p>
@@ -2505,14 +2202,7 @@
         <w:rPr>
           <w:rFonts w:ascii="Arial" w:eastAsia="Times New Roman" w:hAnsi="Arial" w:cs="Arial"/>
         </w:rPr>
-        <w:t xml:space="preserve">{%p if not </w:t>
-      </w:r>
-      <w:proofErr w:type="spellStart"/>
-      <w:r>
-        <w:rPr>
-          <w:rFonts w:ascii="Arial" w:eastAsia="Times New Roman" w:hAnsi="Arial" w:cs="Arial"/>
-        </w:rPr>
-        <w:t>fan_</w:t>
+        <w:t>{%p if not fan_</w:t>
       </w:r>
       <w:proofErr w:type="gramStart"/>
       <w:r>
@@ -2526,14 +2216,7 @@
         <w:rPr>
           <w:rFonts w:ascii="Arial" w:eastAsia="Times New Roman" w:hAnsi="Arial" w:cs="Arial"/>
         </w:rPr>
-        <w:t>_items</w:t>
-      </w:r>
-      <w:proofErr w:type="spellEnd"/>
-      <w:r>
-        <w:rPr>
-          <w:rFonts w:ascii="Arial" w:eastAsia="Times New Roman" w:hAnsi="Arial" w:cs="Arial"/>
-        </w:rPr>
-        <w:t xml:space="preserve"> %}</w:t>
+        <w:t>_items %}</w:t>
       </w:r>
     </w:p>
     <w:p>
@@ -2592,15 +2275,7 @@
     </w:p>
     <w:p>
       <w:r>
-        <w:t xml:space="preserve">{%p </w:t>
-      </w:r>
-      <w:proofErr w:type="spellStart"/>
-      <w:r>
-        <w:t>endfor</w:t>
-      </w:r>
-      <w:proofErr w:type="spellEnd"/>
-      <w:r>
-        <w:t xml:space="preserve"> %}</w:t>
+        <w:t>{%p endfor %}</w:t>
       </w:r>
     </w:p>
     <w:p>
@@ -3213,23 +2888,7 @@
           </w:tcPr>
           <w:p>
             <w:r>
-              <w:t xml:space="preserve">{%tr for </w:t>
-            </w:r>
-            <w:proofErr w:type="spellStart"/>
-            <w:r>
-              <w:t>fan_config</w:t>
-            </w:r>
-            <w:proofErr w:type="spellEnd"/>
-            <w:r>
-              <w:t xml:space="preserve"> in </w:t>
-            </w:r>
-            <w:proofErr w:type="spellStart"/>
-            <w:r>
-              <w:t>fan_configs</w:t>
-            </w:r>
-            <w:proofErr w:type="spellEnd"/>
-            <w:r>
-              <w:t xml:space="preserve"> %}</w:t>
+              <w:t>{%tr for fan_config in fan_configs %}</w:t>
             </w:r>
           </w:p>
         </w:tc>
@@ -3298,43 +2957,25 @@
                 <w:b/>
                 <w:bCs/>
               </w:rPr>
-              <w:t xml:space="preserve">{{ </w:t>
-            </w:r>
-            <w:proofErr w:type="spellStart"/>
+              <w:t>{{ fan</w:t>
+            </w:r>
+            <w:proofErr w:type="gramEnd"/>
             <w:r>
               <w:rPr>
                 <w:rFonts w:ascii="Arial" w:eastAsia="Times New Roman" w:hAnsi="Arial" w:cs="Arial"/>
                 <w:b/>
                 <w:bCs/>
               </w:rPr>
-              <w:t>fan</w:t>
-            </w:r>
-            <w:proofErr w:type="gramEnd"/>
+              <w:t>_config.config_</w:t>
+            </w:r>
+            <w:proofErr w:type="gramStart"/>
             <w:r>
               <w:rPr>
                 <w:rFonts w:ascii="Arial" w:eastAsia="Times New Roman" w:hAnsi="Arial" w:cs="Arial"/>
                 <w:b/>
                 <w:bCs/>
               </w:rPr>
-              <w:t>_config.config_</w:t>
-            </w:r>
-            <w:proofErr w:type="gramStart"/>
-            <w:r>
-              <w:rPr>
-                <w:rFonts w:ascii="Arial" w:eastAsia="Times New Roman" w:hAnsi="Arial" w:cs="Arial"/>
-                <w:b/>
-                <w:bCs/>
-              </w:rPr>
-              <w:t>number</w:t>
-            </w:r>
-            <w:proofErr w:type="spellEnd"/>
-            <w:r>
-              <w:rPr>
-                <w:rFonts w:ascii="Arial" w:eastAsia="Times New Roman" w:hAnsi="Arial" w:cs="Arial"/>
-                <w:b/>
-                <w:bCs/>
-              </w:rPr>
-              <w:t xml:space="preserve"> }</w:t>
+              <w:t>number }</w:t>
             </w:r>
             <w:proofErr w:type="gramEnd"/>
             <w:r>
@@ -3353,9 +2994,9 @@
                 <w:bCs/>
                 <w:color w:val="4472C4" w:themeColor="accent1"/>
               </w:rPr>
-              <w:t xml:space="preserve">×{{ </w:t>
-            </w:r>
-            <w:proofErr w:type="spellStart"/>
+              <w:t>×{{ fan</w:t>
+            </w:r>
+            <w:proofErr w:type="gramEnd"/>
             <w:r>
               <w:rPr>
                 <w:rFonts w:ascii="Arial" w:eastAsia="Times New Roman" w:hAnsi="Arial" w:cs="Arial"/>
@@ -3363,9 +3004,9 @@
                 <w:bCs/>
                 <w:color w:val="4472C4" w:themeColor="accent1"/>
               </w:rPr>
-              <w:t>fan</w:t>
-            </w:r>
-            <w:proofErr w:type="gramEnd"/>
+              <w:t>_</w:t>
+            </w:r>
+            <w:proofErr w:type="gramStart"/>
             <w:r>
               <w:rPr>
                 <w:rFonts w:ascii="Arial" w:eastAsia="Times New Roman" w:hAnsi="Arial" w:cs="Arial"/>
@@ -3373,9 +3014,9 @@
                 <w:bCs/>
                 <w:color w:val="4472C4" w:themeColor="accent1"/>
               </w:rPr>
-              <w:t>_</w:t>
-            </w:r>
-            <w:proofErr w:type="gramStart"/>
+              <w:t>config.quantity</w:t>
+            </w:r>
+            <w:proofErr w:type="gramEnd"/>
             <w:r>
               <w:rPr>
                 <w:rFonts w:ascii="Arial" w:eastAsia="Times New Roman" w:hAnsi="Arial" w:cs="Arial"/>
@@ -3383,62 +3024,33 @@
                 <w:bCs/>
                 <w:color w:val="4472C4" w:themeColor="accent1"/>
               </w:rPr>
-              <w:t>config.quantity</w:t>
-            </w:r>
-            <w:proofErr w:type="spellEnd"/>
+              <w:t xml:space="preserve"> }}</w:t>
+            </w:r>
+            <w:r>
+              <w:rPr>
+                <w:rFonts w:ascii="Arial" w:eastAsia="Times New Roman" w:hAnsi="Arial" w:cs="Arial"/>
+                <w:b/>
+                <w:bCs/>
+              </w:rPr>
+              <w:t xml:space="preserve">): </w:t>
+            </w:r>
+            <w:proofErr w:type="gramStart"/>
+            <w:r>
+              <w:rPr>
+                <w:rFonts w:ascii="Arial" w:eastAsia="Times New Roman" w:hAnsi="Arial" w:cs="Arial"/>
+                <w:b/>
+                <w:bCs/>
+              </w:rPr>
+              <w:t>{{ fan_config.fan</w:t>
+            </w:r>
             <w:proofErr w:type="gramEnd"/>
             <w:r>
               <w:rPr>
                 <w:rFonts w:ascii="Arial" w:eastAsia="Times New Roman" w:hAnsi="Arial" w:cs="Arial"/>
                 <w:b/>
                 <w:bCs/>
-                <w:color w:val="4472C4" w:themeColor="accent1"/>
-              </w:rPr>
-              <w:t xml:space="preserve"> }}</w:t>
-            </w:r>
-            <w:r>
-              <w:rPr>
-                <w:rFonts w:ascii="Arial" w:eastAsia="Times New Roman" w:hAnsi="Arial" w:cs="Arial"/>
-                <w:b/>
-                <w:bCs/>
-              </w:rPr>
-              <w:t xml:space="preserve">): </w:t>
-            </w:r>
-            <w:proofErr w:type="gramStart"/>
-            <w:r>
-              <w:rPr>
-                <w:rFonts w:ascii="Arial" w:eastAsia="Times New Roman" w:hAnsi="Arial" w:cs="Arial"/>
-                <w:b/>
-                <w:bCs/>
-              </w:rPr>
-              <w:t xml:space="preserve">{{ </w:t>
-            </w:r>
-            <w:proofErr w:type="spellStart"/>
-            <w:r>
-              <w:rPr>
-                <w:rFonts w:ascii="Arial" w:eastAsia="Times New Roman" w:hAnsi="Arial" w:cs="Arial"/>
-                <w:b/>
-                <w:bCs/>
-              </w:rPr>
-              <w:t>fan_config.fan</w:t>
-            </w:r>
-            <w:proofErr w:type="gramEnd"/>
-            <w:r>
-              <w:rPr>
-                <w:rFonts w:ascii="Arial" w:eastAsia="Times New Roman" w:hAnsi="Arial" w:cs="Arial"/>
-                <w:b/>
-                <w:bCs/>
-              </w:rPr>
-              <w:t>_uid</w:t>
-            </w:r>
-            <w:proofErr w:type="spellEnd"/>
-            <w:r>
-              <w:rPr>
-                <w:rFonts w:ascii="Arial" w:eastAsia="Times New Roman" w:hAnsi="Arial" w:cs="Arial"/>
-                <w:b/>
-                <w:bCs/>
-              </w:rPr>
-              <w:t xml:space="preserve"> }}</w:t>
+              </w:rPr>
+              <w:t>_uid }}</w:t>
             </w:r>
           </w:p>
         </w:tc>
@@ -3530,14 +3142,7 @@
               <w:rPr>
                 <w:rFonts w:ascii="Arial" w:eastAsia="Times New Roman" w:hAnsi="Arial" w:cs="Arial"/>
               </w:rPr>
-              <w:t xml:space="preserve">{{ </w:t>
-            </w:r>
-            <w:proofErr w:type="spellStart"/>
-            <w:r>
-              <w:rPr>
-                <w:rFonts w:ascii="Arial" w:eastAsia="Times New Roman" w:hAnsi="Arial" w:cs="Arial"/>
-              </w:rPr>
-              <w:t>fan_config.fan</w:t>
+              <w:t>{{ fan_config.fan</w:t>
             </w:r>
             <w:proofErr w:type="gramEnd"/>
             <w:r>
@@ -3551,14 +3156,7 @@
               <w:rPr>
                 <w:rFonts w:ascii="Arial" w:eastAsia="Times New Roman" w:hAnsi="Arial" w:cs="Arial"/>
               </w:rPr>
-              <w:t>mm</w:t>
-            </w:r>
-            <w:proofErr w:type="spellEnd"/>
-            <w:r>
-              <w:rPr>
-                <w:rFonts w:ascii="Arial" w:eastAsia="Times New Roman" w:hAnsi="Arial" w:cs="Arial"/>
-              </w:rPr>
-              <w:t xml:space="preserve"> }}mm</w:t>
+              <w:t>mm }}mm</w:t>
             </w:r>
             <w:proofErr w:type="gramEnd"/>
             <w:r>
@@ -3693,39 +3291,23 @@
                 <w:rFonts w:ascii="Arial" w:eastAsia="Times New Roman" w:hAnsi="Arial" w:cs="Arial"/>
                 <w:bCs/>
               </w:rPr>
-              <w:t xml:space="preserve">{%tr for comp in </w:t>
-            </w:r>
-            <w:proofErr w:type="spellStart"/>
+              <w:t>{%tr for comp in fan_</w:t>
+            </w:r>
+            <w:proofErr w:type="gramStart"/>
             <w:r>
               <w:rPr>
                 <w:rFonts w:ascii="Arial" w:eastAsia="Times New Roman" w:hAnsi="Arial" w:cs="Arial"/>
                 <w:bCs/>
               </w:rPr>
-              <w:t>fan_</w:t>
-            </w:r>
-            <w:proofErr w:type="gramStart"/>
+              <w:t>config.component</w:t>
+            </w:r>
+            <w:proofErr w:type="gramEnd"/>
             <w:r>
               <w:rPr>
                 <w:rFonts w:ascii="Arial" w:eastAsia="Times New Roman" w:hAnsi="Arial" w:cs="Arial"/>
                 <w:bCs/>
               </w:rPr>
-              <w:t>config.component</w:t>
-            </w:r>
-            <w:proofErr w:type="gramEnd"/>
-            <w:r>
-              <w:rPr>
-                <w:rFonts w:ascii="Arial" w:eastAsia="Times New Roman" w:hAnsi="Arial" w:cs="Arial"/>
-                <w:bCs/>
-              </w:rPr>
-              <w:t>_pricing</w:t>
-            </w:r>
-            <w:proofErr w:type="spellEnd"/>
-            <w:r>
-              <w:rPr>
-                <w:rFonts w:ascii="Arial" w:eastAsia="Times New Roman" w:hAnsi="Arial" w:cs="Arial"/>
-                <w:bCs/>
-              </w:rPr>
-              <w:t xml:space="preserve"> %}</w:t>
+              <w:t>_pricing %}</w:t>
             </w:r>
           </w:p>
         </w:tc>
@@ -3886,15 +3468,7 @@
                 <w:rFonts w:ascii="Arial" w:eastAsia="Times New Roman" w:hAnsi="Arial" w:cs="Arial"/>
                 <w:b/>
               </w:rPr>
-              <w:t xml:space="preserve">{{ </w:t>
-            </w:r>
-            <w:proofErr w:type="spellStart"/>
-            <w:r>
-              <w:rPr>
-                <w:rFonts w:ascii="Arial" w:eastAsia="Times New Roman" w:hAnsi="Arial" w:cs="Arial"/>
-                <w:b/>
-              </w:rPr>
-              <w:t>comp</w:t>
+              <w:t>{{ comp</w:t>
             </w:r>
             <w:proofErr w:type="gramEnd"/>
             <w:r>
@@ -3902,15 +3476,7 @@
                 <w:rFonts w:ascii="Arial" w:eastAsia="Times New Roman" w:hAnsi="Arial" w:cs="Arial"/>
                 <w:b/>
               </w:rPr>
-              <w:t>.unit_price</w:t>
-            </w:r>
-            <w:proofErr w:type="spellEnd"/>
-            <w:r>
-              <w:rPr>
-                <w:rFonts w:ascii="Arial" w:eastAsia="Times New Roman" w:hAnsi="Arial" w:cs="Arial"/>
-                <w:b/>
-              </w:rPr>
-              <w:t xml:space="preserve"> }}</w:t>
+              <w:t>.unit_price }}</w:t>
             </w:r>
           </w:p>
         </w:tc>
@@ -3939,17 +3505,8 @@
                 <w:rFonts w:ascii="Arial" w:eastAsia="Times New Roman" w:hAnsi="Arial" w:cs="Arial"/>
                 <w:b/>
               </w:rPr>
-              <w:t xml:space="preserve">{{ </w:t>
-            </w:r>
-            <w:proofErr w:type="spellStart"/>
-            <w:r>
-              <w:rPr>
-                <w:rFonts w:ascii="Arial" w:eastAsia="Times New Roman" w:hAnsi="Arial" w:cs="Arial"/>
-                <w:b/>
-              </w:rPr>
-              <w:t>comp.qty</w:t>
-            </w:r>
-            <w:proofErr w:type="spellEnd"/>
+              <w:t>{{ comp.qty</w:t>
+            </w:r>
             <w:proofErr w:type="gramEnd"/>
             <w:r>
               <w:rPr>
@@ -3992,15 +3549,7 @@
                 <w:rFonts w:ascii="Arial" w:eastAsia="Times New Roman" w:hAnsi="Arial" w:cs="Arial"/>
                 <w:b/>
               </w:rPr>
-              <w:t xml:space="preserve">{{ </w:t>
-            </w:r>
-            <w:proofErr w:type="spellStart"/>
-            <w:r>
-              <w:rPr>
-                <w:rFonts w:ascii="Arial" w:eastAsia="Times New Roman" w:hAnsi="Arial" w:cs="Arial"/>
-                <w:b/>
-              </w:rPr>
-              <w:t>comp</w:t>
+              <w:t>{{ comp</w:t>
             </w:r>
             <w:proofErr w:type="gramEnd"/>
             <w:r>
@@ -4008,15 +3557,7 @@
                 <w:rFonts w:ascii="Arial" w:eastAsia="Times New Roman" w:hAnsi="Arial" w:cs="Arial"/>
                 <w:b/>
               </w:rPr>
-              <w:t>.total_price</w:t>
-            </w:r>
-            <w:proofErr w:type="spellEnd"/>
-            <w:r>
-              <w:rPr>
-                <w:rFonts w:ascii="Arial" w:eastAsia="Times New Roman" w:hAnsi="Arial" w:cs="Arial"/>
-                <w:b/>
-              </w:rPr>
-              <w:t xml:space="preserve"> }}</w:t>
+              <w:t>.total_price }}</w:t>
             </w:r>
           </w:p>
         </w:tc>
@@ -4069,23 +3610,7 @@
                 <w:rFonts w:ascii="Arial" w:eastAsia="Times New Roman" w:hAnsi="Arial" w:cs="Arial"/>
                 <w:bCs/>
               </w:rPr>
-              <w:t xml:space="preserve">{%tr </w:t>
-            </w:r>
-            <w:proofErr w:type="spellStart"/>
-            <w:r>
-              <w:rPr>
-                <w:rFonts w:ascii="Arial" w:eastAsia="Times New Roman" w:hAnsi="Arial" w:cs="Arial"/>
-                <w:bCs/>
-              </w:rPr>
-              <w:t>endfor</w:t>
-            </w:r>
-            <w:proofErr w:type="spellEnd"/>
-            <w:r>
-              <w:rPr>
-                <w:rFonts w:ascii="Arial" w:eastAsia="Times New Roman" w:hAnsi="Arial" w:cs="Arial"/>
-                <w:bCs/>
-              </w:rPr>
-              <w:t xml:space="preserve"> %}</w:t>
+              <w:t>{%tr endfor %}</w:t>
             </w:r>
           </w:p>
         </w:tc>
@@ -4291,16 +3816,25 @@
                 <w:b/>
                 <w:color w:val="2F5496" w:themeColor="accent1" w:themeShade="BF"/>
               </w:rPr>
-              <w:t xml:space="preserve">{{ </w:t>
-            </w:r>
-            <w:proofErr w:type="spellStart"/>
+              <w:t>{{ fan</w:t>
+            </w:r>
+            <w:proofErr w:type="gramEnd"/>
             <w:r>
               <w:rPr>
                 <w:rFonts w:ascii="Arial" w:eastAsia="Times New Roman" w:hAnsi="Arial" w:cs="Arial"/>
                 <w:b/>
                 <w:color w:val="2F5496" w:themeColor="accent1" w:themeShade="BF"/>
               </w:rPr>
-              <w:t>fan</w:t>
+              <w:t>_</w:t>
+            </w:r>
+            <w:proofErr w:type="gramStart"/>
+            <w:r>
+              <w:rPr>
+                <w:rFonts w:ascii="Arial" w:eastAsia="Times New Roman" w:hAnsi="Arial" w:cs="Arial"/>
+                <w:b/>
+                <w:color w:val="2F5496" w:themeColor="accent1" w:themeShade="BF"/>
+              </w:rPr>
+              <w:t>config.component</w:t>
             </w:r>
             <w:proofErr w:type="gramEnd"/>
             <w:r>
@@ -4309,34 +3843,7 @@
                 <w:b/>
                 <w:color w:val="2F5496" w:themeColor="accent1" w:themeShade="BF"/>
               </w:rPr>
-              <w:t>_</w:t>
-            </w:r>
-            <w:proofErr w:type="gramStart"/>
-            <w:r>
-              <w:rPr>
-                <w:rFonts w:ascii="Arial" w:eastAsia="Times New Roman" w:hAnsi="Arial" w:cs="Arial"/>
-                <w:b/>
-                <w:color w:val="2F5496" w:themeColor="accent1" w:themeShade="BF"/>
-              </w:rPr>
-              <w:t>config.component</w:t>
-            </w:r>
-            <w:proofErr w:type="gramEnd"/>
-            <w:r>
-              <w:rPr>
-                <w:rFonts w:ascii="Arial" w:eastAsia="Times New Roman" w:hAnsi="Arial" w:cs="Arial"/>
-                <w:b/>
-                <w:color w:val="2F5496" w:themeColor="accent1" w:themeShade="BF"/>
-              </w:rPr>
-              <w:t>_subtotal</w:t>
-            </w:r>
-            <w:proofErr w:type="spellEnd"/>
-            <w:r>
-              <w:rPr>
-                <w:rFonts w:ascii="Arial" w:eastAsia="Times New Roman" w:hAnsi="Arial" w:cs="Arial"/>
-                <w:b/>
-                <w:color w:val="2F5496" w:themeColor="accent1" w:themeShade="BF"/>
-              </w:rPr>
-              <w:t xml:space="preserve"> }}</w:t>
+              <w:t>_subtotal }}</w:t>
             </w:r>
           </w:p>
         </w:tc>
@@ -4518,14 +4025,7 @@
               <w:rPr>
                 <w:rFonts w:ascii="Arial" w:eastAsia="Times New Roman" w:hAnsi="Arial" w:cs="Arial"/>
               </w:rPr>
-              <w:t xml:space="preserve">{{ </w:t>
-            </w:r>
-            <w:proofErr w:type="spellStart"/>
-            <w:r>
-              <w:rPr>
-                <w:rFonts w:ascii="Arial" w:eastAsia="Times New Roman" w:hAnsi="Arial" w:cs="Arial"/>
-              </w:rPr>
-              <w:t>fan</w:t>
+              <w:t>{{ fan</w:t>
             </w:r>
             <w:proofErr w:type="gramEnd"/>
             <w:r>
@@ -4553,14 +4053,7 @@
               <w:rPr>
                 <w:rFonts w:ascii="Arial" w:eastAsia="Times New Roman" w:hAnsi="Arial" w:cs="Arial"/>
               </w:rPr>
-              <w:t>output</w:t>
-            </w:r>
-            <w:proofErr w:type="spellEnd"/>
-            <w:r>
-              <w:rPr>
-                <w:rFonts w:ascii="Arial" w:eastAsia="Times New Roman" w:hAnsi="Arial" w:cs="Arial"/>
-              </w:rPr>
-              <w:t xml:space="preserve"> }}kW</w:t>
+              <w:t>output }}kW</w:t>
             </w:r>
             <w:proofErr w:type="gramEnd"/>
             <w:r>
@@ -4574,14 +4067,7 @@
               <w:rPr>
                 <w:rFonts w:ascii="Arial" w:eastAsia="Times New Roman" w:hAnsi="Arial" w:cs="Arial"/>
               </w:rPr>
-              <w:t xml:space="preserve">{{ </w:t>
-            </w:r>
-            <w:proofErr w:type="spellStart"/>
-            <w:r>
-              <w:rPr>
-                <w:rFonts w:ascii="Arial" w:eastAsia="Times New Roman" w:hAnsi="Arial" w:cs="Arial"/>
-              </w:rPr>
-              <w:t>fan</w:t>
+              <w:t>{{ fan</w:t>
             </w:r>
             <w:proofErr w:type="gramEnd"/>
             <w:r>
@@ -4609,14 +4095,7 @@
               <w:rPr>
                 <w:rFonts w:ascii="Arial" w:eastAsia="Times New Roman" w:hAnsi="Arial" w:cs="Arial"/>
               </w:rPr>
-              <w:t>pole</w:t>
-            </w:r>
-            <w:proofErr w:type="spellEnd"/>
-            <w:r>
-              <w:rPr>
-                <w:rFonts w:ascii="Arial" w:eastAsia="Times New Roman" w:hAnsi="Arial" w:cs="Arial"/>
-              </w:rPr>
-              <w:t xml:space="preserve"> }}-</w:t>
+              <w:t>pole }}-</w:t>
             </w:r>
             <w:proofErr w:type="gramEnd"/>
             <w:r>
@@ -4661,16 +4140,25 @@
                 <w:b/>
                 <w:bCs/>
               </w:rPr>
-              <w:t xml:space="preserve">{{ </w:t>
-            </w:r>
-            <w:proofErr w:type="spellStart"/>
+              <w:t>{{ fan</w:t>
+            </w:r>
+            <w:proofErr w:type="gramEnd"/>
             <w:r>
               <w:rPr>
                 <w:rFonts w:ascii="Arial" w:eastAsia="Times New Roman" w:hAnsi="Arial" w:cs="Arial"/>
                 <w:b/>
                 <w:bCs/>
               </w:rPr>
-              <w:t>fan</w:t>
+              <w:t>_</w:t>
+            </w:r>
+            <w:proofErr w:type="gramStart"/>
+            <w:r>
+              <w:rPr>
+                <w:rFonts w:ascii="Arial" w:eastAsia="Times New Roman" w:hAnsi="Arial" w:cs="Arial"/>
+                <w:b/>
+                <w:bCs/>
+              </w:rPr>
+              <w:t>config.motor</w:t>
             </w:r>
             <w:proofErr w:type="gramEnd"/>
             <w:r>
@@ -4679,34 +4167,7 @@
                 <w:b/>
                 <w:bCs/>
               </w:rPr>
-              <w:t>_</w:t>
-            </w:r>
-            <w:proofErr w:type="gramStart"/>
-            <w:r>
-              <w:rPr>
-                <w:rFonts w:ascii="Arial" w:eastAsia="Times New Roman" w:hAnsi="Arial" w:cs="Arial"/>
-                <w:b/>
-                <w:bCs/>
-              </w:rPr>
-              <w:t>config.motor</w:t>
-            </w:r>
-            <w:proofErr w:type="gramEnd"/>
-            <w:r>
-              <w:rPr>
-                <w:rFonts w:ascii="Arial" w:eastAsia="Times New Roman" w:hAnsi="Arial" w:cs="Arial"/>
-                <w:b/>
-                <w:bCs/>
-              </w:rPr>
-              <w:t>_unit_price</w:t>
-            </w:r>
-            <w:proofErr w:type="spellEnd"/>
-            <w:r>
-              <w:rPr>
-                <w:rFonts w:ascii="Arial" w:eastAsia="Times New Roman" w:hAnsi="Arial" w:cs="Arial"/>
-                <w:b/>
-                <w:bCs/>
-              </w:rPr>
-              <w:t xml:space="preserve"> }}</w:t>
+              <w:t>_unit_price }}</w:t>
             </w:r>
           </w:p>
         </w:tc>
@@ -4735,15 +4196,7 @@
                 <w:rFonts w:ascii="Arial" w:eastAsia="Times New Roman" w:hAnsi="Arial" w:cs="Arial"/>
                 <w:b/>
               </w:rPr>
-              <w:t xml:space="preserve">{{ </w:t>
-            </w:r>
-            <w:proofErr w:type="spellStart"/>
-            <w:r>
-              <w:rPr>
-                <w:rFonts w:ascii="Arial" w:eastAsia="Times New Roman" w:hAnsi="Arial" w:cs="Arial"/>
-                <w:b/>
-              </w:rPr>
-              <w:t>fan</w:t>
+              <w:t>{{ fan</w:t>
             </w:r>
             <w:proofErr w:type="gramEnd"/>
             <w:r>
@@ -4767,15 +4220,7 @@
                 <w:rFonts w:ascii="Arial" w:eastAsia="Times New Roman" w:hAnsi="Arial" w:cs="Arial"/>
                 <w:b/>
               </w:rPr>
-              <w:t>_qty</w:t>
-            </w:r>
-            <w:proofErr w:type="spellEnd"/>
-            <w:r>
-              <w:rPr>
-                <w:rFonts w:ascii="Arial" w:eastAsia="Times New Roman" w:hAnsi="Arial" w:cs="Arial"/>
-                <w:b/>
-              </w:rPr>
-              <w:t xml:space="preserve"> }}</w:t>
+              <w:t>_qty }}</w:t>
             </w:r>
           </w:p>
         </w:tc>
@@ -4811,15 +4256,7 @@
                 <w:rFonts w:ascii="Arial" w:eastAsia="Times New Roman" w:hAnsi="Arial" w:cs="Arial"/>
                 <w:b/>
               </w:rPr>
-              <w:t xml:space="preserve">{{ </w:t>
-            </w:r>
-            <w:proofErr w:type="spellStart"/>
-            <w:r>
-              <w:rPr>
-                <w:rFonts w:ascii="Arial" w:eastAsia="Times New Roman" w:hAnsi="Arial" w:cs="Arial"/>
-                <w:b/>
-              </w:rPr>
-              <w:t>fan</w:t>
+              <w:t>{{ fan</w:t>
             </w:r>
             <w:proofErr w:type="gramEnd"/>
             <w:r>
@@ -4843,15 +4280,7 @@
                 <w:rFonts w:ascii="Arial" w:eastAsia="Times New Roman" w:hAnsi="Arial" w:cs="Arial"/>
                 <w:b/>
               </w:rPr>
-              <w:t>_total_price</w:t>
-            </w:r>
-            <w:proofErr w:type="spellEnd"/>
-            <w:r>
-              <w:rPr>
-                <w:rFonts w:ascii="Arial" w:eastAsia="Times New Roman" w:hAnsi="Arial" w:cs="Arial"/>
-                <w:b/>
-              </w:rPr>
-              <w:t xml:space="preserve"> }}</w:t>
+              <w:t>_total_price }}</w:t>
             </w:r>
           </w:p>
         </w:tc>
@@ -5033,39 +4462,23 @@
                 <w:rFonts w:ascii="Arial" w:eastAsia="Times New Roman" w:hAnsi="Arial" w:cs="Arial"/>
                 <w:bCs/>
               </w:rPr>
-              <w:t xml:space="preserve">{%tr for buyout in </w:t>
-            </w:r>
-            <w:proofErr w:type="spellStart"/>
+              <w:t>{%tr for buyout in fan_</w:t>
+            </w:r>
+            <w:proofErr w:type="gramStart"/>
             <w:r>
               <w:rPr>
                 <w:rFonts w:ascii="Arial" w:eastAsia="Times New Roman" w:hAnsi="Arial" w:cs="Arial"/>
                 <w:bCs/>
               </w:rPr>
-              <w:t>fan_</w:t>
-            </w:r>
-            <w:proofErr w:type="gramStart"/>
+              <w:t>config.buyout</w:t>
+            </w:r>
+            <w:proofErr w:type="gramEnd"/>
             <w:r>
               <w:rPr>
                 <w:rFonts w:ascii="Arial" w:eastAsia="Times New Roman" w:hAnsi="Arial" w:cs="Arial"/>
                 <w:bCs/>
               </w:rPr>
-              <w:t>config.buyout</w:t>
-            </w:r>
-            <w:proofErr w:type="gramEnd"/>
-            <w:r>
-              <w:rPr>
-                <w:rFonts w:ascii="Arial" w:eastAsia="Times New Roman" w:hAnsi="Arial" w:cs="Arial"/>
-                <w:bCs/>
-              </w:rPr>
-              <w:t>_items</w:t>
-            </w:r>
-            <w:proofErr w:type="spellEnd"/>
-            <w:r>
-              <w:rPr>
-                <w:rFonts w:ascii="Arial" w:eastAsia="Times New Roman" w:hAnsi="Arial" w:cs="Arial"/>
-                <w:bCs/>
-              </w:rPr>
-              <w:t xml:space="preserve"> %}</w:t>
+              <w:t>_items %}</w:t>
             </w:r>
           </w:p>
         </w:tc>
@@ -5227,34 +4640,16 @@
                 <w:b/>
                 <w:bCs/>
               </w:rPr>
-              <w:t xml:space="preserve">{{ </w:t>
-            </w:r>
-            <w:proofErr w:type="spellStart"/>
+              <w:t>{{ buyout</w:t>
+            </w:r>
+            <w:proofErr w:type="gramEnd"/>
             <w:r>
               <w:rPr>
                 <w:rFonts w:ascii="Arial" w:eastAsia="Times New Roman" w:hAnsi="Arial" w:cs="Arial"/>
                 <w:b/>
                 <w:bCs/>
               </w:rPr>
-              <w:t>buyout</w:t>
-            </w:r>
-            <w:proofErr w:type="gramEnd"/>
-            <w:r>
-              <w:rPr>
-                <w:rFonts w:ascii="Arial" w:eastAsia="Times New Roman" w:hAnsi="Arial" w:cs="Arial"/>
-                <w:b/>
-                <w:bCs/>
-              </w:rPr>
-              <w:t>.unit_price</w:t>
-            </w:r>
-            <w:proofErr w:type="spellEnd"/>
-            <w:r>
-              <w:rPr>
-                <w:rFonts w:ascii="Arial" w:eastAsia="Times New Roman" w:hAnsi="Arial" w:cs="Arial"/>
-                <w:b/>
-                <w:bCs/>
-              </w:rPr>
-              <w:t xml:space="preserve"> }}</w:t>
+              <w:t>.unit_price }}</w:t>
             </w:r>
           </w:p>
         </w:tc>
@@ -5283,17 +4678,8 @@
                 <w:rFonts w:ascii="Arial" w:eastAsia="Times New Roman" w:hAnsi="Arial" w:cs="Arial"/>
                 <w:b/>
               </w:rPr>
-              <w:t xml:space="preserve">{{ </w:t>
-            </w:r>
-            <w:proofErr w:type="spellStart"/>
-            <w:r>
-              <w:rPr>
-                <w:rFonts w:ascii="Arial" w:eastAsia="Times New Roman" w:hAnsi="Arial" w:cs="Arial"/>
-                <w:b/>
-              </w:rPr>
-              <w:t>buyout.qty</w:t>
-            </w:r>
-            <w:proofErr w:type="spellEnd"/>
+              <w:t>{{ buyout.qty</w:t>
+            </w:r>
             <w:proofErr w:type="gramEnd"/>
             <w:r>
               <w:rPr>
@@ -5336,15 +4722,7 @@
                 <w:rFonts w:ascii="Arial" w:eastAsia="Times New Roman" w:hAnsi="Arial" w:cs="Arial"/>
                 <w:b/>
               </w:rPr>
-              <w:t xml:space="preserve">{{ </w:t>
-            </w:r>
-            <w:proofErr w:type="spellStart"/>
-            <w:r>
-              <w:rPr>
-                <w:rFonts w:ascii="Arial" w:eastAsia="Times New Roman" w:hAnsi="Arial" w:cs="Arial"/>
-                <w:b/>
-              </w:rPr>
-              <w:t>buyout</w:t>
+              <w:t>{{ buyout</w:t>
             </w:r>
             <w:proofErr w:type="gramEnd"/>
             <w:r>
@@ -5352,15 +4730,7 @@
                 <w:rFonts w:ascii="Arial" w:eastAsia="Times New Roman" w:hAnsi="Arial" w:cs="Arial"/>
                 <w:b/>
               </w:rPr>
-              <w:t>.total_price</w:t>
-            </w:r>
-            <w:proofErr w:type="spellEnd"/>
-            <w:r>
-              <w:rPr>
-                <w:rFonts w:ascii="Arial" w:eastAsia="Times New Roman" w:hAnsi="Arial" w:cs="Arial"/>
-                <w:b/>
-              </w:rPr>
-              <w:t xml:space="preserve"> }}</w:t>
+              <w:t>.total_price }}</w:t>
             </w:r>
           </w:p>
         </w:tc>
@@ -5412,23 +4782,7 @@
                 <w:rFonts w:ascii="Arial" w:eastAsia="Times New Roman" w:hAnsi="Arial" w:cs="Arial"/>
                 <w:bCs/>
               </w:rPr>
-              <w:t xml:space="preserve">{%tr </w:t>
-            </w:r>
-            <w:proofErr w:type="spellStart"/>
-            <w:r>
-              <w:rPr>
-                <w:rFonts w:ascii="Arial" w:eastAsia="Times New Roman" w:hAnsi="Arial" w:cs="Arial"/>
-                <w:bCs/>
-              </w:rPr>
-              <w:t>endfor</w:t>
-            </w:r>
-            <w:proofErr w:type="spellEnd"/>
-            <w:r>
-              <w:rPr>
-                <w:rFonts w:ascii="Arial" w:eastAsia="Times New Roman" w:hAnsi="Arial" w:cs="Arial"/>
-                <w:bCs/>
-              </w:rPr>
-              <w:t xml:space="preserve"> %}</w:t>
+              <w:t>{%tr endfor %}</w:t>
             </w:r>
           </w:p>
         </w:tc>
@@ -5723,43 +5077,25 @@
                 <w:b/>
                 <w:color w:val="2F5496" w:themeColor="accent1" w:themeShade="BF"/>
               </w:rPr>
-              <w:t xml:space="preserve">{{ </w:t>
-            </w:r>
-            <w:proofErr w:type="spellStart"/>
+              <w:t>{{ fan</w:t>
+            </w:r>
+            <w:proofErr w:type="gramEnd"/>
             <w:r>
               <w:rPr>
                 <w:rFonts w:ascii="Arial" w:eastAsia="Times New Roman" w:hAnsi="Arial" w:cs="Arial"/>
                 <w:b/>
                 <w:color w:val="2F5496" w:themeColor="accent1" w:themeShade="BF"/>
               </w:rPr>
-              <w:t>fan</w:t>
-            </w:r>
-            <w:proofErr w:type="gramEnd"/>
+              <w:t>_config.config_</w:t>
+            </w:r>
+            <w:proofErr w:type="gramStart"/>
             <w:r>
               <w:rPr>
                 <w:rFonts w:ascii="Arial" w:eastAsia="Times New Roman" w:hAnsi="Arial" w:cs="Arial"/>
                 <w:b/>
                 <w:color w:val="2F5496" w:themeColor="accent1" w:themeShade="BF"/>
               </w:rPr>
-              <w:t>_config.config_</w:t>
-            </w:r>
-            <w:proofErr w:type="gramStart"/>
-            <w:r>
-              <w:rPr>
-                <w:rFonts w:ascii="Arial" w:eastAsia="Times New Roman" w:hAnsi="Arial" w:cs="Arial"/>
-                <w:b/>
-                <w:color w:val="2F5496" w:themeColor="accent1" w:themeShade="BF"/>
-              </w:rPr>
-              <w:t>number</w:t>
-            </w:r>
-            <w:proofErr w:type="spellEnd"/>
-            <w:r>
-              <w:rPr>
-                <w:rFonts w:ascii="Arial" w:eastAsia="Times New Roman" w:hAnsi="Arial" w:cs="Arial"/>
-                <w:b/>
-                <w:color w:val="2F5496" w:themeColor="accent1" w:themeShade="BF"/>
-              </w:rPr>
-              <w:t xml:space="preserve"> }</w:t>
+              <w:t>number }</w:t>
             </w:r>
             <w:proofErr w:type="gramEnd"/>
             <w:r>
@@ -5839,16 +5175,25 @@
                 <w:b/>
                 <w:color w:val="2F5496" w:themeColor="accent1" w:themeShade="BF"/>
               </w:rPr>
-              <w:t xml:space="preserve">{{ </w:t>
-            </w:r>
-            <w:proofErr w:type="spellStart"/>
+              <w:t>{{ fan</w:t>
+            </w:r>
+            <w:proofErr w:type="gramEnd"/>
             <w:r>
               <w:rPr>
                 <w:rFonts w:ascii="Arial" w:eastAsia="Times New Roman" w:hAnsi="Arial" w:cs="Arial"/>
                 <w:b/>
                 <w:color w:val="2F5496" w:themeColor="accent1" w:themeShade="BF"/>
               </w:rPr>
-              <w:t>fan</w:t>
+              <w:t>_</w:t>
+            </w:r>
+            <w:proofErr w:type="gramStart"/>
+            <w:r>
+              <w:rPr>
+                <w:rFonts w:ascii="Arial" w:eastAsia="Times New Roman" w:hAnsi="Arial" w:cs="Arial"/>
+                <w:b/>
+                <w:color w:val="2F5496" w:themeColor="accent1" w:themeShade="BF"/>
+              </w:rPr>
+              <w:t>config.line</w:t>
             </w:r>
             <w:proofErr w:type="gramEnd"/>
             <w:r>
@@ -5857,34 +5202,7 @@
                 <w:b/>
                 <w:color w:val="2F5496" w:themeColor="accent1" w:themeShade="BF"/>
               </w:rPr>
-              <w:t>_</w:t>
-            </w:r>
-            <w:proofErr w:type="gramStart"/>
-            <w:r>
-              <w:rPr>
-                <w:rFonts w:ascii="Arial" w:eastAsia="Times New Roman" w:hAnsi="Arial" w:cs="Arial"/>
-                <w:b/>
-                <w:color w:val="2F5496" w:themeColor="accent1" w:themeShade="BF"/>
-              </w:rPr>
-              <w:t>config.line</w:t>
-            </w:r>
-            <w:proofErr w:type="gramEnd"/>
-            <w:r>
-              <w:rPr>
-                <w:rFonts w:ascii="Arial" w:eastAsia="Times New Roman" w:hAnsi="Arial" w:cs="Arial"/>
-                <w:b/>
-                <w:color w:val="2F5496" w:themeColor="accent1" w:themeShade="BF"/>
-              </w:rPr>
-              <w:t>_total</w:t>
-            </w:r>
-            <w:proofErr w:type="spellEnd"/>
-            <w:r>
-              <w:rPr>
-                <w:rFonts w:ascii="Arial" w:eastAsia="Times New Roman" w:hAnsi="Arial" w:cs="Arial"/>
-                <w:b/>
-                <w:color w:val="2F5496" w:themeColor="accent1" w:themeShade="BF"/>
-              </w:rPr>
-              <w:t xml:space="preserve"> }}</w:t>
+              <w:t>_total }}</w:t>
             </w:r>
           </w:p>
         </w:tc>
@@ -5896,15 +5214,7 @@
           </w:tcPr>
           <w:p>
             <w:r>
-              <w:t xml:space="preserve">{%tr </w:t>
-            </w:r>
-            <w:proofErr w:type="spellStart"/>
-            <w:r>
-              <w:t>endfor</w:t>
-            </w:r>
-            <w:proofErr w:type="spellEnd"/>
-            <w:r>
-              <w:t xml:space="preserve"> %}</w:t>
+              <w:t>{%tr endfor %}</w:t>
             </w:r>
           </w:p>
         </w:tc>
@@ -6073,34 +5383,16 @@
                 <w:b/>
                 <w:color w:val="538135" w:themeColor="accent6" w:themeShade="BF"/>
               </w:rPr>
-              <w:t xml:space="preserve">{{ </w:t>
-            </w:r>
-            <w:proofErr w:type="spellStart"/>
+              <w:t>{{ grand</w:t>
+            </w:r>
+            <w:proofErr w:type="gramEnd"/>
             <w:r>
               <w:rPr>
                 <w:rFonts w:ascii="Arial" w:eastAsia="Times New Roman" w:hAnsi="Arial" w:cs="Arial"/>
                 <w:b/>
                 <w:color w:val="538135" w:themeColor="accent6" w:themeShade="BF"/>
               </w:rPr>
-              <w:t>grand</w:t>
-            </w:r>
-            <w:proofErr w:type="gramEnd"/>
-            <w:r>
-              <w:rPr>
-                <w:rFonts w:ascii="Arial" w:eastAsia="Times New Roman" w:hAnsi="Arial" w:cs="Arial"/>
-                <w:b/>
-                <w:color w:val="538135" w:themeColor="accent6" w:themeShade="BF"/>
-              </w:rPr>
-              <w:t>_total_price</w:t>
-            </w:r>
-            <w:proofErr w:type="spellEnd"/>
-            <w:r>
-              <w:rPr>
-                <w:rFonts w:ascii="Arial" w:eastAsia="Times New Roman" w:hAnsi="Arial" w:cs="Arial"/>
-                <w:b/>
-                <w:color w:val="538135" w:themeColor="accent6" w:themeShade="BF"/>
-              </w:rPr>
-              <w:t xml:space="preserve"> }}</w:t>
+              <w:t>_total_price }}</w:t>
             </w:r>
           </w:p>
         </w:tc>
@@ -6431,7 +5723,6 @@
         </w:rPr>
         <w:t xml:space="preserve"> </w:t>
       </w:r>
-      <w:proofErr w:type="spellStart"/>
       <w:r>
         <w:rPr>
           <w:rFonts w:ascii="Arial" w:eastAsia="Times New Roman" w:hAnsi="Arial" w:cs="Arial"/>
@@ -6452,7 +5743,6 @@
         </w:rPr>
         <w:t>time</w:t>
       </w:r>
-      <w:proofErr w:type="spellEnd"/>
       <w:r>
         <w:rPr>
           <w:rFonts w:ascii="Arial" w:eastAsia="Times New Roman" w:hAnsi="Arial" w:cs="Arial"/>
@@ -7135,15 +6425,7 @@
           <w:rFonts w:ascii="Arial" w:eastAsia="Times New Roman" w:hAnsi="Arial" w:cs="Arial"/>
           <w:b/>
         </w:rPr>
-        <w:t xml:space="preserve">{{ </w:t>
-      </w:r>
-      <w:proofErr w:type="spellStart"/>
-      <w:r>
-        <w:rPr>
-          <w:rFonts w:ascii="Arial" w:eastAsia="Times New Roman" w:hAnsi="Arial" w:cs="Arial"/>
-          <w:b/>
-        </w:rPr>
-        <w:t>user</w:t>
+        <w:t>{{ user</w:t>
       </w:r>
       <w:proofErr w:type="gramEnd"/>
       <w:r>
@@ -7159,15 +6441,7 @@
           <w:rFonts w:ascii="Arial" w:eastAsia="Times New Roman" w:hAnsi="Arial" w:cs="Arial"/>
           <w:b/>
         </w:rPr>
-        <w:t>name</w:t>
-      </w:r>
-      <w:proofErr w:type="spellEnd"/>
-      <w:r>
-        <w:rPr>
-          <w:rFonts w:ascii="Arial" w:eastAsia="Times New Roman" w:hAnsi="Arial" w:cs="Arial"/>
-          <w:b/>
-        </w:rPr>
-        <w:t xml:space="preserve"> }</w:t>
+        <w:t>name }</w:t>
       </w:r>
       <w:proofErr w:type="gramEnd"/>
       <w:r>
@@ -7194,15 +6468,7 @@
           <w:rFonts w:ascii="Arial" w:eastAsia="Times New Roman" w:hAnsi="Arial" w:cs="Arial"/>
           <w:b/>
         </w:rPr>
-        <w:t xml:space="preserve">{{ </w:t>
-      </w:r>
-      <w:proofErr w:type="spellStart"/>
-      <w:r>
-        <w:rPr>
-          <w:rFonts w:ascii="Arial" w:eastAsia="Times New Roman" w:hAnsi="Arial" w:cs="Arial"/>
-          <w:b/>
-        </w:rPr>
-        <w:t>user</w:t>
+        <w:t>{{ user</w:t>
       </w:r>
       <w:proofErr w:type="gramEnd"/>
       <w:r>
@@ -7218,15 +6484,7 @@
           <w:rFonts w:ascii="Arial" w:eastAsia="Times New Roman" w:hAnsi="Arial" w:cs="Arial"/>
           <w:b/>
         </w:rPr>
-        <w:t>position</w:t>
-      </w:r>
-      <w:proofErr w:type="spellEnd"/>
-      <w:r>
-        <w:rPr>
-          <w:rFonts w:ascii="Arial" w:eastAsia="Times New Roman" w:hAnsi="Arial" w:cs="Arial"/>
-          <w:b/>
-        </w:rPr>
-        <w:t xml:space="preserve"> }</w:t>
+        <w:t>position }</w:t>
       </w:r>
       <w:proofErr w:type="gramEnd"/>
       <w:r>
@@ -7399,16 +6657,7 @@
           <w:b/>
           <w:bCs/>
         </w:rPr>
-        <w:t xml:space="preserve">{{ </w:t>
-      </w:r>
-      <w:proofErr w:type="spellStart"/>
-      <w:r>
-        <w:rPr>
-          <w:rFonts w:ascii="Arial" w:eastAsia="Times New Roman" w:hAnsi="Arial" w:cs="Arial"/>
-          <w:b/>
-          <w:bCs/>
-        </w:rPr>
-        <w:t>user</w:t>
+        <w:t>{{ user</w:t>
       </w:r>
       <w:proofErr w:type="gramEnd"/>
       <w:r>
@@ -7426,16 +6675,7 @@
           <w:b/>
           <w:bCs/>
         </w:rPr>
-        <w:t>number</w:t>
-      </w:r>
-      <w:proofErr w:type="spellEnd"/>
-      <w:r>
-        <w:rPr>
-          <w:rFonts w:ascii="Arial" w:eastAsia="Times New Roman" w:hAnsi="Arial" w:cs="Arial"/>
-          <w:b/>
-          <w:bCs/>
-        </w:rPr>
-        <w:t xml:space="preserve"> }</w:t>
+        <w:t>number }</w:t>
       </w:r>
       <w:proofErr w:type="gramEnd"/>
       <w:r>
@@ -7493,16 +6733,7 @@
           <w:b/>
           <w:bCs/>
         </w:rPr>
-        <w:t xml:space="preserve">{{ </w:t>
-      </w:r>
-      <w:proofErr w:type="spellStart"/>
-      <w:r>
-        <w:rPr>
-          <w:rFonts w:ascii="Arial" w:eastAsia="Times New Roman" w:hAnsi="Arial" w:cs="Arial"/>
-          <w:b/>
-          <w:bCs/>
-        </w:rPr>
-        <w:t>user</w:t>
+        <w:t>{{ user</w:t>
       </w:r>
       <w:proofErr w:type="gramEnd"/>
       <w:r>
@@ -7520,16 +6751,7 @@
           <w:b/>
           <w:bCs/>
         </w:rPr>
-        <w:t>email</w:t>
-      </w:r>
-      <w:proofErr w:type="spellEnd"/>
-      <w:r>
-        <w:rPr>
-          <w:rFonts w:ascii="Arial" w:eastAsia="Times New Roman" w:hAnsi="Arial" w:cs="Arial"/>
-          <w:b/>
-          <w:bCs/>
-        </w:rPr>
-        <w:t xml:space="preserve"> }</w:t>
+        <w:t>email }</w:t>
       </w:r>
       <w:proofErr w:type="gramEnd"/>
       <w:r>
@@ -10119,7 +9341,6 @@
   <w:style w:type="character" w:default="1" w:styleId="DefaultParagraphFont">
     <w:name w:val="Default Paragraph Font"/>
     <w:uiPriority w:val="1"/>
-    <w:semiHidden/>
     <w:unhideWhenUsed/>
   </w:style>
   <w:style w:type="table" w:default="1" w:styleId="TableNormal">
@@ -10726,21 +9947,15 @@
 </file>
 
 <file path=customXml/item1.xml><?xml version="1.0" encoding="utf-8"?>
-<b:Sources xmlns:b="http://schemas.openxmlformats.org/officeDocument/2006/bibliography" xmlns="http://schemas.openxmlformats.org/officeDocument/2006/bibliography" SelectedStyle="\APASixthEditionOfficeOnline.xsl" StyleName="APA" Version="6"/>
+<?mso-contentType ?>
+<FormTemplates xmlns="http://schemas.microsoft.com/sharepoint/v3/contenttype/forms">
+  <Display>DocumentLibraryForm</Display>
+  <Edit>DocumentLibraryForm</Edit>
+  <New>DocumentLibraryForm</New>
+</FormTemplates>
 </file>
 
 <file path=customXml/item2.xml><?xml version="1.0" encoding="utf-8"?>
-<p:properties xmlns:p="http://schemas.microsoft.com/office/2006/metadata/properties" xmlns:xsi="http://www.w3.org/2001/XMLSchema-instance" xmlns:pc="http://schemas.microsoft.com/office/infopath/2007/PartnerControls">
-  <documentManagement>
-    <lcf76f155ced4ddcb4097134ff3c332f xmlns="ae64ee24-a287-4487-8358-6fe4ea9a2751">
-      <Terms xmlns="http://schemas.microsoft.com/office/infopath/2007/PartnerControls"/>
-    </lcf76f155ced4ddcb4097134ff3c332f>
-    <TaxCatchAll xmlns="fd1ea970-496a-445f-a0ac-9e633861af08" xsi:nil="true"/>
-  </documentManagement>
-</p:properties>
-</file>
-
-<file path=customXml/item3.xml><?xml version="1.0" encoding="utf-8"?>
 <ct:contentTypeSchema xmlns:ct="http://schemas.microsoft.com/office/2006/metadata/contentType" xmlns:ma="http://schemas.microsoft.com/office/2006/metadata/properties/metaAttributes" ct:_="" ma:_="" ma:contentTypeName="Document" ma:contentTypeID="0x0101008312ED833466FB4CAC852177FFA9EDB4" ma:contentTypeVersion="15" ma:contentTypeDescription="Create a new document." ma:contentTypeScope="" ma:versionID="00ba274f931c318c10f29e2e1d6d74c0">
   <xsd:schema xmlns:xsd="http://www.w3.org/2001/XMLSchema" xmlns:xs="http://www.w3.org/2001/XMLSchema" xmlns:p="http://schemas.microsoft.com/office/2006/metadata/properties" xmlns:ns2="ae64ee24-a287-4487-8358-6fe4ea9a2751" xmlns:ns3="fd1ea970-496a-445f-a0ac-9e633861af08" targetNamespace="http://schemas.microsoft.com/office/2006/metadata/properties" ma:root="true" ma:fieldsID="00de92738e7b8d6b1fdb5cc528c1afed" ns2:_="" ns3:_="">
     <xsd:import namespace="ae64ee24-a287-4487-8358-6fe4ea9a2751"/>
@@ -10975,35 +10190,30 @@
 </ct:contentTypeSchema>
 </file>
 
+<file path=customXml/item3.xml><?xml version="1.0" encoding="utf-8"?>
+<p:properties xmlns:p="http://schemas.microsoft.com/office/2006/metadata/properties" xmlns:xsi="http://www.w3.org/2001/XMLSchema-instance" xmlns:pc="http://schemas.microsoft.com/office/infopath/2007/PartnerControls">
+  <documentManagement>
+    <lcf76f155ced4ddcb4097134ff3c332f xmlns="ae64ee24-a287-4487-8358-6fe4ea9a2751">
+      <Terms xmlns="http://schemas.microsoft.com/office/infopath/2007/PartnerControls"/>
+    </lcf76f155ced4ddcb4097134ff3c332f>
+    <TaxCatchAll xmlns="fd1ea970-496a-445f-a0ac-9e633861af08" xsi:nil="true"/>
+  </documentManagement>
+</p:properties>
+</file>
+
 <file path=customXml/item4.xml><?xml version="1.0" encoding="utf-8"?>
-<?mso-contentType ?>
-<FormTemplates xmlns="http://schemas.microsoft.com/sharepoint/v3/contenttype/forms">
-  <Display>DocumentLibraryForm</Display>
-  <Edit>DocumentLibraryForm</Edit>
-  <New>DocumentLibraryForm</New>
-</FormTemplates>
+<b:Sources xmlns:b="http://schemas.openxmlformats.org/officeDocument/2006/bibliography" xmlns="http://schemas.openxmlformats.org/officeDocument/2006/bibliography" SelectedStyle="\APASixthEditionOfficeOnline.xsl" StyleName="APA" Version="6"/>
 </file>
 
 <file path=customXml/itemProps1.xml><?xml version="1.0" encoding="utf-8"?>
-<ds:datastoreItem xmlns:ds="http://schemas.openxmlformats.org/officeDocument/2006/customXml" ds:itemID="{6B87BA90-45F4-4413-8553-4E37FB89445A}">
+<ds:datastoreItem xmlns:ds="http://schemas.openxmlformats.org/officeDocument/2006/customXml" ds:itemID="{8321DDA5-16E0-4606-B32A-7029020DA1BE}">
   <ds:schemaRefs>
-    <ds:schemaRef ds:uri="http://schemas.openxmlformats.org/officeDocument/2006/bibliography"/>
+    <ds:schemaRef ds:uri="http://schemas.microsoft.com/sharepoint/v3/contenttype/forms"/>
   </ds:schemaRefs>
 </ds:datastoreItem>
 </file>
 
 <file path=customXml/itemProps2.xml><?xml version="1.0" encoding="utf-8"?>
-<ds:datastoreItem xmlns:ds="http://schemas.openxmlformats.org/officeDocument/2006/customXml" ds:itemID="{FAD17780-133F-40F1-8599-9A3527331F37}">
-  <ds:schemaRefs>
-    <ds:schemaRef ds:uri="http://schemas.microsoft.com/office/2006/metadata/properties"/>
-    <ds:schemaRef ds:uri="http://schemas.microsoft.com/office/infopath/2007/PartnerControls"/>
-    <ds:schemaRef ds:uri="ae64ee24-a287-4487-8358-6fe4ea9a2751"/>
-    <ds:schemaRef ds:uri="fd1ea970-496a-445f-a0ac-9e633861af08"/>
-  </ds:schemaRefs>
-</ds:datastoreItem>
-</file>
-
-<file path=customXml/itemProps3.xml><?xml version="1.0" encoding="utf-8"?>
 <ds:datastoreItem xmlns:ds="http://schemas.openxmlformats.org/officeDocument/2006/customXml" ds:itemID="{0084AE77-644A-4249-A0DE-270BF17CEEE1}">
   <ds:schemaRefs>
     <ds:schemaRef ds:uri="http://schemas.microsoft.com/office/2006/metadata/contentType"/>
@@ -11022,10 +10232,21 @@
 </ds:datastoreItem>
 </file>
 
+<file path=customXml/itemProps3.xml><?xml version="1.0" encoding="utf-8"?>
+<ds:datastoreItem xmlns:ds="http://schemas.openxmlformats.org/officeDocument/2006/customXml" ds:itemID="{FAD17780-133F-40F1-8599-9A3527331F37}">
+  <ds:schemaRefs>
+    <ds:schemaRef ds:uri="http://schemas.microsoft.com/office/2006/metadata/properties"/>
+    <ds:schemaRef ds:uri="http://schemas.microsoft.com/office/infopath/2007/PartnerControls"/>
+    <ds:schemaRef ds:uri="ae64ee24-a287-4487-8358-6fe4ea9a2751"/>
+    <ds:schemaRef ds:uri="fd1ea970-496a-445f-a0ac-9e633861af08"/>
+  </ds:schemaRefs>
+</ds:datastoreItem>
+</file>
+
 <file path=customXml/itemProps4.xml><?xml version="1.0" encoding="utf-8"?>
-<ds:datastoreItem xmlns:ds="http://schemas.openxmlformats.org/officeDocument/2006/customXml" ds:itemID="{8321DDA5-16E0-4606-B32A-7029020DA1BE}">
+<ds:datastoreItem xmlns:ds="http://schemas.openxmlformats.org/officeDocument/2006/customXml" ds:itemID="{6B87BA90-45F4-4413-8553-4E37FB89445A}">
   <ds:schemaRefs>
-    <ds:schemaRef ds:uri="http://schemas.microsoft.com/sharepoint/v3/contenttype/forms"/>
+    <ds:schemaRef ds:uri="http://schemas.openxmlformats.org/officeDocument/2006/bibliography"/>
   </ds:schemaRefs>
 </ds:datastoreItem>
 </file>
</xml_diff>